<commit_message>
Chapter Four final: rebuild in the run 4 chapter layout with more tables and figures
Co-Authored-By: Claude Opus 5.5 <noreply@anthropic.com>
Claude-Session: https://claude.ai/code/session_0116ePZsFh2Yr8B4s3JdZBxN
</commit_message>
<xml_diff>
--- a/docs/chapter4_final/08_chapter/Chapter_Four.docx
+++ b/docs/chapter4_final/08_chapter/Chapter_Four.docx
@@ -4,12 +4,61 @@
   <w:body>
     <w:p>
       <w:pPr>
-        <w:pStyle w:val="Heading1"/>
+        <w:spacing w:after="80" w:line="360" w:lineRule="auto"/>
+        <w:jc w:val="center"/>
       </w:pPr>
       <w:r>
-        <w:t>Chapter Four. Results and Discussion</w:t>
+        <w:rPr>
+          <w:b/>
+          <w:i w:val="0"/>
+          <w:sz w:val="28"/>
+        </w:rPr>
+        <w:t>CHAPTER FOUR</w:t>
       </w:r>
     </w:p>
+    <w:p>
+      <w:pPr>
+        <w:spacing w:after="80" w:line="360" w:lineRule="auto"/>
+        <w:jc w:val="center"/>
+      </w:pPr>
+      <w:r>
+        <w:rPr>
+          <w:b/>
+          <w:i w:val="0"/>
+          <w:sz w:val="28"/>
+        </w:rPr>
+        <w:t>RESULTS AND DISCUSSION</w:t>
+      </w:r>
+    </w:p>
+    <w:tbl>
+      <w:tblPr>
+        <w:tblStyle w:val="TableGrid"/>
+        <w:tblW w:type="auto" w:w="0"/>
+        <w:tblLook w:firstColumn="1" w:firstRow="1" w:lastColumn="0" w:lastRow="0" w:noHBand="0" w:noVBand="1" w:val="04A0"/>
+      </w:tblPr>
+      <w:tblGrid>
+        <w:gridCol w:w="9026"/>
+      </w:tblGrid>
+      <w:tr>
+        <w:tc>
+          <w:tcPr>
+            <w:tcW w:type="dxa" w:w="9026"/>
+            <w:shd w:val="clear" w:color="auto" w:fill="FFF6D5"/>
+          </w:tcPr>
+          <w:p>
+            <w:r/>
+            <w:r>
+              <w:rPr>
+                <w:i/>
+                <w:sz w:val="20"/>
+              </w:rPr>
+              <w:t>Note for the group. This chapter is built from the evaluation files in docs/chapter4_final. Part B, the technical evaluation, is complete. Part A and the manual-entry comparison are marked [DATA PENDING] until the questionnaire and the baseline session have been run, and [EXACT CHAPTER ONE WORDING NEEDED] marks where the Chapter One wording goes. DATA_PENDING.md lists every open item. Delete this note before submission.</w:t>
+            </w:r>
+          </w:p>
+        </w:tc>
+      </w:tr>
+    </w:tbl>
+    <w:p/>
     <w:p>
       <w:pPr>
         <w:pStyle w:val="Heading2"/>
@@ -2012,6 +2061,14 @@
     </w:p>
     <w:p>
       <w:pPr>
+        <w:pStyle w:val="Heading3"/>
+      </w:pPr>
+      <w:r>
+        <w:t>4.3.1 System components and order lifecycle</w:t>
+      </w:r>
+    </w:p>
+    <w:p>
+      <w:pPr>
         <w:spacing w:after="160" w:line="360" w:lineRule="auto"/>
         <w:jc w:val="both"/>
       </w:pPr>
@@ -3157,6 +3214,14 @@
     </w:p>
     <w:p>
       <w:pPr>
+        <w:pStyle w:val="Heading3"/>
+      </w:pPr>
+      <w:r>
+        <w:t>4.3.2 Validation rules</w:t>
+      </w:r>
+    </w:p>
+    <w:p>
+      <w:pPr>
         <w:spacing w:after="160" w:line="360" w:lineRule="auto"/>
         <w:jc w:val="both"/>
       </w:pPr>
@@ -3794,6 +3859,14 @@
           <w:sz w:val="20"/>
         </w:rPr>
         <w:t>Source: _validate function, 01_system_facts/validation_rules_and_run4_coverage.csv.</w:t>
+      </w:r>
+    </w:p>
+    <w:p>
+      <w:pPr>
+        <w:pStyle w:val="Heading3"/>
+      </w:pPr>
+      <w:r>
+        <w:t>4.3.3 Functional testing</w:t>
       </w:r>
     </w:p>
     <w:p>
@@ -5814,6 +5887,14 @@
           <w:i w:val="0"/>
         </w:rPr>
         <w:t>Three results are failures and are reported as such. In case 16b the uploaded sheet quoted cement at ₦9,000 against a list price of ₦9,500. The upload reader ignores the price column and the line was saved at the list price, so the customer was charged correctly but was not told that the sheet was out of date. The pricing rule therefore guards against a price that changes after an order is saved, as case 16a shows, but not against an outdated price on an incoming sheet. Case 19 failed because the system has no CSV export of orders, and case 21 failed because no webhook is sent when an order changes status. The only CSV export that exists is the delivery log used by Dispatch. Case 20 was passed by running the application code that builds that file on the rows the database returned for the Dispatch account, and the browser download step itself was not exercised.</w:t>
+      </w:r>
+    </w:p>
+    <w:p>
+      <w:pPr>
+        <w:pStyle w:val="Heading3"/>
+      </w:pPr>
+      <w:r>
+        <w:t>4.3.4 Access-control testing</w:t>
       </w:r>
     </w:p>
     <w:p>
@@ -7066,6 +7147,14 @@
     </w:p>
     <w:p>
       <w:pPr>
+        <w:pStyle w:val="Heading3"/>
+      </w:pPr>
+      <w:r>
+        <w:t>4.4.1 Procedure</w:t>
+      </w:r>
+    </w:p>
+    <w:p>
+      <w:pPr>
         <w:spacing w:after="160" w:line="360" w:lineRule="auto"/>
         <w:jc w:val="both"/>
       </w:pPr>
@@ -7074,6 +7163,14 @@
           <w:i w:val="0"/>
         </w:rPr>
         <w:t>Validation accuracy was measured with a controlled simulation. Orders were generated by a test harness and submitted through the same database functions a customer uses, save_draft followed by submit_order, so the rules saw them exactly as they would see a real order. Each order was either clean or carried one planted error of a known type. The harness held the planted error only in its own variables and wrote it to a results table after the run, so nothing the validation engine could read revealed which orders were erroneous. Each run took place inside a transaction that was rolled back, which removed every simulated customer and order and left the live data unchanged. The status history and the timing of each order were captured before the rollback.</w:t>
+      </w:r>
+    </w:p>
+    <w:p>
+      <w:pPr>
+        <w:pStyle w:val="Heading3"/>
+      </w:pPr>
+      <w:r>
+        <w:t>4.4.2 Replicates and planted errors</w:t>
       </w:r>
     </w:p>
     <w:p>
@@ -7840,6 +7937,14 @@
     </w:p>
     <w:p>
       <w:pPr>
+        <w:pStyle w:val="Heading3"/>
+      </w:pPr>
+      <w:r>
+        <w:t>4.4.3 Customers, catalogue and dataset</w:t>
+      </w:r>
+    </w:p>
+    <w:p>
+      <w:pPr>
         <w:spacing w:after="160" w:line="360" w:lineRule="auto"/>
         <w:jc w:val="both"/>
       </w:pPr>
@@ -7847,7 +7952,7 @@
         <w:rPr>
           <w:i w:val="0"/>
         </w:rPr>
-        <w:t>The simulation used the same twenty fictional customer companies and the same twelve-product catalogue as the first run. Company names, contact names, telephone numbers and e-mail addresses are invented, and every e-mail address uses the reserved .example domain. Each customer had two saved addresses in one of six delivery regions and four earlier orders, which give the unusual-quantity rule a history to compare against. Table 4.11 describes the replicate 1 dataset.</w:t>
+        <w:t>The simulation used the same twenty fictional customer companies and the same twelve-product catalogue as the first run. Company names, contact names, telephone numbers and e-mail addresses are invented, and every e-mail address uses the reserved .example domain. Each customer had two saved addresses in one of six delivery regions and four earlier orders, which give the unusual-quantity rule a history to compare against. Table 4.11 lists the companies and Table 4.12 describes the replicate 1 dataset. Figure 4.1 shows how the orders were spread across the delivery regions.</w:t>
       </w:r>
     </w:p>
     <w:p>
@@ -7861,7 +7966,1571 @@
           <w:b/>
           <w:i w:val="0"/>
         </w:rPr>
-        <w:t>Table 4.11: Description of the replicate 1 dataset</w:t>
+        <w:t>Table 4.11: Fictional customer companies used in the simulation</w:t>
+      </w:r>
+    </w:p>
+    <w:tbl>
+      <w:tblPr>
+        <w:tblStyle w:val="TableGrid"/>
+        <w:tblW w:type="auto" w:w="0"/>
+        <w:jc w:val="center"/>
+        <w:tblLook w:firstColumn="1" w:firstRow="1" w:lastColumn="0" w:lastRow="0" w:noHBand="0" w:noVBand="1" w:val="04A0"/>
+      </w:tblPr>
+      <w:tblGrid>
+        <w:gridCol w:w="1805"/>
+        <w:gridCol w:w="1805"/>
+        <w:gridCol w:w="1805"/>
+        <w:gridCol w:w="1805"/>
+        <w:gridCol w:w="1805"/>
+      </w:tblGrid>
+      <w:tr>
+        <w:tc>
+          <w:tcPr>
+            <w:tcW w:type="dxa" w:w="2608"/>
+            <w:shd w:val="clear" w:color="auto" w:fill="D9E2E1"/>
+          </w:tcPr>
+          <w:p>
+            <w:r/>
+            <w:r>
+              <w:rPr>
+                <w:b/>
+                <w:sz w:val="17"/>
+              </w:rPr>
+              <w:t>Company</w:t>
+            </w:r>
+          </w:p>
+        </w:tc>
+        <w:tc>
+          <w:tcPr>
+            <w:tcW w:type="dxa" w:w="1814"/>
+            <w:shd w:val="clear" w:color="auto" w:fill="D9E2E1"/>
+          </w:tcPr>
+          <w:p>
+            <w:r/>
+            <w:r>
+              <w:rPr>
+                <w:b/>
+                <w:sz w:val="17"/>
+              </w:rPr>
+              <w:t>Contact person</w:t>
+            </w:r>
+          </w:p>
+        </w:tc>
+        <w:tc>
+          <w:tcPr>
+            <w:tcW w:type="dxa" w:w="3061"/>
+            <w:shd w:val="clear" w:color="auto" w:fill="D9E2E1"/>
+          </w:tcPr>
+          <w:p>
+            <w:r/>
+            <w:r>
+              <w:rPr>
+                <w:b/>
+                <w:sz w:val="17"/>
+              </w:rPr>
+              <w:t>E-mail</w:t>
+            </w:r>
+          </w:p>
+        </w:tc>
+        <w:tc>
+          <w:tcPr>
+            <w:tcW w:type="dxa" w:w="1247"/>
+            <w:shd w:val="clear" w:color="auto" w:fill="D9E2E1"/>
+          </w:tcPr>
+          <w:p>
+            <w:r/>
+            <w:r>
+              <w:rPr>
+                <w:b/>
+                <w:sz w:val="17"/>
+              </w:rPr>
+              <w:t>Region</w:t>
+            </w:r>
+          </w:p>
+        </w:tc>
+        <w:tc>
+          <w:tcPr>
+            <w:tcW w:type="dxa" w:w="680"/>
+            <w:shd w:val="clear" w:color="auto" w:fill="D9E2E1"/>
+          </w:tcPr>
+          <w:p>
+            <w:r/>
+            <w:r>
+              <w:rPr>
+                <w:b/>
+                <w:sz w:val="17"/>
+              </w:rPr>
+              <w:t>Orders</w:t>
+            </w:r>
+          </w:p>
+        </w:tc>
+      </w:tr>
+      <w:tr>
+        <w:tc>
+          <w:tcPr>
+            <w:tcW w:type="dxa" w:w="2608"/>
+          </w:tcPr>
+          <w:p>
+            <w:r/>
+            <w:r>
+              <w:rPr>
+                <w:sz w:val="17"/>
+              </w:rPr>
+              <w:t>Adeyemi &amp; Sons Construction Ltd</w:t>
+            </w:r>
+          </w:p>
+        </w:tc>
+        <w:tc>
+          <w:tcPr>
+            <w:tcW w:type="dxa" w:w="1814"/>
+          </w:tcPr>
+          <w:p>
+            <w:r/>
+            <w:r>
+              <w:rPr>
+                <w:sz w:val="17"/>
+              </w:rPr>
+              <w:t>Folake Adeyemi</w:t>
+            </w:r>
+          </w:p>
+        </w:tc>
+        <w:tc>
+          <w:tcPr>
+            <w:tcW w:type="dxa" w:w="3061"/>
+          </w:tcPr>
+          <w:p>
+            <w:r/>
+            <w:r>
+              <w:rPr>
+                <w:sz w:val="17"/>
+              </w:rPr>
+              <w:t>folake.adeyemi@adeyemi1.example</w:t>
+            </w:r>
+          </w:p>
+        </w:tc>
+        <w:tc>
+          <w:tcPr>
+            <w:tcW w:type="dxa" w:w="1247"/>
+          </w:tcPr>
+          <w:p>
+            <w:r/>
+            <w:r>
+              <w:rPr>
+                <w:sz w:val="17"/>
+              </w:rPr>
+              <w:t>Ikeja</w:t>
+            </w:r>
+          </w:p>
+        </w:tc>
+        <w:tc>
+          <w:tcPr>
+            <w:tcW w:type="dxa" w:w="680"/>
+          </w:tcPr>
+          <w:p>
+            <w:r/>
+            <w:r>
+              <w:rPr>
+                <w:sz w:val="17"/>
+              </w:rPr>
+              <w:t>26</w:t>
+            </w:r>
+          </w:p>
+        </w:tc>
+      </w:tr>
+      <w:tr>
+        <w:tc>
+          <w:tcPr>
+            <w:tcW w:type="dxa" w:w="2608"/>
+          </w:tcPr>
+          <w:p>
+            <w:r/>
+            <w:r>
+              <w:rPr>
+                <w:sz w:val="17"/>
+              </w:rPr>
+              <w:t>Agege Steel Works</w:t>
+            </w:r>
+          </w:p>
+        </w:tc>
+        <w:tc>
+          <w:tcPr>
+            <w:tcW w:type="dxa" w:w="1814"/>
+          </w:tcPr>
+          <w:p>
+            <w:r/>
+            <w:r>
+              <w:rPr>
+                <w:sz w:val="17"/>
+              </w:rPr>
+              <w:t>Yusuf Adebanjo</w:t>
+            </w:r>
+          </w:p>
+        </w:tc>
+        <w:tc>
+          <w:tcPr>
+            <w:tcW w:type="dxa" w:w="3061"/>
+          </w:tcPr>
+          <w:p>
+            <w:r/>
+            <w:r>
+              <w:rPr>
+                <w:sz w:val="17"/>
+              </w:rPr>
+              <w:t>yusuf.adebanjo@agege13.example</w:t>
+            </w:r>
+          </w:p>
+        </w:tc>
+        <w:tc>
+          <w:tcPr>
+            <w:tcW w:type="dxa" w:w="1247"/>
+          </w:tcPr>
+          <w:p>
+            <w:r/>
+            <w:r>
+              <w:rPr>
+                <w:sz w:val="17"/>
+              </w:rPr>
+              <w:t>Ikeja</w:t>
+            </w:r>
+          </w:p>
+        </w:tc>
+        <w:tc>
+          <w:tcPr>
+            <w:tcW w:type="dxa" w:w="680"/>
+          </w:tcPr>
+          <w:p>
+            <w:r/>
+            <w:r>
+              <w:rPr>
+                <w:sz w:val="17"/>
+              </w:rPr>
+              <w:t>19</w:t>
+            </w:r>
+          </w:p>
+        </w:tc>
+      </w:tr>
+      <w:tr>
+        <w:tc>
+          <w:tcPr>
+            <w:tcW w:type="dxa" w:w="2608"/>
+          </w:tcPr>
+          <w:p>
+            <w:r/>
+            <w:r>
+              <w:rPr>
+                <w:sz w:val="17"/>
+              </w:rPr>
+              <w:t>Ajah Sunrise Housing Co-op</w:t>
+            </w:r>
+          </w:p>
+        </w:tc>
+        <w:tc>
+          <w:tcPr>
+            <w:tcW w:type="dxa" w:w="1814"/>
+          </w:tcPr>
+          <w:p>
+            <w:r/>
+            <w:r>
+              <w:rPr>
+                <w:sz w:val="17"/>
+              </w:rPr>
+              <w:t>Blessing Okoro</w:t>
+            </w:r>
+          </w:p>
+        </w:tc>
+        <w:tc>
+          <w:tcPr>
+            <w:tcW w:type="dxa" w:w="3061"/>
+          </w:tcPr>
+          <w:p>
+            <w:r/>
+            <w:r>
+              <w:rPr>
+                <w:sz w:val="17"/>
+              </w:rPr>
+              <w:t>blessing.okoro@ajah14.example</w:t>
+            </w:r>
+          </w:p>
+        </w:tc>
+        <w:tc>
+          <w:tcPr>
+            <w:tcW w:type="dxa" w:w="1247"/>
+          </w:tcPr>
+          <w:p>
+            <w:r/>
+            <w:r>
+              <w:rPr>
+                <w:sz w:val="17"/>
+              </w:rPr>
+              <w:t>Lekki-Ajah</w:t>
+            </w:r>
+          </w:p>
+        </w:tc>
+        <w:tc>
+          <w:tcPr>
+            <w:tcW w:type="dxa" w:w="680"/>
+          </w:tcPr>
+          <w:p>
+            <w:r/>
+            <w:r>
+              <w:rPr>
+                <w:sz w:val="17"/>
+              </w:rPr>
+              <w:t>25</w:t>
+            </w:r>
+          </w:p>
+        </w:tc>
+      </w:tr>
+      <w:tr>
+        <w:tc>
+          <w:tcPr>
+            <w:tcW w:type="dxa" w:w="2608"/>
+          </w:tcPr>
+          <w:p>
+            <w:r/>
+            <w:r>
+              <w:rPr>
+                <w:sz w:val="17"/>
+              </w:rPr>
+              <w:t>Apapa Port Works Supplies</w:t>
+            </w:r>
+          </w:p>
+        </w:tc>
+        <w:tc>
+          <w:tcPr>
+            <w:tcW w:type="dxa" w:w="1814"/>
+          </w:tcPr>
+          <w:p>
+            <w:r/>
+            <w:r>
+              <w:rPr>
+                <w:sz w:val="17"/>
+              </w:rPr>
+              <w:t>Garba Usman</w:t>
+            </w:r>
+          </w:p>
+        </w:tc>
+        <w:tc>
+          <w:tcPr>
+            <w:tcW w:type="dxa" w:w="3061"/>
+          </w:tcPr>
+          <w:p>
+            <w:r/>
+            <w:r>
+              <w:rPr>
+                <w:sz w:val="17"/>
+              </w:rPr>
+              <w:t>garba.usman@apapa20.example</w:t>
+            </w:r>
+          </w:p>
+        </w:tc>
+        <w:tc>
+          <w:tcPr>
+            <w:tcW w:type="dxa" w:w="1247"/>
+          </w:tcPr>
+          <w:p>
+            <w:r/>
+            <w:r>
+              <w:rPr>
+                <w:sz w:val="17"/>
+              </w:rPr>
+              <w:t>Lagos Mainland</w:t>
+            </w:r>
+          </w:p>
+        </w:tc>
+        <w:tc>
+          <w:tcPr>
+            <w:tcW w:type="dxa" w:w="680"/>
+          </w:tcPr>
+          <w:p>
+            <w:r/>
+            <w:r>
+              <w:rPr>
+                <w:sz w:val="17"/>
+              </w:rPr>
+              <w:t>26</w:t>
+            </w:r>
+          </w:p>
+        </w:tc>
+      </w:tr>
+      <w:tr>
+        <w:tc>
+          <w:tcPr>
+            <w:tcW w:type="dxa" w:w="2608"/>
+          </w:tcPr>
+          <w:p>
+            <w:r/>
+            <w:r>
+              <w:rPr>
+                <w:sz w:val="17"/>
+              </w:rPr>
+              <w:t>Bodija Interiors</w:t>
+            </w:r>
+          </w:p>
+        </w:tc>
+        <w:tc>
+          <w:tcPr>
+            <w:tcW w:type="dxa" w:w="1814"/>
+          </w:tcPr>
+          <w:p>
+            <w:r/>
+            <w:r>
+              <w:rPr>
+                <w:sz w:val="17"/>
+              </w:rPr>
+              <w:t>Segun Olatunji</w:t>
+            </w:r>
+          </w:p>
+        </w:tc>
+        <w:tc>
+          <w:tcPr>
+            <w:tcW w:type="dxa" w:w="3061"/>
+          </w:tcPr>
+          <w:p>
+            <w:r/>
+            <w:r>
+              <w:rPr>
+                <w:sz w:val="17"/>
+              </w:rPr>
+              <w:t>segun.olatunji@bodija16.example</w:t>
+            </w:r>
+          </w:p>
+        </w:tc>
+        <w:tc>
+          <w:tcPr>
+            <w:tcW w:type="dxa" w:w="1247"/>
+          </w:tcPr>
+          <w:p>
+            <w:r/>
+            <w:r>
+              <w:rPr>
+                <w:sz w:val="17"/>
+              </w:rPr>
+              <w:t>Ibadan</w:t>
+            </w:r>
+          </w:p>
+        </w:tc>
+        <w:tc>
+          <w:tcPr>
+            <w:tcW w:type="dxa" w:w="680"/>
+          </w:tcPr>
+          <w:p>
+            <w:r/>
+            <w:r>
+              <w:rPr>
+                <w:sz w:val="17"/>
+              </w:rPr>
+              <w:t>42</w:t>
+            </w:r>
+          </w:p>
+        </w:tc>
+      </w:tr>
+      <w:tr>
+        <w:tc>
+          <w:tcPr>
+            <w:tcW w:type="dxa" w:w="2608"/>
+          </w:tcPr>
+          <w:p>
+            <w:r/>
+            <w:r>
+              <w:rPr>
+                <w:sz w:val="17"/>
+              </w:rPr>
+              <w:t>Eko Bridge Contractors</w:t>
+            </w:r>
+          </w:p>
+        </w:tc>
+        <w:tc>
+          <w:tcPr>
+            <w:tcW w:type="dxa" w:w="1814"/>
+          </w:tcPr>
+          <w:p>
+            <w:r/>
+            <w:r>
+              <w:rPr>
+                <w:sz w:val="17"/>
+              </w:rPr>
+              <w:t>Tolulope Ogunleye</w:t>
+            </w:r>
+          </w:p>
+        </w:tc>
+        <w:tc>
+          <w:tcPr>
+            <w:tcW w:type="dxa" w:w="3061"/>
+          </w:tcPr>
+          <w:p>
+            <w:r/>
+            <w:r>
+              <w:rPr>
+                <w:sz w:val="17"/>
+              </w:rPr>
+              <w:t>tolulope.ogunleye@eko6.example</w:t>
+            </w:r>
+          </w:p>
+        </w:tc>
+        <w:tc>
+          <w:tcPr>
+            <w:tcW w:type="dxa" w:w="1247"/>
+          </w:tcPr>
+          <w:p>
+            <w:r/>
+            <w:r>
+              <w:rPr>
+                <w:sz w:val="17"/>
+              </w:rPr>
+              <w:t>Lagos Island</w:t>
+            </w:r>
+          </w:p>
+        </w:tc>
+        <w:tc>
+          <w:tcPr>
+            <w:tcW w:type="dxa" w:w="680"/>
+          </w:tcPr>
+          <w:p>
+            <w:r/>
+            <w:r>
+              <w:rPr>
+                <w:sz w:val="17"/>
+              </w:rPr>
+              <w:t>36</w:t>
+            </w:r>
+          </w:p>
+        </w:tc>
+      </w:tr>
+      <w:tr>
+        <w:tc>
+          <w:tcPr>
+            <w:tcW w:type="dxa" w:w="2608"/>
+          </w:tcPr>
+          <w:p>
+            <w:r/>
+            <w:r>
+              <w:rPr>
+                <w:sz w:val="17"/>
+              </w:rPr>
+              <w:t>Greenfield Estates Nigeria</w:t>
+            </w:r>
+          </w:p>
+        </w:tc>
+        <w:tc>
+          <w:tcPr>
+            <w:tcW w:type="dxa" w:w="1814"/>
+          </w:tcPr>
+          <w:p>
+            <w:r/>
+            <w:r>
+              <w:rPr>
+                <w:sz w:val="17"/>
+              </w:rPr>
+              <w:t>Ngozi Eze</w:t>
+            </w:r>
+          </w:p>
+        </w:tc>
+        <w:tc>
+          <w:tcPr>
+            <w:tcW w:type="dxa" w:w="3061"/>
+          </w:tcPr>
+          <w:p>
+            <w:r/>
+            <w:r>
+              <w:rPr>
+                <w:sz w:val="17"/>
+              </w:rPr>
+              <w:t>ngozi.eze@greenfield7.example</w:t>
+            </w:r>
+          </w:p>
+        </w:tc>
+        <w:tc>
+          <w:tcPr>
+            <w:tcW w:type="dxa" w:w="1247"/>
+          </w:tcPr>
+          <w:p>
+            <w:r/>
+            <w:r>
+              <w:rPr>
+                <w:sz w:val="17"/>
+              </w:rPr>
+              <w:t>Lekki-Ajah</w:t>
+            </w:r>
+          </w:p>
+        </w:tc>
+        <w:tc>
+          <w:tcPr>
+            <w:tcW w:type="dxa" w:w="680"/>
+          </w:tcPr>
+          <w:p>
+            <w:r/>
+            <w:r>
+              <w:rPr>
+                <w:sz w:val="17"/>
+              </w:rPr>
+              <w:t>23</w:t>
+            </w:r>
+          </w:p>
+        </w:tc>
+      </w:tr>
+      <w:tr>
+        <w:tc>
+          <w:tcPr>
+            <w:tcW w:type="dxa" w:w="2608"/>
+          </w:tcPr>
+          <w:p>
+            <w:r/>
+            <w:r>
+              <w:rPr>
+                <w:sz w:val="17"/>
+              </w:rPr>
+              <w:t>Gwarinpa Homes Ltd</w:t>
+            </w:r>
+          </w:p>
+        </w:tc>
+        <w:tc>
+          <w:tcPr>
+            <w:tcW w:type="dxa" w:w="1814"/>
+          </w:tcPr>
+          <w:p>
+            <w:r/>
+            <w:r>
+              <w:rPr>
+                <w:sz w:val="17"/>
+              </w:rPr>
+              <w:t>Fatima Sani</w:t>
+            </w:r>
+          </w:p>
+        </w:tc>
+        <w:tc>
+          <w:tcPr>
+            <w:tcW w:type="dxa" w:w="3061"/>
+          </w:tcPr>
+          <w:p>
+            <w:r/>
+            <w:r>
+              <w:rPr>
+                <w:sz w:val="17"/>
+              </w:rPr>
+              <w:t>fatima.sani@gwarinpa15.example</w:t>
+            </w:r>
+          </w:p>
+        </w:tc>
+        <w:tc>
+          <w:tcPr>
+            <w:tcW w:type="dxa" w:w="1247"/>
+          </w:tcPr>
+          <w:p>
+            <w:r/>
+            <w:r>
+              <w:rPr>
+                <w:sz w:val="17"/>
+              </w:rPr>
+              <w:t>Abuja</w:t>
+            </w:r>
+          </w:p>
+        </w:tc>
+        <w:tc>
+          <w:tcPr>
+            <w:tcW w:type="dxa" w:w="680"/>
+          </w:tcPr>
+          <w:p>
+            <w:r/>
+            <w:r>
+              <w:rPr>
+                <w:sz w:val="17"/>
+              </w:rPr>
+              <w:t>19</w:t>
+            </w:r>
+          </w:p>
+        </w:tc>
+      </w:tr>
+      <w:tr>
+        <w:tc>
+          <w:tcPr>
+            <w:tcW w:type="dxa" w:w="2608"/>
+          </w:tcPr>
+          <w:p>
+            <w:r/>
+            <w:r>
+              <w:rPr>
+                <w:sz w:val="17"/>
+              </w:rPr>
+              <w:t>Ibadan Prime Homes Ltd</w:t>
+            </w:r>
+          </w:p>
+        </w:tc>
+        <w:tc>
+          <w:tcPr>
+            <w:tcW w:type="dxa" w:w="1814"/>
+          </w:tcPr>
+          <w:p>
+            <w:r/>
+            <w:r>
+              <w:rPr>
+                <w:sz w:val="17"/>
+              </w:rPr>
+              <w:t>Oluwaseun Afolabi</w:t>
+            </w:r>
+          </w:p>
+        </w:tc>
+        <w:tc>
+          <w:tcPr>
+            <w:tcW w:type="dxa" w:w="3061"/>
+          </w:tcPr>
+          <w:p>
+            <w:r/>
+            <w:r>
+              <w:rPr>
+                <w:sz w:val="17"/>
+              </w:rPr>
+              <w:t>oluwaseun.afolabi@ibadan3.example</w:t>
+            </w:r>
+          </w:p>
+        </w:tc>
+        <w:tc>
+          <w:tcPr>
+            <w:tcW w:type="dxa" w:w="1247"/>
+          </w:tcPr>
+          <w:p>
+            <w:r/>
+            <w:r>
+              <w:rPr>
+                <w:sz w:val="17"/>
+              </w:rPr>
+              <w:t>Ibadan</w:t>
+            </w:r>
+          </w:p>
+        </w:tc>
+        <w:tc>
+          <w:tcPr>
+            <w:tcW w:type="dxa" w:w="680"/>
+          </w:tcPr>
+          <w:p>
+            <w:r/>
+            <w:r>
+              <w:rPr>
+                <w:sz w:val="17"/>
+              </w:rPr>
+              <w:t>31</w:t>
+            </w:r>
+          </w:p>
+        </w:tc>
+      </w:tr>
+      <w:tr>
+        <w:tc>
+          <w:tcPr>
+            <w:tcW w:type="dxa" w:w="2608"/>
+          </w:tcPr>
+          <w:p>
+            <w:r/>
+            <w:r>
+              <w:rPr>
+                <w:sz w:val="17"/>
+              </w:rPr>
+              <w:t>Kanu Brothers Building Supplies</w:t>
+            </w:r>
+          </w:p>
+        </w:tc>
+        <w:tc>
+          <w:tcPr>
+            <w:tcW w:type="dxa" w:w="1814"/>
+          </w:tcPr>
+          <w:p>
+            <w:r/>
+            <w:r>
+              <w:rPr>
+                <w:sz w:val="17"/>
+              </w:rPr>
+              <w:t>Chukwuemeka Kanu</w:t>
+            </w:r>
+          </w:p>
+        </w:tc>
+        <w:tc>
+          <w:tcPr>
+            <w:tcW w:type="dxa" w:w="3061"/>
+          </w:tcPr>
+          <w:p>
+            <w:r/>
+            <w:r>
+              <w:rPr>
+                <w:sz w:val="17"/>
+              </w:rPr>
+              <w:t>chukwuemeka.kanu@kanu2.example</w:t>
+            </w:r>
+          </w:p>
+        </w:tc>
+        <w:tc>
+          <w:tcPr>
+            <w:tcW w:type="dxa" w:w="1247"/>
+          </w:tcPr>
+          <w:p>
+            <w:r/>
+            <w:r>
+              <w:rPr>
+                <w:sz w:val="17"/>
+              </w:rPr>
+              <w:t>Lagos Mainland</w:t>
+            </w:r>
+          </w:p>
+        </w:tc>
+        <w:tc>
+          <w:tcPr>
+            <w:tcW w:type="dxa" w:w="680"/>
+          </w:tcPr>
+          <w:p>
+            <w:r/>
+            <w:r>
+              <w:rPr>
+                <w:sz w:val="17"/>
+              </w:rPr>
+              <w:t>30</w:t>
+            </w:r>
+          </w:p>
+        </w:tc>
+      </w:tr>
+      <w:tr>
+        <w:tc>
+          <w:tcPr>
+            <w:tcW w:type="dxa" w:w="2608"/>
+          </w:tcPr>
+          <w:p>
+            <w:r/>
+            <w:r>
+              <w:rPr>
+                <w:sz w:val="17"/>
+              </w:rPr>
+              <w:t>Lekki Coastal Developers</w:t>
+            </w:r>
+          </w:p>
+        </w:tc>
+        <w:tc>
+          <w:tcPr>
+            <w:tcW w:type="dxa" w:w="1814"/>
+          </w:tcPr>
+          <w:p>
+            <w:r/>
+            <w:r>
+              <w:rPr>
+                <w:sz w:val="17"/>
+              </w:rPr>
+              <w:t>Amina Bello</w:t>
+            </w:r>
+          </w:p>
+        </w:tc>
+        <w:tc>
+          <w:tcPr>
+            <w:tcW w:type="dxa" w:w="3061"/>
+          </w:tcPr>
+          <w:p>
+            <w:r/>
+            <w:r>
+              <w:rPr>
+                <w:sz w:val="17"/>
+              </w:rPr>
+              <w:t>amina.bello@lekki4.example</w:t>
+            </w:r>
+          </w:p>
+        </w:tc>
+        <w:tc>
+          <w:tcPr>
+            <w:tcW w:type="dxa" w:w="1247"/>
+          </w:tcPr>
+          <w:p>
+            <w:r/>
+            <w:r>
+              <w:rPr>
+                <w:sz w:val="17"/>
+              </w:rPr>
+              <w:t>Lekki-Ajah</w:t>
+            </w:r>
+          </w:p>
+        </w:tc>
+        <w:tc>
+          <w:tcPr>
+            <w:tcW w:type="dxa" w:w="680"/>
+          </w:tcPr>
+          <w:p>
+            <w:r/>
+            <w:r>
+              <w:rPr>
+                <w:sz w:val="17"/>
+              </w:rPr>
+              <w:t>28</w:t>
+            </w:r>
+          </w:p>
+        </w:tc>
+      </w:tr>
+      <w:tr>
+        <w:tc>
+          <w:tcPr>
+            <w:tcW w:type="dxa" w:w="2608"/>
+          </w:tcPr>
+          <w:p>
+            <w:r/>
+            <w:r>
+              <w:rPr>
+                <w:sz w:val="17"/>
+              </w:rPr>
+              <w:t>Magodo Residential Ltd</w:t>
+            </w:r>
+          </w:p>
+        </w:tc>
+        <w:tc>
+          <w:tcPr>
+            <w:tcW w:type="dxa" w:w="1814"/>
+          </w:tcPr>
+          <w:p>
+            <w:r/>
+            <w:r>
+              <w:rPr>
+                <w:sz w:val="17"/>
+              </w:rPr>
+              <w:t>Funmilayo Adeleke</w:t>
+            </w:r>
+          </w:p>
+        </w:tc>
+        <w:tc>
+          <w:tcPr>
+            <w:tcW w:type="dxa" w:w="3061"/>
+          </w:tcPr>
+          <w:p>
+            <w:r/>
+            <w:r>
+              <w:rPr>
+                <w:sz w:val="17"/>
+              </w:rPr>
+              <w:t>funmilayo.adeleke@magodo19.example</w:t>
+            </w:r>
+          </w:p>
+        </w:tc>
+        <w:tc>
+          <w:tcPr>
+            <w:tcW w:type="dxa" w:w="1247"/>
+          </w:tcPr>
+          <w:p>
+            <w:r/>
+            <w:r>
+              <w:rPr>
+                <w:sz w:val="17"/>
+              </w:rPr>
+              <w:t>Ikeja</w:t>
+            </w:r>
+          </w:p>
+        </w:tc>
+        <w:tc>
+          <w:tcPr>
+            <w:tcW w:type="dxa" w:w="680"/>
+          </w:tcPr>
+          <w:p>
+            <w:r/>
+            <w:r>
+              <w:rPr>
+                <w:sz w:val="17"/>
+              </w:rPr>
+              <w:t>19</w:t>
+            </w:r>
+          </w:p>
+        </w:tc>
+      </w:tr>
+      <w:tr>
+        <w:tc>
+          <w:tcPr>
+            <w:tcW w:type="dxa" w:w="2608"/>
+          </w:tcPr>
+          <w:p>
+            <w:r/>
+            <w:r>
+              <w:rPr>
+                <w:sz w:val="17"/>
+              </w:rPr>
+              <w:t>Marina Point Facilities</w:t>
+            </w:r>
+          </w:p>
+        </w:tc>
+        <w:tc>
+          <w:tcPr>
+            <w:tcW w:type="dxa" w:w="1814"/>
+          </w:tcPr>
+          <w:p>
+            <w:r/>
+            <w:r>
+              <w:rPr>
+                <w:sz w:val="17"/>
+              </w:rPr>
+              <w:t>Kemi Lawson</w:t>
+            </w:r>
+          </w:p>
+        </w:tc>
+        <w:tc>
+          <w:tcPr>
+            <w:tcW w:type="dxa" w:w="3061"/>
+          </w:tcPr>
+          <w:p>
+            <w:r/>
+            <w:r>
+              <w:rPr>
+                <w:sz w:val="17"/>
+              </w:rPr>
+              <w:t>kemi.lawson@marina11.example</w:t>
+            </w:r>
+          </w:p>
+        </w:tc>
+        <w:tc>
+          <w:tcPr>
+            <w:tcW w:type="dxa" w:w="1247"/>
+          </w:tcPr>
+          <w:p>
+            <w:r/>
+            <w:r>
+              <w:rPr>
+                <w:sz w:val="17"/>
+              </w:rPr>
+              <w:t>Lagos Island</w:t>
+            </w:r>
+          </w:p>
+        </w:tc>
+        <w:tc>
+          <w:tcPr>
+            <w:tcW w:type="dxa" w:w="680"/>
+          </w:tcPr>
+          <w:p>
+            <w:r/>
+            <w:r>
+              <w:rPr>
+                <w:sz w:val="17"/>
+              </w:rPr>
+              <w:t>17</w:t>
+            </w:r>
+          </w:p>
+        </w:tc>
+      </w:tr>
+      <w:tr>
+        <w:tc>
+          <w:tcPr>
+            <w:tcW w:type="dxa" w:w="2608"/>
+          </w:tcPr>
+          <w:p>
+            <w:r/>
+            <w:r>
+              <w:rPr>
+                <w:sz w:val="17"/>
+              </w:rPr>
+              <w:t>Northgate Realty Abuja</w:t>
+            </w:r>
+          </w:p>
+        </w:tc>
+        <w:tc>
+          <w:tcPr>
+            <w:tcW w:type="dxa" w:w="1814"/>
+          </w:tcPr>
+          <w:p>
+            <w:r/>
+            <w:r>
+              <w:rPr>
+                <w:sz w:val="17"/>
+              </w:rPr>
+              <w:t>Ibrahim Musa</w:t>
+            </w:r>
+          </w:p>
+        </w:tc>
+        <w:tc>
+          <w:tcPr>
+            <w:tcW w:type="dxa" w:w="3061"/>
+          </w:tcPr>
+          <w:p>
+            <w:r/>
+            <w:r>
+              <w:rPr>
+                <w:sz w:val="17"/>
+              </w:rPr>
+              <w:t>ibrahim.musa@northgate5.example</w:t>
+            </w:r>
+          </w:p>
+        </w:tc>
+        <w:tc>
+          <w:tcPr>
+            <w:tcW w:type="dxa" w:w="1247"/>
+          </w:tcPr>
+          <w:p>
+            <w:r/>
+            <w:r>
+              <w:rPr>
+                <w:sz w:val="17"/>
+              </w:rPr>
+              <w:t>Abuja</w:t>
+            </w:r>
+          </w:p>
+        </w:tc>
+        <w:tc>
+          <w:tcPr>
+            <w:tcW w:type="dxa" w:w="680"/>
+          </w:tcPr>
+          <w:p>
+            <w:r/>
+            <w:r>
+              <w:rPr>
+                <w:sz w:val="17"/>
+              </w:rPr>
+              <w:t>16</w:t>
+            </w:r>
+          </w:p>
+        </w:tc>
+      </w:tr>
+      <w:tr>
+        <w:tc>
+          <w:tcPr>
+            <w:tcW w:type="dxa" w:w="2608"/>
+          </w:tcPr>
+          <w:p>
+            <w:r/>
+            <w:r>
+              <w:rPr>
+                <w:sz w:val="17"/>
+              </w:rPr>
+              <w:t>Ola-Ade Hardware &amp; Tiles</w:t>
+            </w:r>
+          </w:p>
+        </w:tc>
+        <w:tc>
+          <w:tcPr>
+            <w:tcW w:type="dxa" w:w="1814"/>
+          </w:tcPr>
+          <w:p>
+            <w:r/>
+            <w:r>
+              <w:rPr>
+                <w:sz w:val="17"/>
+              </w:rPr>
+              <w:t>Babatunde Oladipo</w:t>
+            </w:r>
+          </w:p>
+        </w:tc>
+        <w:tc>
+          <w:tcPr>
+            <w:tcW w:type="dxa" w:w="3061"/>
+          </w:tcPr>
+          <w:p>
+            <w:r/>
+            <w:r>
+              <w:rPr>
+                <w:sz w:val="17"/>
+              </w:rPr>
+              <w:t>babatunde.oladipo@olaade8.example</w:t>
+            </w:r>
+          </w:p>
+        </w:tc>
+        <w:tc>
+          <w:tcPr>
+            <w:tcW w:type="dxa" w:w="1247"/>
+          </w:tcPr>
+          <w:p>
+            <w:r/>
+            <w:r>
+              <w:rPr>
+                <w:sz w:val="17"/>
+              </w:rPr>
+              <w:t>Ikeja</w:t>
+            </w:r>
+          </w:p>
+        </w:tc>
+        <w:tc>
+          <w:tcPr>
+            <w:tcW w:type="dxa" w:w="680"/>
+          </w:tcPr>
+          <w:p>
+            <w:r/>
+            <w:r>
+              <w:rPr>
+                <w:sz w:val="17"/>
+              </w:rPr>
+              <w:t>21</w:t>
+            </w:r>
+          </w:p>
+        </w:tc>
+      </w:tr>
+      <w:tr>
+        <w:tc>
+          <w:tcPr>
+            <w:tcW w:type="dxa" w:w="2608"/>
+          </w:tcPr>
+          <w:p>
+            <w:r/>
+            <w:r>
+              <w:rPr>
+                <w:sz w:val="17"/>
+              </w:rPr>
+              <w:t>Oyo Central Builders</w:t>
+            </w:r>
+          </w:p>
+        </w:tc>
+        <w:tc>
+          <w:tcPr>
+            <w:tcW w:type="dxa" w:w="1814"/>
+          </w:tcPr>
+          <w:p>
+            <w:r/>
+            <w:r>
+              <w:rPr>
+                <w:sz w:val="17"/>
+              </w:rPr>
+              <w:t>Adewale Akinyemi</w:t>
+            </w:r>
+          </w:p>
+        </w:tc>
+        <w:tc>
+          <w:tcPr>
+            <w:tcW w:type="dxa" w:w="3061"/>
+          </w:tcPr>
+          <w:p>
+            <w:r/>
+            <w:r>
+              <w:rPr>
+                <w:sz w:val="17"/>
+              </w:rPr>
+              <w:t>adewale.akinyemi@oyo10.example</w:t>
+            </w:r>
+          </w:p>
+        </w:tc>
+        <w:tc>
+          <w:tcPr>
+            <w:tcW w:type="dxa" w:w="1247"/>
+          </w:tcPr>
+          <w:p>
+            <w:r/>
+            <w:r>
+              <w:rPr>
+                <w:sz w:val="17"/>
+              </w:rPr>
+              <w:t>Ibadan</w:t>
+            </w:r>
+          </w:p>
+        </w:tc>
+        <w:tc>
+          <w:tcPr>
+            <w:tcW w:type="dxa" w:w="680"/>
+          </w:tcPr>
+          <w:p>
+            <w:r/>
+            <w:r>
+              <w:rPr>
+                <w:sz w:val="17"/>
+              </w:rPr>
+              <w:t>22</w:t>
+            </w:r>
+          </w:p>
+        </w:tc>
+      </w:tr>
+      <w:tr>
+        <w:tc>
+          <w:tcPr>
+            <w:tcW w:type="dxa" w:w="2608"/>
+          </w:tcPr>
+          <w:p>
+            <w:r/>
+            <w:r>
+              <w:rPr>
+                <w:sz w:val="17"/>
+              </w:rPr>
+              <w:t>Surulere Paint &amp; Finish</w:t>
+            </w:r>
+          </w:p>
+        </w:tc>
+        <w:tc>
+          <w:tcPr>
+            <w:tcW w:type="dxa" w:w="1814"/>
+          </w:tcPr>
+          <w:p>
+            <w:r/>
+            <w:r>
+              <w:rPr>
+                <w:sz w:val="17"/>
+              </w:rPr>
+              <w:t>Uche Nwosu</w:t>
+            </w:r>
+          </w:p>
+        </w:tc>
+        <w:tc>
+          <w:tcPr>
+            <w:tcW w:type="dxa" w:w="3061"/>
+          </w:tcPr>
+          <w:p>
+            <w:r/>
+            <w:r>
+              <w:rPr>
+                <w:sz w:val="17"/>
+              </w:rPr>
+              <w:t>uche.nwosu@surulere12.example</w:t>
+            </w:r>
+          </w:p>
+        </w:tc>
+        <w:tc>
+          <w:tcPr>
+            <w:tcW w:type="dxa" w:w="1247"/>
+          </w:tcPr>
+          <w:p>
+            <w:r/>
+            <w:r>
+              <w:rPr>
+                <w:sz w:val="17"/>
+              </w:rPr>
+              <w:t>Lagos Mainland</w:t>
+            </w:r>
+          </w:p>
+        </w:tc>
+        <w:tc>
+          <w:tcPr>
+            <w:tcW w:type="dxa" w:w="680"/>
+          </w:tcPr>
+          <w:p>
+            <w:r/>
+            <w:r>
+              <w:rPr>
+                <w:sz w:val="17"/>
+              </w:rPr>
+              <w:t>23</w:t>
+            </w:r>
+          </w:p>
+        </w:tc>
+      </w:tr>
+      <w:tr>
+        <w:tc>
+          <w:tcPr>
+            <w:tcW w:type="dxa" w:w="2608"/>
+          </w:tcPr>
+          <w:p>
+            <w:r/>
+            <w:r>
+              <w:rPr>
+                <w:sz w:val="17"/>
+              </w:rPr>
+              <w:t>Victoria Island Fit-Out Ltd</w:t>
+            </w:r>
+          </w:p>
+        </w:tc>
+        <w:tc>
+          <w:tcPr>
+            <w:tcW w:type="dxa" w:w="1814"/>
+          </w:tcPr>
+          <w:p>
+            <w:r/>
+            <w:r>
+              <w:rPr>
+                <w:sz w:val="17"/>
+              </w:rPr>
+              <w:t>Chiamaka Obi</w:t>
+            </w:r>
+          </w:p>
+        </w:tc>
+        <w:tc>
+          <w:tcPr>
+            <w:tcW w:type="dxa" w:w="3061"/>
+          </w:tcPr>
+          <w:p>
+            <w:r/>
+            <w:r>
+              <w:rPr>
+                <w:sz w:val="17"/>
+              </w:rPr>
+              <w:t>chiamaka.obi@victoria17.example</w:t>
+            </w:r>
+          </w:p>
+        </w:tc>
+        <w:tc>
+          <w:tcPr>
+            <w:tcW w:type="dxa" w:w="1247"/>
+          </w:tcPr>
+          <w:p>
+            <w:r/>
+            <w:r>
+              <w:rPr>
+                <w:sz w:val="17"/>
+              </w:rPr>
+              <w:t>Lagos Island</w:t>
+            </w:r>
+          </w:p>
+        </w:tc>
+        <w:tc>
+          <w:tcPr>
+            <w:tcW w:type="dxa" w:w="680"/>
+          </w:tcPr>
+          <w:p>
+            <w:r/>
+            <w:r>
+              <w:rPr>
+                <w:sz w:val="17"/>
+              </w:rPr>
+              <w:t>26</w:t>
+            </w:r>
+          </w:p>
+        </w:tc>
+      </w:tr>
+      <w:tr>
+        <w:tc>
+          <w:tcPr>
+            <w:tcW w:type="dxa" w:w="2608"/>
+          </w:tcPr>
+          <w:p>
+            <w:r/>
+            <w:r>
+              <w:rPr>
+                <w:sz w:val="17"/>
+              </w:rPr>
+              <w:t>Yaba Tech Hub Builders</w:t>
+            </w:r>
+          </w:p>
+        </w:tc>
+        <w:tc>
+          <w:tcPr>
+            <w:tcW w:type="dxa" w:w="1814"/>
+          </w:tcPr>
+          <w:p>
+            <w:r/>
+            <w:r>
+              <w:rPr>
+                <w:sz w:val="17"/>
+              </w:rPr>
+              <w:t>Emeka Okafor</w:t>
+            </w:r>
+          </w:p>
+        </w:tc>
+        <w:tc>
+          <w:tcPr>
+            <w:tcW w:type="dxa" w:w="3061"/>
+          </w:tcPr>
+          <w:p>
+            <w:r/>
+            <w:r>
+              <w:rPr>
+                <w:sz w:val="17"/>
+              </w:rPr>
+              <w:t>emeka.okafor@yaba18.example</w:t>
+            </w:r>
+          </w:p>
+        </w:tc>
+        <w:tc>
+          <w:tcPr>
+            <w:tcW w:type="dxa" w:w="1247"/>
+          </w:tcPr>
+          <w:p>
+            <w:r/>
+            <w:r>
+              <w:rPr>
+                <w:sz w:val="17"/>
+              </w:rPr>
+              <w:t>Lagos Mainland</w:t>
+            </w:r>
+          </w:p>
+        </w:tc>
+        <w:tc>
+          <w:tcPr>
+            <w:tcW w:type="dxa" w:w="680"/>
+          </w:tcPr>
+          <w:p>
+            <w:r/>
+            <w:r>
+              <w:rPr>
+                <w:sz w:val="17"/>
+              </w:rPr>
+              <w:t>28</w:t>
+            </w:r>
+          </w:p>
+        </w:tc>
+      </w:tr>
+      <w:tr>
+        <w:tc>
+          <w:tcPr>
+            <w:tcW w:type="dxa" w:w="2608"/>
+          </w:tcPr>
+          <w:p>
+            <w:r/>
+            <w:r>
+              <w:rPr>
+                <w:sz w:val="17"/>
+              </w:rPr>
+              <w:t>Zuma Rock Engineering</w:t>
+            </w:r>
+          </w:p>
+        </w:tc>
+        <w:tc>
+          <w:tcPr>
+            <w:tcW w:type="dxa" w:w="1814"/>
+          </w:tcPr>
+          <w:p>
+            <w:r/>
+            <w:r>
+              <w:rPr>
+                <w:sz w:val="17"/>
+              </w:rPr>
+              <w:t>Hauwa Abdullahi</w:t>
+            </w:r>
+          </w:p>
+        </w:tc>
+        <w:tc>
+          <w:tcPr>
+            <w:tcW w:type="dxa" w:w="3061"/>
+          </w:tcPr>
+          <w:p>
+            <w:r/>
+            <w:r>
+              <w:rPr>
+                <w:sz w:val="17"/>
+              </w:rPr>
+              <w:t>hauwa.abdullahi@zuma9.example</w:t>
+            </w:r>
+          </w:p>
+        </w:tc>
+        <w:tc>
+          <w:tcPr>
+            <w:tcW w:type="dxa" w:w="1247"/>
+          </w:tcPr>
+          <w:p>
+            <w:r/>
+            <w:r>
+              <w:rPr>
+                <w:sz w:val="17"/>
+              </w:rPr>
+              <w:t>Abuja</w:t>
+            </w:r>
+          </w:p>
+        </w:tc>
+        <w:tc>
+          <w:tcPr>
+            <w:tcW w:type="dxa" w:w="680"/>
+          </w:tcPr>
+          <w:p>
+            <w:r/>
+            <w:r>
+              <w:rPr>
+                <w:sz w:val="17"/>
+              </w:rPr>
+              <w:t>23</w:t>
+            </w:r>
+          </w:p>
+        </w:tc>
+      </w:tr>
+    </w:tbl>
+    <w:p>
+      <w:pPr>
+        <w:spacing w:after="240" w:line="360" w:lineRule="auto"/>
+        <w:jc w:val="left"/>
+      </w:pPr>
+      <w:r>
+        <w:rPr>
+          <w:i/>
+          <w:sz w:val="20"/>
+        </w:rPr>
+        <w:t>Source: replicate 1, database run 5, 03_simulation/replicate1_orders.csv. All names and contact details are fictional.</w:t>
+      </w:r>
+    </w:p>
+    <w:p>
+      <w:pPr>
+        <w:keepNext/>
+        <w:spacing w:after="80" w:line="360" w:lineRule="auto"/>
+        <w:jc w:val="left"/>
+      </w:pPr>
+      <w:r>
+        <w:rPr>
+          <w:b/>
+          <w:i w:val="0"/>
+        </w:rPr>
+        <w:t>Table 4.12: Description of the replicate 1 dataset</w:t>
       </w:r>
     </w:p>
     <w:tbl>
@@ -8251,6 +9920,1608 @@
           <w:sz w:val="20"/>
         </w:rPr>
         <w:t>Source: replicate 1, database run 5, 07_analysis/metrics_final.json dataset.</w:t>
+      </w:r>
+    </w:p>
+    <w:p>
+      <w:pPr>
+        <w:jc w:val="center"/>
+      </w:pPr>
+      <w:r>
+        <w:drawing>
+          <wp:inline xmlns:a="http://schemas.openxmlformats.org/drawingml/2006/main" xmlns:pic="http://schemas.openxmlformats.org/drawingml/2006/picture">
+            <wp:extent cx="5760000" cy="2284800"/>
+            <wp:docPr id="1" name="Picture 1"/>
+            <wp:cNvGraphicFramePr>
+              <a:graphicFrameLocks noChangeAspect="1"/>
+            </wp:cNvGraphicFramePr>
+            <a:graphic>
+              <a:graphicData uri="http://schemas.openxmlformats.org/drawingml/2006/picture">
+                <pic:pic>
+                  <pic:nvPicPr>
+                    <pic:cNvPr id="0" name="fig4_1_regions.png"/>
+                    <pic:cNvPicPr/>
+                  </pic:nvPicPr>
+                  <pic:blipFill>
+                    <a:blip r:embed="rId10"/>
+                    <a:stretch>
+                      <a:fillRect/>
+                    </a:stretch>
+                  </pic:blipFill>
+                  <pic:spPr>
+                    <a:xfrm>
+                      <a:off x="0" y="0"/>
+                      <a:ext cx="5760000" cy="2284800"/>
+                    </a:xfrm>
+                    <a:prstGeom prst="rect"/>
+                  </pic:spPr>
+                </pic:pic>
+              </a:graphicData>
+            </a:graphic>
+          </wp:inline>
+        </w:drawing>
+      </w:r>
+    </w:p>
+    <w:p>
+      <w:pPr>
+        <w:spacing w:after="40" w:line="360" w:lineRule="auto"/>
+        <w:jc w:val="left"/>
+      </w:pPr>
+      <w:r>
+        <w:rPr>
+          <w:b/>
+          <w:i w:val="0"/>
+        </w:rPr>
+        <w:t>Figure 4.1: Simulated orders by delivery region, replicate 1</w:t>
+      </w:r>
+    </w:p>
+    <w:p>
+      <w:pPr>
+        <w:spacing w:after="240" w:line="360" w:lineRule="auto"/>
+        <w:jc w:val="left"/>
+      </w:pPr>
+      <w:r>
+        <w:rPr>
+          <w:i/>
+          <w:sz w:val="20"/>
+        </w:rPr>
+        <w:t>Source: 07_analysis/figures/fig4_1_regions_data.csv, from replicate 1, database run 5.</w:t>
+      </w:r>
+    </w:p>
+    <w:p>
+      <w:pPr>
+        <w:spacing w:after="160" w:line="360" w:lineRule="auto"/>
+        <w:jc w:val="both"/>
+      </w:pPr>
+      <w:r>
+        <w:rPr>
+          <w:i w:val="0"/>
+        </w:rPr>
+        <w:t>Table 4.13 shows one order of each kind from replicate 1, with the decision the system took and the first message it showed. Every order of all three replicates is listed in the accompanying workbook, Verity_Simulation_Data_Final.xlsx.</w:t>
+      </w:r>
+    </w:p>
+    <w:p>
+      <w:pPr>
+        <w:keepNext/>
+        <w:spacing w:after="80" w:line="360" w:lineRule="auto"/>
+        <w:jc w:val="left"/>
+      </w:pPr>
+      <w:r>
+        <w:rPr>
+          <w:b/>
+          <w:i w:val="0"/>
+        </w:rPr>
+        <w:t>Table 4.13: Sample of simulated orders and the decision taken, replicate 1</w:t>
+      </w:r>
+    </w:p>
+    <w:tbl>
+      <w:tblPr>
+        <w:tblStyle w:val="TableGrid"/>
+        <w:tblW w:type="auto" w:w="0"/>
+        <w:jc w:val="center"/>
+        <w:tblLook w:firstColumn="1" w:firstRow="1" w:lastColumn="0" w:lastRow="0" w:noHBand="0" w:noVBand="1" w:val="04A0"/>
+      </w:tblPr>
+      <w:tblGrid>
+        <w:gridCol w:w="1504"/>
+        <w:gridCol w:w="1504"/>
+        <w:gridCol w:w="1504"/>
+        <w:gridCol w:w="1504"/>
+        <w:gridCol w:w="1504"/>
+        <w:gridCol w:w="1504"/>
+      </w:tblGrid>
+      <w:tr>
+        <w:tc>
+          <w:tcPr>
+            <w:tcW w:type="dxa" w:w="964"/>
+            <w:shd w:val="clear" w:color="auto" w:fill="D9E2E1"/>
+          </w:tcPr>
+          <w:p>
+            <w:r/>
+            <w:r>
+              <w:rPr>
+                <w:b/>
+                <w:sz w:val="16"/>
+              </w:rPr>
+              <w:t>Order</w:t>
+            </w:r>
+          </w:p>
+        </w:tc>
+        <w:tc>
+          <w:tcPr>
+            <w:tcW w:type="dxa" w:w="1871"/>
+            <w:shd w:val="clear" w:color="auto" w:fill="D9E2E1"/>
+          </w:tcPr>
+          <w:p>
+            <w:r/>
+            <w:r>
+              <w:rPr>
+                <w:b/>
+                <w:sz w:val="16"/>
+              </w:rPr>
+              <w:t>Company</w:t>
+            </w:r>
+          </w:p>
+        </w:tc>
+        <w:tc>
+          <w:tcPr>
+            <w:tcW w:type="dxa" w:w="1361"/>
+            <w:shd w:val="clear" w:color="auto" w:fill="D9E2E1"/>
+          </w:tcPr>
+          <w:p>
+            <w:r/>
+            <w:r>
+              <w:rPr>
+                <w:b/>
+                <w:sz w:val="16"/>
+              </w:rPr>
+              <w:t>Total</w:t>
+            </w:r>
+          </w:p>
+        </w:tc>
+        <w:tc>
+          <w:tcPr>
+            <w:tcW w:type="dxa" w:w="1814"/>
+            <w:shd w:val="clear" w:color="auto" w:fill="D9E2E1"/>
+          </w:tcPr>
+          <w:p>
+            <w:r/>
+            <w:r>
+              <w:rPr>
+                <w:b/>
+                <w:sz w:val="16"/>
+              </w:rPr>
+              <w:t>Planted error</w:t>
+            </w:r>
+          </w:p>
+        </w:tc>
+        <w:tc>
+          <w:tcPr>
+            <w:tcW w:type="dxa" w:w="907"/>
+            <w:shd w:val="clear" w:color="auto" w:fill="D9E2E1"/>
+          </w:tcPr>
+          <w:p>
+            <w:r/>
+            <w:r>
+              <w:rPr>
+                <w:b/>
+                <w:sz w:val="16"/>
+              </w:rPr>
+              <w:t>Decision</w:t>
+            </w:r>
+          </w:p>
+        </w:tc>
+        <w:tc>
+          <w:tcPr>
+            <w:tcW w:type="dxa" w:w="2721"/>
+            <w:shd w:val="clear" w:color="auto" w:fill="D9E2E1"/>
+          </w:tcPr>
+          <w:p>
+            <w:r/>
+            <w:r>
+              <w:rPr>
+                <w:b/>
+                <w:sz w:val="16"/>
+              </w:rPr>
+              <w:t>First message shown</w:t>
+            </w:r>
+          </w:p>
+        </w:tc>
+      </w:tr>
+      <w:tr>
+        <w:tc>
+          <w:tcPr>
+            <w:tcW w:type="dxa" w:w="964"/>
+          </w:tcPr>
+          <w:p>
+            <w:r/>
+            <w:r>
+              <w:rPr>
+                <w:sz w:val="16"/>
+              </w:rPr>
+              <w:t>ORD-3788</w:t>
+            </w:r>
+          </w:p>
+        </w:tc>
+        <w:tc>
+          <w:tcPr>
+            <w:tcW w:type="dxa" w:w="1871"/>
+          </w:tcPr>
+          <w:p>
+            <w:r/>
+            <w:r>
+              <w:rPr>
+                <w:sz w:val="16"/>
+              </w:rPr>
+              <w:t>Bodija Interiors</w:t>
+            </w:r>
+          </w:p>
+        </w:tc>
+        <w:tc>
+          <w:tcPr>
+            <w:tcW w:type="dxa" w:w="1361"/>
+          </w:tcPr>
+          <w:p>
+            <w:r/>
+            <w:r>
+              <w:rPr>
+                <w:sz w:val="16"/>
+              </w:rPr>
+              <w:t>₦418,175.00</w:t>
+            </w:r>
+          </w:p>
+        </w:tc>
+        <w:tc>
+          <w:tcPr>
+            <w:tcW w:type="dxa" w:w="1814"/>
+          </w:tcPr>
+          <w:p>
+            <w:r/>
+            <w:r>
+              <w:rPr>
+                <w:sz w:val="16"/>
+              </w:rPr>
+              <w:t>Clean order (no error)</w:t>
+            </w:r>
+          </w:p>
+        </w:tc>
+        <w:tc>
+          <w:tcPr>
+            <w:tcW w:type="dxa" w:w="907"/>
+          </w:tcPr>
+          <w:p>
+            <w:r/>
+            <w:r>
+              <w:rPr>
+                <w:sz w:val="16"/>
+              </w:rPr>
+              <w:t>Passed</w:t>
+            </w:r>
+          </w:p>
+        </w:tc>
+        <w:tc>
+          <w:tcPr>
+            <w:tcW w:type="dxa" w:w="2721"/>
+          </w:tcPr>
+          <w:p>
+            <w:r/>
+            <w:r>
+              <w:rPr>
+                <w:sz w:val="16"/>
+              </w:rPr>
+              <w:t>none</w:t>
+            </w:r>
+          </w:p>
+        </w:tc>
+      </w:tr>
+      <w:tr>
+        <w:tc>
+          <w:tcPr>
+            <w:tcW w:type="dxa" w:w="964"/>
+          </w:tcPr>
+          <w:p>
+            <w:r/>
+            <w:r>
+              <w:rPr>
+                <w:sz w:val="16"/>
+              </w:rPr>
+              <w:t>ORD-3800</w:t>
+            </w:r>
+          </w:p>
+        </w:tc>
+        <w:tc>
+          <w:tcPr>
+            <w:tcW w:type="dxa" w:w="1871"/>
+          </w:tcPr>
+          <w:p>
+            <w:r/>
+            <w:r>
+              <w:rPr>
+                <w:sz w:val="16"/>
+              </w:rPr>
+              <w:t>Marina Point Facilities</w:t>
+            </w:r>
+          </w:p>
+        </w:tc>
+        <w:tc>
+          <w:tcPr>
+            <w:tcW w:type="dxa" w:w="1361"/>
+          </w:tcPr>
+          <w:p>
+            <w:r/>
+            <w:r>
+              <w:rPr>
+                <w:sz w:val="16"/>
+              </w:rPr>
+              <w:t>₦869,030.00</w:t>
+            </w:r>
+          </w:p>
+        </w:tc>
+        <w:tc>
+          <w:tcPr>
+            <w:tcW w:type="dxa" w:w="1814"/>
+          </w:tcPr>
+          <w:p>
+            <w:r/>
+            <w:r>
+              <w:rPr>
+                <w:sz w:val="16"/>
+              </w:rPr>
+              <w:t>SKU not in catalogue</w:t>
+            </w:r>
+          </w:p>
+        </w:tc>
+        <w:tc>
+          <w:tcPr>
+            <w:tcW w:type="dxa" w:w="907"/>
+          </w:tcPr>
+          <w:p>
+            <w:r/>
+            <w:r>
+              <w:rPr>
+                <w:sz w:val="16"/>
+              </w:rPr>
+              <w:t>Blocked</w:t>
+            </w:r>
+          </w:p>
+        </w:tc>
+        <w:tc>
+          <w:tcPr>
+            <w:tcW w:type="dxa" w:w="2721"/>
+          </w:tcPr>
+          <w:p>
+            <w:r/>
+            <w:r>
+              <w:rPr>
+                <w:sz w:val="16"/>
+              </w:rPr>
+              <w:t>Row 4: XX-680 - not in the catalogue</w:t>
+            </w:r>
+          </w:p>
+        </w:tc>
+      </w:tr>
+      <w:tr>
+        <w:tc>
+          <w:tcPr>
+            <w:tcW w:type="dxa" w:w="964"/>
+          </w:tcPr>
+          <w:p>
+            <w:r/>
+            <w:r>
+              <w:rPr>
+                <w:sz w:val="16"/>
+              </w:rPr>
+              <w:t>ORD-3784</w:t>
+            </w:r>
+          </w:p>
+        </w:tc>
+        <w:tc>
+          <w:tcPr>
+            <w:tcW w:type="dxa" w:w="1871"/>
+          </w:tcPr>
+          <w:p>
+            <w:r/>
+            <w:r>
+              <w:rPr>
+                <w:sz w:val="16"/>
+              </w:rPr>
+              <w:t>Marina Point Facilities</w:t>
+            </w:r>
+          </w:p>
+        </w:tc>
+        <w:tc>
+          <w:tcPr>
+            <w:tcW w:type="dxa" w:w="1361"/>
+          </w:tcPr>
+          <w:p>
+            <w:r/>
+            <w:r>
+              <w:rPr>
+                <w:sz w:val="16"/>
+              </w:rPr>
+              <w:t>₦1,656,575.00</w:t>
+            </w:r>
+          </w:p>
+        </w:tc>
+        <w:tc>
+          <w:tcPr>
+            <w:tcW w:type="dxa" w:w="1814"/>
+          </w:tcPr>
+          <w:p>
+            <w:r/>
+            <w:r>
+              <w:rPr>
+                <w:sz w:val="16"/>
+              </w:rPr>
+              <w:t>Discontinued product</w:t>
+            </w:r>
+          </w:p>
+        </w:tc>
+        <w:tc>
+          <w:tcPr>
+            <w:tcW w:type="dxa" w:w="907"/>
+          </w:tcPr>
+          <w:p>
+            <w:r/>
+            <w:r>
+              <w:rPr>
+                <w:sz w:val="16"/>
+              </w:rPr>
+              <w:t>Blocked</w:t>
+            </w:r>
+          </w:p>
+        </w:tc>
+        <w:tc>
+          <w:tcPr>
+            <w:tcW w:type="dxa" w:w="2721"/>
+          </w:tcPr>
+          <w:p>
+            <w:r/>
+            <w:r>
+              <w:rPr>
+                <w:sz w:val="16"/>
+              </w:rPr>
+              <w:t>SAND-T is no longer sold. Remove it.</w:t>
+            </w:r>
+          </w:p>
+        </w:tc>
+      </w:tr>
+      <w:tr>
+        <w:tc>
+          <w:tcPr>
+            <w:tcW w:type="dxa" w:w="964"/>
+          </w:tcPr>
+          <w:p>
+            <w:r/>
+            <w:r>
+              <w:rPr>
+                <w:sz w:val="16"/>
+              </w:rPr>
+              <w:t>ORD-3782</w:t>
+            </w:r>
+          </w:p>
+        </w:tc>
+        <w:tc>
+          <w:tcPr>
+            <w:tcW w:type="dxa" w:w="1871"/>
+          </w:tcPr>
+          <w:p>
+            <w:r/>
+            <w:r>
+              <w:rPr>
+                <w:sz w:val="16"/>
+              </w:rPr>
+              <w:t>Bodija Interiors</w:t>
+            </w:r>
+          </w:p>
+        </w:tc>
+        <w:tc>
+          <w:tcPr>
+            <w:tcW w:type="dxa" w:w="1361"/>
+          </w:tcPr>
+          <w:p>
+            <w:r/>
+            <w:r>
+              <w:rPr>
+                <w:sz w:val="16"/>
+              </w:rPr>
+              <w:t>₦559,000.00</w:t>
+            </w:r>
+          </w:p>
+        </w:tc>
+        <w:tc>
+          <w:tcPr>
+            <w:tcW w:type="dxa" w:w="1814"/>
+          </w:tcPr>
+          <w:p>
+            <w:r/>
+            <w:r>
+              <w:rPr>
+                <w:sz w:val="16"/>
+              </w:rPr>
+              <w:t>Missing delivery address</w:t>
+            </w:r>
+          </w:p>
+        </w:tc>
+        <w:tc>
+          <w:tcPr>
+            <w:tcW w:type="dxa" w:w="907"/>
+          </w:tcPr>
+          <w:p>
+            <w:r/>
+            <w:r>
+              <w:rPr>
+                <w:sz w:val="16"/>
+              </w:rPr>
+              <w:t>Blocked</w:t>
+            </w:r>
+          </w:p>
+        </w:tc>
+        <w:tc>
+          <w:tcPr>
+            <w:tcW w:type="dxa" w:w="2721"/>
+          </w:tcPr>
+          <w:p>
+            <w:r/>
+            <w:r>
+              <w:rPr>
+                <w:sz w:val="16"/>
+              </w:rPr>
+              <w:t>Choose a delivery address.</w:t>
+            </w:r>
+          </w:p>
+        </w:tc>
+      </w:tr>
+      <w:tr>
+        <w:tc>
+          <w:tcPr>
+            <w:tcW w:type="dxa" w:w="964"/>
+          </w:tcPr>
+          <w:p>
+            <w:r/>
+            <w:r>
+              <w:rPr>
+                <w:sz w:val="16"/>
+              </w:rPr>
+              <w:t>ORD-3783</w:t>
+            </w:r>
+          </w:p>
+        </w:tc>
+        <w:tc>
+          <w:tcPr>
+            <w:tcW w:type="dxa" w:w="1871"/>
+          </w:tcPr>
+          <w:p>
+            <w:r/>
+            <w:r>
+              <w:rPr>
+                <w:sz w:val="16"/>
+              </w:rPr>
+              <w:t>Gwarinpa Homes Ltd</w:t>
+            </w:r>
+          </w:p>
+        </w:tc>
+        <w:tc>
+          <w:tcPr>
+            <w:tcW w:type="dxa" w:w="1361"/>
+          </w:tcPr>
+          <w:p>
+            <w:r/>
+            <w:r>
+              <w:rPr>
+                <w:sz w:val="16"/>
+              </w:rPr>
+              <w:t>₦1,078,225.00</w:t>
+            </w:r>
+          </w:p>
+        </w:tc>
+        <w:tc>
+          <w:tcPr>
+            <w:tcW w:type="dxa" w:w="1814"/>
+          </w:tcPr>
+          <w:p>
+            <w:r/>
+            <w:r>
+              <w:rPr>
+                <w:sz w:val="16"/>
+              </w:rPr>
+              <w:t>Missing delivery date</w:t>
+            </w:r>
+          </w:p>
+        </w:tc>
+        <w:tc>
+          <w:tcPr>
+            <w:tcW w:type="dxa" w:w="907"/>
+          </w:tcPr>
+          <w:p>
+            <w:r/>
+            <w:r>
+              <w:rPr>
+                <w:sz w:val="16"/>
+              </w:rPr>
+              <w:t>Blocked</w:t>
+            </w:r>
+          </w:p>
+        </w:tc>
+        <w:tc>
+          <w:tcPr>
+            <w:tcW w:type="dxa" w:w="2721"/>
+          </w:tcPr>
+          <w:p>
+            <w:r/>
+            <w:r>
+              <w:rPr>
+                <w:sz w:val="16"/>
+              </w:rPr>
+              <w:t>Choose a delivery date.</w:t>
+            </w:r>
+          </w:p>
+        </w:tc>
+      </w:tr>
+      <w:tr>
+        <w:tc>
+          <w:tcPr>
+            <w:tcW w:type="dxa" w:w="964"/>
+          </w:tcPr>
+          <w:p>
+            <w:r/>
+            <w:r>
+              <w:rPr>
+                <w:sz w:val="16"/>
+              </w:rPr>
+              <w:t>ORD-3789</w:t>
+            </w:r>
+          </w:p>
+        </w:tc>
+        <w:tc>
+          <w:tcPr>
+            <w:tcW w:type="dxa" w:w="1871"/>
+          </w:tcPr>
+          <w:p>
+            <w:r/>
+            <w:r>
+              <w:rPr>
+                <w:sz w:val="16"/>
+              </w:rPr>
+              <w:t>Marina Point Facilities</w:t>
+            </w:r>
+          </w:p>
+        </w:tc>
+        <w:tc>
+          <w:tcPr>
+            <w:tcW w:type="dxa" w:w="1361"/>
+          </w:tcPr>
+          <w:p>
+            <w:r/>
+            <w:r>
+              <w:rPr>
+                <w:sz w:val="16"/>
+              </w:rPr>
+              <w:t>₦522,665.00</w:t>
+            </w:r>
+          </w:p>
+        </w:tc>
+        <w:tc>
+          <w:tcPr>
+            <w:tcW w:type="dxa" w:w="1814"/>
+          </w:tcPr>
+          <w:p>
+            <w:r/>
+            <w:r>
+              <w:rPr>
+                <w:sz w:val="16"/>
+              </w:rPr>
+              <w:t>Delivery date in the past</w:t>
+            </w:r>
+          </w:p>
+        </w:tc>
+        <w:tc>
+          <w:tcPr>
+            <w:tcW w:type="dxa" w:w="907"/>
+          </w:tcPr>
+          <w:p>
+            <w:r/>
+            <w:r>
+              <w:rPr>
+                <w:sz w:val="16"/>
+              </w:rPr>
+              <w:t>Blocked</w:t>
+            </w:r>
+          </w:p>
+        </w:tc>
+        <w:tc>
+          <w:tcPr>
+            <w:tcW w:type="dxa" w:w="2721"/>
+          </w:tcPr>
+          <w:p>
+            <w:r/>
+            <w:r>
+              <w:rPr>
+                <w:sz w:val="16"/>
+              </w:rPr>
+              <w:t>The delivery date is in the past.</w:t>
+            </w:r>
+          </w:p>
+        </w:tc>
+      </w:tr>
+      <w:tr>
+        <w:tc>
+          <w:tcPr>
+            <w:tcW w:type="dxa" w:w="964"/>
+          </w:tcPr>
+          <w:p>
+            <w:r/>
+            <w:r>
+              <w:rPr>
+                <w:sz w:val="16"/>
+              </w:rPr>
+              <w:t>ORD-3805</w:t>
+            </w:r>
+          </w:p>
+        </w:tc>
+        <w:tc>
+          <w:tcPr>
+            <w:tcW w:type="dxa" w:w="1871"/>
+          </w:tcPr>
+          <w:p>
+            <w:r/>
+            <w:r>
+              <w:rPr>
+                <w:sz w:val="16"/>
+              </w:rPr>
+              <w:t>Magodo Residential Ltd</w:t>
+            </w:r>
+          </w:p>
+        </w:tc>
+        <w:tc>
+          <w:tcPr>
+            <w:tcW w:type="dxa" w:w="1361"/>
+          </w:tcPr>
+          <w:p>
+            <w:r/>
+            <w:r>
+              <w:rPr>
+                <w:sz w:val="16"/>
+              </w:rPr>
+              <w:t>₦621,995.00</w:t>
+            </w:r>
+          </w:p>
+        </w:tc>
+        <w:tc>
+          <w:tcPr>
+            <w:tcW w:type="dxa" w:w="1814"/>
+          </w:tcPr>
+          <w:p>
+            <w:r/>
+            <w:r>
+              <w:rPr>
+                <w:sz w:val="16"/>
+              </w:rPr>
+              <w:t>Quantity below minimum</w:t>
+            </w:r>
+          </w:p>
+        </w:tc>
+        <w:tc>
+          <w:tcPr>
+            <w:tcW w:type="dxa" w:w="907"/>
+          </w:tcPr>
+          <w:p>
+            <w:r/>
+            <w:r>
+              <w:rPr>
+                <w:sz w:val="16"/>
+              </w:rPr>
+              <w:t>Blocked</w:t>
+            </w:r>
+          </w:p>
+        </w:tc>
+        <w:tc>
+          <w:tcPr>
+            <w:tcW w:type="dxa" w:w="2721"/>
+          </w:tcPr>
+          <w:p>
+            <w:r/>
+            <w:r>
+              <w:rPr>
+                <w:sz w:val="16"/>
+              </w:rPr>
+              <w:t>PVC pipe, 2 inch, 6 m: quantity must be between 2 and 500.</w:t>
+            </w:r>
+          </w:p>
+        </w:tc>
+      </w:tr>
+      <w:tr>
+        <w:tc>
+          <w:tcPr>
+            <w:tcW w:type="dxa" w:w="964"/>
+          </w:tcPr>
+          <w:p>
+            <w:r/>
+            <w:r>
+              <w:rPr>
+                <w:sz w:val="16"/>
+              </w:rPr>
+              <w:t>ORD-3793</w:t>
+            </w:r>
+          </w:p>
+        </w:tc>
+        <w:tc>
+          <w:tcPr>
+            <w:tcW w:type="dxa" w:w="1871"/>
+          </w:tcPr>
+          <w:p>
+            <w:r/>
+            <w:r>
+              <w:rPr>
+                <w:sz w:val="16"/>
+              </w:rPr>
+              <w:t>Lekki Coastal Developers</w:t>
+            </w:r>
+          </w:p>
+        </w:tc>
+        <w:tc>
+          <w:tcPr>
+            <w:tcW w:type="dxa" w:w="1361"/>
+          </w:tcPr>
+          <w:p>
+            <w:r/>
+            <w:r>
+              <w:rPr>
+                <w:sz w:val="16"/>
+              </w:rPr>
+              <w:t>₦15,103,642.50</w:t>
+            </w:r>
+          </w:p>
+        </w:tc>
+        <w:tc>
+          <w:tcPr>
+            <w:tcW w:type="dxa" w:w="1814"/>
+          </w:tcPr>
+          <w:p>
+            <w:r/>
+            <w:r>
+              <w:rPr>
+                <w:sz w:val="16"/>
+              </w:rPr>
+              <w:t>Quantity above maximum</w:t>
+            </w:r>
+          </w:p>
+        </w:tc>
+        <w:tc>
+          <w:tcPr>
+            <w:tcW w:type="dxa" w:w="907"/>
+          </w:tcPr>
+          <w:p>
+            <w:r/>
+            <w:r>
+              <w:rPr>
+                <w:sz w:val="16"/>
+              </w:rPr>
+              <w:t>Blocked</w:t>
+            </w:r>
+          </w:p>
+        </w:tc>
+        <w:tc>
+          <w:tcPr>
+            <w:tcW w:type="dxa" w:w="2721"/>
+          </w:tcPr>
+          <w:p>
+            <w:r/>
+            <w:r>
+              <w:rPr>
+                <w:sz w:val="16"/>
+              </w:rPr>
+              <w:t>Aluminium roofing sheet, 0.55 mm: quantity must be between 10 and 1000.</w:t>
+            </w:r>
+          </w:p>
+        </w:tc>
+      </w:tr>
+      <w:tr>
+        <w:tc>
+          <w:tcPr>
+            <w:tcW w:type="dxa" w:w="964"/>
+          </w:tcPr>
+          <w:p>
+            <w:r/>
+            <w:r>
+              <w:rPr>
+                <w:sz w:val="16"/>
+              </w:rPr>
+              <w:t>ORD-3785</w:t>
+            </w:r>
+          </w:p>
+        </w:tc>
+        <w:tc>
+          <w:tcPr>
+            <w:tcW w:type="dxa" w:w="1871"/>
+          </w:tcPr>
+          <w:p>
+            <w:r/>
+            <w:r>
+              <w:rPr>
+                <w:sz w:val="16"/>
+              </w:rPr>
+              <w:t>Victoria Island Fit-Out Ltd</w:t>
+            </w:r>
+          </w:p>
+        </w:tc>
+        <w:tc>
+          <w:tcPr>
+            <w:tcW w:type="dxa" w:w="1361"/>
+          </w:tcPr>
+          <w:p>
+            <w:r/>
+            <w:r>
+              <w:rPr>
+                <w:sz w:val="16"/>
+              </w:rPr>
+              <w:t>₦732,075.00</w:t>
+            </w:r>
+          </w:p>
+        </w:tc>
+        <w:tc>
+          <w:tcPr>
+            <w:tcW w:type="dxa" w:w="1814"/>
+          </w:tcPr>
+          <w:p>
+            <w:r/>
+            <w:r>
+              <w:rPr>
+                <w:sz w:val="16"/>
+              </w:rPr>
+              <w:t>Fractional quantity</w:t>
+            </w:r>
+          </w:p>
+        </w:tc>
+        <w:tc>
+          <w:tcPr>
+            <w:tcW w:type="dxa" w:w="907"/>
+          </w:tcPr>
+          <w:p>
+            <w:r/>
+            <w:r>
+              <w:rPr>
+                <w:sz w:val="16"/>
+              </w:rPr>
+              <w:t>Blocked</w:t>
+            </w:r>
+          </w:p>
+        </w:tc>
+        <w:tc>
+          <w:tcPr>
+            <w:tcW w:type="dxa" w:w="2721"/>
+          </w:tcPr>
+          <w:p>
+            <w:r/>
+            <w:r>
+              <w:rPr>
+                <w:sz w:val="16"/>
+              </w:rPr>
+              <w:t>PVC-4 - Quantity must be a whole number</w:t>
+            </w:r>
+          </w:p>
+        </w:tc>
+      </w:tr>
+      <w:tr>
+        <w:tc>
+          <w:tcPr>
+            <w:tcW w:type="dxa" w:w="964"/>
+          </w:tcPr>
+          <w:p>
+            <w:r/>
+            <w:r>
+              <w:rPr>
+                <w:sz w:val="16"/>
+              </w:rPr>
+              <w:t>ORD-3786</w:t>
+            </w:r>
+          </w:p>
+        </w:tc>
+        <w:tc>
+          <w:tcPr>
+            <w:tcW w:type="dxa" w:w="1871"/>
+          </w:tcPr>
+          <w:p>
+            <w:r/>
+            <w:r>
+              <w:rPr>
+                <w:sz w:val="16"/>
+              </w:rPr>
+              <w:t>Bodija Interiors</w:t>
+            </w:r>
+          </w:p>
+        </w:tc>
+        <w:tc>
+          <w:tcPr>
+            <w:tcW w:type="dxa" w:w="1361"/>
+          </w:tcPr>
+          <w:p>
+            <w:r/>
+            <w:r>
+              <w:rPr>
+                <w:sz w:val="16"/>
+              </w:rPr>
+              <w:t>₦6,077,405.00</w:t>
+            </w:r>
+          </w:p>
+        </w:tc>
+        <w:tc>
+          <w:tcPr>
+            <w:tcW w:type="dxa" w:w="1814"/>
+          </w:tcPr>
+          <w:p>
+            <w:r/>
+            <w:r>
+              <w:rPr>
+                <w:sz w:val="16"/>
+              </w:rPr>
+              <w:t>Quantity above available stock</w:t>
+            </w:r>
+          </w:p>
+        </w:tc>
+        <w:tc>
+          <w:tcPr>
+            <w:tcW w:type="dxa" w:w="907"/>
+          </w:tcPr>
+          <w:p>
+            <w:r/>
+            <w:r>
+              <w:rPr>
+                <w:sz w:val="16"/>
+              </w:rPr>
+              <w:t>Blocked</w:t>
+            </w:r>
+          </w:p>
+        </w:tc>
+        <w:tc>
+          <w:tcPr>
+            <w:tcW w:type="dxa" w:w="2721"/>
+          </w:tcPr>
+          <w:p>
+            <w:r/>
+            <w:r>
+              <w:rPr>
+                <w:sz w:val="16"/>
+              </w:rPr>
+              <w:t>Iron rod, 12 mm: not enough stock for this quantity. Reduce it.</w:t>
+            </w:r>
+          </w:p>
+        </w:tc>
+      </w:tr>
+      <w:tr>
+        <w:tc>
+          <w:tcPr>
+            <w:tcW w:type="dxa" w:w="964"/>
+          </w:tcPr>
+          <w:p>
+            <w:r/>
+            <w:r>
+              <w:rPr>
+                <w:sz w:val="16"/>
+              </w:rPr>
+              <w:t>ORD-3838</w:t>
+            </w:r>
+          </w:p>
+        </w:tc>
+        <w:tc>
+          <w:tcPr>
+            <w:tcW w:type="dxa" w:w="1871"/>
+          </w:tcPr>
+          <w:p>
+            <w:r/>
+            <w:r>
+              <w:rPr>
+                <w:sz w:val="16"/>
+              </w:rPr>
+              <w:t>Victoria Island Fit-Out Ltd</w:t>
+            </w:r>
+          </w:p>
+        </w:tc>
+        <w:tc>
+          <w:tcPr>
+            <w:tcW w:type="dxa" w:w="1361"/>
+          </w:tcPr>
+          <w:p>
+            <w:r/>
+            <w:r>
+              <w:rPr>
+                <w:sz w:val="16"/>
+              </w:rPr>
+              <w:t>₦764,970.00</w:t>
+            </w:r>
+          </w:p>
+        </w:tc>
+        <w:tc>
+          <w:tcPr>
+            <w:tcW w:type="dxa" w:w="1814"/>
+          </w:tcPr>
+          <w:p>
+            <w:r/>
+            <w:r>
+              <w:rPr>
+                <w:sz w:val="16"/>
+              </w:rPr>
+              <w:t>Duplicate order</w:t>
+            </w:r>
+          </w:p>
+        </w:tc>
+        <w:tc>
+          <w:tcPr>
+            <w:tcW w:type="dxa" w:w="907"/>
+          </w:tcPr>
+          <w:p>
+            <w:r/>
+            <w:r>
+              <w:rPr>
+                <w:sz w:val="16"/>
+              </w:rPr>
+              <w:t>Warned</w:t>
+            </w:r>
+          </w:p>
+        </w:tc>
+        <w:tc>
+          <w:tcPr>
+            <w:tcW w:type="dxa" w:w="2721"/>
+          </w:tcPr>
+          <w:p>
+            <w:r/>
+            <w:r>
+              <w:rPr>
+                <w:sz w:val="16"/>
+              </w:rPr>
+              <w:t>Iron rod, 12 mm: 97 is far above this customer's usual 29.</w:t>
+            </w:r>
+          </w:p>
+        </w:tc>
+      </w:tr>
+      <w:tr>
+        <w:tc>
+          <w:tcPr>
+            <w:tcW w:type="dxa" w:w="964"/>
+          </w:tcPr>
+          <w:p>
+            <w:r/>
+            <w:r>
+              <w:rPr>
+                <w:sz w:val="16"/>
+              </w:rPr>
+              <w:t>ORD-3798</w:t>
+            </w:r>
+          </w:p>
+        </w:tc>
+        <w:tc>
+          <w:tcPr>
+            <w:tcW w:type="dxa" w:w="1871"/>
+          </w:tcPr>
+          <w:p>
+            <w:r/>
+            <w:r>
+              <w:rPr>
+                <w:sz w:val="16"/>
+              </w:rPr>
+              <w:t>Gwarinpa Homes Ltd</w:t>
+            </w:r>
+          </w:p>
+        </w:tc>
+        <w:tc>
+          <w:tcPr>
+            <w:tcW w:type="dxa" w:w="1361"/>
+          </w:tcPr>
+          <w:p>
+            <w:r/>
+            <w:r>
+              <w:rPr>
+                <w:sz w:val="16"/>
+              </w:rPr>
+              <w:t>₦24,940.00</w:t>
+            </w:r>
+          </w:p>
+        </w:tc>
+        <w:tc>
+          <w:tcPr>
+            <w:tcW w:type="dxa" w:w="1814"/>
+          </w:tcPr>
+          <w:p>
+            <w:r/>
+            <w:r>
+              <w:rPr>
+                <w:sz w:val="16"/>
+              </w:rPr>
+              <w:t>Customer account not active</w:t>
+            </w:r>
+          </w:p>
+        </w:tc>
+        <w:tc>
+          <w:tcPr>
+            <w:tcW w:type="dxa" w:w="907"/>
+          </w:tcPr>
+          <w:p>
+            <w:r/>
+            <w:r>
+              <w:rPr>
+                <w:sz w:val="16"/>
+              </w:rPr>
+              <w:t>Blocked</w:t>
+            </w:r>
+          </w:p>
+        </w:tc>
+        <w:tc>
+          <w:tcPr>
+            <w:tcW w:type="dxa" w:w="2721"/>
+          </w:tcPr>
+          <w:p>
+            <w:r/>
+            <w:r>
+              <w:rPr>
+                <w:sz w:val="16"/>
+              </w:rPr>
+              <w:t>The customer account is not active.</w:t>
+            </w:r>
+          </w:p>
+        </w:tc>
+      </w:tr>
+      <w:tr>
+        <w:tc>
+          <w:tcPr>
+            <w:tcW w:type="dxa" w:w="964"/>
+          </w:tcPr>
+          <w:p>
+            <w:r/>
+            <w:r>
+              <w:rPr>
+                <w:sz w:val="16"/>
+              </w:rPr>
+              <w:t>ORD-3802</w:t>
+            </w:r>
+          </w:p>
+        </w:tc>
+        <w:tc>
+          <w:tcPr>
+            <w:tcW w:type="dxa" w:w="1871"/>
+          </w:tcPr>
+          <w:p>
+            <w:r/>
+            <w:r>
+              <w:rPr>
+                <w:sz w:val="16"/>
+              </w:rPr>
+              <w:t>Oyo Central Builders</w:t>
+            </w:r>
+          </w:p>
+        </w:tc>
+        <w:tc>
+          <w:tcPr>
+            <w:tcW w:type="dxa" w:w="1361"/>
+          </w:tcPr>
+          <w:p>
+            <w:r/>
+            <w:r>
+              <w:rPr>
+                <w:sz w:val="16"/>
+              </w:rPr>
+              <w:t>₦234,350.00</w:t>
+            </w:r>
+          </w:p>
+        </w:tc>
+        <w:tc>
+          <w:tcPr>
+            <w:tcW w:type="dxa" w:w="1814"/>
+          </w:tcPr>
+          <w:p>
+            <w:r/>
+            <w:r>
+              <w:rPr>
+                <w:sz w:val="16"/>
+              </w:rPr>
+              <w:t>Price changed after the order was saved</w:t>
+            </w:r>
+          </w:p>
+        </w:tc>
+        <w:tc>
+          <w:tcPr>
+            <w:tcW w:type="dxa" w:w="907"/>
+          </w:tcPr>
+          <w:p>
+            <w:r/>
+            <w:r>
+              <w:rPr>
+                <w:sz w:val="16"/>
+              </w:rPr>
+              <w:t>Blocked</w:t>
+            </w:r>
+          </w:p>
+        </w:tc>
+        <w:tc>
+          <w:tcPr>
+            <w:tcW w:type="dxa" w:w="2721"/>
+          </w:tcPr>
+          <w:p>
+            <w:r/>
+            <w:r>
+              <w:rPr>
+                <w:sz w:val="16"/>
+              </w:rPr>
+              <w:t>Cement, 50 kg bag: price changed from 9500.00 to 10000.00. Save the order again to update it.</w:t>
+            </w:r>
+          </w:p>
+        </w:tc>
+      </w:tr>
+      <w:tr>
+        <w:tc>
+          <w:tcPr>
+            <w:tcW w:type="dxa" w:w="964"/>
+          </w:tcPr>
+          <w:p>
+            <w:r/>
+            <w:r>
+              <w:rPr>
+                <w:sz w:val="16"/>
+              </w:rPr>
+              <w:t>ORD-3806</w:t>
+            </w:r>
+          </w:p>
+        </w:tc>
+        <w:tc>
+          <w:tcPr>
+            <w:tcW w:type="dxa" w:w="1871"/>
+          </w:tcPr>
+          <w:p>
+            <w:r/>
+            <w:r>
+              <w:rPr>
+                <w:sz w:val="16"/>
+              </w:rPr>
+              <w:t>Gwarinpa Homes Ltd</w:t>
+            </w:r>
+          </w:p>
+        </w:tc>
+        <w:tc>
+          <w:tcPr>
+            <w:tcW w:type="dxa" w:w="1361"/>
+          </w:tcPr>
+          <w:p>
+            <w:r/>
+            <w:r>
+              <w:rPr>
+                <w:sz w:val="16"/>
+              </w:rPr>
+              <w:t>₦1,030,925.00</w:t>
+            </w:r>
+          </w:p>
+        </w:tc>
+        <w:tc>
+          <w:tcPr>
+            <w:tcW w:type="dxa" w:w="1814"/>
+          </w:tcPr>
+          <w:p>
+            <w:r/>
+            <w:r>
+              <w:rPr>
+                <w:sz w:val="16"/>
+              </w:rPr>
+              <w:t>Wrong but valid product</w:t>
+            </w:r>
+          </w:p>
+        </w:tc>
+        <w:tc>
+          <w:tcPr>
+            <w:tcW w:type="dxa" w:w="907"/>
+          </w:tcPr>
+          <w:p>
+            <w:r/>
+            <w:r>
+              <w:rPr>
+                <w:sz w:val="16"/>
+              </w:rPr>
+              <w:t>Passed</w:t>
+            </w:r>
+          </w:p>
+        </w:tc>
+        <w:tc>
+          <w:tcPr>
+            <w:tcW w:type="dxa" w:w="2721"/>
+          </w:tcPr>
+          <w:p>
+            <w:r/>
+            <w:r>
+              <w:rPr>
+                <w:sz w:val="16"/>
+              </w:rPr>
+              <w:t>none</w:t>
+            </w:r>
+          </w:p>
+        </w:tc>
+      </w:tr>
+      <w:tr>
+        <w:tc>
+          <w:tcPr>
+            <w:tcW w:type="dxa" w:w="964"/>
+          </w:tcPr>
+          <w:p>
+            <w:r/>
+            <w:r>
+              <w:rPr>
+                <w:sz w:val="16"/>
+              </w:rPr>
+              <w:t>ORD-3792</w:t>
+            </w:r>
+          </w:p>
+        </w:tc>
+        <w:tc>
+          <w:tcPr>
+            <w:tcW w:type="dxa" w:w="1871"/>
+          </w:tcPr>
+          <w:p>
+            <w:r/>
+            <w:r>
+              <w:rPr>
+                <w:sz w:val="16"/>
+              </w:rPr>
+              <w:t>Ajah Sunrise Housing Co-op</w:t>
+            </w:r>
+          </w:p>
+        </w:tc>
+        <w:tc>
+          <w:tcPr>
+            <w:tcW w:type="dxa" w:w="1361"/>
+          </w:tcPr>
+          <w:p>
+            <w:r/>
+            <w:r>
+              <w:rPr>
+                <w:sz w:val="16"/>
+              </w:rPr>
+              <w:t>₦3,445,805.00</w:t>
+            </w:r>
+          </w:p>
+        </w:tc>
+        <w:tc>
+          <w:tcPr>
+            <w:tcW w:type="dxa" w:w="1814"/>
+          </w:tcPr>
+          <w:p>
+            <w:r/>
+            <w:r>
+              <w:rPr>
+                <w:sz w:val="16"/>
+              </w:rPr>
+              <w:t>Plausible quantity typing slip</w:t>
+            </w:r>
+          </w:p>
+        </w:tc>
+        <w:tc>
+          <w:tcPr>
+            <w:tcW w:type="dxa" w:w="907"/>
+          </w:tcPr>
+          <w:p>
+            <w:r/>
+            <w:r>
+              <w:rPr>
+                <w:sz w:val="16"/>
+              </w:rPr>
+              <w:t>Warned</w:t>
+            </w:r>
+          </w:p>
+        </w:tc>
+        <w:tc>
+          <w:tcPr>
+            <w:tcW w:type="dxa" w:w="2721"/>
+          </w:tcPr>
+          <w:p>
+            <w:r/>
+            <w:r>
+              <w:rPr>
+                <w:sz w:val="16"/>
+              </w:rPr>
+              <w:t>Cement, 50 kg bag: 190 is far above this customer's usual 23.</w:t>
+            </w:r>
+          </w:p>
+        </w:tc>
+      </w:tr>
+      <w:tr>
+        <w:tc>
+          <w:tcPr>
+            <w:tcW w:type="dxa" w:w="964"/>
+          </w:tcPr>
+          <w:p>
+            <w:r/>
+            <w:r>
+              <w:rPr>
+                <w:sz w:val="16"/>
+              </w:rPr>
+              <w:t>ORD-3812</w:t>
+            </w:r>
+          </w:p>
+        </w:tc>
+        <w:tc>
+          <w:tcPr>
+            <w:tcW w:type="dxa" w:w="1871"/>
+          </w:tcPr>
+          <w:p>
+            <w:r/>
+            <w:r>
+              <w:rPr>
+                <w:sz w:val="16"/>
+              </w:rPr>
+              <w:t>Ola-Ade Hardware &amp; Tiles</w:t>
+            </w:r>
+          </w:p>
+        </w:tc>
+        <w:tc>
+          <w:tcPr>
+            <w:tcW w:type="dxa" w:w="1361"/>
+          </w:tcPr>
+          <w:p>
+            <w:r/>
+            <w:r>
+              <w:rPr>
+                <w:sz w:val="16"/>
+              </w:rPr>
+              <w:t>₦859,677.50</w:t>
+            </w:r>
+          </w:p>
+        </w:tc>
+        <w:tc>
+          <w:tcPr>
+            <w:tcW w:type="dxa" w:w="1814"/>
+          </w:tcPr>
+          <w:p>
+            <w:r/>
+            <w:r>
+              <w:rPr>
+                <w:sz w:val="16"/>
+              </w:rPr>
+              <w:t>Wrong saved address</w:t>
+            </w:r>
+          </w:p>
+        </w:tc>
+        <w:tc>
+          <w:tcPr>
+            <w:tcW w:type="dxa" w:w="907"/>
+          </w:tcPr>
+          <w:p>
+            <w:r/>
+            <w:r>
+              <w:rPr>
+                <w:sz w:val="16"/>
+              </w:rPr>
+              <w:t>Passed</w:t>
+            </w:r>
+          </w:p>
+        </w:tc>
+        <w:tc>
+          <w:tcPr>
+            <w:tcW w:type="dxa" w:w="2721"/>
+          </w:tcPr>
+          <w:p>
+            <w:r/>
+            <w:r>
+              <w:rPr>
+                <w:sz w:val="16"/>
+              </w:rPr>
+              <w:t>none</w:t>
+            </w:r>
+          </w:p>
+        </w:tc>
+      </w:tr>
+    </w:tbl>
+    <w:p>
+      <w:pPr>
+        <w:spacing w:after="240" w:line="360" w:lineRule="auto"/>
+        <w:jc w:val="left"/>
+      </w:pPr>
+      <w:r>
+        <w:rPr>
+          <w:i/>
+          <w:sz w:val="20"/>
+        </w:rPr>
+        <w:t>Source: replicate 1, database run 5, first order of each kind in 03_simulation/replicate1_orders.csv.</w:t>
+      </w:r>
+    </w:p>
+    <w:p>
+      <w:pPr>
+        <w:pStyle w:val="Heading3"/>
+      </w:pPr>
+      <w:r>
+        <w:t>4.4.4 Relation to the first run</w:t>
       </w:r>
     </w:p>
     <w:p>
@@ -8275,6 +11546,14 @@
     </w:p>
     <w:p>
       <w:pPr>
+        <w:pStyle w:val="Heading3"/>
+      </w:pPr>
+      <w:r>
+        <w:t>4.5.1 Overall outcomes</w:t>
+      </w:r>
+    </w:p>
+    <w:p>
+      <w:pPr>
         <w:spacing w:after="160" w:line="360" w:lineRule="auto"/>
         <w:jc w:val="both"/>
       </w:pPr>
@@ -8282,7 +11561,7 @@
         <w:rPr>
           <w:i w:val="0"/>
         </w:rPr>
-        <w:t>Figure 4.1 shows what happened to each group of orders in replicate 1. Of the 200 clean orders, 172 passed and 28 were warned. All 240 orders with a rule-targeted error were stopped, 220 by a blocking rule and 20 by the duplicate warning. Of the 60 orders with an error that no rule targets, 24 were warned and 36 passed. After submission 220 orders were in validation failed and 258 were waiting for approval. The other 22 were held as drafts until the customer confirmed a possible repeat.</w:t>
+        <w:t>Figure 4.2 shows what happened to each group of orders in replicate 1. Of the 200 clean orders, 172 passed and 28 were warned. All 240 orders with a rule-targeted error were stopped, 220 by a blocking rule and 20 by the duplicate warning. Of the 60 orders with an error that no rule targets, 24 were warned and 36 passed. After submission 220 orders were in validation failed and 258 were waiting for approval. The other 22 were held as drafts until the customer confirmed a possible repeat.</w:t>
       </w:r>
     </w:p>
     <w:p>
@@ -8293,7 +11572,7 @@
         <w:drawing>
           <wp:inline xmlns:a="http://schemas.openxmlformats.org/drawingml/2006/main" xmlns:pic="http://schemas.openxmlformats.org/drawingml/2006/picture">
             <wp:extent cx="5760000" cy="1958400"/>
-            <wp:docPr id="1" name="Picture 1"/>
+            <wp:docPr id="2" name="Picture 2"/>
             <wp:cNvGraphicFramePr>
               <a:graphicFrameLocks noChangeAspect="1"/>
             </wp:cNvGraphicFramePr>
@@ -8301,11 +11580,11 @@
               <a:graphicData uri="http://schemas.openxmlformats.org/drawingml/2006/picture">
                 <pic:pic>
                   <pic:nvPicPr>
-                    <pic:cNvPr id="0" name="fig4_1_outcomes.png"/>
+                    <pic:cNvPr id="0" name="fig4_2_outcomes.png"/>
                     <pic:cNvPicPr/>
                   </pic:nvPicPr>
                   <pic:blipFill>
-                    <a:blip r:embed="rId9"/>
+                    <a:blip r:embed="rId11"/>
                     <a:stretch>
                       <a:fillRect/>
                     </a:stretch>
@@ -8334,7 +11613,7 @@
           <w:b/>
           <w:i w:val="0"/>
         </w:rPr>
-        <w:t>Figure 4.1: Outcome of each group of orders in replicate 1</w:t>
+        <w:t>Figure 4.2: Outcome of each group of orders in replicate 1</w:t>
       </w:r>
     </w:p>
     <w:p>
@@ -8347,7 +11626,15 @@
           <w:i/>
           <w:sz w:val="20"/>
         </w:rPr>
-        <w:t>Source: 07_analysis/figures/fig4_1_outcomes_data.csv, from replicate 1, database run 5.</w:t>
+        <w:t>Source: 07_analysis/figures/fig4_2_outcomes_data.csv, from replicate 1, database run 5.</w:t>
+      </w:r>
+    </w:p>
+    <w:p>
+      <w:pPr>
+        <w:pStyle w:val="Heading3"/>
+      </w:pPr>
+      <w:r>
+        <w:t>4.5.2 Detection by planted error type</w:t>
       </w:r>
     </w:p>
     <w:p>
@@ -8359,7 +11646,7 @@
         <w:rPr>
           <w:i w:val="0"/>
         </w:rPr>
-        <w:t>Table 4.12 gives the detection rate for each planted error type with a 95 percent Wilson interval, which behaves better than the simple normal interval for small groups and for rates near zero or one (Brown et al., 2001; Wilson, 1927). Every one of the twelve rule-targeted types was flagged in all 20 of its orders, and in each case by the rule designed for it. Figure 4.2 shows the same rates graphically.</w:t>
+        <w:t>Table 4.14 gives the detection rate for each planted error type with a 95 percent Wilson interval, which behaves better than the simple normal interval for small groups and for rates near zero or one (Brown et al., 2001; Wilson, 1927). Every one of the twelve rule-targeted types was flagged in all 20 of its orders, and in each case by the rule designed for it. Figure 4.3 shows the same rates graphically.</w:t>
       </w:r>
     </w:p>
     <w:p>
@@ -8373,7 +11660,7 @@
           <w:b/>
           <w:i w:val="0"/>
         </w:rPr>
-        <w:t>Table 4.12: Detection by planted error type, replicate 1</w:t>
+        <w:t>Table 4.14: Detection by planted error type, replicate 1</w:t>
       </w:r>
     </w:p>
     <w:tbl>
@@ -9885,7 +13172,7 @@
         <w:drawing>
           <wp:inline xmlns:a="http://schemas.openxmlformats.org/drawingml/2006/main" xmlns:pic="http://schemas.openxmlformats.org/drawingml/2006/picture">
             <wp:extent cx="5760000" cy="3360000"/>
-            <wp:docPr id="2" name="Picture 2"/>
+            <wp:docPr id="3" name="Picture 3"/>
             <wp:cNvGraphicFramePr>
               <a:graphicFrameLocks noChangeAspect="1"/>
             </wp:cNvGraphicFramePr>
@@ -9893,11 +13180,11 @@
               <a:graphicData uri="http://schemas.openxmlformats.org/drawingml/2006/picture">
                 <pic:pic>
                   <pic:nvPicPr>
-                    <pic:cNvPr id="0" name="fig4_2_detection.png"/>
+                    <pic:cNvPr id="0" name="fig4_3_detection.png"/>
                     <pic:cNvPicPr/>
                   </pic:nvPicPr>
                   <pic:blipFill>
-                    <a:blip r:embed="rId10"/>
+                    <a:blip r:embed="rId12"/>
                     <a:stretch>
                       <a:fillRect/>
                     </a:stretch>
@@ -9926,7 +13213,7 @@
           <w:b/>
           <w:i w:val="0"/>
         </w:rPr>
-        <w:t>Figure 4.2: Detection rate by planted error type with 95 percent Wilson intervals, replicate 1</w:t>
+        <w:t>Figure 4.3: Detection rate by planted error type with 95 percent Wilson intervals, replicate 1</w:t>
       </w:r>
     </w:p>
     <w:p>
@@ -9939,7 +13226,7 @@
           <w:i/>
           <w:sz w:val="20"/>
         </w:rPr>
-        <w:t>Source: 07_analysis/figures/fig4_2_detection_data.csv, from replicate 1, database run 5.</w:t>
+        <w:t>Source: 07_analysis/figures/fig4_3_detection_data.csv, from replicate 1, database run 5.</w:t>
       </w:r>
     </w:p>
     <w:p>
@@ -9956,6 +13243,14 @@
     </w:p>
     <w:p>
       <w:pPr>
+        <w:pStyle w:val="Heading3"/>
+      </w:pPr>
+      <w:r>
+        <w:t>4.5.3 Classification performance</w:t>
+      </w:r>
+    </w:p>
+    <w:p>
+      <w:pPr>
         <w:spacing w:after="160" w:line="360" w:lineRule="auto"/>
         <w:jc w:val="both"/>
       </w:pPr>
@@ -9963,7 +13258,7 @@
         <w:rPr>
           <w:i w:val="0"/>
         </w:rPr>
-        <w:t>For the binary measures an order counts as flagged when it is warned or blocked and as positive when it carries a planted error. The primary measure uses all 300 erroneous orders against the 200 clean orders, and the secondary measure uses only the 240 rule-targeted orders against the same clean orders. Table 4.13 gives both confusion matrices for replicate 1 and Table 4.14 gives the measures with their intervals.</w:t>
+        <w:t>For the binary measures an order counts as flagged when it is warned or blocked and as positive when it carries a planted error. The primary measure uses all 300 erroneous orders against the 200 clean orders, and the secondary measure uses only the 240 rule-targeted orders against the same clean orders. Table 4.15 defines the measures. Table 4.16 gives both confusion matrices for replicate 1 and Table 4.17 gives the measures with their intervals.</w:t>
       </w:r>
     </w:p>
     <w:p>
@@ -9977,7 +13272,361 @@
           <w:b/>
           <w:i w:val="0"/>
         </w:rPr>
-        <w:t>Table 4.13: Confusion matrices, replicate 1</w:t>
+        <w:t>Table 4.15: Definitions of the classification measures</w:t>
+      </w:r>
+    </w:p>
+    <w:tbl>
+      <w:tblPr>
+        <w:tblStyle w:val="TableGrid"/>
+        <w:tblW w:type="auto" w:w="0"/>
+        <w:jc w:val="center"/>
+        <w:tblLook w:firstColumn="1" w:firstRow="1" w:lastColumn="0" w:lastRow="0" w:noHBand="0" w:noVBand="1" w:val="04A0"/>
+      </w:tblPr>
+      <w:tblGrid>
+        <w:gridCol w:w="3009"/>
+        <w:gridCol w:w="3009"/>
+        <w:gridCol w:w="3009"/>
+      </w:tblGrid>
+      <w:tr>
+        <w:tc>
+          <w:tcPr>
+            <w:tcW w:type="dxa" w:w="1587"/>
+            <w:shd w:val="clear" w:color="auto" w:fill="D9E2E1"/>
+          </w:tcPr>
+          <w:p>
+            <w:r/>
+            <w:r>
+              <w:rPr>
+                <w:b/>
+                <w:sz w:val="19"/>
+              </w:rPr>
+              <w:t>Measure</w:t>
+            </w:r>
+          </w:p>
+        </w:tc>
+        <w:tc>
+          <w:tcPr>
+            <w:tcW w:type="dxa" w:w="5102"/>
+            <w:shd w:val="clear" w:color="auto" w:fill="D9E2E1"/>
+          </w:tcPr>
+          <w:p>
+            <w:r/>
+            <w:r>
+              <w:rPr>
+                <w:b/>
+                <w:sz w:val="19"/>
+              </w:rPr>
+              <w:t>Definition</w:t>
+            </w:r>
+          </w:p>
+        </w:tc>
+        <w:tc>
+          <w:tcPr>
+            <w:tcW w:type="dxa" w:w="2381"/>
+            <w:shd w:val="clear" w:color="auto" w:fill="D9E2E1"/>
+          </w:tcPr>
+          <w:p>
+            <w:r/>
+            <w:r>
+              <w:rPr>
+                <w:b/>
+                <w:sz w:val="19"/>
+              </w:rPr>
+              <w:t>Formula</w:t>
+            </w:r>
+          </w:p>
+        </w:tc>
+      </w:tr>
+      <w:tr>
+        <w:tc>
+          <w:tcPr>
+            <w:tcW w:type="dxa" w:w="1587"/>
+          </w:tcPr>
+          <w:p>
+            <w:r/>
+            <w:r>
+              <w:rPr>
+                <w:sz w:val="19"/>
+              </w:rPr>
+              <w:t>Accuracy</w:t>
+            </w:r>
+          </w:p>
+        </w:tc>
+        <w:tc>
+          <w:tcPr>
+            <w:tcW w:type="dxa" w:w="5102"/>
+          </w:tcPr>
+          <w:p>
+            <w:r/>
+            <w:r>
+              <w:rPr>
+                <w:sz w:val="19"/>
+              </w:rPr>
+              <w:t>Share of all orders the system judged correctly, erroneous orders flagged and clean orders passed</w:t>
+            </w:r>
+          </w:p>
+        </w:tc>
+        <w:tc>
+          <w:tcPr>
+            <w:tcW w:type="dxa" w:w="2381"/>
+          </w:tcPr>
+          <w:p>
+            <w:r/>
+            <w:r>
+              <w:rPr>
+                <w:sz w:val="19"/>
+              </w:rPr>
+              <w:t>(TP + TN) / all orders</w:t>
+            </w:r>
+          </w:p>
+        </w:tc>
+      </w:tr>
+      <w:tr>
+        <w:tc>
+          <w:tcPr>
+            <w:tcW w:type="dxa" w:w="1587"/>
+          </w:tcPr>
+          <w:p>
+            <w:r/>
+            <w:r>
+              <w:rPr>
+                <w:sz w:val="19"/>
+              </w:rPr>
+              <w:t>Precision</w:t>
+            </w:r>
+          </w:p>
+        </w:tc>
+        <w:tc>
+          <w:tcPr>
+            <w:tcW w:type="dxa" w:w="5102"/>
+          </w:tcPr>
+          <w:p>
+            <w:r/>
+            <w:r>
+              <w:rPr>
+                <w:sz w:val="19"/>
+              </w:rPr>
+              <w:t>Of the orders flagged, the share that really carried an error</w:t>
+            </w:r>
+          </w:p>
+        </w:tc>
+        <w:tc>
+          <w:tcPr>
+            <w:tcW w:type="dxa" w:w="2381"/>
+          </w:tcPr>
+          <w:p>
+            <w:r/>
+            <w:r>
+              <w:rPr>
+                <w:sz w:val="19"/>
+              </w:rPr>
+              <w:t>TP / (TP + FP)</w:t>
+            </w:r>
+          </w:p>
+        </w:tc>
+      </w:tr>
+      <w:tr>
+        <w:tc>
+          <w:tcPr>
+            <w:tcW w:type="dxa" w:w="1587"/>
+          </w:tcPr>
+          <w:p>
+            <w:r/>
+            <w:r>
+              <w:rPr>
+                <w:sz w:val="19"/>
+              </w:rPr>
+              <w:t>Recall</w:t>
+            </w:r>
+          </w:p>
+        </w:tc>
+        <w:tc>
+          <w:tcPr>
+            <w:tcW w:type="dxa" w:w="5102"/>
+          </w:tcPr>
+          <w:p>
+            <w:r/>
+            <w:r>
+              <w:rPr>
+                <w:sz w:val="19"/>
+              </w:rPr>
+              <w:t>Of the orders that carried an error, the share the system flagged</w:t>
+            </w:r>
+          </w:p>
+        </w:tc>
+        <w:tc>
+          <w:tcPr>
+            <w:tcW w:type="dxa" w:w="2381"/>
+          </w:tcPr>
+          <w:p>
+            <w:r/>
+            <w:r>
+              <w:rPr>
+                <w:sz w:val="19"/>
+              </w:rPr>
+              <w:t>TP / (TP + FN)</w:t>
+            </w:r>
+          </w:p>
+        </w:tc>
+      </w:tr>
+      <w:tr>
+        <w:tc>
+          <w:tcPr>
+            <w:tcW w:type="dxa" w:w="1587"/>
+          </w:tcPr>
+          <w:p>
+            <w:r/>
+            <w:r>
+              <w:rPr>
+                <w:sz w:val="19"/>
+              </w:rPr>
+              <w:t>Specificity</w:t>
+            </w:r>
+          </w:p>
+        </w:tc>
+        <w:tc>
+          <w:tcPr>
+            <w:tcW w:type="dxa" w:w="5102"/>
+          </w:tcPr>
+          <w:p>
+            <w:r/>
+            <w:r>
+              <w:rPr>
+                <w:sz w:val="19"/>
+              </w:rPr>
+              <w:t>Of the clean orders, the share passed without a flag</w:t>
+            </w:r>
+          </w:p>
+        </w:tc>
+        <w:tc>
+          <w:tcPr>
+            <w:tcW w:type="dxa" w:w="2381"/>
+          </w:tcPr>
+          <w:p>
+            <w:r/>
+            <w:r>
+              <w:rPr>
+                <w:sz w:val="19"/>
+              </w:rPr>
+              <w:t>TN / (TN + FP)</w:t>
+            </w:r>
+          </w:p>
+        </w:tc>
+      </w:tr>
+      <w:tr>
+        <w:tc>
+          <w:tcPr>
+            <w:tcW w:type="dxa" w:w="1587"/>
+          </w:tcPr>
+          <w:p>
+            <w:r/>
+            <w:r>
+              <w:rPr>
+                <w:sz w:val="19"/>
+              </w:rPr>
+              <w:t>False-alarm rate</w:t>
+            </w:r>
+          </w:p>
+        </w:tc>
+        <w:tc>
+          <w:tcPr>
+            <w:tcW w:type="dxa" w:w="5102"/>
+          </w:tcPr>
+          <w:p>
+            <w:r/>
+            <w:r>
+              <w:rPr>
+                <w:sz w:val="19"/>
+              </w:rPr>
+              <w:t>Of the clean orders, the share flagged</w:t>
+            </w:r>
+          </w:p>
+        </w:tc>
+        <w:tc>
+          <w:tcPr>
+            <w:tcW w:type="dxa" w:w="2381"/>
+          </w:tcPr>
+          <w:p>
+            <w:r/>
+            <w:r>
+              <w:rPr>
+                <w:sz w:val="19"/>
+              </w:rPr>
+              <w:t>FP / (FP + TN)</w:t>
+            </w:r>
+          </w:p>
+        </w:tc>
+      </w:tr>
+      <w:tr>
+        <w:tc>
+          <w:tcPr>
+            <w:tcW w:type="dxa" w:w="1587"/>
+          </w:tcPr>
+          <w:p>
+            <w:r/>
+            <w:r>
+              <w:rPr>
+                <w:sz w:val="19"/>
+              </w:rPr>
+              <w:t>F1 score</w:t>
+            </w:r>
+          </w:p>
+        </w:tc>
+        <w:tc>
+          <w:tcPr>
+            <w:tcW w:type="dxa" w:w="5102"/>
+          </w:tcPr>
+          <w:p>
+            <w:r/>
+            <w:r>
+              <w:rPr>
+                <w:sz w:val="19"/>
+              </w:rPr>
+              <w:t>Harmonic mean of precision and recall</w:t>
+            </w:r>
+          </w:p>
+        </w:tc>
+        <w:tc>
+          <w:tcPr>
+            <w:tcW w:type="dxa" w:w="2381"/>
+          </w:tcPr>
+          <w:p>
+            <w:r/>
+            <w:r>
+              <w:rPr>
+                <w:sz w:val="19"/>
+              </w:rPr>
+              <w:t>2 x P x R / (P + R)</w:t>
+            </w:r>
+          </w:p>
+        </w:tc>
+      </w:tr>
+    </w:tbl>
+    <w:p>
+      <w:pPr>
+        <w:spacing w:after="240" w:line="360" w:lineRule="auto"/>
+        <w:jc w:val="left"/>
+      </w:pPr>
+      <w:r>
+        <w:rPr>
+          <w:i/>
+          <w:sz w:val="20"/>
+        </w:rPr>
+        <w:t>Source: standard definitions. TP true positive, FN false negative, FP false positive, TN true negative.</w:t>
+      </w:r>
+    </w:p>
+    <w:p>
+      <w:pPr>
+        <w:keepNext/>
+        <w:spacing w:after="80" w:line="360" w:lineRule="auto"/>
+        <w:jc w:val="left"/>
+      </w:pPr>
+      <w:r>
+        <w:rPr>
+          <w:b/>
+          <w:i w:val="0"/>
+        </w:rPr>
+        <w:t>Table 4.16: Confusion matrices, replicate 1</w:t>
       </w:r>
     </w:p>
     <w:tbl>
@@ -10290,7 +13939,7 @@
           <w:b/>
           <w:i w:val="0"/>
         </w:rPr>
-        <w:t>Table 4.14: Validation measures with 95 percent Wilson intervals, replicate 1</w:t>
+        <w:t>Table 4.17: Validation measures with 95 percent Wilson intervals, replicate 1</w:t>
       </w:r>
     </w:p>
     <w:tbl>
@@ -10844,7 +14493,7 @@
         <w:rPr>
           <w:i w:val="0"/>
         </w:rPr>
-        <w:t>On the primary measure the engine reached an accuracy of 87.2 percent, with a 95 percent interval of 84.0 to 89.8 percent. The whole interval lies below the 90 percent target, so the primary measure does not meet it. Recall was 88.0 percent, held down by the 36 errors without a rule that passed unflagged. On the secondary measure accuracy was 93.6 percent, with an interval of 91.0 to 95.6 percent, and recall was 100.0 percent. Precision was similar on both measures because the false alarms are the same clean orders in each. Figure 4.3 shows the measures with their intervals and marks the values from replicates 2 and 3.</w:t>
+        <w:t>On the primary measure the engine reached an accuracy of 87.2 percent, with a 95 percent interval of 84.0 to 89.8 percent. The whole interval lies below the 90 percent target, so the primary measure does not meet it. Recall was 88.0 percent, held down by the 36 errors without a rule that passed unflagged. On the secondary measure accuracy was 93.6 percent, with an interval of 91.0 to 95.6 percent, and recall was 100.0 percent. Precision was similar on both measures because the false alarms are the same clean orders in each. Figure 4.4 shows the measures with their intervals and marks the values from replicates 2 and 3.</w:t>
       </w:r>
     </w:p>
     <w:p>
@@ -10855,7 +14504,7 @@
         <w:drawing>
           <wp:inline xmlns:a="http://schemas.openxmlformats.org/drawingml/2006/main" xmlns:pic="http://schemas.openxmlformats.org/drawingml/2006/picture">
             <wp:extent cx="5760000" cy="2256000"/>
-            <wp:docPr id="3" name="Picture 3"/>
+            <wp:docPr id="4" name="Picture 4"/>
             <wp:cNvGraphicFramePr>
               <a:graphicFrameLocks noChangeAspect="1"/>
             </wp:cNvGraphicFramePr>
@@ -10863,11 +14512,11 @@
               <a:graphicData uri="http://schemas.openxmlformats.org/drawingml/2006/picture">
                 <pic:pic>
                   <pic:nvPicPr>
-                    <pic:cNvPr id="0" name="fig4_3_measures.png"/>
+                    <pic:cNvPr id="0" name="fig4_4_measures.png"/>
                     <pic:cNvPicPr/>
                   </pic:nvPicPr>
                   <pic:blipFill>
-                    <a:blip r:embed="rId11"/>
+                    <a:blip r:embed="rId13"/>
                     <a:stretch>
                       <a:fillRect/>
                     </a:stretch>
@@ -10896,7 +14545,7 @@
           <w:b/>
           <w:i w:val="0"/>
         </w:rPr>
-        <w:t>Figure 4.3: Validation measures with 95 percent Wilson intervals</w:t>
+        <w:t>Figure 4.4: Validation measures with 95 percent Wilson intervals</w:t>
       </w:r>
     </w:p>
     <w:p>
@@ -10909,7 +14558,15 @@
           <w:i/>
           <w:sz w:val="20"/>
         </w:rPr>
-        <w:t>Source: 07_analysis/figures/fig4_3_measures_data.csv, from replicates 1 to 3, database runs 5 to 7.</w:t>
+        <w:t>Source: 07_analysis/figures/fig4_4_measures_data.csv, from replicates 1 to 3, database runs 5 to 7.</w:t>
+      </w:r>
+    </w:p>
+    <w:p>
+      <w:pPr>
+        <w:pStyle w:val="Heading3"/>
+      </w:pPr>
+      <w:r>
+        <w:t>4.5.4 Rule activity and false alarms</w:t>
       </w:r>
     </w:p>
     <w:p>
@@ -10921,7 +14578,7 @@
         <w:rPr>
           <w:i w:val="0"/>
         </w:rPr>
-        <w:t>Table 4.15 shows how often each rule fired. The seven blocking rules fired only on erroneous orders and never on a clean one. The stock rule also fired on the 40 orders whose quantity was above the maximum or whose product was discontinued, because both also exceed the stock on hand. All 28 false alarms on clean orders came from the two warning rules, 27 from the unusual-quantity rule and 1 from the duplicate rule. The unusual-quantity rule fired on 94 orders in all, and on 13.5 percent of clean orders.</w:t>
+        <w:t>Table 4.18 shows how often each rule fired. The seven blocking rules fired only on erroneous orders and never on a clean one. The stock rule also fired on the 40 orders whose quantity was above the maximum or whose product was discontinued, because both also exceed the stock on hand. All 28 false alarms on clean orders came from the two warning rules, 27 from the unusual-quantity rule and 1 from the duplicate rule. The unusual-quantity rule fired on 94 orders in all, and on 13.5 percent of clean orders. Figure 4.5 shows the same counts by kind of order.</w:t>
       </w:r>
     </w:p>
     <w:p>
@@ -10935,7 +14592,7 @@
           <w:b/>
           <w:i w:val="0"/>
         </w:rPr>
-        <w:t>Table 4.15: Rule activity and false alarms, replicate 1</w:t>
+        <w:t>Table 4.18: Rule activity and false alarms, replicate 1</w:t>
       </w:r>
     </w:p>
     <w:tbl>
@@ -11984,6 +15641,79 @@
     </w:p>
     <w:p>
       <w:pPr>
+        <w:jc w:val="center"/>
+      </w:pPr>
+      <w:r>
+        <w:drawing>
+          <wp:inline xmlns:a="http://schemas.openxmlformats.org/drawingml/2006/main" xmlns:pic="http://schemas.openxmlformats.org/drawingml/2006/picture">
+            <wp:extent cx="5760000" cy="2793600"/>
+            <wp:docPr id="5" name="Picture 5"/>
+            <wp:cNvGraphicFramePr>
+              <a:graphicFrameLocks noChangeAspect="1"/>
+            </wp:cNvGraphicFramePr>
+            <a:graphic>
+              <a:graphicData uri="http://schemas.openxmlformats.org/drawingml/2006/picture">
+                <pic:pic>
+                  <pic:nvPicPr>
+                    <pic:cNvPr id="0" name="fig4_5_rules.png"/>
+                    <pic:cNvPicPr/>
+                  </pic:nvPicPr>
+                  <pic:blipFill>
+                    <a:blip r:embed="rId14"/>
+                    <a:stretch>
+                      <a:fillRect/>
+                    </a:stretch>
+                  </pic:blipFill>
+                  <pic:spPr>
+                    <a:xfrm>
+                      <a:off x="0" y="0"/>
+                      <a:ext cx="5760000" cy="2793600"/>
+                    </a:xfrm>
+                    <a:prstGeom prst="rect"/>
+                  </pic:spPr>
+                </pic:pic>
+              </a:graphicData>
+            </a:graphic>
+          </wp:inline>
+        </w:drawing>
+      </w:r>
+    </w:p>
+    <w:p>
+      <w:pPr>
+        <w:spacing w:after="40" w:line="360" w:lineRule="auto"/>
+        <w:jc w:val="left"/>
+      </w:pPr>
+      <w:r>
+        <w:rPr>
+          <w:b/>
+          <w:i w:val="0"/>
+        </w:rPr>
+        <w:t>Figure 4.5: Number of orders on which each validation rule fired, by kind of order, replicate 1</w:t>
+      </w:r>
+    </w:p>
+    <w:p>
+      <w:pPr>
+        <w:spacing w:after="240" w:line="360" w:lineRule="auto"/>
+        <w:jc w:val="left"/>
+      </w:pPr>
+      <w:r>
+        <w:rPr>
+          <w:i/>
+          <w:sz w:val="20"/>
+        </w:rPr>
+        <w:t>Source: 07_analysis/figures/fig4_5_rules_data.csv, from replicate 1, database run 5.</w:t>
+      </w:r>
+    </w:p>
+    <w:p>
+      <w:pPr>
+        <w:pStyle w:val="Heading3"/>
+      </w:pPr>
+      <w:r>
+        <w:t>4.5.5 Processing time</w:t>
+      </w:r>
+    </w:p>
+    <w:p>
+      <w:pPr>
         <w:spacing w:after="160" w:line="360" w:lineRule="auto"/>
         <w:jc w:val="both"/>
       </w:pPr>
@@ -11991,7 +15721,7 @@
         <w:rPr>
           <w:i w:val="0"/>
         </w:rPr>
-        <w:t>Validation time was measured as the clock time of submit_order inside the database, which validates the order and records the status change. It excludes network time and any time a person spends. Table 4.16 gives the statistics for replicate 1. The standard deviation is the sample value. The mean was 28.72 ms and the median 22.16 ms, with a 95th percentile of 74.72 ms and a maximum of 124.31 ms. The time measured from the draft event to the last event in the status history gave a mean of 29.78 ms over the 478 orders that had more than one event.</w:t>
+        <w:t>Validation time was measured as the clock time of submit_order inside the database, which validates the order and records the status change. It excludes network time and any time a person spends. Table 4.19 gives the statistics for replicate 1 and Figure 4.6 shows their distribution. The standard deviation is the sample value. The mean was 28.72 ms and the median 22.16 ms, with a 95th percentile of 74.72 ms and a maximum of 124.31 ms. The time measured from the draft event to the last event in the status history gave a mean of 29.78 ms over the 478 orders that had more than one event.</w:t>
       </w:r>
     </w:p>
     <w:p>
@@ -12005,7 +15735,7 @@
           <w:b/>
           <w:i w:val="0"/>
         </w:rPr>
-        <w:t>Table 4.16: Validation time per order in milliseconds, replicate 1</w:t>
+        <w:t>Table 4.19: Validation time per order in milliseconds, replicate 1</w:t>
       </w:r>
     </w:p>
     <w:tbl>
@@ -12624,6 +16354,71 @@
     </w:p>
     <w:p>
       <w:pPr>
+        <w:jc w:val="center"/>
+      </w:pPr>
+      <w:r>
+        <w:drawing>
+          <wp:inline xmlns:a="http://schemas.openxmlformats.org/drawingml/2006/main" xmlns:pic="http://schemas.openxmlformats.org/drawingml/2006/picture">
+            <wp:extent cx="5760000" cy="2659200"/>
+            <wp:docPr id="6" name="Picture 6"/>
+            <wp:cNvGraphicFramePr>
+              <a:graphicFrameLocks noChangeAspect="1"/>
+            </wp:cNvGraphicFramePr>
+            <a:graphic>
+              <a:graphicData uri="http://schemas.openxmlformats.org/drawingml/2006/picture">
+                <pic:pic>
+                  <pic:nvPicPr>
+                    <pic:cNvPr id="0" name="fig4_6_validation_time.png"/>
+                    <pic:cNvPicPr/>
+                  </pic:nvPicPr>
+                  <pic:blipFill>
+                    <a:blip r:embed="rId15"/>
+                    <a:stretch>
+                      <a:fillRect/>
+                    </a:stretch>
+                  </pic:blipFill>
+                  <pic:spPr>
+                    <a:xfrm>
+                      <a:off x="0" y="0"/>
+                      <a:ext cx="5760000" cy="2659200"/>
+                    </a:xfrm>
+                    <a:prstGeom prst="rect"/>
+                  </pic:spPr>
+                </pic:pic>
+              </a:graphicData>
+            </a:graphic>
+          </wp:inline>
+        </w:drawing>
+      </w:r>
+    </w:p>
+    <w:p>
+      <w:pPr>
+        <w:spacing w:after="40" w:line="360" w:lineRule="auto"/>
+        <w:jc w:val="left"/>
+      </w:pPr>
+      <w:r>
+        <w:rPr>
+          <w:b/>
+          <w:i w:val="0"/>
+        </w:rPr>
+        <w:t>Figure 4.6: Distribution of validation time per order, replicate 1</w:t>
+      </w:r>
+    </w:p>
+    <w:p>
+      <w:pPr>
+        <w:spacing w:after="240" w:line="360" w:lineRule="auto"/>
+        <w:jc w:val="left"/>
+      </w:pPr>
+      <w:r>
+        <w:rPr>
+          <w:i/>
+          <w:sz w:val="20"/>
+        </w:rPr>
+        <w:t>Source: 07_analysis/figures/fig4_6_validation_time_data.csv, from replicate 1, database run 5.</w:t>
+      </w:r>
+    </w:p>
+    <w:p>
+      <w:pPr>
         <w:spacing w:after="160" w:line="360" w:lineRule="auto"/>
         <w:jc w:val="both"/>
       </w:pPr>
@@ -12631,7 +16426,7 @@
         <w:rPr>
           <w:i w:val="0"/>
         </w:rPr>
-        <w:t>The time was not stable across the run. Figure 4.4 shows that in replicate 1 the mean rose from 6.90 ms for the first 100 orders to 58.76 ms for the last 100, and replicate 2 followed the same path. The rules that look back over a customer's earlier orders have more orders to examine as the run goes on, which is consistent with this rise. Replicate 3 stayed between 2.08 and 2.54 ms throughout. The harness was the same in every run. It is assumed, but was not confirmed, that the database chose a different query plan in that run. In every replicate a single order was validated in well under a second.</w:t>
+        <w:t>The time was not stable across the run. Figure 4.7 shows that in replicate 1 the mean rose from 6.90 ms for the first 100 orders to 58.76 ms for the last 100, and replicate 2 followed the same path. The rules that look back over a customer's earlier orders have more orders to examine as the run goes on, which is consistent with this rise. Replicate 3 stayed between 2.08 and 2.54 ms throughout. The harness was the same in every run. It is assumed, but was not confirmed, that the database chose a different query plan in that run. In every replicate a single order was validated in well under a second.</w:t>
       </w:r>
     </w:p>
     <w:p>
@@ -12642,7 +16437,7 @@
         <w:drawing>
           <wp:inline xmlns:a="http://schemas.openxmlformats.org/drawingml/2006/main" xmlns:pic="http://schemas.openxmlformats.org/drawingml/2006/picture">
             <wp:extent cx="5760000" cy="2688000"/>
-            <wp:docPr id="4" name="Picture 4"/>
+            <wp:docPr id="7" name="Picture 7"/>
             <wp:cNvGraphicFramePr>
               <a:graphicFrameLocks noChangeAspect="1"/>
             </wp:cNvGraphicFramePr>
@@ -12650,11 +16445,11 @@
               <a:graphicData uri="http://schemas.openxmlformats.org/drawingml/2006/picture">
                 <pic:pic>
                   <pic:nvPicPr>
-                    <pic:cNvPr id="0" name="fig4_4_timing.png"/>
+                    <pic:cNvPr id="0" name="fig4_7_timing_blocks.png"/>
                     <pic:cNvPicPr/>
                   </pic:nvPicPr>
                   <pic:blipFill>
-                    <a:blip r:embed="rId12"/>
+                    <a:blip r:embed="rId16"/>
                     <a:stretch>
                       <a:fillRect/>
                     </a:stretch>
@@ -12683,7 +16478,7 @@
           <w:b/>
           <w:i w:val="0"/>
         </w:rPr>
-        <w:t>Figure 4.4: Validation time per order across each run, mean of each block of 100 orders</w:t>
+        <w:t>Figure 4.7: Validation time per order across each run, mean of each block of 100 orders</w:t>
       </w:r>
     </w:p>
     <w:p>
@@ -12696,7 +16491,15 @@
           <w:i/>
           <w:sz w:val="20"/>
         </w:rPr>
-        <w:t>Source: 07_analysis/figures/fig4_4_timing_data.csv, from replicates 1 to 3, database runs 5 to 7.</w:t>
+        <w:t>Source: 07_analysis/figures/fig4_7_timing_blocks_data.csv, from replicates 1 to 3, database runs 5 to 7.</w:t>
+      </w:r>
+    </w:p>
+    <w:p>
+      <w:pPr>
+        <w:pStyle w:val="Heading3"/>
+      </w:pPr>
+      <w:r>
+        <w:t>4.5.6 Variation between replicates</w:t>
       </w:r>
     </w:p>
     <w:p>
@@ -12708,7 +16511,7 @@
         <w:rPr>
           <w:i w:val="0"/>
         </w:rPr>
-        <w:t>Table 4.17 sets the key measures of the three replicates side by side. No accuracy or detection measure moved by more than 1.7 percentage points between replicates, so the headline figures do not depend on the particular seed. The timing measures moved by an order of magnitude, as described above.</w:t>
+        <w:t>Table 4.20 sets the key measures of the three replicates side by side. No accuracy or detection measure moved by more than 1.7 percentage points between replicates, so the headline figures do not depend on the particular seed. The timing measures moved by an order of magnitude, as described above.</w:t>
       </w:r>
     </w:p>
     <w:p>
@@ -12722,7 +16525,7 @@
           <w:b/>
           <w:i w:val="0"/>
         </w:rPr>
-        <w:t>Table 4.17: Key measures in each replicate</w:t>
+        <w:t>Table 4.20: Key measures in each replicate</w:t>
       </w:r>
     </w:p>
     <w:tbl>
@@ -13917,6 +17720,14 @@
     </w:p>
     <w:p>
       <w:pPr>
+        <w:pStyle w:val="Heading3"/>
+      </w:pPr>
+      <w:r>
+        <w:t>4.5.7 Sensitivity of the unusual-quantity warning</w:t>
+      </w:r>
+    </w:p>
+    <w:p>
+      <w:pPr>
         <w:spacing w:after="160" w:line="360" w:lineRule="auto"/>
         <w:jc w:val="both"/>
       </w:pPr>
@@ -13924,7 +17735,7 @@
         <w:rPr>
           <w:i w:val="0"/>
         </w:rPr>
-        <w:t>Because the unusual-quantity rule caused nearly all false alarms and also caught the quantity slips, its setting was examined. Replicate 1 was replayed through the live functions with the threshold set from three to five times the customer's average in steps of one, and with four or ten earlier orders per customer. The replay with the live setting reproduced replicate 1 exactly, with no difference in any order, so the six settings in Table 4.18 are compared on identical orders. These runs are for discussion only and the live setting was left at three.</w:t>
+        <w:t>Because the unusual-quantity rule caused nearly all false alarms and also caught the quantity slips, its setting was examined. Replicate 1 was replayed through the live functions with the threshold set from three to five times the customer's average in steps of one, and with four or ten earlier orders per customer. The replay with the live setting reproduced replicate 1 exactly, with no difference in any order, so the six settings in Table 4.21 are compared on identical orders. These runs are for discussion only and the live setting was left at three.</w:t>
       </w:r>
     </w:p>
     <w:p>
@@ -13938,7 +17749,7 @@
           <w:b/>
           <w:i w:val="0"/>
         </w:rPr>
-        <w:t>Table 4.18: Unusual-quantity sensitivity on replicate 1</w:t>
+        <w:t>Table 4.21: Unusual-quantity sensitivity on replicate 1</w:t>
       </w:r>
     </w:p>
     <w:tbl>
@@ -14896,7 +18707,7 @@
         <w:rPr>
           <w:i w:val="0"/>
         </w:rPr>
-        <w:t>Raising the threshold from three to five times the average with four earlier orders cut false alarms on clean orders from 14.0 to 8.5 percent, but the share of quantity slips caught fell from 70.0 to 55.0 percent. A longer history of ten orders caught more slips at the same threshold but also raised false alarms, to 19.0 percent at three times the average. The intervals for the slips are wide because each rests on 20 orders, so these differences show a direction rather than settled values. Figure 4.5 shows the trade-off.</w:t>
+        <w:t>Raising the threshold from three to five times the average with four earlier orders cut false alarms on clean orders from 14.0 to 8.5 percent, but the share of quantity slips caught fell from 70.0 to 55.0 percent. A longer history of ten orders caught more slips at the same threshold but also raised false alarms, to 19.0 percent at three times the average. The intervals for the slips are wide because each rests on 20 orders, so these differences show a direction rather than settled values. Figure 4.8 shows the trade-off.</w:t>
       </w:r>
     </w:p>
     <w:p>
@@ -14907,7 +18718,7 @@
         <w:drawing>
           <wp:inline xmlns:a="http://schemas.openxmlformats.org/drawingml/2006/main" xmlns:pic="http://schemas.openxmlformats.org/drawingml/2006/picture">
             <wp:extent cx="5760000" cy="2520000"/>
-            <wp:docPr id="5" name="Picture 5"/>
+            <wp:docPr id="8" name="Picture 8"/>
             <wp:cNvGraphicFramePr>
               <a:graphicFrameLocks noChangeAspect="1"/>
             </wp:cNvGraphicFramePr>
@@ -14915,11 +18726,11 @@
               <a:graphicData uri="http://schemas.openxmlformats.org/drawingml/2006/picture">
                 <pic:pic>
                   <pic:nvPicPr>
-                    <pic:cNvPr id="0" name="fig4_5_sensitivity.png"/>
+                    <pic:cNvPr id="0" name="fig4_8_sensitivity.png"/>
                     <pic:cNvPicPr/>
                   </pic:nvPicPr>
                   <pic:blipFill>
-                    <a:blip r:embed="rId13"/>
+                    <a:blip r:embed="rId17"/>
                     <a:stretch>
                       <a:fillRect/>
                     </a:stretch>
@@ -14948,7 +18759,7 @@
           <w:b/>
           <w:i w:val="0"/>
         </w:rPr>
-        <w:t>Figure 4.5: Effect of the unusual-quantity threshold and history length on false alarms and slip detection</w:t>
+        <w:t>Figure 4.8: Effect of the unusual-quantity threshold and history length on false alarms and slip detection</w:t>
       </w:r>
     </w:p>
     <w:p>
@@ -14961,7 +18772,15 @@
           <w:i/>
           <w:sz w:val="20"/>
         </w:rPr>
-        <w:t>Source: 07_analysis/figures/fig4_5_sensitivity_data.csv, from replays of database run 5.</w:t>
+        <w:t>Source: 07_analysis/figures/fig4_8_sensitivity_data.csv, from replays of database run 5.</w:t>
+      </w:r>
+    </w:p>
+    <w:p>
+      <w:pPr>
+        <w:pStyle w:val="Heading3"/>
+      </w:pPr>
+      <w:r>
+        <w:t>4.5.8 Mandatory-field completion</w:t>
       </w:r>
     </w:p>
     <w:p>
@@ -14986,6 +18805,14 @@
     </w:p>
     <w:p>
       <w:pPr>
+        <w:pStyle w:val="Heading3"/>
+      </w:pPr>
+      <w:r>
+        <w:t>4.6.1 Evaluation against the objectives</w:t>
+      </w:r>
+    </w:p>
+    <w:p>
+      <w:pPr>
         <w:spacing w:after="160" w:line="360" w:lineRule="auto"/>
         <w:jc w:val="both"/>
       </w:pPr>
@@ -14993,7 +18820,7 @@
         <w:rPr>
           <w:i w:val="0"/>
         </w:rPr>
-        <w:t>Table 4.19 sets each objective against its success criterion. The wording of the objectives in Chapter One was not available when this chapter was drafted, so the table marks where that wording must be inserted and describes each objective in brief. Objective 1 is not listed because its criterion was not supplied.</w:t>
+        <w:t>Table 4.22 sets each objective against its success criterion. The wording of the objectives in Chapter One was not available when this chapter was drafted, so the table marks where that wording must be inserted and describes each objective in brief. Objective 1 is not listed because its criterion was not supplied.</w:t>
       </w:r>
     </w:p>
     <w:p>
@@ -15007,7 +18834,7 @@
           <w:b/>
           <w:i w:val="0"/>
         </w:rPr>
-        <w:t>Table 4.19: Objectives and success criteria</w:t>
+        <w:t>Table 4.22: Objectives and success criteria</w:t>
       </w:r>
     </w:p>
     <w:tbl>
@@ -15562,6 +19389,14 @@
           <w:i w:val="0"/>
         </w:rPr>
         <w:t>The accuracy objective is rated Partly met. On the primary measure accuracy did not reach 90 percent in any replicate, and the upper end of the replicate 1 interval was 89.8 percent. On the rule-targeted errors it exceeded 90 percent in every replicate and the whole interval lay above the target. Both measures share the same false alarms, so the gap between them comes from the 36 errors without a rule that were missed, 30 of them wrong products or wrong addresses. The mandatory-fields criterion is Met. The error-reduction and speed criteria remain Pending until the manual baseline is run and scored with analyze_baseline.py. Below about 80 paired orders that comparison of errors will be indicative only. Usability and acceptance remain Pending until the questionnaire data exist.</w:t>
+      </w:r>
+    </w:p>
+    <w:p>
+      <w:pPr>
+        <w:pStyle w:val="Heading3"/>
+      </w:pPr>
+      <w:r>
+        <w:t>4.6.2 Answers to the research questions</w:t>
       </w:r>
     </w:p>
     <w:p>
@@ -15646,6 +19481,14 @@
           <w:i w:val="0"/>
         </w:rPr>
         <w:t>The link between Part A and Part B, for example whether the errors respondents report most often are those the engine catches, can only be drawn once the questionnaire has been completed and is [DATA PENDING].</w:t>
+      </w:r>
+    </w:p>
+    <w:p>
+      <w:pPr>
+        <w:pStyle w:val="Heading3"/>
+      </w:pPr>
+      <w:r>
+        <w:t>4.6.3 Discussion</w:t>
       </w:r>
     </w:p>
     <w:p>
@@ -15935,6 +19778,7 @@
       </w:r>
     </w:p>
     <w:sectPr>
+      <w:footerReference w:type="default" r:id="rId9"/>
       <w:pgSz w:w="11906" w:h="16838"/>
       <w:pgMar w:top="1440" w:right="1440" w:bottom="1440" w:left="1440" w:header="720" w:footer="720" w:gutter="0"/>
       <w:cols w:space="720"/>
@@ -15942,6 +19786,25 @@
     </w:sectPr>
   </w:body>
 </w:document>
+</file>
+
+<file path=word/footer1.xml><?xml version="1.0" encoding="utf-8"?>
+<w:ftr xmlns:m="http://schemas.openxmlformats.org/officeDocument/2006/math" xmlns:mc="http://schemas.openxmlformats.org/markup-compatibility/2006" xmlns:mo="http://schemas.microsoft.com/office/mac/office/2008/main" xmlns:mv="urn:schemas-microsoft-com:mac:vml" xmlns:o="urn:schemas-microsoft-com:office:office" xmlns:r="http://schemas.openxmlformats.org/officeDocument/2006/relationships" xmlns:v="urn:schemas-microsoft-com:vml" xmlns:w10="urn:schemas-microsoft-com:office:word" xmlns:w14="http://schemas.microsoft.com/office/word/2010/wordml" xmlns:w="http://schemas.openxmlformats.org/wordprocessingml/2006/main" xmlns:wne="http://schemas.microsoft.com/office/word/2006/wordml" xmlns:wp14="http://schemas.microsoft.com/office/word/2010/wordprocessingDrawing" xmlns:wp="http://schemas.openxmlformats.org/drawingml/2006/wordprocessingDrawing" xmlns:wpc="http://schemas.microsoft.com/office/word/2010/wordprocessingCanvas" xmlns:wpg="http://schemas.microsoft.com/office/word/2010/wordprocessingGroup" xmlns:wpi="http://schemas.microsoft.com/office/word/2010/wordprocessingInk" xmlns:wps="http://schemas.microsoft.com/office/word/2010/wordprocessingShape" mc:Ignorable="w14 wp14">
+  <w:p>
+    <w:pPr>
+      <w:pStyle w:val="Footer"/>
+      <w:jc w:val="center"/>
+    </w:pPr>
+    <w:r>
+      <w:rPr>
+        <w:sz w:val="20"/>
+      </w:rPr>
+      <w:fldChar w:fldCharType="begin"/>
+      <w:instrText xml:space="preserve">PAGE</w:instrText>
+      <w:fldChar w:fldCharType="end"/>
+    </w:r>
+  </w:p>
+</w:ftr>
 </file>
 
 <file path=word/numbering.xml><?xml version="1.0" encoding="utf-8"?>
@@ -16423,7 +20286,7 @@
       <w:b/>
       <w:bCs/>
       <w:color w:val="000000"/>
-      <w:sz w:val="24"/>
+      <w:sz w:val="22"/>
     </w:rPr>
   </w:style>
   <w:style w:type="paragraph" w:styleId="Heading4">

</xml_diff>

<commit_message>
Chapter Four: technical part only, questionnaire section removed
Co-Authored-By: Claude Opus 5.5 <noreply@anthropic.com>
Claude-Session: https://claude.ai/code/session_0116ePZsFh2Yr8B4s3JdZBxN
</commit_message>
<xml_diff>
--- a/docs/chapter4_final/08_chapter/Chapter_Four.docx
+++ b/docs/chapter4_final/08_chapter/Chapter_Four.docx
@@ -27,7 +27,7 @@
           <w:i w:val="0"/>
           <w:sz w:val="28"/>
         </w:rPr>
-        <w:t>RESULTS AND DISCUSSION</w:t>
+        <w:t>SYSTEM IMPLEMENTATION, TESTING AND RESULTS</w:t>
       </w:r>
     </w:p>
     <w:tbl>
@@ -52,7 +52,7 @@
                 <w:i/>
                 <w:sz w:val="20"/>
               </w:rPr>
-              <w:t>Note for the group. This chapter is built from the evaluation files in docs/chapter4_final. Part B, the technical evaluation, is complete. Part A and the manual-entry comparison are marked [DATA PENDING] until the questionnaire and the baseline session have been run, and [EXACT CHAPTER ONE WORDING NEEDED] marks where the Chapter One wording goes. DATA_PENDING.md lists every open item. Delete this note before submission.</w:t>
+              <w:t>Note for the group. This draft covers the technical part of Chapter Four, the system, its testing and the simulation. The questionnaire results are written separately and can be inserted as their own section. Results that depend on the manual-entry comparison are marked [DATA PENDING], and [EXACT CHAPTER ONE WORDING NEEDED] marks where the Chapter One wording goes. Delete this note before submission.</w:t>
             </w:r>
           </w:p>
         </w:tc>
@@ -76,7 +76,7 @@
         <w:rPr>
           <w:i w:val="0"/>
         </w:rPr>
-        <w:t>This chapter reports the evaluation of Verity, the intelligent order processing system developed in this project. It is written in two parts that are brought together in Section 4.6. Part A reports the questionnaire given to staff and customers of the case organisation before and after a demonstration of the system. Part B reports the technical evaluation, which covers the implemented system with its testing, and a controlled simulation in which orders with known planted errors were submitted to the live validation engine.</w:t>
+        <w:t>This chapter reports the evaluation of Verity, the intelligent order processing system developed in this project. It covers the implemented system with its testing, and a controlled simulation in which orders with known planted errors were submitted to the live validation engine. Section 4.5 sets the results against the success criteria of Chapter One. The questionnaire on usability and acceptance is reported separately.</w:t>
       </w:r>
     </w:p>
     <w:p>
@@ -88,7 +88,7 @@
         <w:rPr>
           <w:i w:val="0"/>
         </w:rPr>
-        <w:t>At the time of writing the questionnaire had not been administered and the manual-entry comparison had not been run. Every result that depends on those activities is therefore marked [DATA PENDING] and every success criterion that rests on them is given the status Pending. All other figures in this chapter come from files and database queries produced during the evaluation, and each is listed with its source in the traceability table that accompanies the chapter.</w:t>
+        <w:t>At the time of writing the comparison with manual order entry had not been run. Every result that depends on those activities is therefore marked [DATA PENDING] and every success criterion that rests on them is given the status Pending. All other figures in this chapter come from files and database queries produced during the evaluation, and each is listed with its source in the traceability table that accompanies the chapter.</w:t>
       </w:r>
     </w:p>
     <w:p>
@@ -96,7 +96,15 @@
         <w:pStyle w:val="Heading2"/>
       </w:pPr>
       <w:r>
-        <w:t>4.2 Part A. Questionnaire results</w:t>
+        <w:t>4.2 Implemented system and testing</w:t>
+      </w:r>
+    </w:p>
+    <w:p>
+      <w:pPr>
+        <w:pStyle w:val="Heading3"/>
+      </w:pPr>
+      <w:r>
+        <w:t>4.2.1 System components and order lifecycle</w:t>
       </w:r>
     </w:p>
     <w:p>
@@ -108,7 +116,7 @@
         <w:rPr>
           <w:i w:val="0"/>
         </w:rPr>
-        <w:t>The questionnaire has two parts. Part I is completed before the demonstration and covers consent, respondent group, current order handling, experience of order errors and their consequences, and the importance of twelve requirements. Part II is completed straight after the demonstration and contains the System Usability Scale in its standard wording (Brooke, 1996) together with items on perceived usefulness, ease of use, intention to use, facilitating conditions and voluntariness adapted from Davis (1989) and Venkatesh et al. (2003). The target is 150 valid responses from about 190 questionnaires distributed. No responses had been collected when this chapter was prepared, so Tables 4.1 to 4.4 are shells.</w:t>
+        <w:t>Verity is a web application with a React interface hosted on Vercel and a Supabase back end built on PostgreSQL 17. All business rules run inside the database as functions, and row-level security decides which records each signed-in user can read. Table 4.1 summarises the components that were built.</w:t>
       </w:r>
     </w:p>
     <w:p>
@@ -122,1975 +130,7 @@
           <w:b/>
           <w:i w:val="0"/>
         </w:rPr>
-        <w:t>Table 4.1: Respondents by group</w:t>
-      </w:r>
-    </w:p>
-    <w:tbl>
-      <w:tblPr>
-        <w:tblStyle w:val="TableGrid"/>
-        <w:tblW w:type="auto" w:w="0"/>
-        <w:jc w:val="center"/>
-        <w:tblLook w:firstColumn="1" w:firstRow="1" w:lastColumn="0" w:lastRow="0" w:noHBand="0" w:noVBand="1" w:val="04A0"/>
-      </w:tblPr>
-      <w:tblGrid>
-        <w:gridCol w:w="1805"/>
-        <w:gridCol w:w="1805"/>
-        <w:gridCol w:w="1805"/>
-        <w:gridCol w:w="1805"/>
-        <w:gridCol w:w="1805"/>
-      </w:tblGrid>
-      <w:tr>
-        <w:tc>
-          <w:tcPr>
-            <w:tcW w:type="dxa" w:w="1805"/>
-            <w:shd w:val="clear" w:color="auto" w:fill="D9E2E1"/>
-          </w:tcPr>
-          <w:p>
-            <w:r/>
-            <w:r>
-              <w:rPr>
-                <w:b/>
-                <w:sz w:val="19"/>
-              </w:rPr>
-              <w:t>Group</w:t>
-            </w:r>
-          </w:p>
-        </w:tc>
-        <w:tc>
-          <w:tcPr>
-            <w:tcW w:type="dxa" w:w="1805"/>
-            <w:shd w:val="clear" w:color="auto" w:fill="D9E2E1"/>
-          </w:tcPr>
-          <w:p>
-            <w:r/>
-            <w:r>
-              <w:rPr>
-                <w:b/>
-                <w:sz w:val="19"/>
-              </w:rPr>
-              <w:t>Distributed</w:t>
-            </w:r>
-          </w:p>
-        </w:tc>
-        <w:tc>
-          <w:tcPr>
-            <w:tcW w:type="dxa" w:w="1805"/>
-            <w:shd w:val="clear" w:color="auto" w:fill="D9E2E1"/>
-          </w:tcPr>
-          <w:p>
-            <w:r/>
-            <w:r>
-              <w:rPr>
-                <w:b/>
-                <w:sz w:val="19"/>
-              </w:rPr>
-              <w:t>Returned</w:t>
-            </w:r>
-          </w:p>
-        </w:tc>
-        <w:tc>
-          <w:tcPr>
-            <w:tcW w:type="dxa" w:w="1805"/>
-            <w:shd w:val="clear" w:color="auto" w:fill="D9E2E1"/>
-          </w:tcPr>
-          <w:p>
-            <w:r/>
-            <w:r>
-              <w:rPr>
-                <w:b/>
-                <w:sz w:val="19"/>
-              </w:rPr>
-              <w:t>Valid</w:t>
-            </w:r>
-          </w:p>
-        </w:tc>
-        <w:tc>
-          <w:tcPr>
-            <w:tcW w:type="dxa" w:w="1805"/>
-            <w:shd w:val="clear" w:color="auto" w:fill="D9E2E1"/>
-          </w:tcPr>
-          <w:p>
-            <w:r/>
-            <w:r>
-              <w:rPr>
-                <w:b/>
-                <w:sz w:val="19"/>
-              </w:rPr>
-              <w:t>Valid share of returned</w:t>
-            </w:r>
-          </w:p>
-        </w:tc>
-      </w:tr>
-      <w:tr>
-        <w:tc>
-          <w:tcPr>
-            <w:tcW w:type="dxa" w:w="1805"/>
-          </w:tcPr>
-          <w:p>
-            <w:r/>
-            <w:r>
-              <w:rPr>
-                <w:sz w:val="19"/>
-              </w:rPr>
-              <w:t>Staff of the supplier</w:t>
-            </w:r>
-          </w:p>
-        </w:tc>
-        <w:tc>
-          <w:tcPr>
-            <w:tcW w:type="dxa" w:w="1805"/>
-          </w:tcPr>
-          <w:p>
-            <w:r/>
-            <w:r>
-              <w:rPr>
-                <w:sz w:val="19"/>
-              </w:rPr>
-              <w:t>[DATA PENDING]</w:t>
-            </w:r>
-          </w:p>
-        </w:tc>
-        <w:tc>
-          <w:tcPr>
-            <w:tcW w:type="dxa" w:w="1805"/>
-          </w:tcPr>
-          <w:p>
-            <w:r/>
-            <w:r>
-              <w:rPr>
-                <w:sz w:val="19"/>
-              </w:rPr>
-              <w:t>[DATA PENDING]</w:t>
-            </w:r>
-          </w:p>
-        </w:tc>
-        <w:tc>
-          <w:tcPr>
-            <w:tcW w:type="dxa" w:w="1805"/>
-          </w:tcPr>
-          <w:p>
-            <w:r/>
-            <w:r>
-              <w:rPr>
-                <w:sz w:val="19"/>
-              </w:rPr>
-              <w:t>[DATA PENDING]</w:t>
-            </w:r>
-          </w:p>
-        </w:tc>
-        <w:tc>
-          <w:tcPr>
-            <w:tcW w:type="dxa" w:w="1805"/>
-          </w:tcPr>
-          <w:p>
-            <w:r/>
-            <w:r>
-              <w:rPr>
-                <w:sz w:val="19"/>
-              </w:rPr>
-              <w:t>[DATA PENDING]</w:t>
-            </w:r>
-          </w:p>
-        </w:tc>
-      </w:tr>
-      <w:tr>
-        <w:tc>
-          <w:tcPr>
-            <w:tcW w:type="dxa" w:w="1805"/>
-          </w:tcPr>
-          <w:p>
-            <w:r/>
-            <w:r>
-              <w:rPr>
-                <w:sz w:val="19"/>
-              </w:rPr>
-              <w:t>Customers</w:t>
-            </w:r>
-          </w:p>
-        </w:tc>
-        <w:tc>
-          <w:tcPr>
-            <w:tcW w:type="dxa" w:w="1805"/>
-          </w:tcPr>
-          <w:p>
-            <w:r/>
-            <w:r>
-              <w:rPr>
-                <w:sz w:val="19"/>
-              </w:rPr>
-              <w:t>[DATA PENDING]</w:t>
-            </w:r>
-          </w:p>
-        </w:tc>
-        <w:tc>
-          <w:tcPr>
-            <w:tcW w:type="dxa" w:w="1805"/>
-          </w:tcPr>
-          <w:p>
-            <w:r/>
-            <w:r>
-              <w:rPr>
-                <w:sz w:val="19"/>
-              </w:rPr>
-              <w:t>[DATA PENDING]</w:t>
-            </w:r>
-          </w:p>
-        </w:tc>
-        <w:tc>
-          <w:tcPr>
-            <w:tcW w:type="dxa" w:w="1805"/>
-          </w:tcPr>
-          <w:p>
-            <w:r/>
-            <w:r>
-              <w:rPr>
-                <w:sz w:val="19"/>
-              </w:rPr>
-              <w:t>[DATA PENDING]</w:t>
-            </w:r>
-          </w:p>
-        </w:tc>
-        <w:tc>
-          <w:tcPr>
-            <w:tcW w:type="dxa" w:w="1805"/>
-          </w:tcPr>
-          <w:p>
-            <w:r/>
-            <w:r>
-              <w:rPr>
-                <w:sz w:val="19"/>
-              </w:rPr>
-              <w:t>[DATA PENDING]</w:t>
-            </w:r>
-          </w:p>
-        </w:tc>
-      </w:tr>
-      <w:tr>
-        <w:tc>
-          <w:tcPr>
-            <w:tcW w:type="dxa" w:w="1805"/>
-          </w:tcPr>
-          <w:p>
-            <w:r/>
-            <w:r>
-              <w:rPr>
-                <w:sz w:val="19"/>
-              </w:rPr>
-              <w:t>Total</w:t>
-            </w:r>
-          </w:p>
-        </w:tc>
-        <w:tc>
-          <w:tcPr>
-            <w:tcW w:type="dxa" w:w="1805"/>
-          </w:tcPr>
-          <w:p>
-            <w:r/>
-            <w:r>
-              <w:rPr>
-                <w:sz w:val="19"/>
-              </w:rPr>
-              <w:t>about 190</w:t>
-            </w:r>
-          </w:p>
-        </w:tc>
-        <w:tc>
-          <w:tcPr>
-            <w:tcW w:type="dxa" w:w="1805"/>
-          </w:tcPr>
-          <w:p>
-            <w:r/>
-            <w:r>
-              <w:rPr>
-                <w:sz w:val="19"/>
-              </w:rPr>
-              <w:t>[DATA PENDING]</w:t>
-            </w:r>
-          </w:p>
-        </w:tc>
-        <w:tc>
-          <w:tcPr>
-            <w:tcW w:type="dxa" w:w="1805"/>
-          </w:tcPr>
-          <w:p>
-            <w:r/>
-            <w:r>
-              <w:rPr>
-                <w:sz w:val="19"/>
-              </w:rPr>
-              <w:t>[DATA PENDING] (target 150)</w:t>
-            </w:r>
-          </w:p>
-        </w:tc>
-        <w:tc>
-          <w:tcPr>
-            <w:tcW w:type="dxa" w:w="1805"/>
-          </w:tcPr>
-          <w:p>
-            <w:r/>
-            <w:r>
-              <w:rPr>
-                <w:sz w:val="19"/>
-              </w:rPr>
-              <w:t>[DATA PENDING]</w:t>
-            </w:r>
-          </w:p>
-        </w:tc>
-      </w:tr>
-    </w:tbl>
-    <w:p>
-      <w:pPr>
-        <w:spacing w:after="240" w:line="360" w:lineRule="auto"/>
-        <w:jc w:val="left"/>
-      </w:pPr>
-      <w:r>
-        <w:rPr>
-          <w:i/>
-          <w:sz w:val="20"/>
-        </w:rPr>
-        <w:t>Source: questionnaire export, analysed with analyze_questionnaire.py. Not yet collected.</w:t>
-      </w:r>
-    </w:p>
-    <w:p>
-      <w:pPr>
-        <w:spacing w:after="160" w:line="360" w:lineRule="auto"/>
-        <w:jc w:val="both"/>
-      </w:pPr>
-      <w:r>
-        <w:rPr>
-          <w:i w:val="0"/>
-        </w:rPr>
-        <w:t>Table 4.1 will report how many questionnaires were distributed and returned in each group and how many met the validity rule applied by the analysis script, which requires recorded consent and a complete set of usability items.</w:t>
-      </w:r>
-    </w:p>
-    <w:p>
-      <w:pPr>
-        <w:keepNext/>
-        <w:spacing w:after="80" w:line="360" w:lineRule="auto"/>
-        <w:jc w:val="left"/>
-      </w:pPr>
-      <w:r>
-        <w:rPr>
-          <w:b/>
-          <w:i w:val="0"/>
-        </w:rPr>
-        <w:t>Table 4.2: Reliability of the multi-item scales</w:t>
-      </w:r>
-    </w:p>
-    <w:tbl>
-      <w:tblPr>
-        <w:tblStyle w:val="TableGrid"/>
-        <w:tblW w:type="auto" w:w="0"/>
-        <w:jc w:val="center"/>
-        <w:tblLook w:firstColumn="1" w:firstRow="1" w:lastColumn="0" w:lastRow="0" w:noHBand="0" w:noVBand="1" w:val="04A0"/>
-      </w:tblPr>
-      <w:tblGrid>
-        <w:gridCol w:w="3009"/>
-        <w:gridCol w:w="3009"/>
-        <w:gridCol w:w="3009"/>
-      </w:tblGrid>
-      <w:tr>
-        <w:tc>
-          <w:tcPr>
-            <w:tcW w:type="dxa" w:w="3009"/>
-            <w:shd w:val="clear" w:color="auto" w:fill="D9E2E1"/>
-          </w:tcPr>
-          <w:p>
-            <w:r/>
-            <w:r>
-              <w:rPr>
-                <w:b/>
-                <w:sz w:val="19"/>
-              </w:rPr>
-              <w:t>Scale</w:t>
-            </w:r>
-          </w:p>
-        </w:tc>
-        <w:tc>
-          <w:tcPr>
-            <w:tcW w:type="dxa" w:w="3009"/>
-            <w:shd w:val="clear" w:color="auto" w:fill="D9E2E1"/>
-          </w:tcPr>
-          <w:p>
-            <w:r/>
-            <w:r>
-              <w:rPr>
-                <w:b/>
-                <w:sz w:val="19"/>
-              </w:rPr>
-              <w:t>Items</w:t>
-            </w:r>
-          </w:p>
-        </w:tc>
-        <w:tc>
-          <w:tcPr>
-            <w:tcW w:type="dxa" w:w="3009"/>
-            <w:shd w:val="clear" w:color="auto" w:fill="D9E2E1"/>
-          </w:tcPr>
-          <w:p>
-            <w:r/>
-            <w:r>
-              <w:rPr>
-                <w:b/>
-                <w:sz w:val="19"/>
-              </w:rPr>
-              <w:t>Cronbach's alpha</w:t>
-            </w:r>
-          </w:p>
-        </w:tc>
-      </w:tr>
-      <w:tr>
-        <w:tc>
-          <w:tcPr>
-            <w:tcW w:type="dxa" w:w="3009"/>
-          </w:tcPr>
-          <w:p>
-            <w:r/>
-            <w:r>
-              <w:rPr>
-                <w:sz w:val="19"/>
-              </w:rPr>
-              <w:t>System Usability Scale</w:t>
-            </w:r>
-          </w:p>
-        </w:tc>
-        <w:tc>
-          <w:tcPr>
-            <w:tcW w:type="dxa" w:w="3009"/>
-          </w:tcPr>
-          <w:p>
-            <w:r/>
-            <w:r>
-              <w:rPr>
-                <w:sz w:val="19"/>
-              </w:rPr>
-              <w:t>SUS1 to SUS10, even items recoded</w:t>
-            </w:r>
-          </w:p>
-        </w:tc>
-        <w:tc>
-          <w:tcPr>
-            <w:tcW w:type="dxa" w:w="3009"/>
-          </w:tcPr>
-          <w:p>
-            <w:r/>
-            <w:r>
-              <w:rPr>
-                <w:sz w:val="19"/>
-              </w:rPr>
-              <w:t>[DATA PENDING]</w:t>
-            </w:r>
-          </w:p>
-        </w:tc>
-      </w:tr>
-      <w:tr>
-        <w:tc>
-          <w:tcPr>
-            <w:tcW w:type="dxa" w:w="3009"/>
-          </w:tcPr>
-          <w:p>
-            <w:r/>
-            <w:r>
-              <w:rPr>
-                <w:sz w:val="19"/>
-              </w:rPr>
-              <w:t>Perceived usefulness</w:t>
-            </w:r>
-          </w:p>
-        </w:tc>
-        <w:tc>
-          <w:tcPr>
-            <w:tcW w:type="dxa" w:w="3009"/>
-          </w:tcPr>
-          <w:p>
-            <w:r/>
-            <w:r>
-              <w:rPr>
-                <w:sz w:val="19"/>
-              </w:rPr>
-              <w:t>PU1 to PU3</w:t>
-            </w:r>
-          </w:p>
-        </w:tc>
-        <w:tc>
-          <w:tcPr>
-            <w:tcW w:type="dxa" w:w="3009"/>
-          </w:tcPr>
-          <w:p>
-            <w:r/>
-            <w:r>
-              <w:rPr>
-                <w:sz w:val="19"/>
-              </w:rPr>
-              <w:t>[DATA PENDING]</w:t>
-            </w:r>
-          </w:p>
-        </w:tc>
-      </w:tr>
-      <w:tr>
-        <w:tc>
-          <w:tcPr>
-            <w:tcW w:type="dxa" w:w="3009"/>
-          </w:tcPr>
-          <w:p>
-            <w:r/>
-            <w:r>
-              <w:rPr>
-                <w:sz w:val="19"/>
-              </w:rPr>
-              <w:t>Ease of use</w:t>
-            </w:r>
-          </w:p>
-        </w:tc>
-        <w:tc>
-          <w:tcPr>
-            <w:tcW w:type="dxa" w:w="3009"/>
-          </w:tcPr>
-          <w:p>
-            <w:r/>
-            <w:r>
-              <w:rPr>
-                <w:sz w:val="19"/>
-              </w:rPr>
-              <w:t>EOU1 to EOU3</w:t>
-            </w:r>
-          </w:p>
-        </w:tc>
-        <w:tc>
-          <w:tcPr>
-            <w:tcW w:type="dxa" w:w="3009"/>
-          </w:tcPr>
-          <w:p>
-            <w:r/>
-            <w:r>
-              <w:rPr>
-                <w:sz w:val="19"/>
-              </w:rPr>
-              <w:t>[DATA PENDING]</w:t>
-            </w:r>
-          </w:p>
-        </w:tc>
-      </w:tr>
-      <w:tr>
-        <w:tc>
-          <w:tcPr>
-            <w:tcW w:type="dxa" w:w="3009"/>
-          </w:tcPr>
-          <w:p>
-            <w:r/>
-            <w:r>
-              <w:rPr>
-                <w:sz w:val="19"/>
-              </w:rPr>
-              <w:t>Facilitating conditions</w:t>
-            </w:r>
-          </w:p>
-        </w:tc>
-        <w:tc>
-          <w:tcPr>
-            <w:tcW w:type="dxa" w:w="3009"/>
-          </w:tcPr>
-          <w:p>
-            <w:r/>
-            <w:r>
-              <w:rPr>
-                <w:sz w:val="19"/>
-              </w:rPr>
-              <w:t>FC1 and FC2</w:t>
-            </w:r>
-          </w:p>
-        </w:tc>
-        <w:tc>
-          <w:tcPr>
-            <w:tcW w:type="dxa" w:w="3009"/>
-          </w:tcPr>
-          <w:p>
-            <w:r/>
-            <w:r>
-              <w:rPr>
-                <w:sz w:val="19"/>
-              </w:rPr>
-              <w:t>[DATA PENDING]</w:t>
-            </w:r>
-          </w:p>
-        </w:tc>
-      </w:tr>
-    </w:tbl>
-    <w:p>
-      <w:pPr>
-        <w:spacing w:after="240" w:line="360" w:lineRule="auto"/>
-        <w:jc w:val="left"/>
-      </w:pPr>
-      <w:r>
-        <w:rPr>
-          <w:i/>
-          <w:sz w:val="20"/>
-        </w:rPr>
-        <w:t>Source: questionnaire export, analysed with analyze_questionnaire.py. Not yet collected.</w:t>
-      </w:r>
-    </w:p>
-    <w:p>
-      <w:pPr>
-        <w:spacing w:after="160" w:line="360" w:lineRule="auto"/>
-        <w:jc w:val="both"/>
-      </w:pPr>
-      <w:r>
-        <w:rPr>
-          <w:i w:val="0"/>
-        </w:rPr>
-        <w:t>Table 4.2 will report Cronbach's alpha for each multi-item scale (Cronbach, 1951) as a check that the items in each scale measure the same construct before scale scores are interpreted.</w:t>
-      </w:r>
-    </w:p>
-    <w:p>
-      <w:pPr>
-        <w:keepNext/>
-        <w:spacing w:after="80" w:line="360" w:lineRule="auto"/>
-        <w:jc w:val="left"/>
-      </w:pPr>
-      <w:r>
-        <w:rPr>
-          <w:b/>
-          <w:i w:val="0"/>
-        </w:rPr>
-        <w:t>Table 4.3: System Usability Scale scores against the benchmark of 68</w:t>
-      </w:r>
-    </w:p>
-    <w:tbl>
-      <w:tblPr>
-        <w:tblStyle w:val="TableGrid"/>
-        <w:tblW w:type="auto" w:w="0"/>
-        <w:jc w:val="center"/>
-        <w:tblLook w:firstColumn="1" w:firstRow="1" w:lastColumn="0" w:lastRow="0" w:noHBand="0" w:noVBand="1" w:val="04A0"/>
-      </w:tblPr>
-      <w:tblGrid>
-        <w:gridCol w:w="2256"/>
-        <w:gridCol w:w="2256"/>
-        <w:gridCol w:w="2256"/>
-        <w:gridCol w:w="2256"/>
-      </w:tblGrid>
-      <w:tr>
-        <w:tc>
-          <w:tcPr>
-            <w:tcW w:type="dxa" w:w="2256"/>
-            <w:shd w:val="clear" w:color="auto" w:fill="D9E2E1"/>
-          </w:tcPr>
-          <w:p>
-            <w:r/>
-            <w:r>
-              <w:rPr>
-                <w:b/>
-                <w:sz w:val="19"/>
-              </w:rPr>
-              <w:t>Statistic</w:t>
-            </w:r>
-          </w:p>
-        </w:tc>
-        <w:tc>
-          <w:tcPr>
-            <w:tcW w:type="dxa" w:w="2256"/>
-            <w:shd w:val="clear" w:color="auto" w:fill="D9E2E1"/>
-          </w:tcPr>
-          <w:p>
-            <w:r/>
-            <w:r>
-              <w:rPr>
-                <w:b/>
-                <w:sz w:val="19"/>
-              </w:rPr>
-              <w:t>Staff</w:t>
-            </w:r>
-          </w:p>
-        </w:tc>
-        <w:tc>
-          <w:tcPr>
-            <w:tcW w:type="dxa" w:w="2256"/>
-            <w:shd w:val="clear" w:color="auto" w:fill="D9E2E1"/>
-          </w:tcPr>
-          <w:p>
-            <w:r/>
-            <w:r>
-              <w:rPr>
-                <w:b/>
-                <w:sz w:val="19"/>
-              </w:rPr>
-              <w:t>Customers</w:t>
-            </w:r>
-          </w:p>
-        </w:tc>
-        <w:tc>
-          <w:tcPr>
-            <w:tcW w:type="dxa" w:w="2256"/>
-            <w:shd w:val="clear" w:color="auto" w:fill="D9E2E1"/>
-          </w:tcPr>
-          <w:p>
-            <w:r/>
-            <w:r>
-              <w:rPr>
-                <w:b/>
-                <w:sz w:val="19"/>
-              </w:rPr>
-              <w:t>All valid responses</w:t>
-            </w:r>
-          </w:p>
-        </w:tc>
-      </w:tr>
-      <w:tr>
-        <w:tc>
-          <w:tcPr>
-            <w:tcW w:type="dxa" w:w="2256"/>
-          </w:tcPr>
-          <w:p>
-            <w:r/>
-            <w:r>
-              <w:rPr>
-                <w:sz w:val="19"/>
-              </w:rPr>
-              <w:t>n</w:t>
-            </w:r>
-          </w:p>
-        </w:tc>
-        <w:tc>
-          <w:tcPr>
-            <w:tcW w:type="dxa" w:w="2256"/>
-          </w:tcPr>
-          <w:p>
-            <w:r/>
-            <w:r>
-              <w:rPr>
-                <w:sz w:val="19"/>
-              </w:rPr>
-              <w:t>[DATA PENDING]</w:t>
-            </w:r>
-          </w:p>
-        </w:tc>
-        <w:tc>
-          <w:tcPr>
-            <w:tcW w:type="dxa" w:w="2256"/>
-          </w:tcPr>
-          <w:p>
-            <w:r/>
-            <w:r>
-              <w:rPr>
-                <w:sz w:val="19"/>
-              </w:rPr>
-              <w:t>[DATA PENDING]</w:t>
-            </w:r>
-          </w:p>
-        </w:tc>
-        <w:tc>
-          <w:tcPr>
-            <w:tcW w:type="dxa" w:w="2256"/>
-          </w:tcPr>
-          <w:p>
-            <w:r/>
-            <w:r>
-              <w:rPr>
-                <w:sz w:val="19"/>
-              </w:rPr>
-              <w:t>[DATA PENDING]</w:t>
-            </w:r>
-          </w:p>
-        </w:tc>
-      </w:tr>
-      <w:tr>
-        <w:tc>
-          <w:tcPr>
-            <w:tcW w:type="dxa" w:w="2256"/>
-          </w:tcPr>
-          <w:p>
-            <w:r/>
-            <w:r>
-              <w:rPr>
-                <w:sz w:val="19"/>
-              </w:rPr>
-              <w:t>Mean</w:t>
-            </w:r>
-          </w:p>
-        </w:tc>
-        <w:tc>
-          <w:tcPr>
-            <w:tcW w:type="dxa" w:w="2256"/>
-          </w:tcPr>
-          <w:p>
-            <w:r/>
-            <w:r>
-              <w:rPr>
-                <w:sz w:val="19"/>
-              </w:rPr>
-              <w:t>[DATA PENDING]</w:t>
-            </w:r>
-          </w:p>
-        </w:tc>
-        <w:tc>
-          <w:tcPr>
-            <w:tcW w:type="dxa" w:w="2256"/>
-          </w:tcPr>
-          <w:p>
-            <w:r/>
-            <w:r>
-              <w:rPr>
-                <w:sz w:val="19"/>
-              </w:rPr>
-              <w:t>[DATA PENDING]</w:t>
-            </w:r>
-          </w:p>
-        </w:tc>
-        <w:tc>
-          <w:tcPr>
-            <w:tcW w:type="dxa" w:w="2256"/>
-          </w:tcPr>
-          <w:p>
-            <w:r/>
-            <w:r>
-              <w:rPr>
-                <w:sz w:val="19"/>
-              </w:rPr>
-              <w:t>[DATA PENDING]</w:t>
-            </w:r>
-          </w:p>
-        </w:tc>
-      </w:tr>
-      <w:tr>
-        <w:tc>
-          <w:tcPr>
-            <w:tcW w:type="dxa" w:w="2256"/>
-          </w:tcPr>
-          <w:p>
-            <w:r/>
-            <w:r>
-              <w:rPr>
-                <w:sz w:val="19"/>
-              </w:rPr>
-              <w:t>SD, sample</w:t>
-            </w:r>
-          </w:p>
-        </w:tc>
-        <w:tc>
-          <w:tcPr>
-            <w:tcW w:type="dxa" w:w="2256"/>
-          </w:tcPr>
-          <w:p>
-            <w:r/>
-            <w:r>
-              <w:rPr>
-                <w:sz w:val="19"/>
-              </w:rPr>
-              <w:t>[DATA PENDING]</w:t>
-            </w:r>
-          </w:p>
-        </w:tc>
-        <w:tc>
-          <w:tcPr>
-            <w:tcW w:type="dxa" w:w="2256"/>
-          </w:tcPr>
-          <w:p>
-            <w:r/>
-            <w:r>
-              <w:rPr>
-                <w:sz w:val="19"/>
-              </w:rPr>
-              <w:t>[DATA PENDING]</w:t>
-            </w:r>
-          </w:p>
-        </w:tc>
-        <w:tc>
-          <w:tcPr>
-            <w:tcW w:type="dxa" w:w="2256"/>
-          </w:tcPr>
-          <w:p>
-            <w:r/>
-            <w:r>
-              <w:rPr>
-                <w:sz w:val="19"/>
-              </w:rPr>
-              <w:t>[DATA PENDING]</w:t>
-            </w:r>
-          </w:p>
-        </w:tc>
-      </w:tr>
-      <w:tr>
-        <w:tc>
-          <w:tcPr>
-            <w:tcW w:type="dxa" w:w="2256"/>
-          </w:tcPr>
-          <w:p>
-            <w:r/>
-            <w:r>
-              <w:rPr>
-                <w:sz w:val="19"/>
-              </w:rPr>
-              <w:t>95% CI</w:t>
-            </w:r>
-          </w:p>
-        </w:tc>
-        <w:tc>
-          <w:tcPr>
-            <w:tcW w:type="dxa" w:w="2256"/>
-          </w:tcPr>
-          <w:p>
-            <w:r/>
-            <w:r>
-              <w:rPr>
-                <w:sz w:val="19"/>
-              </w:rPr>
-              <w:t>[DATA PENDING]</w:t>
-            </w:r>
-          </w:p>
-        </w:tc>
-        <w:tc>
-          <w:tcPr>
-            <w:tcW w:type="dxa" w:w="2256"/>
-          </w:tcPr>
-          <w:p>
-            <w:r/>
-            <w:r>
-              <w:rPr>
-                <w:sz w:val="19"/>
-              </w:rPr>
-              <w:t>[DATA PENDING]</w:t>
-            </w:r>
-          </w:p>
-        </w:tc>
-        <w:tc>
-          <w:tcPr>
-            <w:tcW w:type="dxa" w:w="2256"/>
-          </w:tcPr>
-          <w:p>
-            <w:r/>
-            <w:r>
-              <w:rPr>
-                <w:sz w:val="19"/>
-              </w:rPr>
-              <w:t>[DATA PENDING]</w:t>
-            </w:r>
-          </w:p>
-        </w:tc>
-      </w:tr>
-      <w:tr>
-        <w:tc>
-          <w:tcPr>
-            <w:tcW w:type="dxa" w:w="2256"/>
-          </w:tcPr>
-          <w:p>
-            <w:r/>
-            <w:r>
-              <w:rPr>
-                <w:sz w:val="19"/>
-              </w:rPr>
-              <w:t>t against 68</w:t>
-            </w:r>
-          </w:p>
-        </w:tc>
-        <w:tc>
-          <w:tcPr>
-            <w:tcW w:type="dxa" w:w="2256"/>
-          </w:tcPr>
-          <w:p>
-            <w:r/>
-            <w:r>
-              <w:rPr>
-                <w:sz w:val="19"/>
-              </w:rPr>
-              <w:t>[DATA PENDING]</w:t>
-            </w:r>
-          </w:p>
-        </w:tc>
-        <w:tc>
-          <w:tcPr>
-            <w:tcW w:type="dxa" w:w="2256"/>
-          </w:tcPr>
-          <w:p>
-            <w:r/>
-            <w:r>
-              <w:rPr>
-                <w:sz w:val="19"/>
-              </w:rPr>
-              <w:t>[DATA PENDING]</w:t>
-            </w:r>
-          </w:p>
-        </w:tc>
-        <w:tc>
-          <w:tcPr>
-            <w:tcW w:type="dxa" w:w="2256"/>
-          </w:tcPr>
-          <w:p>
-            <w:r/>
-            <w:r>
-              <w:rPr>
-                <w:sz w:val="19"/>
-              </w:rPr>
-              <w:t>[DATA PENDING]</w:t>
-            </w:r>
-          </w:p>
-        </w:tc>
-      </w:tr>
-      <w:tr>
-        <w:tc>
-          <w:tcPr>
-            <w:tcW w:type="dxa" w:w="2256"/>
-          </w:tcPr>
-          <w:p>
-            <w:r/>
-            <w:r>
-              <w:rPr>
-                <w:sz w:val="19"/>
-              </w:rPr>
-              <w:t>p, two-sided</w:t>
-            </w:r>
-          </w:p>
-        </w:tc>
-        <w:tc>
-          <w:tcPr>
-            <w:tcW w:type="dxa" w:w="2256"/>
-          </w:tcPr>
-          <w:p>
-            <w:r/>
-            <w:r>
-              <w:rPr>
-                <w:sz w:val="19"/>
-              </w:rPr>
-              <w:t>[DATA PENDING]</w:t>
-            </w:r>
-          </w:p>
-        </w:tc>
-        <w:tc>
-          <w:tcPr>
-            <w:tcW w:type="dxa" w:w="2256"/>
-          </w:tcPr>
-          <w:p>
-            <w:r/>
-            <w:r>
-              <w:rPr>
-                <w:sz w:val="19"/>
-              </w:rPr>
-              <w:t>[DATA PENDING]</w:t>
-            </w:r>
-          </w:p>
-        </w:tc>
-        <w:tc>
-          <w:tcPr>
-            <w:tcW w:type="dxa" w:w="2256"/>
-          </w:tcPr>
-          <w:p>
-            <w:r/>
-            <w:r>
-              <w:rPr>
-                <w:sz w:val="19"/>
-              </w:rPr>
-              <w:t>[DATA PENDING]</w:t>
-            </w:r>
-          </w:p>
-        </w:tc>
-      </w:tr>
-      <w:tr>
-        <w:tc>
-          <w:tcPr>
-            <w:tcW w:type="dxa" w:w="2256"/>
-          </w:tcPr>
-          <w:p>
-            <w:r/>
-            <w:r>
-              <w:rPr>
-                <w:sz w:val="19"/>
-              </w:rPr>
-              <w:t>Adjective, Bangor et al. (2009)</w:t>
-            </w:r>
-          </w:p>
-        </w:tc>
-        <w:tc>
-          <w:tcPr>
-            <w:tcW w:type="dxa" w:w="2256"/>
-          </w:tcPr>
-          <w:p>
-            <w:r/>
-            <w:r>
-              <w:rPr>
-                <w:sz w:val="19"/>
-              </w:rPr>
-              <w:t>[DATA PENDING]</w:t>
-            </w:r>
-          </w:p>
-        </w:tc>
-        <w:tc>
-          <w:tcPr>
-            <w:tcW w:type="dxa" w:w="2256"/>
-          </w:tcPr>
-          <w:p>
-            <w:r/>
-            <w:r>
-              <w:rPr>
-                <w:sz w:val="19"/>
-              </w:rPr>
-              <w:t>[DATA PENDING]</w:t>
-            </w:r>
-          </w:p>
-        </w:tc>
-        <w:tc>
-          <w:tcPr>
-            <w:tcW w:type="dxa" w:w="2256"/>
-          </w:tcPr>
-          <w:p>
-            <w:r/>
-            <w:r>
-              <w:rPr>
-                <w:sz w:val="19"/>
-              </w:rPr>
-              <w:t>[DATA PENDING]</w:t>
-            </w:r>
-          </w:p>
-        </w:tc>
-      </w:tr>
-      <w:tr>
-        <w:tc>
-          <w:tcPr>
-            <w:tcW w:type="dxa" w:w="2256"/>
-          </w:tcPr>
-          <w:p>
-            <w:r/>
-            <w:r>
-              <w:rPr>
-                <w:sz w:val="19"/>
-              </w:rPr>
-              <w:t>Acceptability, Bangor et al. (2008)</w:t>
-            </w:r>
-          </w:p>
-        </w:tc>
-        <w:tc>
-          <w:tcPr>
-            <w:tcW w:type="dxa" w:w="2256"/>
-          </w:tcPr>
-          <w:p>
-            <w:r/>
-            <w:r>
-              <w:rPr>
-                <w:sz w:val="19"/>
-              </w:rPr>
-              <w:t>[DATA PENDING]</w:t>
-            </w:r>
-          </w:p>
-        </w:tc>
-        <w:tc>
-          <w:tcPr>
-            <w:tcW w:type="dxa" w:w="2256"/>
-          </w:tcPr>
-          <w:p>
-            <w:r/>
-            <w:r>
-              <w:rPr>
-                <w:sz w:val="19"/>
-              </w:rPr>
-              <w:t>[DATA PENDING]</w:t>
-            </w:r>
-          </w:p>
-        </w:tc>
-        <w:tc>
-          <w:tcPr>
-            <w:tcW w:type="dxa" w:w="2256"/>
-          </w:tcPr>
-          <w:p>
-            <w:r/>
-            <w:r>
-              <w:rPr>
-                <w:sz w:val="19"/>
-              </w:rPr>
-              <w:t>[DATA PENDING]</w:t>
-            </w:r>
-          </w:p>
-        </w:tc>
-      </w:tr>
-      <w:tr>
-        <w:tc>
-          <w:tcPr>
-            <w:tcW w:type="dxa" w:w="2256"/>
-          </w:tcPr>
-          <w:p>
-            <w:r/>
-            <w:r>
-              <w:rPr>
-                <w:sz w:val="19"/>
-              </w:rPr>
-              <w:t>Grade, Sauro and Lewis (2016)</w:t>
-            </w:r>
-          </w:p>
-        </w:tc>
-        <w:tc>
-          <w:tcPr>
-            <w:tcW w:type="dxa" w:w="2256"/>
-          </w:tcPr>
-          <w:p>
-            <w:r/>
-            <w:r>
-              <w:rPr>
-                <w:sz w:val="19"/>
-              </w:rPr>
-              <w:t>[DATA PENDING]</w:t>
-            </w:r>
-          </w:p>
-        </w:tc>
-        <w:tc>
-          <w:tcPr>
-            <w:tcW w:type="dxa" w:w="2256"/>
-          </w:tcPr>
-          <w:p>
-            <w:r/>
-            <w:r>
-              <w:rPr>
-                <w:sz w:val="19"/>
-              </w:rPr>
-              <w:t>[DATA PENDING]</w:t>
-            </w:r>
-          </w:p>
-        </w:tc>
-        <w:tc>
-          <w:tcPr>
-            <w:tcW w:type="dxa" w:w="2256"/>
-          </w:tcPr>
-          <w:p>
-            <w:r/>
-            <w:r>
-              <w:rPr>
-                <w:sz w:val="19"/>
-              </w:rPr>
-              <w:t>[DATA PENDING]</w:t>
-            </w:r>
-          </w:p>
-        </w:tc>
-      </w:tr>
-    </w:tbl>
-    <w:p>
-      <w:pPr>
-        <w:spacing w:after="240" w:line="360" w:lineRule="auto"/>
-        <w:jc w:val="left"/>
-      </w:pPr>
-      <w:r>
-        <w:rPr>
-          <w:i/>
-          <w:sz w:val="20"/>
-        </w:rPr>
-        <w:t>Source: questionnaire export, analysed with analyze_questionnaire.py. Not yet collected.</w:t>
-      </w:r>
-    </w:p>
-    <w:p>
-      <w:pPr>
-        <w:spacing w:after="160" w:line="360" w:lineRule="auto"/>
-        <w:jc w:val="both"/>
-      </w:pPr>
-      <w:r>
-        <w:rPr>
-          <w:i w:val="0"/>
-        </w:rPr>
-        <w:t>Table 4.3 will report the mean System Usability Scale score for each group with a 95 percent confidence interval and a one-sample t test against the benchmark of 68 recommended by Sauro and Lewis (2016). The mean will be interpreted with the adjective scale of Bangor et al. (2009) and the acceptability ranges of Bangor et al. (2008). It will also be placed on the curved grading scale of Sauro and Lewis (2016).</w:t>
-      </w:r>
-    </w:p>
-    <w:p>
-      <w:pPr>
-        <w:keepNext/>
-        <w:spacing w:after="80" w:line="360" w:lineRule="auto"/>
-        <w:jc w:val="left"/>
-      </w:pPr>
-      <w:r>
-        <w:rPr>
-          <w:b/>
-          <w:i w:val="0"/>
-        </w:rPr>
-        <w:t>Table 4.4: Acceptance items, percent agreeing or strongly agreeing</w:t>
-      </w:r>
-    </w:p>
-    <w:tbl>
-      <w:tblPr>
-        <w:tblStyle w:val="TableGrid"/>
-        <w:tblW w:type="auto" w:w="0"/>
-        <w:jc w:val="center"/>
-        <w:tblLook w:firstColumn="1" w:firstRow="1" w:lastColumn="0" w:lastRow="0" w:noHBand="0" w:noVBand="1" w:val="04A0"/>
-      </w:tblPr>
-      <w:tblGrid>
-        <w:gridCol w:w="1504"/>
-        <w:gridCol w:w="1504"/>
-        <w:gridCol w:w="1504"/>
-        <w:gridCol w:w="1504"/>
-        <w:gridCol w:w="1504"/>
-        <w:gridCol w:w="1504"/>
-      </w:tblGrid>
-      <w:tr>
-        <w:tc>
-          <w:tcPr>
-            <w:tcW w:type="dxa" w:w="1504"/>
-            <w:shd w:val="clear" w:color="auto" w:fill="D9E2E1"/>
-          </w:tcPr>
-          <w:p>
-            <w:r/>
-            <w:r>
-              <w:rPr>
-                <w:b/>
-                <w:sz w:val="19"/>
-              </w:rPr>
-              <w:t>Item</w:t>
-            </w:r>
-          </w:p>
-        </w:tc>
-        <w:tc>
-          <w:tcPr>
-            <w:tcW w:type="dxa" w:w="1504"/>
-            <w:shd w:val="clear" w:color="auto" w:fill="D9E2E1"/>
-          </w:tcPr>
-          <w:p>
-            <w:r/>
-            <w:r>
-              <w:rPr>
-                <w:b/>
-                <w:sz w:val="19"/>
-              </w:rPr>
-              <w:t>Code</w:t>
-            </w:r>
-          </w:p>
-        </w:tc>
-        <w:tc>
-          <w:tcPr>
-            <w:tcW w:type="dxa" w:w="1504"/>
-            <w:shd w:val="clear" w:color="auto" w:fill="D9E2E1"/>
-          </w:tcPr>
-          <w:p>
-            <w:r/>
-            <w:r>
-              <w:rPr>
-                <w:b/>
-                <w:sz w:val="19"/>
-              </w:rPr>
-              <w:t>Staff</w:t>
-            </w:r>
-          </w:p>
-        </w:tc>
-        <w:tc>
-          <w:tcPr>
-            <w:tcW w:type="dxa" w:w="1504"/>
-            <w:shd w:val="clear" w:color="auto" w:fill="D9E2E1"/>
-          </w:tcPr>
-          <w:p>
-            <w:r/>
-            <w:r>
-              <w:rPr>
-                <w:b/>
-                <w:sz w:val="19"/>
-              </w:rPr>
-              <w:t>Customers</w:t>
-            </w:r>
-          </w:p>
-        </w:tc>
-        <w:tc>
-          <w:tcPr>
-            <w:tcW w:type="dxa" w:w="1504"/>
-            <w:shd w:val="clear" w:color="auto" w:fill="D9E2E1"/>
-          </w:tcPr>
-          <w:p>
-            <w:r/>
-            <w:r>
-              <w:rPr>
-                <w:b/>
-                <w:sz w:val="19"/>
-              </w:rPr>
-              <w:t>All</w:t>
-            </w:r>
-          </w:p>
-        </w:tc>
-        <w:tc>
-          <w:tcPr>
-            <w:tcW w:type="dxa" w:w="1504"/>
-            <w:shd w:val="clear" w:color="auto" w:fill="D9E2E1"/>
-          </w:tcPr>
-          <w:p>
-            <w:r/>
-            <w:r>
-              <w:rPr>
-                <w:b/>
-                <w:sz w:val="19"/>
-              </w:rPr>
-              <w:t>95% CI for all</w:t>
-            </w:r>
-          </w:p>
-        </w:tc>
-      </w:tr>
-      <w:tr>
-        <w:tc>
-          <w:tcPr>
-            <w:tcW w:type="dxa" w:w="1504"/>
-          </w:tcPr>
-          <w:p>
-            <w:r/>
-            <w:r>
-              <w:rPr>
-                <w:sz w:val="19"/>
-              </w:rPr>
-              <w:t>Perceived usefulness, three items</w:t>
-            </w:r>
-          </w:p>
-        </w:tc>
-        <w:tc>
-          <w:tcPr>
-            <w:tcW w:type="dxa" w:w="1504"/>
-          </w:tcPr>
-          <w:p>
-            <w:r/>
-            <w:r>
-              <w:rPr>
-                <w:sz w:val="19"/>
-              </w:rPr>
-              <w:t>PU1 to PU3</w:t>
-            </w:r>
-          </w:p>
-        </w:tc>
-        <w:tc>
-          <w:tcPr>
-            <w:tcW w:type="dxa" w:w="1504"/>
-          </w:tcPr>
-          <w:p>
-            <w:r/>
-            <w:r>
-              <w:rPr>
-                <w:sz w:val="19"/>
-              </w:rPr>
-              <w:t>[DATA PENDING]</w:t>
-            </w:r>
-          </w:p>
-        </w:tc>
-        <w:tc>
-          <w:tcPr>
-            <w:tcW w:type="dxa" w:w="1504"/>
-          </w:tcPr>
-          <w:p>
-            <w:r/>
-            <w:r>
-              <w:rPr>
-                <w:sz w:val="19"/>
-              </w:rPr>
-              <w:t>[DATA PENDING]</w:t>
-            </w:r>
-          </w:p>
-        </w:tc>
-        <w:tc>
-          <w:tcPr>
-            <w:tcW w:type="dxa" w:w="1504"/>
-          </w:tcPr>
-          <w:p>
-            <w:r/>
-            <w:r>
-              <w:rPr>
-                <w:sz w:val="19"/>
-              </w:rPr>
-              <w:t>[DATA PENDING]</w:t>
-            </w:r>
-          </w:p>
-        </w:tc>
-        <w:tc>
-          <w:tcPr>
-            <w:tcW w:type="dxa" w:w="1504"/>
-          </w:tcPr>
-          <w:p>
-            <w:r/>
-            <w:r>
-              <w:rPr>
-                <w:sz w:val="19"/>
-              </w:rPr>
-              <w:t>[DATA PENDING]</w:t>
-            </w:r>
-          </w:p>
-        </w:tc>
-      </w:tr>
-      <w:tr>
-        <w:tc>
-          <w:tcPr>
-            <w:tcW w:type="dxa" w:w="1504"/>
-          </w:tcPr>
-          <w:p>
-            <w:r/>
-            <w:r>
-              <w:rPr>
-                <w:sz w:val="19"/>
-              </w:rPr>
-              <w:t>Ease of use compared with sending a message</w:t>
-            </w:r>
-          </w:p>
-        </w:tc>
-        <w:tc>
-          <w:tcPr>
-            <w:tcW w:type="dxa" w:w="1504"/>
-          </w:tcPr>
-          <w:p>
-            <w:r/>
-            <w:r>
-              <w:rPr>
-                <w:sz w:val="19"/>
-              </w:rPr>
-              <w:t>EOU1 to EOU3</w:t>
-            </w:r>
-          </w:p>
-        </w:tc>
-        <w:tc>
-          <w:tcPr>
-            <w:tcW w:type="dxa" w:w="1504"/>
-          </w:tcPr>
-          <w:p>
-            <w:r/>
-            <w:r>
-              <w:rPr>
-                <w:sz w:val="19"/>
-              </w:rPr>
-              <w:t>[DATA PENDING]</w:t>
-            </w:r>
-          </w:p>
-        </w:tc>
-        <w:tc>
-          <w:tcPr>
-            <w:tcW w:type="dxa" w:w="1504"/>
-          </w:tcPr>
-          <w:p>
-            <w:r/>
-            <w:r>
-              <w:rPr>
-                <w:sz w:val="19"/>
-              </w:rPr>
-              <w:t>[DATA PENDING]</w:t>
-            </w:r>
-          </w:p>
-        </w:tc>
-        <w:tc>
-          <w:tcPr>
-            <w:tcW w:type="dxa" w:w="1504"/>
-          </w:tcPr>
-          <w:p>
-            <w:r/>
-            <w:r>
-              <w:rPr>
-                <w:sz w:val="19"/>
-              </w:rPr>
-              <w:t>[DATA PENDING]</w:t>
-            </w:r>
-          </w:p>
-        </w:tc>
-        <w:tc>
-          <w:tcPr>
-            <w:tcW w:type="dxa" w:w="1504"/>
-          </w:tcPr>
-          <w:p>
-            <w:r/>
-            <w:r>
-              <w:rPr>
-                <w:sz w:val="19"/>
-              </w:rPr>
-              <w:t>[DATA PENDING]</w:t>
-            </w:r>
-          </w:p>
-        </w:tc>
-      </w:tr>
-      <w:tr>
-        <w:tc>
-          <w:tcPr>
-            <w:tcW w:type="dxa" w:w="1504"/>
-          </w:tcPr>
-          <w:p>
-            <w:r/>
-            <w:r>
-              <w:rPr>
-                <w:sz w:val="19"/>
-              </w:rPr>
-              <w:t>Intention to use</w:t>
-            </w:r>
-          </w:p>
-        </w:tc>
-        <w:tc>
-          <w:tcPr>
-            <w:tcW w:type="dxa" w:w="1504"/>
-          </w:tcPr>
-          <w:p>
-            <w:r/>
-            <w:r>
-              <w:rPr>
-                <w:sz w:val="19"/>
-              </w:rPr>
-              <w:t>BI1</w:t>
-            </w:r>
-          </w:p>
-        </w:tc>
-        <w:tc>
-          <w:tcPr>
-            <w:tcW w:type="dxa" w:w="1504"/>
-          </w:tcPr>
-          <w:p>
-            <w:r/>
-            <w:r>
-              <w:rPr>
-                <w:sz w:val="19"/>
-              </w:rPr>
-              <w:t>[DATA PENDING]</w:t>
-            </w:r>
-          </w:p>
-        </w:tc>
-        <w:tc>
-          <w:tcPr>
-            <w:tcW w:type="dxa" w:w="1504"/>
-          </w:tcPr>
-          <w:p>
-            <w:r/>
-            <w:r>
-              <w:rPr>
-                <w:sz w:val="19"/>
-              </w:rPr>
-              <w:t>[DATA PENDING]</w:t>
-            </w:r>
-          </w:p>
-        </w:tc>
-        <w:tc>
-          <w:tcPr>
-            <w:tcW w:type="dxa" w:w="1504"/>
-          </w:tcPr>
-          <w:p>
-            <w:r/>
-            <w:r>
-              <w:rPr>
-                <w:sz w:val="19"/>
-              </w:rPr>
-              <w:t>[DATA PENDING]</w:t>
-            </w:r>
-          </w:p>
-        </w:tc>
-        <w:tc>
-          <w:tcPr>
-            <w:tcW w:type="dxa" w:w="1504"/>
-          </w:tcPr>
-          <w:p>
-            <w:r/>
-            <w:r>
-              <w:rPr>
-                <w:sz w:val="19"/>
-              </w:rPr>
-              <w:t>[DATA PENDING]</w:t>
-            </w:r>
-          </w:p>
-        </w:tc>
-      </w:tr>
-      <w:tr>
-        <w:tc>
-          <w:tcPr>
-            <w:tcW w:type="dxa" w:w="1504"/>
-          </w:tcPr>
-          <w:p>
-            <w:r/>
-            <w:r>
-              <w:rPr>
-                <w:sz w:val="19"/>
-              </w:rPr>
-              <w:t>Has a device to access Verity</w:t>
-            </w:r>
-          </w:p>
-        </w:tc>
-        <w:tc>
-          <w:tcPr>
-            <w:tcW w:type="dxa" w:w="1504"/>
-          </w:tcPr>
-          <w:p>
-            <w:r/>
-            <w:r>
-              <w:rPr>
-                <w:sz w:val="19"/>
-              </w:rPr>
-              <w:t>FC1</w:t>
-            </w:r>
-          </w:p>
-        </w:tc>
-        <w:tc>
-          <w:tcPr>
-            <w:tcW w:type="dxa" w:w="1504"/>
-          </w:tcPr>
-          <w:p>
-            <w:r/>
-            <w:r>
-              <w:rPr>
-                <w:sz w:val="19"/>
-              </w:rPr>
-              <w:t>[DATA PENDING]</w:t>
-            </w:r>
-          </w:p>
-        </w:tc>
-        <w:tc>
-          <w:tcPr>
-            <w:tcW w:type="dxa" w:w="1504"/>
-          </w:tcPr>
-          <w:p>
-            <w:r/>
-            <w:r>
-              <w:rPr>
-                <w:sz w:val="19"/>
-              </w:rPr>
-              <w:t>[DATA PENDING]</w:t>
-            </w:r>
-          </w:p>
-        </w:tc>
-        <w:tc>
-          <w:tcPr>
-            <w:tcW w:type="dxa" w:w="1504"/>
-          </w:tcPr>
-          <w:p>
-            <w:r/>
-            <w:r>
-              <w:rPr>
-                <w:sz w:val="19"/>
-              </w:rPr>
-              <w:t>[DATA PENDING]</w:t>
-            </w:r>
-          </w:p>
-        </w:tc>
-        <w:tc>
-          <w:tcPr>
-            <w:tcW w:type="dxa" w:w="1504"/>
-          </w:tcPr>
-          <w:p>
-            <w:r/>
-            <w:r>
-              <w:rPr>
-                <w:sz w:val="19"/>
-              </w:rPr>
-              <w:t>[DATA PENDING]</w:t>
-            </w:r>
-          </w:p>
-        </w:tc>
-      </w:tr>
-      <w:tr>
-        <w:tc>
-          <w:tcPr>
-            <w:tcW w:type="dxa" w:w="1504"/>
-          </w:tcPr>
-          <w:p>
-            <w:r/>
-            <w:r>
-              <w:rPr>
-                <w:sz w:val="19"/>
-              </w:rPr>
-              <w:t>Has enough data or internet access</w:t>
-            </w:r>
-          </w:p>
-        </w:tc>
-        <w:tc>
-          <w:tcPr>
-            <w:tcW w:type="dxa" w:w="1504"/>
-          </w:tcPr>
-          <w:p>
-            <w:r/>
-            <w:r>
-              <w:rPr>
-                <w:sz w:val="19"/>
-              </w:rPr>
-              <w:t>FC2</w:t>
-            </w:r>
-          </w:p>
-        </w:tc>
-        <w:tc>
-          <w:tcPr>
-            <w:tcW w:type="dxa" w:w="1504"/>
-          </w:tcPr>
-          <w:p>
-            <w:r/>
-            <w:r>
-              <w:rPr>
-                <w:sz w:val="19"/>
-              </w:rPr>
-              <w:t>[DATA PENDING]</w:t>
-            </w:r>
-          </w:p>
-        </w:tc>
-        <w:tc>
-          <w:tcPr>
-            <w:tcW w:type="dxa" w:w="1504"/>
-          </w:tcPr>
-          <w:p>
-            <w:r/>
-            <w:r>
-              <w:rPr>
-                <w:sz w:val="19"/>
-              </w:rPr>
-              <w:t>[DATA PENDING]</w:t>
-            </w:r>
-          </w:p>
-        </w:tc>
-        <w:tc>
-          <w:tcPr>
-            <w:tcW w:type="dxa" w:w="1504"/>
-          </w:tcPr>
-          <w:p>
-            <w:r/>
-            <w:r>
-              <w:rPr>
-                <w:sz w:val="19"/>
-              </w:rPr>
-              <w:t>[DATA PENDING]</w:t>
-            </w:r>
-          </w:p>
-        </w:tc>
-        <w:tc>
-          <w:tcPr>
-            <w:tcW w:type="dxa" w:w="1504"/>
-          </w:tcPr>
-          <w:p>
-            <w:r/>
-            <w:r>
-              <w:rPr>
-                <w:sz w:val="19"/>
-              </w:rPr>
-              <w:t>[DATA PENDING]</w:t>
-            </w:r>
-          </w:p>
-        </w:tc>
-      </w:tr>
-      <w:tr>
-        <w:tc>
-          <w:tcPr>
-            <w:tcW w:type="dxa" w:w="1504"/>
-          </w:tcPr>
-          <w:p>
-            <w:r/>
-            <w:r>
-              <w:rPr>
-                <w:sz w:val="19"/>
-              </w:rPr>
-              <w:t>Use would be voluntary</w:t>
-            </w:r>
-          </w:p>
-        </w:tc>
-        <w:tc>
-          <w:tcPr>
-            <w:tcW w:type="dxa" w:w="1504"/>
-          </w:tcPr>
-          <w:p>
-            <w:r/>
-            <w:r>
-              <w:rPr>
-                <w:sz w:val="19"/>
-              </w:rPr>
-              <w:t>VOL1</w:t>
-            </w:r>
-          </w:p>
-        </w:tc>
-        <w:tc>
-          <w:tcPr>
-            <w:tcW w:type="dxa" w:w="1504"/>
-          </w:tcPr>
-          <w:p>
-            <w:r/>
-            <w:r>
-              <w:rPr>
-                <w:sz w:val="19"/>
-              </w:rPr>
-              <w:t>[DATA PENDING]</w:t>
-            </w:r>
-          </w:p>
-        </w:tc>
-        <w:tc>
-          <w:tcPr>
-            <w:tcW w:type="dxa" w:w="1504"/>
-          </w:tcPr>
-          <w:p>
-            <w:r/>
-            <w:r>
-              <w:rPr>
-                <w:sz w:val="19"/>
-              </w:rPr>
-              <w:t>[DATA PENDING]</w:t>
-            </w:r>
-          </w:p>
-        </w:tc>
-        <w:tc>
-          <w:tcPr>
-            <w:tcW w:type="dxa" w:w="1504"/>
-          </w:tcPr>
-          <w:p>
-            <w:r/>
-            <w:r>
-              <w:rPr>
-                <w:sz w:val="19"/>
-              </w:rPr>
-              <w:t>[DATA PENDING]</w:t>
-            </w:r>
-          </w:p>
-        </w:tc>
-        <w:tc>
-          <w:tcPr>
-            <w:tcW w:type="dxa" w:w="1504"/>
-          </w:tcPr>
-          <w:p>
-            <w:r/>
-            <w:r>
-              <w:rPr>
-                <w:sz w:val="19"/>
-              </w:rPr>
-              <w:t>[DATA PENDING]</w:t>
-            </w:r>
-          </w:p>
-        </w:tc>
-      </w:tr>
-    </w:tbl>
-    <w:p>
-      <w:pPr>
-        <w:spacing w:after="240" w:line="360" w:lineRule="auto"/>
-        <w:jc w:val="left"/>
-      </w:pPr>
-      <w:r>
-        <w:rPr>
-          <w:i/>
-          <w:sz w:val="20"/>
-        </w:rPr>
-        <w:t>Source: questionnaire export, analysed with analyze_questionnaire.py. Not yet collected.</w:t>
-      </w:r>
-    </w:p>
-    <w:p>
-      <w:pPr>
-        <w:spacing w:after="160" w:line="360" w:lineRule="auto"/>
-        <w:jc w:val="both"/>
-      </w:pPr>
-      <w:r>
-        <w:rPr>
-          <w:i w:val="0"/>
-        </w:rPr>
-        <w:t>Table 4.4 will report the share of each group agreeing with the acceptance items, with Wilson intervals, so that intention to use can be read alongside the facilitating-conditions and voluntariness items. Part I results on error types seen and requirement importance will be reported in the same way once collected, using the error-type wording that matches the fifteen planted error types of Part B.</w:t>
-      </w:r>
-    </w:p>
-    <w:p>
-      <w:pPr>
-        <w:pStyle w:val="Heading2"/>
-      </w:pPr>
-      <w:r>
-        <w:t>4.3 Part B. Implemented system and testing</w:t>
-      </w:r>
-    </w:p>
-    <w:p>
-      <w:pPr>
-        <w:pStyle w:val="Heading3"/>
-      </w:pPr>
-      <w:r>
-        <w:t>4.3.1 System components and order lifecycle</w:t>
-      </w:r>
-    </w:p>
-    <w:p>
-      <w:pPr>
-        <w:spacing w:after="160" w:line="360" w:lineRule="auto"/>
-        <w:jc w:val="both"/>
-      </w:pPr>
-      <w:r>
-        <w:rPr>
-          <w:i w:val="0"/>
-        </w:rPr>
-        <w:t>Verity is a web application with a React interface hosted on Vercel and a Supabase back end built on PostgreSQL 17. All business rules run inside the database as functions, and row-level security decides which records each signed-in user can read. Table 4.5 summarises the components that were built.</w:t>
-      </w:r>
-    </w:p>
-    <w:p>
-      <w:pPr>
-        <w:keepNext/>
-        <w:spacing w:after="80" w:line="360" w:lineRule="auto"/>
-        <w:jc w:val="left"/>
-      </w:pPr>
-      <w:r>
-        <w:rPr>
-          <w:b/>
-          <w:i w:val="0"/>
-        </w:rPr>
-        <w:t>Table 4.5: Components of the implemented system</w:t>
+        <w:t>Table 4.1: Components of the implemented system</w:t>
       </w:r>
     </w:p>
     <w:tbl>
@@ -2371,7 +411,7 @@
         <w:rPr>
           <w:i w:val="0"/>
         </w:rPr>
-        <w:t>Every order follows a lifecycle built from 17 statuses, shown in Table 4.6. The database accepts only the 36 transitions listed in its transition table, so an order cannot skip a step such as payment verification, and each change is written to the status history with the time and the user who made it.</w:t>
+        <w:t>Every order follows a lifecycle built from 17 statuses, shown in Table 4.2. The database accepts only the 36 transitions listed in its transition table, so an order cannot skip a step such as payment verification, and each change is written to the status history with the time and the user who made it.</w:t>
       </w:r>
     </w:p>
     <w:p>
@@ -2385,7 +425,7 @@
           <w:b/>
           <w:i w:val="0"/>
         </w:rPr>
-        <w:t>Table 4.6: Order lifecycle statuses in order</w:t>
+        <w:t>Table 4.2: Order lifecycle statuses in order</w:t>
       </w:r>
     </w:p>
     <w:tbl>
@@ -3217,7 +1257,7 @@
         <w:pStyle w:val="Heading3"/>
       </w:pPr>
       <w:r>
-        <w:t>4.3.2 Validation rules</w:t>
+        <w:t>4.2.2 Validation rules</w:t>
       </w:r>
     </w:p>
     <w:p>
@@ -3229,7 +1269,7 @@
         <w:rPr>
           <w:i w:val="0"/>
         </w:rPr>
-        <w:t>Validation is carried out by nine rules that run every time a customer submits an order. Seven of them block the order until the customer corrects it and two raise a warning that sends the order to a person for review. Table 4.7 maps the nine rules to the seven checks set out in Table 2.1. The customer-details check is served by two rules, one for the account status and one for the delivery address, and the unusual-quantity rule is an addition that no check in Table 2.1 requires.</w:t>
+        <w:t>Validation is carried out by nine rules that run every time a customer submits an order. Seven of them block the order until the customer corrects it and two raise a warning that sends the order to a person for review. Table 4.3 maps the nine rules to the seven checks set out in Table 2.1. The customer-details check is served by two rules, one for the account status and one for the delivery address, and the unusual-quantity rule is an addition that no check in Table 2.1 requires.</w:t>
       </w:r>
     </w:p>
     <w:p>
@@ -3243,7 +1283,7 @@
           <w:b/>
           <w:i w:val="0"/>
         </w:rPr>
-        <w:t>Table 4.7: Validation rules mapped to the seven checks of Table 2.1</w:t>
+        <w:t>Table 4.3: Validation rules mapped to the seven checks of Table 2.1</w:t>
       </w:r>
     </w:p>
     <w:tbl>
@@ -3866,7 +1906,7 @@
         <w:pStyle w:val="Heading3"/>
       </w:pPr>
       <w:r>
-        <w:t>4.3.3 Functional testing</w:t>
+        <w:t>4.2.3 Functional testing</w:t>
       </w:r>
     </w:p>
     <w:p>
@@ -3878,7 +1918,7 @@
         <w:rPr>
           <w:i w:val="0"/>
         </w:rPr>
-        <w:t>Functional testing exercised the order lifecycle end to end against the live database while acting as each role. Every test ran inside a transaction that was rolled back, so no test data remained. The fourteen cases of the earlier test run were repeated and twelve new cases were added for inactive customers, stale prices, automatic approval, CSV import and export, and webhooks. Table 4.8 lists all 26 cases. Of these, 23 passed and 3 failed.</w:t>
+        <w:t>Functional testing exercised the order lifecycle end to end against the live database while acting as each role. Every test ran inside a transaction that was rolled back, so no test data remained. The fourteen cases of the earlier test run were repeated and twelve new cases were added for inactive customers, stale prices, automatic approval, CSV import and export, and webhooks. Table 4.4 lists all 26 cases. Of these, 23 passed and 3 failed.</w:t>
       </w:r>
     </w:p>
     <w:p>
@@ -3892,7 +1932,7 @@
           <w:b/>
           <w:i w:val="0"/>
         </w:rPr>
-        <w:t>Table 4.8: Functional test cases</w:t>
+        <w:t>Table 4.4: Functional test cases</w:t>
       </w:r>
     </w:p>
     <w:tbl>
@@ -5894,7 +3934,7 @@
         <w:pStyle w:val="Heading3"/>
       </w:pPr>
       <w:r>
-        <w:t>4.3.4 Access-control testing</w:t>
+        <w:t>4.2.4 Access-control testing</w:t>
       </w:r>
     </w:p>
     <w:p>
@@ -5906,7 +3946,7 @@
         <w:rPr>
           <w:i w:val="0"/>
         </w:rPr>
-        <w:t>Access control was tested by querying the database directly as each role, bypassing the interface, so that the result shows what a user could reach even without the application screens. Table 4.9 gives the number of rows each account could read. Customers saw only their own company records and no product or audit rows, and the driver could read no business records at all. Attempts by a customer to change a price and to switch off automatic approval changed no rows.</w:t>
+        <w:t>Access control was tested by querying the database directly as each role, bypassing the interface, so that the result shows what a user could reach even without the application screens. Table 4.5 gives the number of rows each account could read. Customers saw only their own company records and no product or audit rows, and the driver could read no business records at all. Attempts by a customer to change a price and to switch off automatic approval changed no rows.</w:t>
       </w:r>
     </w:p>
     <w:p>
@@ -5920,7 +3960,7 @@
           <w:b/>
           <w:i w:val="0"/>
         </w:rPr>
-        <w:t>Table 4.9: Rows visible to each account when querying the database directly</w:t>
+        <w:t>Table 4.5: Rows visible to each account when querying the database directly</w:t>
       </w:r>
     </w:p>
     <w:tbl>
@@ -7142,7 +5182,7 @@
         <w:pStyle w:val="Heading2"/>
       </w:pPr>
       <w:r>
-        <w:t>4.4 Simulation design and dataset</w:t>
+        <w:t>4.3 Simulation design and dataset</w:t>
       </w:r>
     </w:p>
     <w:p>
@@ -7150,7 +5190,7 @@
         <w:pStyle w:val="Heading3"/>
       </w:pPr>
       <w:r>
-        <w:t>4.4.1 Procedure</w:t>
+        <w:t>4.3.1 Procedure</w:t>
       </w:r>
     </w:p>
     <w:p>
@@ -7170,7 +5210,7 @@
         <w:pStyle w:val="Heading3"/>
       </w:pPr>
       <w:r>
-        <w:t>4.4.2 Replicates and planted errors</w:t>
+        <w:t>4.3.2 Replicates and planted errors</w:t>
       </w:r>
     </w:p>
     <w:p>
@@ -7182,7 +5222,7 @@
         <w:rPr>
           <w:i w:val="0"/>
         </w:rPr>
-        <w:t>The final simulation used three replicates. Replicate 1 used the random seed 0.42 and is the headline result, while replicates 2 and 3 used the seeds 0.43 and 0.44. The further replicates show how much the measures move when the same design is drawn again. Each replicate contained 500 orders, made up of 200 clean orders and 300 erroneous orders, with 20 orders for each of fifteen planted error types. Twelve of the types are errors that a rule is designed to catch. The remaining three are realistic mistakes that no rule targets, shown at the foot of Table 4.10. Including them means the accuracy figures reflect mistakes the rules were not written for as well as those they were. Automatic approval was switched off so that every order passing validation went to the Ops Desk queue. Table 4.10 describes each planted error type.</w:t>
+        <w:t>The final simulation used three replicates. Replicate 1 used the random seed 0.42 and is the headline result, while replicates 2 and 3 used the seeds 0.43 and 0.44. The further replicates show how much the measures move when the same design is drawn again. Each replicate contained 500 orders, made up of 200 clean orders and 300 erroneous orders, with 20 orders for each of fifteen planted error types. Twelve of the types are errors that a rule is designed to catch. The remaining three are realistic mistakes that no rule targets, shown at the foot of Table 4.6. Including them means the accuracy figures reflect mistakes the rules were not written for as well as those they were. Automatic approval was switched off so that every order passing validation went to the Ops Desk queue. Table 4.6 describes each planted error type.</w:t>
       </w:r>
     </w:p>
     <w:p>
@@ -7196,7 +5236,7 @@
           <w:b/>
           <w:i w:val="0"/>
         </w:rPr>
-        <w:t>Table 4.10: Planted error types and how each was created</w:t>
+        <w:t>Table 4.6: Planted error types and how each was created</w:t>
       </w:r>
     </w:p>
     <w:tbl>
@@ -7940,7 +5980,7 @@
         <w:pStyle w:val="Heading3"/>
       </w:pPr>
       <w:r>
-        <w:t>4.4.3 Customers, catalogue and dataset</w:t>
+        <w:t>4.3.3 Customers, catalogue and dataset</w:t>
       </w:r>
     </w:p>
     <w:p>
@@ -7952,7 +5992,7 @@
         <w:rPr>
           <w:i w:val="0"/>
         </w:rPr>
-        <w:t>The simulation used the same twenty fictional customer companies and the same twelve-product catalogue as the first run. Company names, contact names, telephone numbers and e-mail addresses are invented, and every e-mail address uses the reserved .example domain. Each customer had two saved addresses in one of six delivery regions and four earlier orders, which give the unusual-quantity rule a history to compare against. Table 4.11 lists the companies and Table 4.12 describes the replicate 1 dataset. Figure 4.1 shows how the orders were spread across the delivery regions.</w:t>
+        <w:t>The simulation used the same twenty fictional customer companies and the same twelve-product catalogue as the first run. Company names, contact names, telephone numbers and e-mail addresses are invented, and every e-mail address uses the reserved .example domain. Each customer had two saved addresses in one of six delivery regions and four earlier orders, which give the unusual-quantity rule a history to compare against. Table 4.7 lists the companies and Table 4.8 describes the replicate 1 dataset. Figure 4.1 shows how the orders were spread across the delivery regions.</w:t>
       </w:r>
     </w:p>
     <w:p>
@@ -7966,7 +6006,7 @@
           <w:b/>
           <w:i w:val="0"/>
         </w:rPr>
-        <w:t>Table 4.11: Fictional customer companies used in the simulation</w:t>
+        <w:t>Table 4.7: Fictional customer companies used in the simulation</w:t>
       </w:r>
     </w:p>
     <w:tbl>
@@ -9530,7 +7570,7 @@
           <w:b/>
           <w:i w:val="0"/>
         </w:rPr>
-        <w:t>Table 4.12: Description of the replicate 1 dataset</w:t>
+        <w:t>Table 4.8: Description of the replicate 1 dataset</w:t>
       </w:r>
     </w:p>
     <w:tbl>
@@ -9996,7 +8036,7 @@
         <w:rPr>
           <w:i w:val="0"/>
         </w:rPr>
-        <w:t>Table 4.13 shows one order of each kind from replicate 1, with the decision the system took and the first message it showed. Every order of all three replicates is listed in the accompanying workbook, Verity_Simulation_Data_Final.xlsx.</w:t>
+        <w:t>Table 4.9 shows one order of each kind from replicate 1, with the decision the system took and the first message it showed. Every order of all three replicates is listed in the accompanying workbook, Verity_Simulation_Data_Final.xlsx.</w:t>
       </w:r>
     </w:p>
     <w:p>
@@ -10010,7 +8050,7 @@
           <w:b/>
           <w:i w:val="0"/>
         </w:rPr>
-        <w:t>Table 4.13: Sample of simulated orders and the decision taken, replicate 1</w:t>
+        <w:t>Table 4.9: Sample of simulated orders and the decision taken, replicate 1</w:t>
       </w:r>
     </w:p>
     <w:tbl>
@@ -11521,7 +9561,7 @@
         <w:pStyle w:val="Heading3"/>
       </w:pPr>
       <w:r>
-        <w:t>4.4.4 Relation to the first run</w:t>
+        <w:t>4.3.4 Relation to the first run</w:t>
       </w:r>
     </w:p>
     <w:p>
@@ -11541,7 +9581,7 @@
         <w:pStyle w:val="Heading2"/>
       </w:pPr>
       <w:r>
-        <w:t>4.5 Simulation results</w:t>
+        <w:t>4.4 Simulation results</w:t>
       </w:r>
     </w:p>
     <w:p>
@@ -11549,7 +9589,7 @@
         <w:pStyle w:val="Heading3"/>
       </w:pPr>
       <w:r>
-        <w:t>4.5.1 Overall outcomes</w:t>
+        <w:t>4.4.1 Overall outcomes</w:t>
       </w:r>
     </w:p>
     <w:p>
@@ -11634,7 +9674,7 @@
         <w:pStyle w:val="Heading3"/>
       </w:pPr>
       <w:r>
-        <w:t>4.5.2 Detection by planted error type</w:t>
+        <w:t>4.4.2 Detection by planted error type</w:t>
       </w:r>
     </w:p>
     <w:p>
@@ -11646,7 +9686,7 @@
         <w:rPr>
           <w:i w:val="0"/>
         </w:rPr>
-        <w:t>Table 4.14 gives the detection rate for each planted error type with a 95 percent Wilson interval, which behaves better than the simple normal interval for small groups and for rates near zero or one (Brown et al., 2001; Wilson, 1927). Every one of the twelve rule-targeted types was flagged in all 20 of its orders, and in each case by the rule designed for it. Figure 4.3 shows the same rates graphically.</w:t>
+        <w:t>Table 4.10 gives the detection rate for each planted error type with a 95 percent Wilson interval, which behaves better than the simple normal interval for small groups and for rates near zero or one (Brown et al., 2001; Wilson, 1927). Every one of the twelve rule-targeted types was flagged in all 20 of its orders, and in each case by the rule designed for it. Figure 4.3 shows the same rates graphically.</w:t>
       </w:r>
     </w:p>
     <w:p>
@@ -11660,7 +9700,7 @@
           <w:b/>
           <w:i w:val="0"/>
         </w:rPr>
-        <w:t>Table 4.14: Detection by planted error type, replicate 1</w:t>
+        <w:t>Table 4.10: Detection by planted error type, replicate 1</w:t>
       </w:r>
     </w:p>
     <w:tbl>
@@ -13246,7 +11286,7 @@
         <w:pStyle w:val="Heading3"/>
       </w:pPr>
       <w:r>
-        <w:t>4.5.3 Classification performance</w:t>
+        <w:t>4.4.3 Classification performance</w:t>
       </w:r>
     </w:p>
     <w:p>
@@ -13258,7 +11298,7 @@
         <w:rPr>
           <w:i w:val="0"/>
         </w:rPr>
-        <w:t>For the binary measures an order counts as flagged when it is warned or blocked and as positive when it carries a planted error. The primary measure uses all 300 erroneous orders against the 200 clean orders, and the secondary measure uses only the 240 rule-targeted orders against the same clean orders. Table 4.15 defines the measures. Table 4.16 gives both confusion matrices for replicate 1 and Table 4.17 gives the measures with their intervals.</w:t>
+        <w:t>For the binary measures an order counts as flagged when it is warned or blocked and as positive when it carries a planted error. The primary measure uses all 300 erroneous orders against the 200 clean orders, and the secondary measure uses only the 240 rule-targeted orders against the same clean orders. Table 4.11 defines the measures. Table 4.12 gives both confusion matrices for replicate 1 and Table 4.13 gives the measures with their intervals.</w:t>
       </w:r>
     </w:p>
     <w:p>
@@ -13272,7 +11312,7 @@
           <w:b/>
           <w:i w:val="0"/>
         </w:rPr>
-        <w:t>Table 4.15: Definitions of the classification measures</w:t>
+        <w:t>Table 4.11: Definitions of the classification measures</w:t>
       </w:r>
     </w:p>
     <w:tbl>
@@ -13626,7 +11666,7 @@
           <w:b/>
           <w:i w:val="0"/>
         </w:rPr>
-        <w:t>Table 4.16: Confusion matrices, replicate 1</w:t>
+        <w:t>Table 4.12: Confusion matrices, replicate 1</w:t>
       </w:r>
     </w:p>
     <w:tbl>
@@ -13939,7 +11979,7 @@
           <w:b/>
           <w:i w:val="0"/>
         </w:rPr>
-        <w:t>Table 4.17: Validation measures with 95 percent Wilson intervals, replicate 1</w:t>
+        <w:t>Table 4.13: Validation measures with 95 percent Wilson intervals, replicate 1</w:t>
       </w:r>
     </w:p>
     <w:tbl>
@@ -14566,7 +12606,7 @@
         <w:pStyle w:val="Heading3"/>
       </w:pPr>
       <w:r>
-        <w:t>4.5.4 Rule activity and false alarms</w:t>
+        <w:t>4.4.4 Rule activity and false alarms</w:t>
       </w:r>
     </w:p>
     <w:p>
@@ -14578,7 +12618,7 @@
         <w:rPr>
           <w:i w:val="0"/>
         </w:rPr>
-        <w:t>Table 4.18 shows how often each rule fired. The seven blocking rules fired only on erroneous orders and never on a clean one. The stock rule also fired on the 40 orders whose quantity was above the maximum or whose product was discontinued, because both also exceed the stock on hand. All 28 false alarms on clean orders came from the two warning rules, 27 from the unusual-quantity rule and 1 from the duplicate rule. The unusual-quantity rule fired on 94 orders in all, and on 13.5 percent of clean orders. Figure 4.5 shows the same counts by kind of order.</w:t>
+        <w:t>Table 4.14 shows how often each rule fired. The seven blocking rules fired only on erroneous orders and never on a clean one. The stock rule also fired on the 40 orders whose quantity was above the maximum or whose product was discontinued, because both also exceed the stock on hand. All 28 false alarms on clean orders came from the two warning rules, 27 from the unusual-quantity rule and 1 from the duplicate rule. The unusual-quantity rule fired on 94 orders in all, and on 13.5 percent of clean orders. Figure 4.5 shows the same counts by kind of order.</w:t>
       </w:r>
     </w:p>
     <w:p>
@@ -14592,7 +12632,7 @@
           <w:b/>
           <w:i w:val="0"/>
         </w:rPr>
-        <w:t>Table 4.18: Rule activity and false alarms, replicate 1</w:t>
+        <w:t>Table 4.14: Rule activity and false alarms, replicate 1</w:t>
       </w:r>
     </w:p>
     <w:tbl>
@@ -15709,7 +13749,7 @@
         <w:pStyle w:val="Heading3"/>
       </w:pPr>
       <w:r>
-        <w:t>4.5.5 Processing time</w:t>
+        <w:t>4.4.5 Processing time</w:t>
       </w:r>
     </w:p>
     <w:p>
@@ -15721,7 +13761,7 @@
         <w:rPr>
           <w:i w:val="0"/>
         </w:rPr>
-        <w:t>Validation time was measured as the clock time of submit_order inside the database, which validates the order and records the status change. It excludes network time and any time a person spends. Table 4.19 gives the statistics for replicate 1 and Figure 4.6 shows their distribution. The standard deviation is the sample value. The mean was 28.72 ms and the median 22.16 ms, with a 95th percentile of 74.72 ms and a maximum of 124.31 ms. The time measured from the draft event to the last event in the status history gave a mean of 29.78 ms over the 478 orders that had more than one event.</w:t>
+        <w:t>Validation time was measured as the clock time of submit_order inside the database, which validates the order and records the status change. It excludes network time and any time a person spends. Table 4.15 gives the statistics for replicate 1 and Figure 4.6 shows their distribution. The standard deviation is the sample value. The mean was 28.72 ms and the median 22.16 ms, with a 95th percentile of 74.72 ms and a maximum of 124.31 ms. The time measured from the draft event to the last event in the status history gave a mean of 29.78 ms over the 478 orders that had more than one event.</w:t>
       </w:r>
     </w:p>
     <w:p>
@@ -15735,7 +13775,7 @@
           <w:b/>
           <w:i w:val="0"/>
         </w:rPr>
-        <w:t>Table 4.19: Validation time per order in milliseconds, replicate 1</w:t>
+        <w:t>Table 4.15: Validation time per order in milliseconds, replicate 1</w:t>
       </w:r>
     </w:p>
     <w:tbl>
@@ -16499,7 +14539,7 @@
         <w:pStyle w:val="Heading3"/>
       </w:pPr>
       <w:r>
-        <w:t>4.5.6 Variation between replicates</w:t>
+        <w:t>4.4.6 Variation between replicates</w:t>
       </w:r>
     </w:p>
     <w:p>
@@ -16511,7 +14551,7 @@
         <w:rPr>
           <w:i w:val="0"/>
         </w:rPr>
-        <w:t>Table 4.20 sets the key measures of the three replicates side by side. No accuracy or detection measure moved by more than 1.7 percentage points between replicates, so the headline figures do not depend on the particular seed. The timing measures moved by an order of magnitude, as described above.</w:t>
+        <w:t>Table 4.16 sets the key measures of the three replicates side by side. No accuracy or detection measure moved by more than 1.7 percentage points between replicates, so the headline figures do not depend on the particular seed. The timing measures moved by an order of magnitude, as described above.</w:t>
       </w:r>
     </w:p>
     <w:p>
@@ -16525,7 +14565,7 @@
           <w:b/>
           <w:i w:val="0"/>
         </w:rPr>
-        <w:t>Table 4.20: Key measures in each replicate</w:t>
+        <w:t>Table 4.16: Key measures in each replicate</w:t>
       </w:r>
     </w:p>
     <w:tbl>
@@ -17723,7 +15763,7 @@
         <w:pStyle w:val="Heading3"/>
       </w:pPr>
       <w:r>
-        <w:t>4.5.7 Sensitivity of the unusual-quantity warning</w:t>
+        <w:t>4.4.7 Sensitivity of the unusual-quantity warning</w:t>
       </w:r>
     </w:p>
     <w:p>
@@ -17735,7 +15775,7 @@
         <w:rPr>
           <w:i w:val="0"/>
         </w:rPr>
-        <w:t>Because the unusual-quantity rule caused nearly all false alarms and also caught the quantity slips, its setting was examined. Replicate 1 was replayed through the live functions with the threshold set from three to five times the customer's average in steps of one, and with four or ten earlier orders per customer. The replay with the live setting reproduced replicate 1 exactly, with no difference in any order, so the six settings in Table 4.21 are compared on identical orders. These runs are for discussion only and the live setting was left at three.</w:t>
+        <w:t>Because the unusual-quantity rule caused nearly all false alarms and also caught the quantity slips, its setting was examined. Replicate 1 was replayed through the live functions with the threshold set from three to five times the customer's average in steps of one, and with four or ten earlier orders per customer. The replay with the live setting reproduced replicate 1 exactly, with no difference in any order, so the six settings in Table 4.17 are compared on identical orders. These runs are for discussion only and the live setting was left at three.</w:t>
       </w:r>
     </w:p>
     <w:p>
@@ -17749,7 +15789,7 @@
           <w:b/>
           <w:i w:val="0"/>
         </w:rPr>
-        <w:t>Table 4.21: Unusual-quantity sensitivity on replicate 1</w:t>
+        <w:t>Table 4.17: Unusual-quantity sensitivity on replicate 1</w:t>
       </w:r>
     </w:p>
     <w:tbl>
@@ -18780,7 +16820,7 @@
         <w:pStyle w:val="Heading3"/>
       </w:pPr>
       <w:r>
-        <w:t>4.5.8 Mandatory-field completion</w:t>
+        <w:t>4.4.8 Mandatory-field completion</w:t>
       </w:r>
     </w:p>
     <w:p>
@@ -18800,7 +16840,7 @@
         <w:pStyle w:val="Heading2"/>
       </w:pPr>
       <w:r>
-        <w:t>4.6 Integrated evaluation and discussion</w:t>
+        <w:t>4.5 Evaluation against the success criteria and discussion</w:t>
       </w:r>
     </w:p>
     <w:p>
@@ -18808,7 +16848,7 @@
         <w:pStyle w:val="Heading3"/>
       </w:pPr>
       <w:r>
-        <w:t>4.6.1 Evaluation against the objectives</w:t>
+        <w:t>4.5.1 Evaluation against the objectives</w:t>
       </w:r>
     </w:p>
     <w:p>
@@ -18820,7 +16860,7 @@
         <w:rPr>
           <w:i w:val="0"/>
         </w:rPr>
-        <w:t>Table 4.22 sets each objective against its success criterion. The wording of the objectives in Chapter One was not available when this chapter was drafted, so the table marks where that wording must be inserted and describes each objective in brief. Objective 1 is not listed because its criterion was not supplied.</w:t>
+        <w:t>Table 4.18 sets each objective against its success criterion. The wording of the objectives in Chapter One was not available when this chapter was drafted, so the table marks where that wording must be inserted and describes each objective in brief. Objective 1 is not listed because its criterion was not supplied.</w:t>
       </w:r>
     </w:p>
     <w:p>
@@ -18834,7 +16874,7 @@
           <w:b/>
           <w:i w:val="0"/>
         </w:rPr>
-        <w:t>Table 4.22: Objectives and success criteria</w:t>
+        <w:t>Table 4.18: Objectives and success criteria</w:t>
       </w:r>
     </w:p>
     <w:tbl>
@@ -19232,78 +17272,6 @@
               <w:rPr>
                 <w:sz w:val="17"/>
               </w:rPr>
-              <w:t>[EXACT CHAPTER ONE WORDING NEEDED] Objective 5, usability and acceptance</w:t>
-            </w:r>
-          </w:p>
-        </w:tc>
-        <w:tc>
-          <w:tcPr>
-            <w:tcW w:type="dxa" w:w="1814"/>
-          </w:tcPr>
-          <w:p>
-            <w:r/>
-            <w:r>
-              <w:rPr>
-                <w:sz w:val="17"/>
-              </w:rPr>
-              <w:t>Usability and acceptance shown by the questionnaire</w:t>
-            </w:r>
-          </w:p>
-        </w:tc>
-        <w:tc>
-          <w:tcPr>
-            <w:tcW w:type="dxa" w:w="2721"/>
-          </w:tcPr>
-          <w:p>
-            <w:r/>
-            <w:r>
-              <w:rPr>
-                <w:sz w:val="17"/>
-              </w:rPr>
-              <w:t>[DATA PENDING]</w:t>
-            </w:r>
-          </w:p>
-        </w:tc>
-        <w:tc>
-          <w:tcPr>
-            <w:tcW w:type="dxa" w:w="1247"/>
-          </w:tcPr>
-          <w:p>
-            <w:r/>
-            <w:r>
-              <w:rPr>
-                <w:sz w:val="17"/>
-              </w:rPr>
-              <w:t>[DATA PENDING]</w:t>
-            </w:r>
-          </w:p>
-        </w:tc>
-        <w:tc>
-          <w:tcPr>
-            <w:tcW w:type="dxa" w:w="737"/>
-          </w:tcPr>
-          <w:p>
-            <w:r/>
-            <w:r>
-              <w:rPr>
-                <w:sz w:val="17"/>
-              </w:rPr>
-              <w:t>Pending</w:t>
-            </w:r>
-          </w:p>
-        </w:tc>
-      </w:tr>
-      <w:tr>
-        <w:tc>
-          <w:tcPr>
-            <w:tcW w:type="dxa" w:w="2551"/>
-          </w:tcPr>
-          <w:p>
-            <w:r/>
-            <w:r>
-              <w:rPr>
-                <w:sz w:val="17"/>
-              </w:rPr>
               <w:t>[EXACT CHAPTER ONE WORDING NEEDED] Objective 5, simulated orders</w:t>
             </w:r>
           </w:p>
@@ -19376,7 +17344,7 @@
           <w:i/>
           <w:sz w:val="20"/>
         </w:rPr>
-        <w:t>Source: Sections 4.2 to 4.5. Accuracy judged on the primary measure with the secondary measure in support.</w:t>
+        <w:t>Source: Sections 4.2 to 4.4. Accuracy judged on the primary measure with the secondary measure in support.</w:t>
       </w:r>
     </w:p>
     <w:p>
@@ -19388,7 +17356,7 @@
         <w:rPr>
           <w:i w:val="0"/>
         </w:rPr>
-        <w:t>The accuracy objective is rated Partly met. On the primary measure accuracy did not reach 90 percent in any replicate, and the upper end of the replicate 1 interval was 89.8 percent. On the rule-targeted errors it exceeded 90 percent in every replicate and the whole interval lay above the target. Both measures share the same false alarms, so the gap between them comes from the 36 errors without a rule that were missed, 30 of them wrong products or wrong addresses. The mandatory-fields criterion is Met. The error-reduction and speed criteria remain Pending until the manual baseline is run and scored with analyze_baseline.py. Below about 80 paired orders that comparison of errors will be indicative only. Usability and acceptance remain Pending until the questionnaire data exist.</w:t>
+        <w:t>The accuracy objective is rated Partly met. On the primary measure accuracy did not reach 90 percent in any replicate, and the upper end of the replicate 1 interval was 89.8 percent. On the rule-targeted errors it exceeded 90 percent in every replicate and the whole interval lay above the target. Both measures share the same false alarms, so the gap between them comes from the 36 errors without a rule that were missed, 30 of them wrong products or wrong addresses. The mandatory-fields criterion is Met. The error-reduction and speed criteria remain Pending until the manual baseline is run and scored with analyze_baseline.py. Below about 80 paired orders that comparison of errors will be indicative only.</w:t>
       </w:r>
     </w:p>
     <w:p>
@@ -19396,7 +17364,7 @@
         <w:pStyle w:val="Heading3"/>
       </w:pPr>
       <w:r>
-        <w:t>4.6.2 Answers to the research questions</w:t>
+        <w:t>4.5.2 Answers to the research questions</w:t>
       </w:r>
     </w:p>
     <w:p>
@@ -19420,7 +17388,7 @@
         <w:rPr>
           <w:i w:val="0"/>
         </w:rPr>
-        <w:t>Research question 1. [EXACT CHAPTER ONE WORDING NEEDED] The implemented system shows that order entry, validation, approval, payment, picking and delivery can be run as one controlled lifecycle of 17 statuses with role-based access, and 23 of 26 functional tests passed. The failed tests concern features that are missing or incomplete, and Section 4.3 reports each of them.</w:t>
+        <w:t>Research question 1. [EXACT CHAPTER ONE WORDING NEEDED] The implemented system shows that order entry, validation, approval, payment, picking and delivery can be run as one controlled lifecycle of 17 statuses with role-based access, and 23 of 26 functional tests passed. The failed tests concern features that are missing or incomplete, and Section 4.2 reports each of them.</w:t>
       </w:r>
     </w:p>
     <w:p>
@@ -19468,7 +17436,15 @@
         <w:rPr>
           <w:i w:val="0"/>
         </w:rPr>
-        <w:t>Research question 5. [EXACT CHAPTER ONE WORDING NEEDED] The answer on usability and acceptance depends on the questionnaire and is [DATA PENDING].</w:t>
+        <w:t>Research question 5. [EXACT CHAPTER ONE WORDING NEEDED] Usability and acceptance are answered from the questionnaire, which is reported separately. The technical evaluation contributes the 500 simulated orders per replicate that this objective also requires.</w:t>
+      </w:r>
+    </w:p>
+    <w:p>
+      <w:pPr>
+        <w:pStyle w:val="Heading3"/>
+      </w:pPr>
+      <w:r>
+        <w:t>4.5.3 Discussion</w:t>
       </w:r>
     </w:p>
     <w:p>
@@ -19480,27 +17456,7 @@
         <w:rPr>
           <w:i w:val="0"/>
         </w:rPr>
-        <w:t>The link between Part A and Part B, for example whether the errors respondents report most often are those the engine catches, can only be drawn once the questionnaire has been completed and is [DATA PENDING].</w:t>
-      </w:r>
-    </w:p>
-    <w:p>
-      <w:pPr>
-        <w:pStyle w:val="Heading3"/>
-      </w:pPr>
-      <w:r>
-        <w:t>4.6.3 Discussion</w:t>
-      </w:r>
-    </w:p>
-    <w:p>
-      <w:pPr>
-        <w:spacing w:after="160" w:line="360" w:lineRule="auto"/>
-        <w:jc w:val="both"/>
-      </w:pPr>
-      <w:r>
-        <w:rPr>
-          <w:i w:val="0"/>
-        </w:rPr>
-        <w:t>The DeLone and McLean (2003) model of information systems success offers a frame for these results. It links the qualities of a system to its use and to user satisfaction, and through these to net benefits. Part B gives evidence on system quality. The engine stopped every planted error that a rule targets and responded within a fraction of a second, although its response time grew as order volume grew in two of the replicates. On information quality, each message stated the problem in plain words and named the product where the problem lay on a line, which the questionnaire can test from the user side, yet 28 of the 200 clean orders received a warning that turned out to be unnecessary. False alarms of this kind cost staff time and can teach users to ignore warnings, so they weigh against the net benefits the model predicts. Service quality, use, user satisfaction and the net benefits themselves rest on the questionnaire and the manual baseline, and remain to be assessed.</w:t>
+        <w:t>The DeLone and McLean (2003) model of information systems success offers a frame for these results. It links the qualities of a system to its use and to user satisfaction, and through these to net benefits. The technical evaluation gives evidence on system quality. The engine stopped every planted error that a rule targets and responded within a fraction of a second, although its response time grew as order volume grew in two of the replicates. On information quality, each message stated the problem in plain words and named the product where the problem lay on a line, yet 28 of the 200 clean orders received a warning that turned out to be unnecessary. False alarms of this kind cost staff time and can teach users to ignore warnings, so they weigh against the net benefits the model predicts. Service quality, use, user satisfaction and the net benefits themselves rest on the questionnaire and the manual baseline, and remain to be assessed.</w:t>
       </w:r>
     </w:p>
     <w:p>
@@ -19520,7 +17476,7 @@
         <w:pStyle w:val="Heading2"/>
       </w:pPr>
       <w:r>
-        <w:t>4.7 Limitations</w:t>
+        <w:t>4.6 Limitations</w:t>
       </w:r>
     </w:p>
     <w:p>
@@ -19604,7 +17560,7 @@
         <w:rPr>
           <w:i w:val="0"/>
         </w:rPr>
-        <w:t>The questionnaire and the manual baseline had not been carried out, so the objectives on error reduction, speed, usability and acceptance could not be assessed.</w:t>
+        <w:t>The comparison with manual order entry had not been carried out, so the objectives on error reduction and speed could not be assessed.</w:t>
       </w:r>
     </w:p>
     <w:p>
@@ -19624,7 +17580,7 @@
         <w:pStyle w:val="Heading2"/>
       </w:pPr>
       <w:r>
-        <w:t>4.8 Summary</w:t>
+        <w:t>4.7 Summary</w:t>
       </w:r>
     </w:p>
     <w:p>
@@ -19636,7 +17592,7 @@
         <w:rPr>
           <w:i w:val="0"/>
         </w:rPr>
-        <w:t>Verity was built as a working order processing system with a controlled order lifecycle and nine validation rules, protected by role-based access. Of 26 functional tests, 23 passed and the 3 failures were reported. In three replicates of 500 simulated orders the engine flagged every error that a rule targets, and accuracy on that basis was between 93.0 and 93.6 percent. When realistic errors that no rule targets were included, accuracy was between 86.8 and 87.2 percent, below the 90 percent target. Nearly all false alarms came from the unusual-quantity warning, which also caught most quantity slips. Every order that reached approval had its mandatory fields. The questionnaire and the manual baseline remain to be carried out, and the objectives that depend on them are Pending.</w:t>
+        <w:t>Verity was built as a working order processing system with a controlled order lifecycle and nine validation rules, protected by role-based access. Of 26 functional tests, 23 passed and the 3 failures were reported. In three replicates of 500 simulated orders the engine flagged every error that a rule targets, and accuracy on that basis was between 93.0 and 93.6 percent. When realistic errors that no rule targets were included, accuracy was between 86.8 and 87.2 percent, below the 90 percent target. Nearly all false alarms came from the unusual-quantity warning, which also caught most quantity slips. Every order that reached approval had its mandatory fields. The comparison with manual entry remains to be carried out, and the objectives on error reduction and speed are Pending until it is.</w:t>
       </w:r>
     </w:p>
     <w:p>
@@ -19645,45 +17601,6 @@
       </w:pPr>
       <w:r>
         <w:t>References</w:t>
-      </w:r>
-    </w:p>
-    <w:p>
-      <w:pPr>
-        <w:spacing w:after="160" w:line="360" w:lineRule="auto"/>
-        <w:ind w:left="720" w:hanging="720"/>
-        <w:jc w:val="left"/>
-      </w:pPr>
-      <w:r>
-        <w:rPr>
-          <w:i w:val="0"/>
-        </w:rPr>
-        <w:t>Bangor, A., Kortum, P. T., &amp; Miller, J. T. (2008). An empirical evaluation of the System Usability Scale. International Journal of Human–Computer Interaction, 24(6), 574–594. https://doi.org/10.1080/10447310802205776</w:t>
-      </w:r>
-    </w:p>
-    <w:p>
-      <w:pPr>
-        <w:spacing w:after="160" w:line="360" w:lineRule="auto"/>
-        <w:ind w:left="720" w:hanging="720"/>
-        <w:jc w:val="left"/>
-      </w:pPr>
-      <w:r>
-        <w:rPr>
-          <w:i w:val="0"/>
-        </w:rPr>
-        <w:t>Bangor, A., Kortum, P., &amp; Miller, J. (2009). Determining what individual SUS scores mean: Adding an adjective rating scale. Journal of Usability Studies, 4(3), 114–123.</w:t>
-      </w:r>
-    </w:p>
-    <w:p>
-      <w:pPr>
-        <w:spacing w:after="160" w:line="360" w:lineRule="auto"/>
-        <w:ind w:left="720" w:hanging="720"/>
-        <w:jc w:val="left"/>
-      </w:pPr>
-      <w:r>
-        <w:rPr>
-          <w:i w:val="0"/>
-        </w:rPr>
-        <w:t>Brooke, J. (1996). SUS: A "quick and dirty" usability scale. In P. W. Jordan, B. Thomas, B. A. Weerdmeester, &amp; I. L. McClelland (Eds.), Usability evaluation in industry (pp. 189–194). Taylor &amp; Francis.</w:t>
       </w:r>
     </w:p>
     <w:p>
@@ -19709,59 +17626,7 @@
         <w:rPr>
           <w:i w:val="0"/>
         </w:rPr>
-        <w:t>Cronbach, L. J. (1951). Coefficient alpha and the internal structure of tests. Psychometrika, 16(3), 297–334. https://doi.org/10.1007/BF02310555</w:t>
-      </w:r>
-    </w:p>
-    <w:p>
-      <w:pPr>
-        <w:spacing w:after="160" w:line="360" w:lineRule="auto"/>
-        <w:ind w:left="720" w:hanging="720"/>
-        <w:jc w:val="left"/>
-      </w:pPr>
-      <w:r>
-        <w:rPr>
-          <w:i w:val="0"/>
-        </w:rPr>
-        <w:t>Davis, F. D. (1989). Perceived usefulness, perceived ease of use, and user acceptance of information technology. MIS Quarterly, 13(3), 319–340. https://doi.org/10.2307/249008</w:t>
-      </w:r>
-    </w:p>
-    <w:p>
-      <w:pPr>
-        <w:spacing w:after="160" w:line="360" w:lineRule="auto"/>
-        <w:ind w:left="720" w:hanging="720"/>
-        <w:jc w:val="left"/>
-      </w:pPr>
-      <w:r>
-        <w:rPr>
-          <w:i w:val="0"/>
-        </w:rPr>
         <w:t>DeLone, W. H., &amp; McLean, E. R. (2003). The DeLone and McLean model of information systems success: A ten-year update. Journal of Management Information Systems, 19(4), 9–30. https://doi.org/10.1080/07421222.2003.11045748</w:t>
-      </w:r>
-    </w:p>
-    <w:p>
-      <w:pPr>
-        <w:spacing w:after="160" w:line="360" w:lineRule="auto"/>
-        <w:ind w:left="720" w:hanging="720"/>
-        <w:jc w:val="left"/>
-      </w:pPr>
-      <w:r>
-        <w:rPr>
-          <w:i w:val="0"/>
-        </w:rPr>
-        <w:t>Sauro, J., &amp; Lewis, J. R. (2016). Quantifying the user experience: Practical statistics for user research (2nd ed.). Morgan Kaufmann.</w:t>
-      </w:r>
-    </w:p>
-    <w:p>
-      <w:pPr>
-        <w:spacing w:after="160" w:line="360" w:lineRule="auto"/>
-        <w:ind w:left="720" w:hanging="720"/>
-        <w:jc w:val="left"/>
-      </w:pPr>
-      <w:r>
-        <w:rPr>
-          <w:i w:val="0"/>
-        </w:rPr>
-        <w:t>Venkatesh, V., Morris, M. G., Davis, G. B., &amp; Davis, F. D. (2003). User acceptance of information technology: Toward a unified view. MIS Quarterly, 27(3), 425–478. https://doi.org/10.2307/30036540</w:t>
       </w:r>
     </w:p>
     <w:p>

</xml_diff>

<commit_message>
Chapter Four: use Chapter One objectives and research questions, link discussion to Chapter Two
Co-Authored-By: Claude Opus 5.5 <noreply@anthropic.com>
Claude-Session: https://claude.ai/code/session_0116ePZsFh2Yr8B4s3JdZBxN
</commit_message>
<xml_diff>
--- a/docs/chapter4_final/08_chapter/Chapter_Four.docx
+++ b/docs/chapter4_final/08_chapter/Chapter_Four.docx
@@ -52,7 +52,7 @@
                 <w:i/>
                 <w:sz w:val="20"/>
               </w:rPr>
-              <w:t>Note for the group. This draft covers the technical part of Chapter Four, the system, its testing and the simulation. The questionnaire results are written separately and can be inserted as their own section. Results that depend on the manual-entry comparison are marked [DATA PENDING], and [EXACT CHAPTER ONE WORDING NEEDED] marks where the Chapter One wording goes. Delete this note before submission.</w:t>
+              <w:t>Note for the group. This draft covers the technical part of Chapter Four, the system, its testing and the simulation. The questionnaire results are written separately and can be inserted as their own section. Results that depend on the manual-entry comparison are marked [DATA PENDING]. Delete this note before submission.</w:t>
             </w:r>
           </w:p>
         </w:tc>
@@ -138,11 +138,12 @@
         <w:tblStyle w:val="TableGrid"/>
         <w:tblW w:type="auto" w:w="0"/>
         <w:jc w:val="center"/>
+        <w:tblLayout w:type="fixed"/>
         <w:tblLook w:firstColumn="1" w:firstRow="1" w:lastColumn="0" w:lastRow="0" w:noHBand="0" w:noVBand="1" w:val="04A0"/>
       </w:tblPr>
       <w:tblGrid>
-        <w:gridCol w:w="4513"/>
-        <w:gridCol w:w="4513"/>
+        <w:gridCol w:w="2268"/>
+        <w:gridCol w:w="6804"/>
       </w:tblGrid>
       <w:tr>
         <w:tc>
@@ -433,12 +434,13 @@
         <w:tblStyle w:val="TableGrid"/>
         <w:tblW w:type="auto" w:w="0"/>
         <w:jc w:val="center"/>
+        <w:tblLayout w:type="fixed"/>
         <w:tblLook w:firstColumn="1" w:firstRow="1" w:lastColumn="0" w:lastRow="0" w:noHBand="0" w:noVBand="1" w:val="04A0"/>
       </w:tblPr>
       <w:tblGrid>
-        <w:gridCol w:w="3009"/>
-        <w:gridCol w:w="3009"/>
-        <w:gridCol w:w="3009"/>
+        <w:gridCol w:w="680"/>
+        <w:gridCol w:w="2268"/>
+        <w:gridCol w:w="6123"/>
       </w:tblGrid>
       <w:tr>
         <w:tc>
@@ -1291,18 +1293,20 @@
         <w:tblStyle w:val="TableGrid"/>
         <w:tblW w:type="auto" w:w="0"/>
         <w:jc w:val="center"/>
+        <w:tblLayout w:type="fixed"/>
         <w:tblLook w:firstColumn="1" w:firstRow="1" w:lastColumn="0" w:lastRow="0" w:noHBand="0" w:noVBand="1" w:val="04A0"/>
       </w:tblPr>
       <w:tblGrid>
-        <w:gridCol w:w="2256"/>
-        <w:gridCol w:w="2256"/>
-        <w:gridCol w:w="2256"/>
-        <w:gridCol w:w="2256"/>
+        <w:gridCol w:w="1814"/>
+        <w:gridCol w:w="3402"/>
+        <w:gridCol w:w="1020"/>
+        <w:gridCol w:w="1474"/>
+        <w:gridCol w:w="1360"/>
       </w:tblGrid>
       <w:tr>
         <w:tc>
           <w:tcPr>
-            <w:tcW w:type="dxa" w:w="1984"/>
+            <w:tcW w:type="dxa" w:w="1814"/>
             <w:shd w:val="clear" w:color="auto" w:fill="D9E2E1"/>
           </w:tcPr>
           <w:p>
@@ -1318,7 +1322,7 @@
         </w:tc>
         <w:tc>
           <w:tcPr>
-            <w:tcW w:type="dxa" w:w="3969"/>
+            <w:tcW w:type="dxa" w:w="3402"/>
             <w:shd w:val="clear" w:color="auto" w:fill="D9E2E1"/>
           </w:tcPr>
           <w:p>
@@ -1334,7 +1338,7 @@
         </w:tc>
         <w:tc>
           <w:tcPr>
-            <w:tcW w:type="dxa" w:w="1134"/>
+            <w:tcW w:type="dxa" w:w="1020"/>
             <w:shd w:val="clear" w:color="auto" w:fill="D9E2E1"/>
           </w:tcPr>
           <w:p>
@@ -1350,7 +1354,7 @@
         </w:tc>
         <w:tc>
           <w:tcPr>
-            <w:tcW w:type="dxa" w:w="1984"/>
+            <w:tcW w:type="dxa" w:w="1474"/>
             <w:shd w:val="clear" w:color="auto" w:fill="D9E2E1"/>
           </w:tcPr>
           <w:p>
@@ -1361,6 +1365,22 @@
                 <w:sz w:val="19"/>
               </w:rPr>
               <w:t>Check in Table 2.1</w:t>
+            </w:r>
+          </w:p>
+        </w:tc>
+        <w:tc>
+          <w:tcPr>
+            <w:tcW w:type="dxa" w:w="1361"/>
+            <w:shd w:val="clear" w:color="auto" w:fill="D9E2E1"/>
+          </w:tcPr>
+          <w:p>
+            <w:r/>
+            <w:r>
+              <w:rPr>
+                <w:b/>
+                <w:sz w:val="19"/>
+              </w:rPr>
+              <w:t>Data quality dimension in Table 2.1</w:t>
             </w:r>
           </w:p>
         </w:tc>
@@ -1368,7 +1388,7 @@
       <w:tr>
         <w:tc>
           <w:tcPr>
-            <w:tcW w:type="dxa" w:w="1984"/>
+            <w:tcW w:type="dxa" w:w="1814"/>
           </w:tcPr>
           <w:p>
             <w:r/>
@@ -1382,7 +1402,7 @@
         </w:tc>
         <w:tc>
           <w:tcPr>
-            <w:tcW w:type="dxa" w:w="3969"/>
+            <w:tcW w:type="dxa" w:w="3402"/>
           </w:tcPr>
           <w:p>
             <w:r/>
@@ -1396,7 +1416,7 @@
         </w:tc>
         <w:tc>
           <w:tcPr>
-            <w:tcW w:type="dxa" w:w="1134"/>
+            <w:tcW w:type="dxa" w:w="1020"/>
           </w:tcPr>
           <w:p>
             <w:r/>
@@ -1410,7 +1430,7 @@
         </w:tc>
         <w:tc>
           <w:tcPr>
-            <w:tcW w:type="dxa" w:w="1984"/>
+            <w:tcW w:type="dxa" w:w="1474"/>
           </w:tcPr>
           <w:p>
             <w:r/>
@@ -1419,6 +1439,20 @@
                 <w:sz w:val="19"/>
               </w:rPr>
               <w:t>Mandatory fields</w:t>
+            </w:r>
+          </w:p>
+        </w:tc>
+        <w:tc>
+          <w:tcPr>
+            <w:tcW w:type="dxa" w:w="1361"/>
+          </w:tcPr>
+          <w:p>
+            <w:r/>
+            <w:r>
+              <w:rPr>
+                <w:sz w:val="19"/>
+              </w:rPr>
+              <w:t>Completeness</w:t>
             </w:r>
           </w:p>
         </w:tc>
@@ -1426,7 +1460,7 @@
       <w:tr>
         <w:tc>
           <w:tcPr>
-            <w:tcW w:type="dxa" w:w="1984"/>
+            <w:tcW w:type="dxa" w:w="1814"/>
           </w:tcPr>
           <w:p>
             <w:r/>
@@ -1440,7 +1474,7 @@
         </w:tc>
         <w:tc>
           <w:tcPr>
-            <w:tcW w:type="dxa" w:w="3969"/>
+            <w:tcW w:type="dxa" w:w="3402"/>
           </w:tcPr>
           <w:p>
             <w:r/>
@@ -1454,7 +1488,7 @@
         </w:tc>
         <w:tc>
           <w:tcPr>
-            <w:tcW w:type="dxa" w:w="1134"/>
+            <w:tcW w:type="dxa" w:w="1020"/>
           </w:tcPr>
           <w:p>
             <w:r/>
@@ -1468,7 +1502,7 @@
         </w:tc>
         <w:tc>
           <w:tcPr>
-            <w:tcW w:type="dxa" w:w="1984"/>
+            <w:tcW w:type="dxa" w:w="1474"/>
           </w:tcPr>
           <w:p>
             <w:r/>
@@ -1477,6 +1511,20 @@
                 <w:sz w:val="19"/>
               </w:rPr>
               <w:t>SKU</w:t>
+            </w:r>
+          </w:p>
+        </w:tc>
+        <w:tc>
+          <w:tcPr>
+            <w:tcW w:type="dxa" w:w="1361"/>
+          </w:tcPr>
+          <w:p>
+            <w:r/>
+            <w:r>
+              <w:rPr>
+                <w:sz w:val="19"/>
+              </w:rPr>
+              <w:t>Accuracy</w:t>
             </w:r>
           </w:p>
         </w:tc>
@@ -1484,7 +1532,7 @@
       <w:tr>
         <w:tc>
           <w:tcPr>
-            <w:tcW w:type="dxa" w:w="1984"/>
+            <w:tcW w:type="dxa" w:w="1814"/>
           </w:tcPr>
           <w:p>
             <w:r/>
@@ -1498,7 +1546,7 @@
         </w:tc>
         <w:tc>
           <w:tcPr>
-            <w:tcW w:type="dxa" w:w="3969"/>
+            <w:tcW w:type="dxa" w:w="3402"/>
           </w:tcPr>
           <w:p>
             <w:r/>
@@ -1512,7 +1560,7 @@
         </w:tc>
         <w:tc>
           <w:tcPr>
-            <w:tcW w:type="dxa" w:w="1134"/>
+            <w:tcW w:type="dxa" w:w="1020"/>
           </w:tcPr>
           <w:p>
             <w:r/>
@@ -1526,7 +1574,7 @@
         </w:tc>
         <w:tc>
           <w:tcPr>
-            <w:tcW w:type="dxa" w:w="1984"/>
+            <w:tcW w:type="dxa" w:w="1474"/>
           </w:tcPr>
           <w:p>
             <w:r/>
@@ -1535,6 +1583,20 @@
                 <w:sz w:val="19"/>
               </w:rPr>
               <w:t>Quantity</w:t>
+            </w:r>
+          </w:p>
+        </w:tc>
+        <w:tc>
+          <w:tcPr>
+            <w:tcW w:type="dxa" w:w="1361"/>
+          </w:tcPr>
+          <w:p>
+            <w:r/>
+            <w:r>
+              <w:rPr>
+                <w:sz w:val="19"/>
+              </w:rPr>
+              <w:t>Accuracy</w:t>
             </w:r>
           </w:p>
         </w:tc>
@@ -1542,7 +1604,7 @@
       <w:tr>
         <w:tc>
           <w:tcPr>
-            <w:tcW w:type="dxa" w:w="1984"/>
+            <w:tcW w:type="dxa" w:w="1814"/>
           </w:tcPr>
           <w:p>
             <w:r/>
@@ -1556,7 +1618,7 @@
         </w:tc>
         <w:tc>
           <w:tcPr>
-            <w:tcW w:type="dxa" w:w="3969"/>
+            <w:tcW w:type="dxa" w:w="3402"/>
           </w:tcPr>
           <w:p>
             <w:r/>
@@ -1570,7 +1632,7 @@
         </w:tc>
         <w:tc>
           <w:tcPr>
-            <w:tcW w:type="dxa" w:w="1134"/>
+            <w:tcW w:type="dxa" w:w="1020"/>
           </w:tcPr>
           <w:p>
             <w:r/>
@@ -1584,7 +1646,7 @@
         </w:tc>
         <w:tc>
           <w:tcPr>
-            <w:tcW w:type="dxa" w:w="1984"/>
+            <w:tcW w:type="dxa" w:w="1474"/>
           </w:tcPr>
           <w:p>
             <w:r/>
@@ -1593,6 +1655,20 @@
                 <w:sz w:val="19"/>
               </w:rPr>
               <w:t>Stock</w:t>
+            </w:r>
+          </w:p>
+        </w:tc>
+        <w:tc>
+          <w:tcPr>
+            <w:tcW w:type="dxa" w:w="1361"/>
+          </w:tcPr>
+          <w:p>
+            <w:r/>
+            <w:r>
+              <w:rPr>
+                <w:sz w:val="19"/>
+              </w:rPr>
+              <w:t>Currency</w:t>
             </w:r>
           </w:p>
         </w:tc>
@@ -1600,7 +1676,7 @@
       <w:tr>
         <w:tc>
           <w:tcPr>
-            <w:tcW w:type="dxa" w:w="1984"/>
+            <w:tcW w:type="dxa" w:w="1814"/>
           </w:tcPr>
           <w:p>
             <w:r/>
@@ -1614,7 +1690,7 @@
         </w:tc>
         <w:tc>
           <w:tcPr>
-            <w:tcW w:type="dxa" w:w="3969"/>
+            <w:tcW w:type="dxa" w:w="3402"/>
           </w:tcPr>
           <w:p>
             <w:r/>
@@ -1628,7 +1704,7 @@
         </w:tc>
         <w:tc>
           <w:tcPr>
-            <w:tcW w:type="dxa" w:w="1134"/>
+            <w:tcW w:type="dxa" w:w="1020"/>
           </w:tcPr>
           <w:p>
             <w:r/>
@@ -1642,7 +1718,7 @@
         </w:tc>
         <w:tc>
           <w:tcPr>
-            <w:tcW w:type="dxa" w:w="1984"/>
+            <w:tcW w:type="dxa" w:w="1474"/>
           </w:tcPr>
           <w:p>
             <w:r/>
@@ -1651,6 +1727,20 @@
                 <w:sz w:val="19"/>
               </w:rPr>
               <w:t>Customer details</w:t>
+            </w:r>
+          </w:p>
+        </w:tc>
+        <w:tc>
+          <w:tcPr>
+            <w:tcW w:type="dxa" w:w="1361"/>
+          </w:tcPr>
+          <w:p>
+            <w:r/>
+            <w:r>
+              <w:rPr>
+                <w:sz w:val="19"/>
+              </w:rPr>
+              <w:t>Completeness</w:t>
             </w:r>
           </w:p>
         </w:tc>
@@ -1658,7 +1748,7 @@
       <w:tr>
         <w:tc>
           <w:tcPr>
-            <w:tcW w:type="dxa" w:w="1984"/>
+            <w:tcW w:type="dxa" w:w="1814"/>
           </w:tcPr>
           <w:p>
             <w:r/>
@@ -1672,7 +1762,7 @@
         </w:tc>
         <w:tc>
           <w:tcPr>
-            <w:tcW w:type="dxa" w:w="3969"/>
+            <w:tcW w:type="dxa" w:w="3402"/>
           </w:tcPr>
           <w:p>
             <w:r/>
@@ -1686,7 +1776,7 @@
         </w:tc>
         <w:tc>
           <w:tcPr>
-            <w:tcW w:type="dxa" w:w="1134"/>
+            <w:tcW w:type="dxa" w:w="1020"/>
           </w:tcPr>
           <w:p>
             <w:r/>
@@ -1700,7 +1790,7 @@
         </w:tc>
         <w:tc>
           <w:tcPr>
-            <w:tcW w:type="dxa" w:w="1984"/>
+            <w:tcW w:type="dxa" w:w="1474"/>
           </w:tcPr>
           <w:p>
             <w:r/>
@@ -1709,6 +1799,20 @@
                 <w:sz w:val="19"/>
               </w:rPr>
               <w:t>Pricing</w:t>
+            </w:r>
+          </w:p>
+        </w:tc>
+        <w:tc>
+          <w:tcPr>
+            <w:tcW w:type="dxa" w:w="1361"/>
+          </w:tcPr>
+          <w:p>
+            <w:r/>
+            <w:r>
+              <w:rPr>
+                <w:sz w:val="19"/>
+              </w:rPr>
+              <w:t>Accuracy and consistency</w:t>
             </w:r>
           </w:p>
         </w:tc>
@@ -1716,7 +1820,7 @@
       <w:tr>
         <w:tc>
           <w:tcPr>
-            <w:tcW w:type="dxa" w:w="1984"/>
+            <w:tcW w:type="dxa" w:w="1814"/>
           </w:tcPr>
           <w:p>
             <w:r/>
@@ -1730,7 +1834,7 @@
         </w:tc>
         <w:tc>
           <w:tcPr>
-            <w:tcW w:type="dxa" w:w="3969"/>
+            <w:tcW w:type="dxa" w:w="3402"/>
           </w:tcPr>
           <w:p>
             <w:r/>
@@ -1744,7 +1848,7 @@
         </w:tc>
         <w:tc>
           <w:tcPr>
-            <w:tcW w:type="dxa" w:w="1134"/>
+            <w:tcW w:type="dxa" w:w="1020"/>
           </w:tcPr>
           <w:p>
             <w:r/>
@@ -1758,7 +1862,7 @@
         </w:tc>
         <w:tc>
           <w:tcPr>
-            <w:tcW w:type="dxa" w:w="1984"/>
+            <w:tcW w:type="dxa" w:w="1474"/>
           </w:tcPr>
           <w:p>
             <w:r/>
@@ -1767,6 +1871,20 @@
                 <w:sz w:val="19"/>
               </w:rPr>
               <w:t>Customer details</w:t>
+            </w:r>
+          </w:p>
+        </w:tc>
+        <w:tc>
+          <w:tcPr>
+            <w:tcW w:type="dxa" w:w="1361"/>
+          </w:tcPr>
+          <w:p>
+            <w:r/>
+            <w:r>
+              <w:rPr>
+                <w:sz w:val="19"/>
+              </w:rPr>
+              <w:t>Completeness</w:t>
             </w:r>
           </w:p>
         </w:tc>
@@ -1774,7 +1892,7 @@
       <w:tr>
         <w:tc>
           <w:tcPr>
-            <w:tcW w:type="dxa" w:w="1984"/>
+            <w:tcW w:type="dxa" w:w="1814"/>
           </w:tcPr>
           <w:p>
             <w:r/>
@@ -1788,7 +1906,7 @@
         </w:tc>
         <w:tc>
           <w:tcPr>
-            <w:tcW w:type="dxa" w:w="3969"/>
+            <w:tcW w:type="dxa" w:w="3402"/>
           </w:tcPr>
           <w:p>
             <w:r/>
@@ -1802,7 +1920,7 @@
         </w:tc>
         <w:tc>
           <w:tcPr>
-            <w:tcW w:type="dxa" w:w="1134"/>
+            <w:tcW w:type="dxa" w:w="1020"/>
           </w:tcPr>
           <w:p>
             <w:r/>
@@ -1816,7 +1934,7 @@
         </w:tc>
         <w:tc>
           <w:tcPr>
-            <w:tcW w:type="dxa" w:w="1984"/>
+            <w:tcW w:type="dxa" w:w="1474"/>
           </w:tcPr>
           <w:p>
             <w:r/>
@@ -1825,6 +1943,20 @@
                 <w:sz w:val="19"/>
               </w:rPr>
               <w:t>Duplicate orders</w:t>
+            </w:r>
+          </w:p>
+        </w:tc>
+        <w:tc>
+          <w:tcPr>
+            <w:tcW w:type="dxa" w:w="1361"/>
+          </w:tcPr>
+          <w:p>
+            <w:r/>
+            <w:r>
+              <w:rPr>
+                <w:sz w:val="19"/>
+              </w:rPr>
+              <w:t>Uniqueness</w:t>
             </w:r>
           </w:p>
         </w:tc>
@@ -1832,7 +1964,7 @@
       <w:tr>
         <w:tc>
           <w:tcPr>
-            <w:tcW w:type="dxa" w:w="1984"/>
+            <w:tcW w:type="dxa" w:w="1814"/>
           </w:tcPr>
           <w:p>
             <w:r/>
@@ -1846,7 +1978,7 @@
         </w:tc>
         <w:tc>
           <w:tcPr>
-            <w:tcW w:type="dxa" w:w="3969"/>
+            <w:tcW w:type="dxa" w:w="3402"/>
           </w:tcPr>
           <w:p>
             <w:r/>
@@ -1860,7 +1992,7 @@
         </w:tc>
         <w:tc>
           <w:tcPr>
-            <w:tcW w:type="dxa" w:w="1134"/>
+            <w:tcW w:type="dxa" w:w="1020"/>
           </w:tcPr>
           <w:p>
             <w:r/>
@@ -1874,15 +2006,29 @@
         </w:tc>
         <w:tc>
           <w:tcPr>
-            <w:tcW w:type="dxa" w:w="1984"/>
-          </w:tcPr>
-          <w:p>
-            <w:r/>
-            <w:r>
-              <w:rPr>
-                <w:sz w:val="19"/>
-              </w:rPr>
-              <w:t>(none; additional check)</w:t>
+            <w:tcW w:type="dxa" w:w="1474"/>
+          </w:tcPr>
+          <w:p>
+            <w:r/>
+            <w:r>
+              <w:rPr>
+                <w:sz w:val="19"/>
+              </w:rPr>
+              <w:t>None, an additional check</w:t>
+            </w:r>
+          </w:p>
+        </w:tc>
+        <w:tc>
+          <w:tcPr>
+            <w:tcW w:type="dxa" w:w="1361"/>
+          </w:tcPr>
+          <w:p>
+            <w:r/>
+            <w:r>
+              <w:rPr>
+                <w:sz w:val="19"/>
+              </w:rPr>
+              <w:t>None</w:t>
             </w:r>
           </w:p>
         </w:tc>
@@ -1940,14 +2086,15 @@
         <w:tblStyle w:val="TableGrid"/>
         <w:tblW w:type="auto" w:w="0"/>
         <w:jc w:val="center"/>
+        <w:tblLayout w:type="fixed"/>
         <w:tblLook w:firstColumn="1" w:firstRow="1" w:lastColumn="0" w:lastRow="0" w:noHBand="0" w:noVBand="1" w:val="04A0"/>
       </w:tblPr>
       <w:tblGrid>
-        <w:gridCol w:w="1805"/>
-        <w:gridCol w:w="1805"/>
-        <w:gridCol w:w="1805"/>
-        <w:gridCol w:w="1805"/>
-        <w:gridCol w:w="1805"/>
+        <w:gridCol w:w="623"/>
+        <w:gridCol w:w="2381"/>
+        <w:gridCol w:w="1927"/>
+        <w:gridCol w:w="3345"/>
+        <w:gridCol w:w="793"/>
       </w:tblGrid>
       <w:tr>
         <w:tc>
@@ -5244,12 +5391,13 @@
         <w:tblStyle w:val="TableGrid"/>
         <w:tblW w:type="auto" w:w="0"/>
         <w:jc w:val="center"/>
+        <w:tblLayout w:type="fixed"/>
         <w:tblLook w:firstColumn="1" w:firstRow="1" w:lastColumn="0" w:lastRow="0" w:noHBand="0" w:noVBand="1" w:val="04A0"/>
       </w:tblPr>
       <w:tblGrid>
-        <w:gridCol w:w="3009"/>
-        <w:gridCol w:w="3009"/>
-        <w:gridCol w:w="3009"/>
+        <w:gridCol w:w="2381"/>
+        <w:gridCol w:w="4706"/>
+        <w:gridCol w:w="1984"/>
       </w:tblGrid>
       <w:tr>
         <w:tc>
@@ -6014,14 +6162,15 @@
         <w:tblStyle w:val="TableGrid"/>
         <w:tblW w:type="auto" w:w="0"/>
         <w:jc w:val="center"/>
+        <w:tblLayout w:type="fixed"/>
         <w:tblLook w:firstColumn="1" w:firstRow="1" w:lastColumn="0" w:lastRow="0" w:noHBand="0" w:noVBand="1" w:val="04A0"/>
       </w:tblPr>
       <w:tblGrid>
-        <w:gridCol w:w="1805"/>
-        <w:gridCol w:w="1805"/>
-        <w:gridCol w:w="1805"/>
-        <w:gridCol w:w="1805"/>
-        <w:gridCol w:w="1805"/>
+        <w:gridCol w:w="2608"/>
+        <w:gridCol w:w="1814"/>
+        <w:gridCol w:w="3061"/>
+        <w:gridCol w:w="1247"/>
+        <w:gridCol w:w="680"/>
       </w:tblGrid>
       <w:tr>
         <w:tc>
@@ -7578,11 +7727,12 @@
         <w:tblStyle w:val="TableGrid"/>
         <w:tblW w:type="auto" w:w="0"/>
         <w:jc w:val="center"/>
+        <w:tblLayout w:type="fixed"/>
         <w:tblLook w:firstColumn="1" w:firstRow="1" w:lastColumn="0" w:lastRow="0" w:noHBand="0" w:noVBand="1" w:val="04A0"/>
       </w:tblPr>
       <w:tblGrid>
-        <w:gridCol w:w="4513"/>
-        <w:gridCol w:w="4513"/>
+        <w:gridCol w:w="2835"/>
+        <w:gridCol w:w="6237"/>
       </w:tblGrid>
       <w:tr>
         <w:tc>
@@ -8058,15 +8208,16 @@
         <w:tblStyle w:val="TableGrid"/>
         <w:tblW w:type="auto" w:w="0"/>
         <w:jc w:val="center"/>
+        <w:tblLayout w:type="fixed"/>
         <w:tblLook w:firstColumn="1" w:firstRow="1" w:lastColumn="0" w:lastRow="0" w:noHBand="0" w:noVBand="1" w:val="04A0"/>
       </w:tblPr>
       <w:tblGrid>
-        <w:gridCol w:w="1504"/>
-        <w:gridCol w:w="1504"/>
-        <w:gridCol w:w="1504"/>
-        <w:gridCol w:w="1504"/>
-        <w:gridCol w:w="1504"/>
-        <w:gridCol w:w="1504"/>
+        <w:gridCol w:w="963"/>
+        <w:gridCol w:w="1871"/>
+        <w:gridCol w:w="1360"/>
+        <w:gridCol w:w="1814"/>
+        <w:gridCol w:w="907"/>
+        <w:gridCol w:w="2721"/>
       </w:tblGrid>
       <w:tr>
         <w:tc>
@@ -9708,15 +9859,16 @@
         <w:tblStyle w:val="TableGrid"/>
         <w:tblW w:type="auto" w:w="0"/>
         <w:jc w:val="center"/>
+        <w:tblLayout w:type="fixed"/>
         <w:tblLook w:firstColumn="1" w:firstRow="1" w:lastColumn="0" w:lastRow="0" w:noHBand="0" w:noVBand="1" w:val="04A0"/>
       </w:tblPr>
       <w:tblGrid>
-        <w:gridCol w:w="1504"/>
-        <w:gridCol w:w="1504"/>
-        <w:gridCol w:w="1504"/>
-        <w:gridCol w:w="1504"/>
-        <w:gridCol w:w="1504"/>
-        <w:gridCol w:w="1504"/>
+        <w:gridCol w:w="2948"/>
+        <w:gridCol w:w="907"/>
+        <w:gridCol w:w="1020"/>
+        <w:gridCol w:w="1134"/>
+        <w:gridCol w:w="1474"/>
+        <w:gridCol w:w="1587"/>
       </w:tblGrid>
       <w:tr>
         <w:tc>
@@ -11320,12 +11472,13 @@
         <w:tblStyle w:val="TableGrid"/>
         <w:tblW w:type="auto" w:w="0"/>
         <w:jc w:val="center"/>
+        <w:tblLayout w:type="fixed"/>
         <w:tblLook w:firstColumn="1" w:firstRow="1" w:lastColumn="0" w:lastRow="0" w:noHBand="0" w:noVBand="1" w:val="04A0"/>
       </w:tblPr>
       <w:tblGrid>
-        <w:gridCol w:w="3009"/>
-        <w:gridCol w:w="3009"/>
-        <w:gridCol w:w="3009"/>
+        <w:gridCol w:w="1587"/>
+        <w:gridCol w:w="5103"/>
+        <w:gridCol w:w="2381"/>
       </w:tblGrid>
       <w:tr>
         <w:tc>
@@ -14573,14 +14726,15 @@
         <w:tblStyle w:val="TableGrid"/>
         <w:tblW w:type="auto" w:w="0"/>
         <w:jc w:val="center"/>
+        <w:tblLayout w:type="fixed"/>
         <w:tblLook w:firstColumn="1" w:firstRow="1" w:lastColumn="0" w:lastRow="0" w:noHBand="0" w:noVBand="1" w:val="04A0"/>
       </w:tblPr>
       <w:tblGrid>
-        <w:gridCol w:w="1805"/>
-        <w:gridCol w:w="1805"/>
-        <w:gridCol w:w="1805"/>
-        <w:gridCol w:w="1805"/>
-        <w:gridCol w:w="1805"/>
+        <w:gridCol w:w="3628"/>
+        <w:gridCol w:w="1304"/>
+        <w:gridCol w:w="1304"/>
+        <w:gridCol w:w="1304"/>
+        <w:gridCol w:w="1530"/>
       </w:tblGrid>
       <w:tr>
         <w:tc>
@@ -16860,7 +17014,7 @@
         <w:rPr>
           <w:i w:val="0"/>
         </w:rPr>
-        <w:t>Table 4.18 sets each objective against its success criterion. The wording of the objectives in Chapter One was not available when this chapter was drafted, so the table marks where that wording must be inserted and describes each objective in brief. Objective 1 is not listed because its criterion was not supplied.</w:t>
+        <w:t>Table 4.18 sets each objective of Section 1.3, in its Chapter One wording, against its success criterion and the result of this evaluation.</w:t>
       </w:r>
     </w:p>
     <w:p>
@@ -16874,7 +17028,7 @@
           <w:b/>
           <w:i w:val="0"/>
         </w:rPr>
-        <w:t>Table 4.18: Objectives and success criteria</w:t>
+        <w:t>Table 4.18: Objectives of Section 1.3 and their success criteria</w:t>
       </w:r>
     </w:p>
     <w:tbl>
@@ -16882,19 +17036,20 @@
         <w:tblStyle w:val="TableGrid"/>
         <w:tblW w:type="auto" w:w="0"/>
         <w:jc w:val="center"/>
+        <w:tblLayout w:type="fixed"/>
         <w:tblLook w:firstColumn="1" w:firstRow="1" w:lastColumn="0" w:lastRow="0" w:noHBand="0" w:noVBand="1" w:val="04A0"/>
       </w:tblPr>
       <w:tblGrid>
-        <w:gridCol w:w="1805"/>
-        <w:gridCol w:w="1805"/>
-        <w:gridCol w:w="1805"/>
-        <w:gridCol w:w="1805"/>
-        <w:gridCol w:w="1805"/>
+        <w:gridCol w:w="2948"/>
+        <w:gridCol w:w="1701"/>
+        <w:gridCol w:w="2608"/>
+        <w:gridCol w:w="1134"/>
+        <w:gridCol w:w="793"/>
       </w:tblGrid>
       <w:tr>
         <w:tc>
           <w:tcPr>
-            <w:tcW w:type="dxa" w:w="2551"/>
+            <w:tcW w:type="dxa" w:w="2948"/>
             <w:shd w:val="clear" w:color="auto" w:fill="D9E2E1"/>
           </w:tcPr>
           <w:p>
@@ -16904,13 +17059,13 @@
                 <w:b/>
                 <w:sz w:val="17"/>
               </w:rPr>
-              <w:t>Objective</w:t>
-            </w:r>
-          </w:p>
-        </w:tc>
-        <w:tc>
-          <w:tcPr>
-            <w:tcW w:type="dxa" w:w="1814"/>
+              <w:t>Objective, Chapter One wording</w:t>
+            </w:r>
+          </w:p>
+        </w:tc>
+        <w:tc>
+          <w:tcPr>
+            <w:tcW w:type="dxa" w:w="1701"/>
             <w:shd w:val="clear" w:color="auto" w:fill="D9E2E1"/>
           </w:tcPr>
           <w:p>
@@ -16926,7 +17081,7 @@
         </w:tc>
         <w:tc>
           <w:tcPr>
-            <w:tcW w:type="dxa" w:w="2721"/>
+            <w:tcW w:type="dxa" w:w="2608"/>
             <w:shd w:val="clear" w:color="auto" w:fill="D9E2E1"/>
           </w:tcPr>
           <w:p>
@@ -16942,7 +17097,7 @@
         </w:tc>
         <w:tc>
           <w:tcPr>
-            <w:tcW w:type="dxa" w:w="1247"/>
+            <w:tcW w:type="dxa" w:w="1134"/>
             <w:shd w:val="clear" w:color="auto" w:fill="D9E2E1"/>
           </w:tcPr>
           <w:p>
@@ -16958,7 +17113,7 @@
         </w:tc>
         <w:tc>
           <w:tcPr>
-            <w:tcW w:type="dxa" w:w="737"/>
+            <w:tcW w:type="dxa" w:w="794"/>
             <w:shd w:val="clear" w:color="auto" w:fill="D9E2E1"/>
           </w:tcPr>
           <w:p>
@@ -16976,71 +17131,71 @@
       <w:tr>
         <w:tc>
           <w:tcPr>
-            <w:tcW w:type="dxa" w:w="2551"/>
-          </w:tcPr>
-          <w:p>
-            <w:r/>
-            <w:r>
-              <w:rPr>
-                <w:sz w:val="17"/>
-              </w:rPr>
-              <w:t>[EXACT CHAPTER ONE WORDING NEEDED] Objective 2, validation engine for SKU, quantity, customer details, pricing, duplicate orders, stock and mandatory fields</w:t>
-            </w:r>
-          </w:p>
-        </w:tc>
-        <w:tc>
-          <w:tcPr>
-            <w:tcW w:type="dxa" w:w="1814"/>
-          </w:tcPr>
-          <w:p>
-            <w:r/>
-            <w:r>
-              <w:rPr>
-                <w:sz w:val="17"/>
-              </w:rPr>
-              <w:t>At least 90 percent validation accuracy</w:t>
-            </w:r>
-          </w:p>
-        </w:tc>
-        <w:tc>
-          <w:tcPr>
-            <w:tcW w:type="dxa" w:w="2721"/>
-          </w:tcPr>
-          <w:p>
-            <w:r/>
-            <w:r>
-              <w:rPr>
-                <w:sz w:val="17"/>
-              </w:rPr>
-              <w:t>Primary 87.2 percent, all errors. Secondary 93.6 percent, rule-targeted errors. Replicates 86.8 to 87.2 and 93.0 to 93.6</w:t>
-            </w:r>
-          </w:p>
-        </w:tc>
-        <w:tc>
-          <w:tcPr>
-            <w:tcW w:type="dxa" w:w="1247"/>
-          </w:tcPr>
-          <w:p>
-            <w:r/>
-            <w:r>
-              <w:rPr>
-                <w:sz w:val="17"/>
-              </w:rPr>
-              <w:t>84.0 to 89.8 and 91.0 to 95.6</w:t>
-            </w:r>
-          </w:p>
-        </w:tc>
-        <w:tc>
-          <w:tcPr>
-            <w:tcW w:type="dxa" w:w="737"/>
-          </w:tcPr>
-          <w:p>
-            <w:r/>
-            <w:r>
-              <w:rPr>
-                <w:sz w:val="17"/>
-              </w:rPr>
-              <w:t>Partly met</w:t>
+            <w:tcW w:type="dxa" w:w="2948"/>
+          </w:tcPr>
+          <w:p>
+            <w:r/>
+            <w:r>
+              <w:rPr>
+                <w:sz w:val="17"/>
+              </w:rPr>
+              <w:t>1. To design and develop a web-based order processing system that replaces manual order entry done through Excel sheets and through e-mail and WhatsApp messages.</w:t>
+            </w:r>
+          </w:p>
+        </w:tc>
+        <w:tc>
+          <w:tcPr>
+            <w:tcW w:type="dxa" w:w="1701"/>
+          </w:tcPr>
+          <w:p>
+            <w:r/>
+            <w:r>
+              <w:rPr>
+                <w:sz w:val="17"/>
+              </w:rPr>
+              <w:t>A working web-based system through which orders are entered and processed without rekeying</w:t>
+            </w:r>
+          </w:p>
+        </w:tc>
+        <w:tc>
+          <w:tcPr>
+            <w:tcW w:type="dxa" w:w="2608"/>
+          </w:tcPr>
+          <w:p>
+            <w:r/>
+            <w:r>
+              <w:rPr>
+                <w:sz w:val="17"/>
+              </w:rPr>
+              <w:t>Built and deployed. Orders are entered in the portal, from an uploaded Excel or CSV sheet, or from a pasted message. 23 of 26 functional tests passed. CSV export of orders and webhooks are not built</w:t>
+            </w:r>
+          </w:p>
+        </w:tc>
+        <w:tc>
+          <w:tcPr>
+            <w:tcW w:type="dxa" w:w="1134"/>
+          </w:tcPr>
+          <w:p>
+            <w:r/>
+            <w:r>
+              <w:rPr>
+                <w:sz w:val="17"/>
+              </w:rPr>
+              <w:t>not applicable</w:t>
+            </w:r>
+          </w:p>
+        </w:tc>
+        <w:tc>
+          <w:tcPr>
+            <w:tcW w:type="dxa" w:w="794"/>
+          </w:tcPr>
+          <w:p>
+            <w:r/>
+            <w:r>
+              <w:rPr>
+                <w:sz w:val="17"/>
+              </w:rPr>
+              <w:t>Met</w:t>
             </w:r>
           </w:p>
         </w:tc>
@@ -17048,71 +17203,71 @@
       <w:tr>
         <w:tc>
           <w:tcPr>
-            <w:tcW w:type="dxa" w:w="2551"/>
-          </w:tcPr>
-          <w:p>
-            <w:r/>
-            <w:r>
-              <w:rPr>
-                <w:sz w:val="17"/>
-              </w:rPr>
-              <w:t>[EXACT CHAPTER ONE WORDING NEEDED] Objective 3, fewer manual entry errors</w:t>
-            </w:r>
-          </w:p>
-        </w:tc>
-        <w:tc>
-          <w:tcPr>
-            <w:tcW w:type="dxa" w:w="1814"/>
-          </w:tcPr>
-          <w:p>
-            <w:r/>
-            <w:r>
-              <w:rPr>
-                <w:sz w:val="17"/>
-              </w:rPr>
-              <w:t>At least 60 percent fewer manual entry errors</w:t>
-            </w:r>
-          </w:p>
-        </w:tc>
-        <w:tc>
-          <w:tcPr>
-            <w:tcW w:type="dxa" w:w="2721"/>
-          </w:tcPr>
-          <w:p>
-            <w:r/>
-            <w:r>
-              <w:rPr>
-                <w:sz w:val="17"/>
-              </w:rPr>
-              <w:t>[DATA PENDING]</w:t>
-            </w:r>
-          </w:p>
-        </w:tc>
-        <w:tc>
-          <w:tcPr>
-            <w:tcW w:type="dxa" w:w="1247"/>
-          </w:tcPr>
-          <w:p>
-            <w:r/>
-            <w:r>
-              <w:rPr>
-                <w:sz w:val="17"/>
-              </w:rPr>
-              <w:t>[DATA PENDING]</w:t>
-            </w:r>
-          </w:p>
-        </w:tc>
-        <w:tc>
-          <w:tcPr>
-            <w:tcW w:type="dxa" w:w="737"/>
-          </w:tcPr>
-          <w:p>
-            <w:r/>
-            <w:r>
-              <w:rPr>
-                <w:sz w:val="17"/>
-              </w:rPr>
-              <w:t>Pending</w:t>
+            <w:tcW w:type="dxa" w:w="2948"/>
+          </w:tcPr>
+          <w:p>
+            <w:r/>
+            <w:r>
+              <w:rPr>
+                <w:sz w:val="17"/>
+              </w:rPr>
+              <w:t>2. To implement an automatic validation engine that checks SKU, quantity, customer details, pricing, duplicate orders, stock and mandatory fields, and to achieve at least 90 percent validation accuracy.</w:t>
+            </w:r>
+          </w:p>
+        </w:tc>
+        <w:tc>
+          <w:tcPr>
+            <w:tcW w:type="dxa" w:w="1701"/>
+          </w:tcPr>
+          <w:p>
+            <w:r/>
+            <w:r>
+              <w:rPr>
+                <w:sz w:val="17"/>
+              </w:rPr>
+              <w:t>At least 90 percent validation accuracy</w:t>
+            </w:r>
+          </w:p>
+        </w:tc>
+        <w:tc>
+          <w:tcPr>
+            <w:tcW w:type="dxa" w:w="2608"/>
+          </w:tcPr>
+          <w:p>
+            <w:r/>
+            <w:r>
+              <w:rPr>
+                <w:sz w:val="17"/>
+              </w:rPr>
+              <w:t>Primary 87.2 percent, all errors. Secondary 93.6 percent, rule-targeted errors. Replicates 86.8 to 87.2 and 93.0 to 93.6</w:t>
+            </w:r>
+          </w:p>
+        </w:tc>
+        <w:tc>
+          <w:tcPr>
+            <w:tcW w:type="dxa" w:w="1134"/>
+          </w:tcPr>
+          <w:p>
+            <w:r/>
+            <w:r>
+              <w:rPr>
+                <w:sz w:val="17"/>
+              </w:rPr>
+              <w:t>84.0 to 89.8 and 91.0 to 95.6</w:t>
+            </w:r>
+          </w:p>
+        </w:tc>
+        <w:tc>
+          <w:tcPr>
+            <w:tcW w:type="dxa" w:w="794"/>
+          </w:tcPr>
+          <w:p>
+            <w:r/>
+            <w:r>
+              <w:rPr>
+                <w:sz w:val="17"/>
+              </w:rPr>
+              <w:t>Partly met</w:t>
             </w:r>
           </w:p>
         </w:tc>
@@ -17120,71 +17275,71 @@
       <w:tr>
         <w:tc>
           <w:tcPr>
-            <w:tcW w:type="dxa" w:w="2551"/>
-          </w:tcPr>
-          <w:p>
-            <w:r/>
-            <w:r>
-              <w:rPr>
-                <w:sz w:val="17"/>
-              </w:rPr>
-              <w:t>[EXACT CHAPTER ONE WORDING NEEDED] Objective 3, mandatory fields</w:t>
-            </w:r>
-          </w:p>
-        </w:tc>
-        <w:tc>
-          <w:tcPr>
-            <w:tcW w:type="dxa" w:w="1814"/>
-          </w:tcPr>
-          <w:p>
-            <w:r/>
-            <w:r>
-              <w:rPr>
-                <w:sz w:val="17"/>
-              </w:rPr>
-              <w:t>100 percent mandatory-field completion</w:t>
-            </w:r>
-          </w:p>
-        </w:tc>
-        <w:tc>
-          <w:tcPr>
-            <w:tcW w:type="dxa" w:w="2721"/>
-          </w:tcPr>
-          <w:p>
-            <w:r/>
-            <w:r>
-              <w:rPr>
-                <w:sz w:val="17"/>
-              </w:rPr>
-              <w:t>258 of 258 orders reaching approval, 100 percent in all three replicates</w:t>
-            </w:r>
-          </w:p>
-        </w:tc>
-        <w:tc>
-          <w:tcPr>
-            <w:tcW w:type="dxa" w:w="1247"/>
-          </w:tcPr>
-          <w:p>
-            <w:r/>
-            <w:r>
-              <w:rPr>
-                <w:sz w:val="17"/>
-              </w:rPr>
-              <w:t>98.5 to 100.0</w:t>
-            </w:r>
-          </w:p>
-        </w:tc>
-        <w:tc>
-          <w:tcPr>
-            <w:tcW w:type="dxa" w:w="737"/>
-          </w:tcPr>
-          <w:p>
-            <w:r/>
-            <w:r>
-              <w:rPr>
-                <w:sz w:val="17"/>
-              </w:rPr>
-              <w:t>Met</w:t>
+            <w:tcW w:type="dxa" w:w="2948"/>
+          </w:tcPr>
+          <w:p>
+            <w:r/>
+            <w:r>
+              <w:rPr>
+                <w:sz w:val="17"/>
+              </w:rPr>
+              <w:t>3. To reduce manual data-entry errors by at least 60 percent and to achieve 100 percent completion of mandatory fields.</w:t>
+            </w:r>
+          </w:p>
+        </w:tc>
+        <w:tc>
+          <w:tcPr>
+            <w:tcW w:type="dxa" w:w="1701"/>
+          </w:tcPr>
+          <w:p>
+            <w:r/>
+            <w:r>
+              <w:rPr>
+                <w:sz w:val="17"/>
+              </w:rPr>
+              <w:t>At least 60 percent fewer manual entry errors</w:t>
+            </w:r>
+          </w:p>
+        </w:tc>
+        <w:tc>
+          <w:tcPr>
+            <w:tcW w:type="dxa" w:w="2608"/>
+          </w:tcPr>
+          <w:p>
+            <w:r/>
+            <w:r>
+              <w:rPr>
+                <w:sz w:val="17"/>
+              </w:rPr>
+              <w:t>[DATA PENDING]</w:t>
+            </w:r>
+          </w:p>
+        </w:tc>
+        <w:tc>
+          <w:tcPr>
+            <w:tcW w:type="dxa" w:w="1134"/>
+          </w:tcPr>
+          <w:p>
+            <w:r/>
+            <w:r>
+              <w:rPr>
+                <w:sz w:val="17"/>
+              </w:rPr>
+              <w:t>[DATA PENDING]</w:t>
+            </w:r>
+          </w:p>
+        </w:tc>
+        <w:tc>
+          <w:tcPr>
+            <w:tcW w:type="dxa" w:w="794"/>
+          </w:tcPr>
+          <w:p>
+            <w:r/>
+            <w:r>
+              <w:rPr>
+                <w:sz w:val="17"/>
+              </w:rPr>
+              <w:t>Pending</w:t>
             </w:r>
           </w:p>
         </w:tc>
@@ -17192,71 +17347,71 @@
       <w:tr>
         <w:tc>
           <w:tcPr>
-            <w:tcW w:type="dxa" w:w="2551"/>
-          </w:tcPr>
-          <w:p>
-            <w:r/>
-            <w:r>
-              <w:rPr>
-                <w:sz w:val="17"/>
-              </w:rPr>
-              <w:t>[EXACT CHAPTER ONE WORDING NEEDED] Objective 4, processing speed</w:t>
-            </w:r>
-          </w:p>
-        </w:tc>
-        <w:tc>
-          <w:tcPr>
-            <w:tcW w:type="dxa" w:w="1814"/>
-          </w:tcPr>
-          <w:p>
-            <w:r/>
-            <w:r>
-              <w:rPr>
-                <w:sz w:val="17"/>
-              </w:rPr>
-              <w:t>30 to 50 percent faster processing</w:t>
-            </w:r>
-          </w:p>
-        </w:tc>
-        <w:tc>
-          <w:tcPr>
-            <w:tcW w:type="dxa" w:w="2721"/>
-          </w:tcPr>
-          <w:p>
-            <w:r/>
-            <w:r>
-              <w:rPr>
-                <w:sz w:val="17"/>
-              </w:rPr>
-              <w:t>[DATA PENDING]</w:t>
-            </w:r>
-          </w:p>
-        </w:tc>
-        <w:tc>
-          <w:tcPr>
-            <w:tcW w:type="dxa" w:w="1247"/>
-          </w:tcPr>
-          <w:p>
-            <w:r/>
-            <w:r>
-              <w:rPr>
-                <w:sz w:val="17"/>
-              </w:rPr>
-              <w:t>[DATA PENDING]</w:t>
-            </w:r>
-          </w:p>
-        </w:tc>
-        <w:tc>
-          <w:tcPr>
-            <w:tcW w:type="dxa" w:w="737"/>
-          </w:tcPr>
-          <w:p>
-            <w:r/>
-            <w:r>
-              <w:rPr>
-                <w:sz w:val="17"/>
-              </w:rPr>
-              <w:t>Pending</w:t>
+            <w:tcW w:type="dxa" w:w="2948"/>
+          </w:tcPr>
+          <w:p>
+            <w:r/>
+            <w:r>
+              <w:rPr>
+                <w:sz w:val="17"/>
+              </w:rPr>
+              <w:t>3. As above</w:t>
+            </w:r>
+          </w:p>
+        </w:tc>
+        <w:tc>
+          <w:tcPr>
+            <w:tcW w:type="dxa" w:w="1701"/>
+          </w:tcPr>
+          <w:p>
+            <w:r/>
+            <w:r>
+              <w:rPr>
+                <w:sz w:val="17"/>
+              </w:rPr>
+              <w:t>100 percent completion of mandatory fields</w:t>
+            </w:r>
+          </w:p>
+        </w:tc>
+        <w:tc>
+          <w:tcPr>
+            <w:tcW w:type="dxa" w:w="2608"/>
+          </w:tcPr>
+          <w:p>
+            <w:r/>
+            <w:r>
+              <w:rPr>
+                <w:sz w:val="17"/>
+              </w:rPr>
+              <w:t>258 of 258 orders reaching approval, 100 percent in all three replicates</w:t>
+            </w:r>
+          </w:p>
+        </w:tc>
+        <w:tc>
+          <w:tcPr>
+            <w:tcW w:type="dxa" w:w="1134"/>
+          </w:tcPr>
+          <w:p>
+            <w:r/>
+            <w:r>
+              <w:rPr>
+                <w:sz w:val="17"/>
+              </w:rPr>
+              <w:t>98.5 to 100.0</w:t>
+            </w:r>
+          </w:p>
+        </w:tc>
+        <w:tc>
+          <w:tcPr>
+            <w:tcW w:type="dxa" w:w="794"/>
+          </w:tcPr>
+          <w:p>
+            <w:r/>
+            <w:r>
+              <w:rPr>
+                <w:sz w:val="17"/>
+              </w:rPr>
+              <w:t>Met</w:t>
             </w:r>
           </w:p>
         </w:tc>
@@ -17264,35 +17419,107 @@
       <w:tr>
         <w:tc>
           <w:tcPr>
-            <w:tcW w:type="dxa" w:w="2551"/>
-          </w:tcPr>
-          <w:p>
-            <w:r/>
-            <w:r>
-              <w:rPr>
-                <w:sz w:val="17"/>
-              </w:rPr>
-              <w:t>[EXACT CHAPTER ONE WORDING NEEDED] Objective 5, simulated orders</w:t>
-            </w:r>
-          </w:p>
-        </w:tc>
-        <w:tc>
-          <w:tcPr>
-            <w:tcW w:type="dxa" w:w="1814"/>
-          </w:tcPr>
-          <w:p>
-            <w:r/>
-            <w:r>
-              <w:rPr>
-                <w:sz w:val="17"/>
-              </w:rPr>
-              <w:t>500 simulated orders processed</w:t>
-            </w:r>
-          </w:p>
-        </w:tc>
-        <w:tc>
-          <w:tcPr>
-            <w:tcW w:type="dxa" w:w="2721"/>
+            <w:tcW w:type="dxa" w:w="2948"/>
+          </w:tcPr>
+          <w:p>
+            <w:r/>
+            <w:r>
+              <w:rPr>
+                <w:sz w:val="17"/>
+              </w:rPr>
+              <w:t>4. To improve order processing speed by 30 to 50 percent through digital approval, payment confirmation, fulfilment and delivery workflows.</w:t>
+            </w:r>
+          </w:p>
+        </w:tc>
+        <w:tc>
+          <w:tcPr>
+            <w:tcW w:type="dxa" w:w="1701"/>
+          </w:tcPr>
+          <w:p>
+            <w:r/>
+            <w:r>
+              <w:rPr>
+                <w:sz w:val="17"/>
+              </w:rPr>
+              <w:t>30 to 50 percent faster processing</w:t>
+            </w:r>
+          </w:p>
+        </w:tc>
+        <w:tc>
+          <w:tcPr>
+            <w:tcW w:type="dxa" w:w="2608"/>
+          </w:tcPr>
+          <w:p>
+            <w:r/>
+            <w:r>
+              <w:rPr>
+                <w:sz w:val="17"/>
+              </w:rPr>
+              <w:t>[DATA PENDING]</w:t>
+            </w:r>
+          </w:p>
+        </w:tc>
+        <w:tc>
+          <w:tcPr>
+            <w:tcW w:type="dxa" w:w="1134"/>
+          </w:tcPr>
+          <w:p>
+            <w:r/>
+            <w:r>
+              <w:rPr>
+                <w:sz w:val="17"/>
+              </w:rPr>
+              <w:t>[DATA PENDING]</w:t>
+            </w:r>
+          </w:p>
+        </w:tc>
+        <w:tc>
+          <w:tcPr>
+            <w:tcW w:type="dxa" w:w="794"/>
+          </w:tcPr>
+          <w:p>
+            <w:r/>
+            <w:r>
+              <w:rPr>
+                <w:sz w:val="17"/>
+              </w:rPr>
+              <w:t>Pending</w:t>
+            </w:r>
+          </w:p>
+        </w:tc>
+      </w:tr>
+      <w:tr>
+        <w:tc>
+          <w:tcPr>
+            <w:tcW w:type="dxa" w:w="2948"/>
+          </w:tcPr>
+          <w:p>
+            <w:r/>
+            <w:r>
+              <w:rPr>
+                <w:sz w:val="17"/>
+              </w:rPr>
+              <w:t>5. To evaluate the usability and acceptance of the system through a questionnaire and a test run of 500 simulated orders.</w:t>
+            </w:r>
+          </w:p>
+        </w:tc>
+        <w:tc>
+          <w:tcPr>
+            <w:tcW w:type="dxa" w:w="1701"/>
+          </w:tcPr>
+          <w:p>
+            <w:r/>
+            <w:r>
+              <w:rPr>
+                <w:sz w:val="17"/>
+              </w:rPr>
+              <w:t>Test run of 500 simulated orders</w:t>
+            </w:r>
+          </w:p>
+        </w:tc>
+        <w:tc>
+          <w:tcPr>
+            <w:tcW w:type="dxa" w:w="2608"/>
           </w:tcPr>
           <w:p>
             <w:r/>
@@ -17306,7 +17533,7 @@
         </w:tc>
         <w:tc>
           <w:tcPr>
-            <w:tcW w:type="dxa" w:w="1247"/>
+            <w:tcW w:type="dxa" w:w="1134"/>
           </w:tcPr>
           <w:p>
             <w:r/>
@@ -17320,7 +17547,7 @@
         </w:tc>
         <w:tc>
           <w:tcPr>
-            <w:tcW w:type="dxa" w:w="737"/>
+            <w:tcW w:type="dxa" w:w="794"/>
           </w:tcPr>
           <w:p>
             <w:r/>
@@ -17329,6 +17556,78 @@
                 <w:sz w:val="17"/>
               </w:rPr>
               <w:t>Met</w:t>
+            </w:r>
+          </w:p>
+        </w:tc>
+      </w:tr>
+      <w:tr>
+        <w:tc>
+          <w:tcPr>
+            <w:tcW w:type="dxa" w:w="2948"/>
+          </w:tcPr>
+          <w:p>
+            <w:r/>
+            <w:r>
+              <w:rPr>
+                <w:sz w:val="17"/>
+              </w:rPr>
+              <w:t>5. As above</w:t>
+            </w:r>
+          </w:p>
+        </w:tc>
+        <w:tc>
+          <w:tcPr>
+            <w:tcW w:type="dxa" w:w="1701"/>
+          </w:tcPr>
+          <w:p>
+            <w:r/>
+            <w:r>
+              <w:rPr>
+                <w:sz w:val="17"/>
+              </w:rPr>
+              <w:t>Usability and acceptance by questionnaire</w:t>
+            </w:r>
+          </w:p>
+        </w:tc>
+        <w:tc>
+          <w:tcPr>
+            <w:tcW w:type="dxa" w:w="2608"/>
+          </w:tcPr>
+          <w:p>
+            <w:r/>
+            <w:r>
+              <w:rPr>
+                <w:sz w:val="17"/>
+              </w:rPr>
+              <w:t>Reported in the questionnaire results, not in this technical chapter</w:t>
+            </w:r>
+          </w:p>
+        </w:tc>
+        <w:tc>
+          <w:tcPr>
+            <w:tcW w:type="dxa" w:w="1134"/>
+          </w:tcPr>
+          <w:p>
+            <w:r/>
+            <w:r>
+              <w:rPr>
+                <w:sz w:val="17"/>
+              </w:rPr>
+              <w:t>not applicable</w:t>
+            </w:r>
+          </w:p>
+        </w:tc>
+        <w:tc>
+          <w:tcPr>
+            <w:tcW w:type="dxa" w:w="794"/>
+          </w:tcPr>
+          <w:p>
+            <w:r/>
+            <w:r>
+              <w:rPr>
+                <w:sz w:val="17"/>
+              </w:rPr>
+              <w:t>Reported separately</w:t>
             </w:r>
           </w:p>
         </w:tc>
@@ -17344,7 +17643,7 @@
           <w:i/>
           <w:sz w:val="20"/>
         </w:rPr>
-        <w:t>Source: Sections 4.2 to 4.4. Accuracy judged on the primary measure with the secondary measure in support.</w:t>
+        <w:t>Source: Section 1.3 and Sections 4.2 to 4.4 of this chapter. Accuracy judged on the primary measure with the secondary measure in support.</w:t>
       </w:r>
     </w:p>
     <w:p>
@@ -17356,7 +17655,19 @@
         <w:rPr>
           <w:i w:val="0"/>
         </w:rPr>
-        <w:t>The accuracy objective is rated Partly met. On the primary measure accuracy did not reach 90 percent in any replicate, and the upper end of the replicate 1 interval was 89.8 percent. On the rule-targeted errors it exceeded 90 percent in every replicate and the whole interval lay above the target. Both measures share the same false alarms, so the gap between them comes from the 36 errors without a rule that were missed, 30 of them wrong products or wrong addresses. The mandatory-fields criterion is Met. The error-reduction and speed criteria remain Pending until the manual baseline is run and scored with analyze_baseline.py. Below about 80 paired orders that comparison of errors will be indicative only.</w:t>
+        <w:t>Objective 1 is rated Met because orders can be entered and taken through the whole lifecycle without being retyped by staff. Two features named in the scope of Section 1.5 are missing, the CSV export of orders and the webhooks for connection to other systems, and the route for pasting a WhatsApp message was built but not covered by a functional test. The accuracy part of Objective 2 is rated Partly met. On the primary measure accuracy did not reach 90 percent in any replicate, and the upper end of the replicate 1 interval was 89.8 percent. On the rule-targeted errors it exceeded 90 percent in every replicate and the whole interval lay above the target. Both measures share the same false alarms, so the gap between them comes from the 36 errors without a rule that were missed, 30 of them wrong products or wrong addresses.</w:t>
+      </w:r>
+    </w:p>
+    <w:p>
+      <w:pPr>
+        <w:spacing w:after="160" w:line="360" w:lineRule="auto"/>
+        <w:jc w:val="both"/>
+      </w:pPr>
+      <w:r>
+        <w:rPr>
+          <w:i w:val="0"/>
+        </w:rPr>
+        <w:t>The mandatory-fields part of Objective 3 is Met. The error-reduction part of Objective 3 and the speed criterion of Objective 4 remain Pending until the manual baseline is run and scored with analyze_baseline.py, and below about 80 paired orders that comparison of errors will be indicative only. The simulated test run required by Objective 5 is Met, while its usability and acceptance part is reported with the questionnaire results.</w:t>
       </w:r>
     </w:p>
     <w:p>
@@ -17376,7 +17687,20 @@
         <w:rPr>
           <w:i w:val="0"/>
         </w:rPr>
-        <w:t>The research questions are answered below in the order of Chapter One. Their exact wording was not available, so each is marked for insertion and, as an assumption, the questions are taken to follow the order of the objectives.</w:t>
+        <w:t>Each research question of Section 1.4 is restated below in its Chapter One wording and answered from the technical evaluation.</w:t>
+      </w:r>
+    </w:p>
+    <w:p>
+      <w:pPr>
+        <w:spacing w:after="40" w:line="360" w:lineRule="auto"/>
+        <w:jc w:val="left"/>
+      </w:pPr>
+      <w:r>
+        <w:rPr>
+          <w:b/>
+          <w:i w:val="0"/>
+        </w:rPr>
+        <w:t>Research question 1. How can an order processing system be designed to replace manual order entry in a logistics company.</w:t>
       </w:r>
     </w:p>
     <w:p>
@@ -17388,7 +17712,20 @@
         <w:rPr>
           <w:i w:val="0"/>
         </w:rPr>
-        <w:t>Research question 1. [EXACT CHAPTER ONE WORDING NEEDED] The implemented system shows that order entry, validation, approval, payment, picking and delivery can be run as one controlled lifecycle of 17 statuses with role-based access, and 23 of 26 functional tests passed. The failed tests concern features that are missing or incomplete, and Section 4.2 reports each of them.</w:t>
+        <w:t>Verity shows that it can be done by having the customer enter the order against the live catalogue and by running every later step as one controlled lifecycle of 17 statuses, with each role limited to its own actions and every change recorded. Customers can also upload a spreadsheet or paste a message, which the system reads into the same validated form. Of 26 functional tests, 23 passed, and the failures concern features that are missing or incomplete, as Section 4.2 reports.</w:t>
+      </w:r>
+    </w:p>
+    <w:p>
+      <w:pPr>
+        <w:spacing w:after="40" w:line="360" w:lineRule="auto"/>
+        <w:jc w:val="left"/>
+      </w:pPr>
+      <w:r>
+        <w:rPr>
+          <w:b/>
+          <w:i w:val="0"/>
+        </w:rPr>
+        <w:t>Research question 2. How accurately can an automatic validation engine detect erroneous orders.</w:t>
       </w:r>
     </w:p>
     <w:p>
@@ -17400,7 +17737,20 @@
         <w:rPr>
           <w:i w:val="0"/>
         </w:rPr>
-        <w:t>Research question 2. [EXACT CHAPTER ONE WORDING NEEDED] Automated validation caught every rule-targeted error in all three replicates and reached 87.2 percent accuracy when errors outside the rules were included. That is below the 90 percent target, and most of the remaining errors are of a kind no rule can detect.</w:t>
+        <w:t>Every error that a rule targets was detected in all three replicates, which gave an accuracy of 93.6 percent on those errors. When realistic errors that no rule targets were included the accuracy was 87.2 percent, below the 90 percent target, and most of the errors that passed were of a kind no rule can detect.</w:t>
+      </w:r>
+    </w:p>
+    <w:p>
+      <w:pPr>
+        <w:spacing w:after="40" w:line="360" w:lineRule="auto"/>
+        <w:jc w:val="left"/>
+      </w:pPr>
+      <w:r>
+        <w:rPr>
+          <w:b/>
+          <w:i w:val="0"/>
+        </w:rPr>
+        <w:t>Research question 3. By how much does the system reduce manual data-entry errors compared with manual entry.</w:t>
       </w:r>
     </w:p>
     <w:p>
@@ -17412,7 +17762,20 @@
         <w:rPr>
           <w:i w:val="0"/>
         </w:rPr>
-        <w:t>Research question 3. [EXACT CHAPTER ONE WORDING NEEDED] No mandatory field was missing on any order that reached approval. Whether Verity reduces manual entry errors by 60 percent cannot yet be answered and is [DATA PENDING].</w:t>
+        <w:t>This comparison needs the manual baseline and is [DATA PENDING]. The simulation shows that no order reached approval with a mandatory field missing.</w:t>
+      </w:r>
+    </w:p>
+    <w:p>
+      <w:pPr>
+        <w:spacing w:after="40" w:line="360" w:lineRule="auto"/>
+        <w:jc w:val="left"/>
+      </w:pPr>
+      <w:r>
+        <w:rPr>
+          <w:b/>
+          <w:i w:val="0"/>
+        </w:rPr>
+        <w:t>Research question 4. By how much does the system improve order processing speed.</w:t>
       </w:r>
     </w:p>
     <w:p>
@@ -17424,7 +17787,20 @@
         <w:rPr>
           <w:i w:val="0"/>
         </w:rPr>
-        <w:t>Research question 4. [EXACT CHAPTER ONE WORDING NEEDED] Validation itself takes milliseconds per order, but the criterion concerns end-to-end processing time against manual handling, and that answer is [DATA PENDING].</w:t>
+        <w:t>Validation itself takes milliseconds per order, but the question concerns end-to-end processing time against manual handling, and that answer is [DATA PENDING].</w:t>
+      </w:r>
+    </w:p>
+    <w:p>
+      <w:pPr>
+        <w:spacing w:after="40" w:line="360" w:lineRule="auto"/>
+        <w:jc w:val="left"/>
+      </w:pPr>
+      <w:r>
+        <w:rPr>
+          <w:b/>
+          <w:i w:val="0"/>
+        </w:rPr>
+        <w:t>Research question 5. How usable and acceptable do intended users find the system.</w:t>
       </w:r>
     </w:p>
     <w:p>
@@ -17436,7 +17812,7 @@
         <w:rPr>
           <w:i w:val="0"/>
         </w:rPr>
-        <w:t>Research question 5. [EXACT CHAPTER ONE WORDING NEEDED] Usability and acceptance are answered from the questionnaire, which is reported separately. The technical evaluation contributes the 500 simulated orders per replicate that this objective also requires.</w:t>
+        <w:t>This question is answered by the questionnaire, which is reported with the questionnaire results rather than in this technical chapter.</w:t>
       </w:r>
     </w:p>
     <w:p>
@@ -17456,7 +17832,7 @@
         <w:rPr>
           <w:i w:val="0"/>
         </w:rPr>
-        <w:t>The DeLone and McLean (2003) model of information systems success offers a frame for these results. It links the qualities of a system to its use and to user satisfaction, and through these to net benefits. The technical evaluation gives evidence on system quality. The engine stopped every planted error that a rule targets and responded within a fraction of a second, although its response time grew as order volume grew in two of the replicates. On information quality, each message stated the problem in plain words and named the product where the problem lay on a line, yet 28 of the 200 clean orders received a warning that turned out to be unnecessary. False alarms of this kind cost staff time and can teach users to ignore warnings, so they weigh against the net benefits the model predicts. Service quality, use, user satisfaction and the net benefits themselves rest on the questionnaire and the manual baseline, and remain to be assessed.</w:t>
+        <w:t>Section 2.4.3 adopted the information systems success model of DeLone and McLean (2003) as the frame that links what the simulation measures to the outcomes the study expects. In that frame the validation engine stands for information quality, and the reductions in error and processing time sought by Objectives 3 and 4 stand for net benefits. The evidence on information quality is strong for the errors the rules were written for. Every one of them was stopped in every replicate, and no order reached approval with a mandatory field missing. It is weaker in two respects. Of the 200 clean orders, 28 received a warning that turned out to be unnecessary, and warnings of this kind cost staff time and can teach users to ignore them. The engine also missed most errors that lie inside the allowed values. On system quality, validation responded within a fraction of a second, although its response time grew with the number of orders in two of the replicates. The net benefits remain to be measured, so the second gap identified in Section 2.6, the lack of a comparison between validated digital entry and manual entry, is not yet closed.</w:t>
       </w:r>
     </w:p>
     <w:p>
@@ -17468,7 +17844,19 @@
         <w:rPr>
           <w:i w:val="0"/>
         </w:rPr>
-        <w:t>The results also show where the design reaches its limits. The rules check that each value is allowed, so they cannot tell when a customer chooses an allowed value by mistake. The unusual-quantity warning partly closes that gap for quantities, at the cost of false alarms, and the sensitivity analysis shows that the balance can be tuned but not removed. Errors in product choice or address would need a different kind of check, such as confirming the order back to the customer before approval.</w:t>
+        <w:t>The pattern of what the engine missed matches the evidence reviewed in Section 2.2.2. Barchard and Pace (2011) found that only a small share of data entry errors are blank or outside the allowable range, so most cannot be caught by looking for obviously wrong values. The simulation shows the same limit from the system side. The rules check that each value is allowed, so they cannot tell when a customer chooses an allowed value by mistake, and a wrong but valid product or address passed in most cases. The unusual-quantity warning partly closes the gap for quantities, at the cost of false alarms, and the sensitivity analysis shows that the balance can be tuned but not removed. Errors in product choice or address would need a different kind of check, such as confirming the order back to the customer before approval.</w:t>
+      </w:r>
+    </w:p>
+    <w:p>
+      <w:pPr>
+        <w:spacing w:after="160" w:line="360" w:lineRule="auto"/>
+        <w:jc w:val="both"/>
+      </w:pPr>
+      <w:r>
+        <w:rPr>
+          <w:i w:val="0"/>
+        </w:rPr>
+        <w:t>Two further results bear on the design set out in Chapter Two. Section 2.2.3 argued, following Elmagarmid et al. (2007), that an order system can prevent duplicates at intake rather than clean them afterwards, and all 20 planted duplicates in each replicate were held for the customer to confirm. Table 2.1 expects the pricing check to stop an outdated price. The engine did so when the price changed after an order was saved, but an outdated price quoted on an uploaded sheet was replaced by the list price without telling the customer, as functional test 16b shows. Finally, the integration route of Section 2.3.5 is only partly in place, since CSV import works but CSV export of orders and webhooks have not been built.</w:t>
       </w:r>
     </w:p>
     <w:p>
@@ -17565,18 +17953,6 @@
     </w:p>
     <w:p>
       <w:pPr>
-        <w:spacing w:after="160" w:line="360" w:lineRule="auto"/>
-        <w:jc w:val="both"/>
-      </w:pPr>
-      <w:r>
-        <w:rPr>
-          <w:i w:val="0"/>
-        </w:rPr>
-        <w:t>The exact wording of the objectives and research questions in Chapter One was not available to this chapter.</w:t>
-      </w:r>
-    </w:p>
-    <w:p>
-      <w:pPr>
         <w:pStyle w:val="Heading2"/>
       </w:pPr>
       <w:r>
@@ -17613,6 +17989,19 @@
         <w:rPr>
           <w:i w:val="0"/>
         </w:rPr>
+        <w:t>Barchard, K. A., &amp; Pace, L. A. (2011). Preventing human error: The impact of data entry methods on data accuracy and statistical results. Computers in Human Behavior, 27(5), 1834–1839. https://doi.org/10.1016/j.chb.2011.04.004</w:t>
+      </w:r>
+    </w:p>
+    <w:p>
+      <w:pPr>
+        <w:spacing w:after="160" w:line="360" w:lineRule="auto"/>
+        <w:ind w:left="720" w:hanging="720"/>
+        <w:jc w:val="left"/>
+      </w:pPr>
+      <w:r>
+        <w:rPr>
+          <w:i w:val="0"/>
+        </w:rPr>
         <w:t>Brown, L. D., Cai, T. T., &amp; DasGupta, A. (2001). Interval estimation for a binomial proportion. Statistical Science, 16(2), 101–133. https://doi.org/10.1214/ss/1009213286</w:t>
       </w:r>
     </w:p>
@@ -17627,6 +18016,19 @@
           <w:i w:val="0"/>
         </w:rPr>
         <w:t>DeLone, W. H., &amp; McLean, E. R. (2003). The DeLone and McLean model of information systems success: A ten-year update. Journal of Management Information Systems, 19(4), 9–30. https://doi.org/10.1080/07421222.2003.11045748</w:t>
+      </w:r>
+    </w:p>
+    <w:p>
+      <w:pPr>
+        <w:spacing w:after="160" w:line="360" w:lineRule="auto"/>
+        <w:ind w:left="720" w:hanging="720"/>
+        <w:jc w:val="left"/>
+      </w:pPr>
+      <w:r>
+        <w:rPr>
+          <w:i w:val="0"/>
+        </w:rPr>
+        <w:t>Elmagarmid, A. K., Ipeirotis, P. G., &amp; Verykios, V. S. (2007). Duplicate record detection: A survey. IEEE Transactions on Knowledge and Data Engineering, 19(1), 1–16. https://doi.org/10.1109/TKDE.2007.250581</w:t>
       </w:r>
     </w:p>
     <w:p>

</xml_diff>

<commit_message>
Chapter Four: plainer wording for the simulation's test customer profiles
Co-Authored-By: Claude Opus 5.5 <noreply@anthropic.com>
Claude-Session: https://claude.ai/code/session_0116ePZsFh2Yr8B4s3JdZBxN
</commit_message>
<xml_diff>
--- a/docs/chapter4_final/08_chapter/Chapter_Four.docx
+++ b/docs/chapter4_final/08_chapter/Chapter_Four.docx
@@ -14643,7 +14643,7 @@
         <w:rPr>
           <w:i w:val="0"/>
         </w:rPr>
-        <w:t>Validation accuracy was measured with a controlled simulation. Orders were generated by a test harness and submitted through the same database functions a customer uses, save_draft followed by submit_order, so the rules saw them exactly as they would see a real order. Each order was either clean or carried one planted error of a known type. The harness held the planted error only in its own variables and wrote it to a results table after the run, so nothing the validation engine could read revealed which orders were erroneous. Each run took place inside a transaction that was rolled back, which removed every simulated customer and order and left the live data unchanged. The status history and the timing of each order were captured before the rollback.</w:t>
+        <w:t>Validation accuracy was measured with a controlled simulation. Orders were generated by a test script and submitted through the same database functions a customer uses, save_draft followed by submit_order, so the rules saw them exactly as they would see a real order. Each order was either clean or carried one planted error of a known type. The script held the planted error only in its own variables and wrote it to a results table after the run, so nothing the validation engine could read revealed which orders were erroneous. Each run took place inside a transaction that was rolled back, which removed every simulated customer and order and left the live data unchanged. The status history and the timing of each order were captured before the rollback.</w:t>
       </w:r>
     </w:p>
     <w:p>
@@ -15434,7 +15434,7 @@
         <w:rPr>
           <w:i w:val="0"/>
         </w:rPr>
-        <w:t>The simulation used the same twenty fictional customer companies and the same twelve-product catalogue as the first run. Company names, contact names, telephone numbers and e-mail addresses are invented, and every e-mail address uses the reserved .example domain. Each customer had two saved addresses in one of six delivery regions and four earlier orders, which give the unusual-quantity rule a history to compare against. Table 4.17 lists the companies and Table 4.18 describes the replicate 1 dataset. Figure 4.4 shows how the orders were spread across the delivery regions.</w:t>
+        <w:t>The simulation used twenty customer profiles and the twelve-product catalogue of the first run. As Section 1.5 sets out, the profiles were set up for the test on the pattern of realistic business customers and do not belong to real customers. Each customer had two saved addresses in one of six delivery regions and four earlier orders, which give the unusual-quantity rule a history to compare against. Table 4.17 lists the companies and Table 4.18 describes the replicate 1 dataset. Figure 4.4 shows how the orders were spread across the delivery regions.</w:t>
       </w:r>
     </w:p>
     <w:p>
@@ -15448,7 +15448,7 @@
           <w:b/>
           <w:i w:val="0"/>
         </w:rPr>
-        <w:t>Table 4.17: Fictional customer companies used in the simulation</w:t>
+        <w:t>Table 4.17: Customer profiles used in the simulation</w:t>
       </w:r>
     </w:p>
     <w:tbl>
@@ -15460,16 +15460,15 @@
         <w:tblLook w:firstColumn="1" w:firstRow="1" w:lastColumn="0" w:lastRow="0" w:noHBand="0" w:noVBand="1" w:val="04A0"/>
       </w:tblPr>
       <w:tblGrid>
-        <w:gridCol w:w="2608"/>
+        <w:gridCol w:w="3742"/>
+        <w:gridCol w:w="2494"/>
         <w:gridCol w:w="1814"/>
-        <w:gridCol w:w="3061"/>
-        <w:gridCol w:w="1247"/>
-        <w:gridCol w:w="680"/>
+        <w:gridCol w:w="1020"/>
       </w:tblGrid>
       <w:tr>
         <w:tc>
           <w:tcPr>
-            <w:tcW w:type="dxa" w:w="2608"/>
+            <w:tcW w:type="dxa" w:w="3742"/>
             <w:shd w:val="clear" w:color="auto" w:fill="D9E2E1"/>
           </w:tcPr>
           <w:p>
@@ -15485,6 +15484,22 @@
         </w:tc>
         <w:tc>
           <w:tcPr>
+            <w:tcW w:type="dxa" w:w="2494"/>
+            <w:shd w:val="clear" w:color="auto" w:fill="D9E2E1"/>
+          </w:tcPr>
+          <w:p>
+            <w:r/>
+            <w:r>
+              <w:rPr>
+                <w:b/>
+                <w:sz w:val="17"/>
+              </w:rPr>
+              <w:t>Contact person</w:t>
+            </w:r>
+          </w:p>
+        </w:tc>
+        <w:tc>
+          <w:tcPr>
             <w:tcW w:type="dxa" w:w="1814"/>
             <w:shd w:val="clear" w:color="auto" w:fill="D9E2E1"/>
           </w:tcPr>
@@ -15495,13 +15510,13 @@
                 <w:b/>
                 <w:sz w:val="17"/>
               </w:rPr>
-              <w:t>Contact person</w:t>
-            </w:r>
-          </w:p>
-        </w:tc>
-        <w:tc>
-          <w:tcPr>
-            <w:tcW w:type="dxa" w:w="3061"/>
+              <w:t>Region</w:t>
+            </w:r>
+          </w:p>
+        </w:tc>
+        <w:tc>
+          <w:tcPr>
+            <w:tcW w:type="dxa" w:w="1020"/>
             <w:shd w:val="clear" w:color="auto" w:fill="D9E2E1"/>
           </w:tcPr>
           <w:p>
@@ -15511,38 +15526,6 @@
                 <w:b/>
                 <w:sz w:val="17"/>
               </w:rPr>
-              <w:t>E-mail</w:t>
-            </w:r>
-          </w:p>
-        </w:tc>
-        <w:tc>
-          <w:tcPr>
-            <w:tcW w:type="dxa" w:w="1247"/>
-            <w:shd w:val="clear" w:color="auto" w:fill="D9E2E1"/>
-          </w:tcPr>
-          <w:p>
-            <w:r/>
-            <w:r>
-              <w:rPr>
-                <w:b/>
-                <w:sz w:val="17"/>
-              </w:rPr>
-              <w:t>Region</w:t>
-            </w:r>
-          </w:p>
-        </w:tc>
-        <w:tc>
-          <w:tcPr>
-            <w:tcW w:type="dxa" w:w="680"/>
-            <w:shd w:val="clear" w:color="auto" w:fill="D9E2E1"/>
-          </w:tcPr>
-          <w:p>
-            <w:r/>
-            <w:r>
-              <w:rPr>
-                <w:b/>
-                <w:sz w:val="17"/>
-              </w:rPr>
               <w:t>Orders</w:t>
             </w:r>
           </w:p>
@@ -15551,7 +15534,7 @@
       <w:tr>
         <w:tc>
           <w:tcPr>
-            <w:tcW w:type="dxa" w:w="2608"/>
+            <w:tcW w:type="dxa" w:w="3742"/>
           </w:tcPr>
           <w:p>
             <w:r/>
@@ -15565,6 +15548,20 @@
         </w:tc>
         <w:tc>
           <w:tcPr>
+            <w:tcW w:type="dxa" w:w="2494"/>
+          </w:tcPr>
+          <w:p>
+            <w:r/>
+            <w:r>
+              <w:rPr>
+                <w:sz w:val="17"/>
+              </w:rPr>
+              <w:t>Folake Adeyemi</w:t>
+            </w:r>
+          </w:p>
+        </w:tc>
+        <w:tc>
+          <w:tcPr>
             <w:tcW w:type="dxa" w:w="1814"/>
           </w:tcPr>
           <w:p>
@@ -15573,41 +15570,13 @@
               <w:rPr>
                 <w:sz w:val="17"/>
               </w:rPr>
-              <w:t>Folake Adeyemi</w:t>
-            </w:r>
-          </w:p>
-        </w:tc>
-        <w:tc>
-          <w:tcPr>
-            <w:tcW w:type="dxa" w:w="3061"/>
-          </w:tcPr>
-          <w:p>
-            <w:r/>
-            <w:r>
-              <w:rPr>
-                <w:sz w:val="17"/>
-              </w:rPr>
-              <w:t>folake.adeyemi@adeyemi1.example</w:t>
-            </w:r>
-          </w:p>
-        </w:tc>
-        <w:tc>
-          <w:tcPr>
-            <w:tcW w:type="dxa" w:w="1247"/>
-          </w:tcPr>
-          <w:p>
-            <w:r/>
-            <w:r>
-              <w:rPr>
-                <w:sz w:val="17"/>
-              </w:rPr>
               <w:t>Ikeja</w:t>
             </w:r>
           </w:p>
         </w:tc>
         <w:tc>
           <w:tcPr>
-            <w:tcW w:type="dxa" w:w="680"/>
+            <w:tcW w:type="dxa" w:w="1020"/>
           </w:tcPr>
           <w:p>
             <w:r/>
@@ -15623,7 +15592,7 @@
       <w:tr>
         <w:tc>
           <w:tcPr>
-            <w:tcW w:type="dxa" w:w="2608"/>
+            <w:tcW w:type="dxa" w:w="3742"/>
           </w:tcPr>
           <w:p>
             <w:r/>
@@ -15637,6 +15606,20 @@
         </w:tc>
         <w:tc>
           <w:tcPr>
+            <w:tcW w:type="dxa" w:w="2494"/>
+          </w:tcPr>
+          <w:p>
+            <w:r/>
+            <w:r>
+              <w:rPr>
+                <w:sz w:val="17"/>
+              </w:rPr>
+              <w:t>Yusuf Adebanjo</w:t>
+            </w:r>
+          </w:p>
+        </w:tc>
+        <w:tc>
+          <w:tcPr>
             <w:tcW w:type="dxa" w:w="1814"/>
           </w:tcPr>
           <w:p>
@@ -15645,41 +15628,13 @@
               <w:rPr>
                 <w:sz w:val="17"/>
               </w:rPr>
-              <w:t>Yusuf Adebanjo</w:t>
-            </w:r>
-          </w:p>
-        </w:tc>
-        <w:tc>
-          <w:tcPr>
-            <w:tcW w:type="dxa" w:w="3061"/>
-          </w:tcPr>
-          <w:p>
-            <w:r/>
-            <w:r>
-              <w:rPr>
-                <w:sz w:val="17"/>
-              </w:rPr>
-              <w:t>yusuf.adebanjo@agege13.example</w:t>
-            </w:r>
-          </w:p>
-        </w:tc>
-        <w:tc>
-          <w:tcPr>
-            <w:tcW w:type="dxa" w:w="1247"/>
-          </w:tcPr>
-          <w:p>
-            <w:r/>
-            <w:r>
-              <w:rPr>
-                <w:sz w:val="17"/>
-              </w:rPr>
               <w:t>Ikeja</w:t>
             </w:r>
           </w:p>
         </w:tc>
         <w:tc>
           <w:tcPr>
-            <w:tcW w:type="dxa" w:w="680"/>
+            <w:tcW w:type="dxa" w:w="1020"/>
           </w:tcPr>
           <w:p>
             <w:r/>
@@ -15695,7 +15650,7 @@
       <w:tr>
         <w:tc>
           <w:tcPr>
-            <w:tcW w:type="dxa" w:w="2608"/>
+            <w:tcW w:type="dxa" w:w="3742"/>
           </w:tcPr>
           <w:p>
             <w:r/>
@@ -15709,6 +15664,20 @@
         </w:tc>
         <w:tc>
           <w:tcPr>
+            <w:tcW w:type="dxa" w:w="2494"/>
+          </w:tcPr>
+          <w:p>
+            <w:r/>
+            <w:r>
+              <w:rPr>
+                <w:sz w:val="17"/>
+              </w:rPr>
+              <w:t>Blessing Okoro</w:t>
+            </w:r>
+          </w:p>
+        </w:tc>
+        <w:tc>
+          <w:tcPr>
             <w:tcW w:type="dxa" w:w="1814"/>
           </w:tcPr>
           <w:p>
@@ -15717,41 +15686,13 @@
               <w:rPr>
                 <w:sz w:val="17"/>
               </w:rPr>
-              <w:t>Blessing Okoro</w:t>
-            </w:r>
-          </w:p>
-        </w:tc>
-        <w:tc>
-          <w:tcPr>
-            <w:tcW w:type="dxa" w:w="3061"/>
-          </w:tcPr>
-          <w:p>
-            <w:r/>
-            <w:r>
-              <w:rPr>
-                <w:sz w:val="17"/>
-              </w:rPr>
-              <w:t>blessing.okoro@ajah14.example</w:t>
-            </w:r>
-          </w:p>
-        </w:tc>
-        <w:tc>
-          <w:tcPr>
-            <w:tcW w:type="dxa" w:w="1247"/>
-          </w:tcPr>
-          <w:p>
-            <w:r/>
-            <w:r>
-              <w:rPr>
-                <w:sz w:val="17"/>
-              </w:rPr>
               <w:t>Lekki-Ajah</w:t>
             </w:r>
           </w:p>
         </w:tc>
         <w:tc>
           <w:tcPr>
-            <w:tcW w:type="dxa" w:w="680"/>
+            <w:tcW w:type="dxa" w:w="1020"/>
           </w:tcPr>
           <w:p>
             <w:r/>
@@ -15767,7 +15708,7 @@
       <w:tr>
         <w:tc>
           <w:tcPr>
-            <w:tcW w:type="dxa" w:w="2608"/>
+            <w:tcW w:type="dxa" w:w="3742"/>
           </w:tcPr>
           <w:p>
             <w:r/>
@@ -15781,6 +15722,20 @@
         </w:tc>
         <w:tc>
           <w:tcPr>
+            <w:tcW w:type="dxa" w:w="2494"/>
+          </w:tcPr>
+          <w:p>
+            <w:r/>
+            <w:r>
+              <w:rPr>
+                <w:sz w:val="17"/>
+              </w:rPr>
+              <w:t>Garba Usman</w:t>
+            </w:r>
+          </w:p>
+        </w:tc>
+        <w:tc>
+          <w:tcPr>
             <w:tcW w:type="dxa" w:w="1814"/>
           </w:tcPr>
           <w:p>
@@ -15789,41 +15744,13 @@
               <w:rPr>
                 <w:sz w:val="17"/>
               </w:rPr>
-              <w:t>Garba Usman</w:t>
-            </w:r>
-          </w:p>
-        </w:tc>
-        <w:tc>
-          <w:tcPr>
-            <w:tcW w:type="dxa" w:w="3061"/>
-          </w:tcPr>
-          <w:p>
-            <w:r/>
-            <w:r>
-              <w:rPr>
-                <w:sz w:val="17"/>
-              </w:rPr>
-              <w:t>garba.usman@apapa20.example</w:t>
-            </w:r>
-          </w:p>
-        </w:tc>
-        <w:tc>
-          <w:tcPr>
-            <w:tcW w:type="dxa" w:w="1247"/>
-          </w:tcPr>
-          <w:p>
-            <w:r/>
-            <w:r>
-              <w:rPr>
-                <w:sz w:val="17"/>
-              </w:rPr>
               <w:t>Lagos Mainland</w:t>
             </w:r>
           </w:p>
         </w:tc>
         <w:tc>
           <w:tcPr>
-            <w:tcW w:type="dxa" w:w="680"/>
+            <w:tcW w:type="dxa" w:w="1020"/>
           </w:tcPr>
           <w:p>
             <w:r/>
@@ -15839,7 +15766,7 @@
       <w:tr>
         <w:tc>
           <w:tcPr>
-            <w:tcW w:type="dxa" w:w="2608"/>
+            <w:tcW w:type="dxa" w:w="3742"/>
           </w:tcPr>
           <w:p>
             <w:r/>
@@ -15853,6 +15780,20 @@
         </w:tc>
         <w:tc>
           <w:tcPr>
+            <w:tcW w:type="dxa" w:w="2494"/>
+          </w:tcPr>
+          <w:p>
+            <w:r/>
+            <w:r>
+              <w:rPr>
+                <w:sz w:val="17"/>
+              </w:rPr>
+              <w:t>Segun Olatunji</w:t>
+            </w:r>
+          </w:p>
+        </w:tc>
+        <w:tc>
+          <w:tcPr>
             <w:tcW w:type="dxa" w:w="1814"/>
           </w:tcPr>
           <w:p>
@@ -15861,41 +15802,13 @@
               <w:rPr>
                 <w:sz w:val="17"/>
               </w:rPr>
-              <w:t>Segun Olatunji</w:t>
-            </w:r>
-          </w:p>
-        </w:tc>
-        <w:tc>
-          <w:tcPr>
-            <w:tcW w:type="dxa" w:w="3061"/>
-          </w:tcPr>
-          <w:p>
-            <w:r/>
-            <w:r>
-              <w:rPr>
-                <w:sz w:val="17"/>
-              </w:rPr>
-              <w:t>segun.olatunji@bodija16.example</w:t>
-            </w:r>
-          </w:p>
-        </w:tc>
-        <w:tc>
-          <w:tcPr>
-            <w:tcW w:type="dxa" w:w="1247"/>
-          </w:tcPr>
-          <w:p>
-            <w:r/>
-            <w:r>
-              <w:rPr>
-                <w:sz w:val="17"/>
-              </w:rPr>
               <w:t>Ibadan</w:t>
             </w:r>
           </w:p>
         </w:tc>
         <w:tc>
           <w:tcPr>
-            <w:tcW w:type="dxa" w:w="680"/>
+            <w:tcW w:type="dxa" w:w="1020"/>
           </w:tcPr>
           <w:p>
             <w:r/>
@@ -15911,7 +15824,7 @@
       <w:tr>
         <w:tc>
           <w:tcPr>
-            <w:tcW w:type="dxa" w:w="2608"/>
+            <w:tcW w:type="dxa" w:w="3742"/>
           </w:tcPr>
           <w:p>
             <w:r/>
@@ -15925,6 +15838,20 @@
         </w:tc>
         <w:tc>
           <w:tcPr>
+            <w:tcW w:type="dxa" w:w="2494"/>
+          </w:tcPr>
+          <w:p>
+            <w:r/>
+            <w:r>
+              <w:rPr>
+                <w:sz w:val="17"/>
+              </w:rPr>
+              <w:t>Tolulope Ogunleye</w:t>
+            </w:r>
+          </w:p>
+        </w:tc>
+        <w:tc>
+          <w:tcPr>
             <w:tcW w:type="dxa" w:w="1814"/>
           </w:tcPr>
           <w:p>
@@ -15933,41 +15860,13 @@
               <w:rPr>
                 <w:sz w:val="17"/>
               </w:rPr>
-              <w:t>Tolulope Ogunleye</w:t>
-            </w:r>
-          </w:p>
-        </w:tc>
-        <w:tc>
-          <w:tcPr>
-            <w:tcW w:type="dxa" w:w="3061"/>
-          </w:tcPr>
-          <w:p>
-            <w:r/>
-            <w:r>
-              <w:rPr>
-                <w:sz w:val="17"/>
-              </w:rPr>
-              <w:t>tolulope.ogunleye@eko6.example</w:t>
-            </w:r>
-          </w:p>
-        </w:tc>
-        <w:tc>
-          <w:tcPr>
-            <w:tcW w:type="dxa" w:w="1247"/>
-          </w:tcPr>
-          <w:p>
-            <w:r/>
-            <w:r>
-              <w:rPr>
-                <w:sz w:val="17"/>
-              </w:rPr>
               <w:t>Lagos Island</w:t>
             </w:r>
           </w:p>
         </w:tc>
         <w:tc>
           <w:tcPr>
-            <w:tcW w:type="dxa" w:w="680"/>
+            <w:tcW w:type="dxa" w:w="1020"/>
           </w:tcPr>
           <w:p>
             <w:r/>
@@ -15983,7 +15882,7 @@
       <w:tr>
         <w:tc>
           <w:tcPr>
-            <w:tcW w:type="dxa" w:w="2608"/>
+            <w:tcW w:type="dxa" w:w="3742"/>
           </w:tcPr>
           <w:p>
             <w:r/>
@@ -15997,6 +15896,20 @@
         </w:tc>
         <w:tc>
           <w:tcPr>
+            <w:tcW w:type="dxa" w:w="2494"/>
+          </w:tcPr>
+          <w:p>
+            <w:r/>
+            <w:r>
+              <w:rPr>
+                <w:sz w:val="17"/>
+              </w:rPr>
+              <w:t>Ngozi Eze</w:t>
+            </w:r>
+          </w:p>
+        </w:tc>
+        <w:tc>
+          <w:tcPr>
             <w:tcW w:type="dxa" w:w="1814"/>
           </w:tcPr>
           <w:p>
@@ -16005,41 +15918,13 @@
               <w:rPr>
                 <w:sz w:val="17"/>
               </w:rPr>
-              <w:t>Ngozi Eze</w:t>
-            </w:r>
-          </w:p>
-        </w:tc>
-        <w:tc>
-          <w:tcPr>
-            <w:tcW w:type="dxa" w:w="3061"/>
-          </w:tcPr>
-          <w:p>
-            <w:r/>
-            <w:r>
-              <w:rPr>
-                <w:sz w:val="17"/>
-              </w:rPr>
-              <w:t>ngozi.eze@greenfield7.example</w:t>
-            </w:r>
-          </w:p>
-        </w:tc>
-        <w:tc>
-          <w:tcPr>
-            <w:tcW w:type="dxa" w:w="1247"/>
-          </w:tcPr>
-          <w:p>
-            <w:r/>
-            <w:r>
-              <w:rPr>
-                <w:sz w:val="17"/>
-              </w:rPr>
               <w:t>Lekki-Ajah</w:t>
             </w:r>
           </w:p>
         </w:tc>
         <w:tc>
           <w:tcPr>
-            <w:tcW w:type="dxa" w:w="680"/>
+            <w:tcW w:type="dxa" w:w="1020"/>
           </w:tcPr>
           <w:p>
             <w:r/>
@@ -16055,7 +15940,7 @@
       <w:tr>
         <w:tc>
           <w:tcPr>
-            <w:tcW w:type="dxa" w:w="2608"/>
+            <w:tcW w:type="dxa" w:w="3742"/>
           </w:tcPr>
           <w:p>
             <w:r/>
@@ -16069,6 +15954,20 @@
         </w:tc>
         <w:tc>
           <w:tcPr>
+            <w:tcW w:type="dxa" w:w="2494"/>
+          </w:tcPr>
+          <w:p>
+            <w:r/>
+            <w:r>
+              <w:rPr>
+                <w:sz w:val="17"/>
+              </w:rPr>
+              <w:t>Fatima Sani</w:t>
+            </w:r>
+          </w:p>
+        </w:tc>
+        <w:tc>
+          <w:tcPr>
             <w:tcW w:type="dxa" w:w="1814"/>
           </w:tcPr>
           <w:p>
@@ -16077,41 +15976,13 @@
               <w:rPr>
                 <w:sz w:val="17"/>
               </w:rPr>
-              <w:t>Fatima Sani</w:t>
-            </w:r>
-          </w:p>
-        </w:tc>
-        <w:tc>
-          <w:tcPr>
-            <w:tcW w:type="dxa" w:w="3061"/>
-          </w:tcPr>
-          <w:p>
-            <w:r/>
-            <w:r>
-              <w:rPr>
-                <w:sz w:val="17"/>
-              </w:rPr>
-              <w:t>fatima.sani@gwarinpa15.example</w:t>
-            </w:r>
-          </w:p>
-        </w:tc>
-        <w:tc>
-          <w:tcPr>
-            <w:tcW w:type="dxa" w:w="1247"/>
-          </w:tcPr>
-          <w:p>
-            <w:r/>
-            <w:r>
-              <w:rPr>
-                <w:sz w:val="17"/>
-              </w:rPr>
               <w:t>Abuja</w:t>
             </w:r>
           </w:p>
         </w:tc>
         <w:tc>
           <w:tcPr>
-            <w:tcW w:type="dxa" w:w="680"/>
+            <w:tcW w:type="dxa" w:w="1020"/>
           </w:tcPr>
           <w:p>
             <w:r/>
@@ -16127,7 +15998,7 @@
       <w:tr>
         <w:tc>
           <w:tcPr>
-            <w:tcW w:type="dxa" w:w="2608"/>
+            <w:tcW w:type="dxa" w:w="3742"/>
           </w:tcPr>
           <w:p>
             <w:r/>
@@ -16141,6 +16012,20 @@
         </w:tc>
         <w:tc>
           <w:tcPr>
+            <w:tcW w:type="dxa" w:w="2494"/>
+          </w:tcPr>
+          <w:p>
+            <w:r/>
+            <w:r>
+              <w:rPr>
+                <w:sz w:val="17"/>
+              </w:rPr>
+              <w:t>Oluwaseun Afolabi</w:t>
+            </w:r>
+          </w:p>
+        </w:tc>
+        <w:tc>
+          <w:tcPr>
             <w:tcW w:type="dxa" w:w="1814"/>
           </w:tcPr>
           <w:p>
@@ -16149,41 +16034,13 @@
               <w:rPr>
                 <w:sz w:val="17"/>
               </w:rPr>
-              <w:t>Oluwaseun Afolabi</w:t>
-            </w:r>
-          </w:p>
-        </w:tc>
-        <w:tc>
-          <w:tcPr>
-            <w:tcW w:type="dxa" w:w="3061"/>
-          </w:tcPr>
-          <w:p>
-            <w:r/>
-            <w:r>
-              <w:rPr>
-                <w:sz w:val="17"/>
-              </w:rPr>
-              <w:t>oluwaseun.afolabi@ibadan3.example</w:t>
-            </w:r>
-          </w:p>
-        </w:tc>
-        <w:tc>
-          <w:tcPr>
-            <w:tcW w:type="dxa" w:w="1247"/>
-          </w:tcPr>
-          <w:p>
-            <w:r/>
-            <w:r>
-              <w:rPr>
-                <w:sz w:val="17"/>
-              </w:rPr>
               <w:t>Ibadan</w:t>
             </w:r>
           </w:p>
         </w:tc>
         <w:tc>
           <w:tcPr>
-            <w:tcW w:type="dxa" w:w="680"/>
+            <w:tcW w:type="dxa" w:w="1020"/>
           </w:tcPr>
           <w:p>
             <w:r/>
@@ -16199,7 +16056,7 @@
       <w:tr>
         <w:tc>
           <w:tcPr>
-            <w:tcW w:type="dxa" w:w="2608"/>
+            <w:tcW w:type="dxa" w:w="3742"/>
           </w:tcPr>
           <w:p>
             <w:r/>
@@ -16213,6 +16070,20 @@
         </w:tc>
         <w:tc>
           <w:tcPr>
+            <w:tcW w:type="dxa" w:w="2494"/>
+          </w:tcPr>
+          <w:p>
+            <w:r/>
+            <w:r>
+              <w:rPr>
+                <w:sz w:val="17"/>
+              </w:rPr>
+              <w:t>Chukwuemeka Kanu</w:t>
+            </w:r>
+          </w:p>
+        </w:tc>
+        <w:tc>
+          <w:tcPr>
             <w:tcW w:type="dxa" w:w="1814"/>
           </w:tcPr>
           <w:p>
@@ -16221,41 +16092,13 @@
               <w:rPr>
                 <w:sz w:val="17"/>
               </w:rPr>
-              <w:t>Chukwuemeka Kanu</w:t>
-            </w:r>
-          </w:p>
-        </w:tc>
-        <w:tc>
-          <w:tcPr>
-            <w:tcW w:type="dxa" w:w="3061"/>
-          </w:tcPr>
-          <w:p>
-            <w:r/>
-            <w:r>
-              <w:rPr>
-                <w:sz w:val="17"/>
-              </w:rPr>
-              <w:t>chukwuemeka.kanu@kanu2.example</w:t>
-            </w:r>
-          </w:p>
-        </w:tc>
-        <w:tc>
-          <w:tcPr>
-            <w:tcW w:type="dxa" w:w="1247"/>
-          </w:tcPr>
-          <w:p>
-            <w:r/>
-            <w:r>
-              <w:rPr>
-                <w:sz w:val="17"/>
-              </w:rPr>
               <w:t>Lagos Mainland</w:t>
             </w:r>
           </w:p>
         </w:tc>
         <w:tc>
           <w:tcPr>
-            <w:tcW w:type="dxa" w:w="680"/>
+            <w:tcW w:type="dxa" w:w="1020"/>
           </w:tcPr>
           <w:p>
             <w:r/>
@@ -16271,7 +16114,7 @@
       <w:tr>
         <w:tc>
           <w:tcPr>
-            <w:tcW w:type="dxa" w:w="2608"/>
+            <w:tcW w:type="dxa" w:w="3742"/>
           </w:tcPr>
           <w:p>
             <w:r/>
@@ -16285,6 +16128,20 @@
         </w:tc>
         <w:tc>
           <w:tcPr>
+            <w:tcW w:type="dxa" w:w="2494"/>
+          </w:tcPr>
+          <w:p>
+            <w:r/>
+            <w:r>
+              <w:rPr>
+                <w:sz w:val="17"/>
+              </w:rPr>
+              <w:t>Amina Bello</w:t>
+            </w:r>
+          </w:p>
+        </w:tc>
+        <w:tc>
+          <w:tcPr>
             <w:tcW w:type="dxa" w:w="1814"/>
           </w:tcPr>
           <w:p>
@@ -16293,41 +16150,13 @@
               <w:rPr>
                 <w:sz w:val="17"/>
               </w:rPr>
-              <w:t>Amina Bello</w:t>
-            </w:r>
-          </w:p>
-        </w:tc>
-        <w:tc>
-          <w:tcPr>
-            <w:tcW w:type="dxa" w:w="3061"/>
-          </w:tcPr>
-          <w:p>
-            <w:r/>
-            <w:r>
-              <w:rPr>
-                <w:sz w:val="17"/>
-              </w:rPr>
-              <w:t>amina.bello@lekki4.example</w:t>
-            </w:r>
-          </w:p>
-        </w:tc>
-        <w:tc>
-          <w:tcPr>
-            <w:tcW w:type="dxa" w:w="1247"/>
-          </w:tcPr>
-          <w:p>
-            <w:r/>
-            <w:r>
-              <w:rPr>
-                <w:sz w:val="17"/>
-              </w:rPr>
               <w:t>Lekki-Ajah</w:t>
             </w:r>
           </w:p>
         </w:tc>
         <w:tc>
           <w:tcPr>
-            <w:tcW w:type="dxa" w:w="680"/>
+            <w:tcW w:type="dxa" w:w="1020"/>
           </w:tcPr>
           <w:p>
             <w:r/>
@@ -16343,7 +16172,7 @@
       <w:tr>
         <w:tc>
           <w:tcPr>
-            <w:tcW w:type="dxa" w:w="2608"/>
+            <w:tcW w:type="dxa" w:w="3742"/>
           </w:tcPr>
           <w:p>
             <w:r/>
@@ -16357,6 +16186,20 @@
         </w:tc>
         <w:tc>
           <w:tcPr>
+            <w:tcW w:type="dxa" w:w="2494"/>
+          </w:tcPr>
+          <w:p>
+            <w:r/>
+            <w:r>
+              <w:rPr>
+                <w:sz w:val="17"/>
+              </w:rPr>
+              <w:t>Funmilayo Adeleke</w:t>
+            </w:r>
+          </w:p>
+        </w:tc>
+        <w:tc>
+          <w:tcPr>
             <w:tcW w:type="dxa" w:w="1814"/>
           </w:tcPr>
           <w:p>
@@ -16365,41 +16208,13 @@
               <w:rPr>
                 <w:sz w:val="17"/>
               </w:rPr>
-              <w:t>Funmilayo Adeleke</w:t>
-            </w:r>
-          </w:p>
-        </w:tc>
-        <w:tc>
-          <w:tcPr>
-            <w:tcW w:type="dxa" w:w="3061"/>
-          </w:tcPr>
-          <w:p>
-            <w:r/>
-            <w:r>
-              <w:rPr>
-                <w:sz w:val="17"/>
-              </w:rPr>
-              <w:t>funmilayo.adeleke@magodo19.example</w:t>
-            </w:r>
-          </w:p>
-        </w:tc>
-        <w:tc>
-          <w:tcPr>
-            <w:tcW w:type="dxa" w:w="1247"/>
-          </w:tcPr>
-          <w:p>
-            <w:r/>
-            <w:r>
-              <w:rPr>
-                <w:sz w:val="17"/>
-              </w:rPr>
               <w:t>Ikeja</w:t>
             </w:r>
           </w:p>
         </w:tc>
         <w:tc>
           <w:tcPr>
-            <w:tcW w:type="dxa" w:w="680"/>
+            <w:tcW w:type="dxa" w:w="1020"/>
           </w:tcPr>
           <w:p>
             <w:r/>
@@ -16415,7 +16230,7 @@
       <w:tr>
         <w:tc>
           <w:tcPr>
-            <w:tcW w:type="dxa" w:w="2608"/>
+            <w:tcW w:type="dxa" w:w="3742"/>
           </w:tcPr>
           <w:p>
             <w:r/>
@@ -16429,6 +16244,20 @@
         </w:tc>
         <w:tc>
           <w:tcPr>
+            <w:tcW w:type="dxa" w:w="2494"/>
+          </w:tcPr>
+          <w:p>
+            <w:r/>
+            <w:r>
+              <w:rPr>
+                <w:sz w:val="17"/>
+              </w:rPr>
+              <w:t>Kemi Lawson</w:t>
+            </w:r>
+          </w:p>
+        </w:tc>
+        <w:tc>
+          <w:tcPr>
             <w:tcW w:type="dxa" w:w="1814"/>
           </w:tcPr>
           <w:p>
@@ -16437,41 +16266,13 @@
               <w:rPr>
                 <w:sz w:val="17"/>
               </w:rPr>
-              <w:t>Kemi Lawson</w:t>
-            </w:r>
-          </w:p>
-        </w:tc>
-        <w:tc>
-          <w:tcPr>
-            <w:tcW w:type="dxa" w:w="3061"/>
-          </w:tcPr>
-          <w:p>
-            <w:r/>
-            <w:r>
-              <w:rPr>
-                <w:sz w:val="17"/>
-              </w:rPr>
-              <w:t>kemi.lawson@marina11.example</w:t>
-            </w:r>
-          </w:p>
-        </w:tc>
-        <w:tc>
-          <w:tcPr>
-            <w:tcW w:type="dxa" w:w="1247"/>
-          </w:tcPr>
-          <w:p>
-            <w:r/>
-            <w:r>
-              <w:rPr>
-                <w:sz w:val="17"/>
-              </w:rPr>
               <w:t>Lagos Island</w:t>
             </w:r>
           </w:p>
         </w:tc>
         <w:tc>
           <w:tcPr>
-            <w:tcW w:type="dxa" w:w="680"/>
+            <w:tcW w:type="dxa" w:w="1020"/>
           </w:tcPr>
           <w:p>
             <w:r/>
@@ -16487,7 +16288,7 @@
       <w:tr>
         <w:tc>
           <w:tcPr>
-            <w:tcW w:type="dxa" w:w="2608"/>
+            <w:tcW w:type="dxa" w:w="3742"/>
           </w:tcPr>
           <w:p>
             <w:r/>
@@ -16501,6 +16302,20 @@
         </w:tc>
         <w:tc>
           <w:tcPr>
+            <w:tcW w:type="dxa" w:w="2494"/>
+          </w:tcPr>
+          <w:p>
+            <w:r/>
+            <w:r>
+              <w:rPr>
+                <w:sz w:val="17"/>
+              </w:rPr>
+              <w:t>Ibrahim Musa</w:t>
+            </w:r>
+          </w:p>
+        </w:tc>
+        <w:tc>
+          <w:tcPr>
             <w:tcW w:type="dxa" w:w="1814"/>
           </w:tcPr>
           <w:p>
@@ -16509,41 +16324,13 @@
               <w:rPr>
                 <w:sz w:val="17"/>
               </w:rPr>
-              <w:t>Ibrahim Musa</w:t>
-            </w:r>
-          </w:p>
-        </w:tc>
-        <w:tc>
-          <w:tcPr>
-            <w:tcW w:type="dxa" w:w="3061"/>
-          </w:tcPr>
-          <w:p>
-            <w:r/>
-            <w:r>
-              <w:rPr>
-                <w:sz w:val="17"/>
-              </w:rPr>
-              <w:t>ibrahim.musa@northgate5.example</w:t>
-            </w:r>
-          </w:p>
-        </w:tc>
-        <w:tc>
-          <w:tcPr>
-            <w:tcW w:type="dxa" w:w="1247"/>
-          </w:tcPr>
-          <w:p>
-            <w:r/>
-            <w:r>
-              <w:rPr>
-                <w:sz w:val="17"/>
-              </w:rPr>
               <w:t>Abuja</w:t>
             </w:r>
           </w:p>
         </w:tc>
         <w:tc>
           <w:tcPr>
-            <w:tcW w:type="dxa" w:w="680"/>
+            <w:tcW w:type="dxa" w:w="1020"/>
           </w:tcPr>
           <w:p>
             <w:r/>
@@ -16559,7 +16346,7 @@
       <w:tr>
         <w:tc>
           <w:tcPr>
-            <w:tcW w:type="dxa" w:w="2608"/>
+            <w:tcW w:type="dxa" w:w="3742"/>
           </w:tcPr>
           <w:p>
             <w:r/>
@@ -16573,6 +16360,20 @@
         </w:tc>
         <w:tc>
           <w:tcPr>
+            <w:tcW w:type="dxa" w:w="2494"/>
+          </w:tcPr>
+          <w:p>
+            <w:r/>
+            <w:r>
+              <w:rPr>
+                <w:sz w:val="17"/>
+              </w:rPr>
+              <w:t>Babatunde Oladipo</w:t>
+            </w:r>
+          </w:p>
+        </w:tc>
+        <w:tc>
+          <w:tcPr>
             <w:tcW w:type="dxa" w:w="1814"/>
           </w:tcPr>
           <w:p>
@@ -16581,41 +16382,13 @@
               <w:rPr>
                 <w:sz w:val="17"/>
               </w:rPr>
-              <w:t>Babatunde Oladipo</w:t>
-            </w:r>
-          </w:p>
-        </w:tc>
-        <w:tc>
-          <w:tcPr>
-            <w:tcW w:type="dxa" w:w="3061"/>
-          </w:tcPr>
-          <w:p>
-            <w:r/>
-            <w:r>
-              <w:rPr>
-                <w:sz w:val="17"/>
-              </w:rPr>
-              <w:t>babatunde.oladipo@olaade8.example</w:t>
-            </w:r>
-          </w:p>
-        </w:tc>
-        <w:tc>
-          <w:tcPr>
-            <w:tcW w:type="dxa" w:w="1247"/>
-          </w:tcPr>
-          <w:p>
-            <w:r/>
-            <w:r>
-              <w:rPr>
-                <w:sz w:val="17"/>
-              </w:rPr>
               <w:t>Ikeja</w:t>
             </w:r>
           </w:p>
         </w:tc>
         <w:tc>
           <w:tcPr>
-            <w:tcW w:type="dxa" w:w="680"/>
+            <w:tcW w:type="dxa" w:w="1020"/>
           </w:tcPr>
           <w:p>
             <w:r/>
@@ -16631,7 +16404,7 @@
       <w:tr>
         <w:tc>
           <w:tcPr>
-            <w:tcW w:type="dxa" w:w="2608"/>
+            <w:tcW w:type="dxa" w:w="3742"/>
           </w:tcPr>
           <w:p>
             <w:r/>
@@ -16645,6 +16418,20 @@
         </w:tc>
         <w:tc>
           <w:tcPr>
+            <w:tcW w:type="dxa" w:w="2494"/>
+          </w:tcPr>
+          <w:p>
+            <w:r/>
+            <w:r>
+              <w:rPr>
+                <w:sz w:val="17"/>
+              </w:rPr>
+              <w:t>Adewale Akinyemi</w:t>
+            </w:r>
+          </w:p>
+        </w:tc>
+        <w:tc>
+          <w:tcPr>
             <w:tcW w:type="dxa" w:w="1814"/>
           </w:tcPr>
           <w:p>
@@ -16653,41 +16440,13 @@
               <w:rPr>
                 <w:sz w:val="17"/>
               </w:rPr>
-              <w:t>Adewale Akinyemi</w:t>
-            </w:r>
-          </w:p>
-        </w:tc>
-        <w:tc>
-          <w:tcPr>
-            <w:tcW w:type="dxa" w:w="3061"/>
-          </w:tcPr>
-          <w:p>
-            <w:r/>
-            <w:r>
-              <w:rPr>
-                <w:sz w:val="17"/>
-              </w:rPr>
-              <w:t>adewale.akinyemi@oyo10.example</w:t>
-            </w:r>
-          </w:p>
-        </w:tc>
-        <w:tc>
-          <w:tcPr>
-            <w:tcW w:type="dxa" w:w="1247"/>
-          </w:tcPr>
-          <w:p>
-            <w:r/>
-            <w:r>
-              <w:rPr>
-                <w:sz w:val="17"/>
-              </w:rPr>
               <w:t>Ibadan</w:t>
             </w:r>
           </w:p>
         </w:tc>
         <w:tc>
           <w:tcPr>
-            <w:tcW w:type="dxa" w:w="680"/>
+            <w:tcW w:type="dxa" w:w="1020"/>
           </w:tcPr>
           <w:p>
             <w:r/>
@@ -16703,7 +16462,7 @@
       <w:tr>
         <w:tc>
           <w:tcPr>
-            <w:tcW w:type="dxa" w:w="2608"/>
+            <w:tcW w:type="dxa" w:w="3742"/>
           </w:tcPr>
           <w:p>
             <w:r/>
@@ -16717,6 +16476,20 @@
         </w:tc>
         <w:tc>
           <w:tcPr>
+            <w:tcW w:type="dxa" w:w="2494"/>
+          </w:tcPr>
+          <w:p>
+            <w:r/>
+            <w:r>
+              <w:rPr>
+                <w:sz w:val="17"/>
+              </w:rPr>
+              <w:t>Uche Nwosu</w:t>
+            </w:r>
+          </w:p>
+        </w:tc>
+        <w:tc>
+          <w:tcPr>
             <w:tcW w:type="dxa" w:w="1814"/>
           </w:tcPr>
           <w:p>
@@ -16725,41 +16498,13 @@
               <w:rPr>
                 <w:sz w:val="17"/>
               </w:rPr>
-              <w:t>Uche Nwosu</w:t>
-            </w:r>
-          </w:p>
-        </w:tc>
-        <w:tc>
-          <w:tcPr>
-            <w:tcW w:type="dxa" w:w="3061"/>
-          </w:tcPr>
-          <w:p>
-            <w:r/>
-            <w:r>
-              <w:rPr>
-                <w:sz w:val="17"/>
-              </w:rPr>
-              <w:t>uche.nwosu@surulere12.example</w:t>
-            </w:r>
-          </w:p>
-        </w:tc>
-        <w:tc>
-          <w:tcPr>
-            <w:tcW w:type="dxa" w:w="1247"/>
-          </w:tcPr>
-          <w:p>
-            <w:r/>
-            <w:r>
-              <w:rPr>
-                <w:sz w:val="17"/>
-              </w:rPr>
               <w:t>Lagos Mainland</w:t>
             </w:r>
           </w:p>
         </w:tc>
         <w:tc>
           <w:tcPr>
-            <w:tcW w:type="dxa" w:w="680"/>
+            <w:tcW w:type="dxa" w:w="1020"/>
           </w:tcPr>
           <w:p>
             <w:r/>
@@ -16775,7 +16520,7 @@
       <w:tr>
         <w:tc>
           <w:tcPr>
-            <w:tcW w:type="dxa" w:w="2608"/>
+            <w:tcW w:type="dxa" w:w="3742"/>
           </w:tcPr>
           <w:p>
             <w:r/>
@@ -16789,6 +16534,20 @@
         </w:tc>
         <w:tc>
           <w:tcPr>
+            <w:tcW w:type="dxa" w:w="2494"/>
+          </w:tcPr>
+          <w:p>
+            <w:r/>
+            <w:r>
+              <w:rPr>
+                <w:sz w:val="17"/>
+              </w:rPr>
+              <w:t>Chiamaka Obi</w:t>
+            </w:r>
+          </w:p>
+        </w:tc>
+        <w:tc>
+          <w:tcPr>
             <w:tcW w:type="dxa" w:w="1814"/>
           </w:tcPr>
           <w:p>
@@ -16797,41 +16556,13 @@
               <w:rPr>
                 <w:sz w:val="17"/>
               </w:rPr>
-              <w:t>Chiamaka Obi</w:t>
-            </w:r>
-          </w:p>
-        </w:tc>
-        <w:tc>
-          <w:tcPr>
-            <w:tcW w:type="dxa" w:w="3061"/>
-          </w:tcPr>
-          <w:p>
-            <w:r/>
-            <w:r>
-              <w:rPr>
-                <w:sz w:val="17"/>
-              </w:rPr>
-              <w:t>chiamaka.obi@victoria17.example</w:t>
-            </w:r>
-          </w:p>
-        </w:tc>
-        <w:tc>
-          <w:tcPr>
-            <w:tcW w:type="dxa" w:w="1247"/>
-          </w:tcPr>
-          <w:p>
-            <w:r/>
-            <w:r>
-              <w:rPr>
-                <w:sz w:val="17"/>
-              </w:rPr>
               <w:t>Lagos Island</w:t>
             </w:r>
           </w:p>
         </w:tc>
         <w:tc>
           <w:tcPr>
-            <w:tcW w:type="dxa" w:w="680"/>
+            <w:tcW w:type="dxa" w:w="1020"/>
           </w:tcPr>
           <w:p>
             <w:r/>
@@ -16847,7 +16578,7 @@
       <w:tr>
         <w:tc>
           <w:tcPr>
-            <w:tcW w:type="dxa" w:w="2608"/>
+            <w:tcW w:type="dxa" w:w="3742"/>
           </w:tcPr>
           <w:p>
             <w:r/>
@@ -16861,6 +16592,20 @@
         </w:tc>
         <w:tc>
           <w:tcPr>
+            <w:tcW w:type="dxa" w:w="2494"/>
+          </w:tcPr>
+          <w:p>
+            <w:r/>
+            <w:r>
+              <w:rPr>
+                <w:sz w:val="17"/>
+              </w:rPr>
+              <w:t>Emeka Okafor</w:t>
+            </w:r>
+          </w:p>
+        </w:tc>
+        <w:tc>
+          <w:tcPr>
             <w:tcW w:type="dxa" w:w="1814"/>
           </w:tcPr>
           <w:p>
@@ -16869,41 +16614,13 @@
               <w:rPr>
                 <w:sz w:val="17"/>
               </w:rPr>
-              <w:t>Emeka Okafor</w:t>
-            </w:r>
-          </w:p>
-        </w:tc>
-        <w:tc>
-          <w:tcPr>
-            <w:tcW w:type="dxa" w:w="3061"/>
-          </w:tcPr>
-          <w:p>
-            <w:r/>
-            <w:r>
-              <w:rPr>
-                <w:sz w:val="17"/>
-              </w:rPr>
-              <w:t>emeka.okafor@yaba18.example</w:t>
-            </w:r>
-          </w:p>
-        </w:tc>
-        <w:tc>
-          <w:tcPr>
-            <w:tcW w:type="dxa" w:w="1247"/>
-          </w:tcPr>
-          <w:p>
-            <w:r/>
-            <w:r>
-              <w:rPr>
-                <w:sz w:val="17"/>
-              </w:rPr>
               <w:t>Lagos Mainland</w:t>
             </w:r>
           </w:p>
         </w:tc>
         <w:tc>
           <w:tcPr>
-            <w:tcW w:type="dxa" w:w="680"/>
+            <w:tcW w:type="dxa" w:w="1020"/>
           </w:tcPr>
           <w:p>
             <w:r/>
@@ -16919,7 +16636,7 @@
       <w:tr>
         <w:tc>
           <w:tcPr>
-            <w:tcW w:type="dxa" w:w="2608"/>
+            <w:tcW w:type="dxa" w:w="3742"/>
           </w:tcPr>
           <w:p>
             <w:r/>
@@ -16933,6 +16650,20 @@
         </w:tc>
         <w:tc>
           <w:tcPr>
+            <w:tcW w:type="dxa" w:w="2494"/>
+          </w:tcPr>
+          <w:p>
+            <w:r/>
+            <w:r>
+              <w:rPr>
+                <w:sz w:val="17"/>
+              </w:rPr>
+              <w:t>Hauwa Abdullahi</w:t>
+            </w:r>
+          </w:p>
+        </w:tc>
+        <w:tc>
+          <w:tcPr>
             <w:tcW w:type="dxa" w:w="1814"/>
           </w:tcPr>
           <w:p>
@@ -16941,41 +16672,13 @@
               <w:rPr>
                 <w:sz w:val="17"/>
               </w:rPr>
-              <w:t>Hauwa Abdullahi</w:t>
-            </w:r>
-          </w:p>
-        </w:tc>
-        <w:tc>
-          <w:tcPr>
-            <w:tcW w:type="dxa" w:w="3061"/>
-          </w:tcPr>
-          <w:p>
-            <w:r/>
-            <w:r>
-              <w:rPr>
-                <w:sz w:val="17"/>
-              </w:rPr>
-              <w:t>hauwa.abdullahi@zuma9.example</w:t>
-            </w:r>
-          </w:p>
-        </w:tc>
-        <w:tc>
-          <w:tcPr>
-            <w:tcW w:type="dxa" w:w="1247"/>
-          </w:tcPr>
-          <w:p>
-            <w:r/>
-            <w:r>
-              <w:rPr>
-                <w:sz w:val="17"/>
-              </w:rPr>
               <w:t>Abuja</w:t>
             </w:r>
           </w:p>
         </w:tc>
         <w:tc>
           <w:tcPr>
-            <w:tcW w:type="dxa" w:w="680"/>
+            <w:tcW w:type="dxa" w:w="1020"/>
           </w:tcPr>
           <w:p>
             <w:r/>
@@ -16999,7 +16702,7 @@
           <w:i/>
           <w:sz w:val="20"/>
         </w:rPr>
-        <w:t>Source: replicate 1, database run 5, 03_simulation/replicate1_orders.csv. All names and contact details are fictional.</w:t>
+        <w:t>Source: test customer profiles, replicate 1, database run 5, 03_simulation/replicate1_orders.csv.</w:t>
       </w:r>
     </w:p>
     <w:p>
@@ -19018,7 +18721,7 @@
         <w:rPr>
           <w:i w:val="0"/>
         </w:rPr>
-        <w:t>The first run of the simulation, run 4, is kept as the first run and is not replaced. It used 500 orders whose types were drawn at random, so group sizes were unequal, and it planted no inactive-customer or stale-price errors. A defect in its harness also submitted 13 of its 35 wrong-product orders with an empty line, which the quantity rule blocked. Those 13 blocks were artefacts of the harness, not detections. The final simulation corrected the defect and added the two missing types, with twenty orders of every type, so its results are the ones assessed in this chapter.</w:t>
+        <w:t>The first run of the simulation, run 4, is kept as the first run and is not replaced. It used 500 orders whose types were drawn at random, so group sizes were unequal, and it planted no inactive-customer or stale-price errors. A defect in its test script also submitted 13 of its 35 wrong-product orders with an empty line, which the quantity rule blocked. Those 13 blocks were artefacts of the script, not detections. The final simulation corrected the defect and added the two missing types, with twenty orders of every type, so its results are the ones assessed in this chapter.</w:t>
       </w:r>
     </w:p>
     <w:p>
@@ -23913,7 +23616,7 @@
         <w:rPr>
           <w:i w:val="0"/>
         </w:rPr>
-        <w:t>The time was not stable across the run. Figure 4.10 shows that in replicate 1 the mean rose from 6.90 ms for the first 100 orders to 58.76 ms for the last 100, and replicate 2 followed the same path. The rules that look back over a customer's earlier orders have more orders to examine as the run goes on, which is consistent with this rise. Replicate 3 stayed between 2.08 and 2.54 ms throughout. The harness was the same in every run. It is assumed, but was not confirmed, that the database chose a different query plan in that run. In every replicate a single order was validated in well under a second.</w:t>
+        <w:t>The time was not stable across the run. Figure 4.10 shows that in replicate 1 the mean rose from 6.90 ms for the first 100 orders to 58.76 ms for the last 100, and replicate 2 followed the same path. The rules that look back over a customer's earlier orders have more orders to examine as the run goes on, which is consistent with this rise. Replicate 3 stayed between 2.08 and 2.54 ms throughout. The test script was the same in every run. It is assumed, but was not confirmed, that the database chose a different query plan in that run. In every replicate a single order was validated in well under a second.</w:t>
       </w:r>
     </w:p>
     <w:p>
@@ -27202,7 +26905,7 @@
         <w:rPr>
           <w:i w:val="0"/>
         </w:rPr>
-        <w:t>The orders were generated by a harness, not taken from real customers. Each carried at most one planted error, and the proportion of erroneous orders was fixed at 60 percent. Real orders may carry several errors, and it is assumed that they are erroneous far less often, which would lower precision for the same false-alarm rate. The figures are therefore a test of the engine under known conditions, not an estimate of its performance in daily use.</w:t>
+        <w:t>The orders were generated for the test, not taken from real customers. Each carried at most one planted error, and the proportion of erroneous orders was fixed at 60 percent. Real orders may carry several errors, and it is assumed that they are erroneous far less often, which would lower precision for the same false-alarm rate. The figures are therefore a test of the engine under known conditions, not an estimate of its performance in daily use.</w:t>
       </w:r>
     </w:p>
     <w:p>
@@ -27226,7 +26929,7 @@
         <w:rPr>
           <w:i w:val="0"/>
         </w:rPr>
-        <w:t>Each run took place inside one database transaction, so the database clock stood still during the run. The harness used the wall clock for timing and status history, but every order counted as submitted at the same moment, which keeps all earlier orders within the 24-hour duplicate window. The customer histories were also synthetic.</w:t>
+        <w:t>Each run took place inside one database transaction, so the database clock stood still during the run. The script used the wall clock for timing and status history, but every order counted as submitted at the same moment, which keeps all earlier orders within the 24-hour duplicate window. The customer histories were also synthetic.</w:t>
       </w:r>
     </w:p>
     <w:p>

</xml_diff>

<commit_message>
Chapter Four: manual end-to-end test of 30 October (Section 4.3.5)
Co-Authored-By: Claude Opus 5.5 <noreply@anthropic.com>
Claude-Session: https://claude.ai/code/session_0116ePZsFh2Yr8B4s3JdZBxN
</commit_message>
<xml_diff>
--- a/docs/chapter4_final/08_chapter/Chapter_Four.docx
+++ b/docs/chapter4_final/08_chapter/Chapter_Four.docx
@@ -14620,6 +14620,2181 @@
     </w:p>
     <w:p>
       <w:pPr>
+        <w:pStyle w:val="Heading3"/>
+      </w:pPr>
+      <w:r>
+        <w:t>4.3.5 Manual end-to-end test</w:t>
+      </w:r>
+    </w:p>
+    <w:p>
+      <w:pPr>
+        <w:spacing w:after="160" w:line="360" w:lineRule="auto"/>
+        <w:jc w:val="both"/>
+      </w:pPr>
+      <w:r>
+        <w:rPr>
+          <w:i w:val="0"/>
+        </w:rPr>
+        <w:t>Besides the scripted tests, the system was tested by hand on 30 October 2026, signing in with the demonstration account of each role in turn. Two orders were taken from the first entry by the customer to delivery, and the status history recorded every step with its time and the account that took it. Table 4.16 lists the steps. Order ORD-9371 went through without problems and was delivered 6 minutes 17 seconds after it was started. While building it the customer saw a stock message for electric cable and changed the order before submitting it.</w:t>
+      </w:r>
+    </w:p>
+    <w:p>
+      <w:pPr>
+        <w:spacing w:after="160" w:line="360" w:lineRule="auto"/>
+        <w:jc w:val="both"/>
+      </w:pPr>
+      <w:r>
+        <w:rPr>
+          <w:i w:val="0"/>
+        </w:rPr>
+        <w:t>Order ORD-9370 was used for the exceptions. Its first submission was blocked by the stock rule and it was corrected and resubmitted 65 seconds later. At picking the Warehouse found less stock than ordered and the customer accepted a partial delivery. Finance then paid the refund of ₦4,407.50 with credit note CN-9003. On the road the first driver entered a wrong delivery code once and then recorded a vehicle breakdown. Dispatch reassigned the order to a second driver, who delivered it with the customer code 13 minutes 28 seconds after it was started. Together the two orders passed through 14 of the 17 statuses and were handled by 6 of the seven roles. The three statuses for rejection and cancellation were not reached, either in this test or in the scripted tests of Table 4.14.</w:t>
+      </w:r>
+    </w:p>
+    <w:p>
+      <w:pPr>
+        <w:spacing w:after="160" w:line="360" w:lineRule="auto"/>
+        <w:jc w:val="both"/>
+      </w:pPr>
+      <w:r>
+        <w:rPr>
+          <w:i w:val="0"/>
+        </w:rPr>
+        <w:t>The accounts were used in quick succession, a few seconds to a few minutes apart, so the times show that each step responded at once rather than how long the steps take in operation. They are not a measure of processing time and do not replace the comparison with manual entry that Objective 4 requires.</w:t>
+      </w:r>
+    </w:p>
+    <w:p>
+      <w:pPr>
+        <w:keepNext/>
+        <w:spacing w:after="80" w:line="360" w:lineRule="auto"/>
+        <w:jc w:val="left"/>
+      </w:pPr>
+      <w:r>
+        <w:rPr>
+          <w:b/>
+          <w:i w:val="0"/>
+        </w:rPr>
+        <w:t>Table 4.16: Manual end-to-end test of two orders on 30 October 2026</w:t>
+      </w:r>
+    </w:p>
+    <w:tbl>
+      <w:tblPr>
+        <w:tblStyle w:val="TableGrid"/>
+        <w:tblW w:type="auto" w:w="0"/>
+        <w:jc w:val="center"/>
+        <w:tblLayout w:type="fixed"/>
+        <w:tblLook w:firstColumn="1" w:firstRow="1" w:lastColumn="0" w:lastRow="0" w:noHBand="0" w:noVBand="1" w:val="04A0"/>
+      </w:tblPr>
+      <w:tblGrid>
+        <w:gridCol w:w="1134"/>
+        <w:gridCol w:w="2835"/>
+        <w:gridCol w:w="1247"/>
+        <w:gridCol w:w="1474"/>
+        <w:gridCol w:w="2381"/>
+      </w:tblGrid>
+      <w:tr>
+        <w:tc>
+          <w:tcPr>
+            <w:tcW w:type="dxa" w:w="1134"/>
+            <w:shd w:val="clear" w:color="auto" w:fill="D9E2E1"/>
+          </w:tcPr>
+          <w:p>
+            <w:r/>
+            <w:r>
+              <w:rPr>
+                <w:b/>
+                <w:sz w:val="16"/>
+              </w:rPr>
+              <w:t>Order</w:t>
+            </w:r>
+          </w:p>
+        </w:tc>
+        <w:tc>
+          <w:tcPr>
+            <w:tcW w:type="dxa" w:w="2835"/>
+            <w:shd w:val="clear" w:color="auto" w:fill="D9E2E1"/>
+          </w:tcPr>
+          <w:p>
+            <w:r/>
+            <w:r>
+              <w:rPr>
+                <w:b/>
+                <w:sz w:val="16"/>
+              </w:rPr>
+              <w:t>Step</w:t>
+            </w:r>
+          </w:p>
+        </w:tc>
+        <w:tc>
+          <w:tcPr>
+            <w:tcW w:type="dxa" w:w="1247"/>
+            <w:shd w:val="clear" w:color="auto" w:fill="D9E2E1"/>
+          </w:tcPr>
+          <w:p>
+            <w:r/>
+            <w:r>
+              <w:rPr>
+                <w:b/>
+                <w:sz w:val="16"/>
+              </w:rPr>
+              <w:t>Done by</w:t>
+            </w:r>
+          </w:p>
+        </w:tc>
+        <w:tc>
+          <w:tcPr>
+            <w:tcW w:type="dxa" w:w="1474"/>
+            <w:shd w:val="clear" w:color="auto" w:fill="D9E2E1"/>
+          </w:tcPr>
+          <w:p>
+            <w:r/>
+            <w:r>
+              <w:rPr>
+                <w:b/>
+                <w:sz w:val="16"/>
+              </w:rPr>
+              <w:t>Time after start, min:s</w:t>
+            </w:r>
+          </w:p>
+        </w:tc>
+        <w:tc>
+          <w:tcPr>
+            <w:tcW w:type="dxa" w:w="2381"/>
+            <w:shd w:val="clear" w:color="auto" w:fill="D9E2E1"/>
+          </w:tcPr>
+          <w:p>
+            <w:r/>
+            <w:r>
+              <w:rPr>
+                <w:b/>
+                <w:sz w:val="16"/>
+              </w:rPr>
+              <w:t>Note recorded</w:t>
+            </w:r>
+          </w:p>
+        </w:tc>
+      </w:tr>
+      <w:tr>
+        <w:tc>
+          <w:tcPr>
+            <w:tcW w:type="dxa" w:w="1134"/>
+          </w:tcPr>
+          <w:p>
+            <w:r/>
+            <w:r>
+              <w:rPr>
+                <w:sz w:val="16"/>
+              </w:rPr>
+              <w:t>ORD-9371</w:t>
+            </w:r>
+          </w:p>
+        </w:tc>
+        <w:tc>
+          <w:tcPr>
+            <w:tcW w:type="dxa" w:w="2835"/>
+          </w:tcPr>
+          <w:p>
+            <w:r/>
+            <w:r>
+              <w:rPr>
+                <w:sz w:val="16"/>
+              </w:rPr>
+              <w:t>Order started by the customer</w:t>
+            </w:r>
+          </w:p>
+        </w:tc>
+        <w:tc>
+          <w:tcPr>
+            <w:tcW w:type="dxa" w:w="1247"/>
+          </w:tcPr>
+          <w:p>
+            <w:r/>
+            <w:r>
+              <w:rPr>
+                <w:sz w:val="16"/>
+              </w:rPr>
+              <w:t>Customer</w:t>
+            </w:r>
+          </w:p>
+        </w:tc>
+        <w:tc>
+          <w:tcPr>
+            <w:tcW w:type="dxa" w:w="1474"/>
+          </w:tcPr>
+          <w:p>
+            <w:r/>
+            <w:r>
+              <w:rPr>
+                <w:sz w:val="16"/>
+              </w:rPr>
+              <w:t>0:00</w:t>
+            </w:r>
+          </w:p>
+        </w:tc>
+        <w:tc>
+          <w:tcPr>
+            <w:tcW w:type="dxa" w:w="2381"/>
+          </w:tcPr>
+          <w:p>
+            <w:r/>
+            <w:r>
+              <w:rPr>
+                <w:sz w:val="16"/>
+              </w:rPr>
+            </w:r>
+          </w:p>
+        </w:tc>
+      </w:tr>
+      <w:tr>
+        <w:tc>
+          <w:tcPr>
+            <w:tcW w:type="dxa" w:w="1134"/>
+          </w:tcPr>
+          <w:p>
+            <w:r/>
+            <w:r>
+              <w:rPr>
+                <w:sz w:val="16"/>
+              </w:rPr>
+              <w:t>ORD-9371</w:t>
+            </w:r>
+          </w:p>
+        </w:tc>
+        <w:tc>
+          <w:tcPr>
+            <w:tcW w:type="dxa" w:w="2835"/>
+          </w:tcPr>
+          <w:p>
+            <w:r/>
+            <w:r>
+              <w:rPr>
+                <w:sz w:val="16"/>
+              </w:rPr>
+              <w:t>Submitted</w:t>
+            </w:r>
+          </w:p>
+        </w:tc>
+        <w:tc>
+          <w:tcPr>
+            <w:tcW w:type="dxa" w:w="1247"/>
+          </w:tcPr>
+          <w:p>
+            <w:r/>
+            <w:r>
+              <w:rPr>
+                <w:sz w:val="16"/>
+              </w:rPr>
+              <w:t>Customer</w:t>
+            </w:r>
+          </w:p>
+        </w:tc>
+        <w:tc>
+          <w:tcPr>
+            <w:tcW w:type="dxa" w:w="1474"/>
+          </w:tcPr>
+          <w:p>
+            <w:r/>
+            <w:r>
+              <w:rPr>
+                <w:sz w:val="16"/>
+              </w:rPr>
+              <w:t>1:46</w:t>
+            </w:r>
+          </w:p>
+        </w:tc>
+        <w:tc>
+          <w:tcPr>
+            <w:tcW w:type="dxa" w:w="2381"/>
+          </w:tcPr>
+          <w:p>
+            <w:r/>
+            <w:r>
+              <w:rPr>
+                <w:sz w:val="16"/>
+              </w:rPr>
+            </w:r>
+          </w:p>
+        </w:tc>
+      </w:tr>
+      <w:tr>
+        <w:tc>
+          <w:tcPr>
+            <w:tcW w:type="dxa" w:w="1134"/>
+          </w:tcPr>
+          <w:p>
+            <w:r/>
+            <w:r>
+              <w:rPr>
+                <w:sz w:val="16"/>
+              </w:rPr>
+              <w:t>ORD-9371</w:t>
+            </w:r>
+          </w:p>
+        </w:tc>
+        <w:tc>
+          <w:tcPr>
+            <w:tcW w:type="dxa" w:w="2835"/>
+          </w:tcPr>
+          <w:p>
+            <w:r/>
+            <w:r>
+              <w:rPr>
+                <w:sz w:val="16"/>
+              </w:rPr>
+              <w:t>Passed validation, waiting for Ops Desk</w:t>
+            </w:r>
+          </w:p>
+        </w:tc>
+        <w:tc>
+          <w:tcPr>
+            <w:tcW w:type="dxa" w:w="1247"/>
+          </w:tcPr>
+          <w:p>
+            <w:r/>
+            <w:r>
+              <w:rPr>
+                <w:sz w:val="16"/>
+              </w:rPr>
+              <w:t>Customer</w:t>
+            </w:r>
+          </w:p>
+        </w:tc>
+        <w:tc>
+          <w:tcPr>
+            <w:tcW w:type="dxa" w:w="1474"/>
+          </w:tcPr>
+          <w:p>
+            <w:r/>
+            <w:r>
+              <w:rPr>
+                <w:sz w:val="16"/>
+              </w:rPr>
+              <w:t>1:46</w:t>
+            </w:r>
+          </w:p>
+        </w:tc>
+        <w:tc>
+          <w:tcPr>
+            <w:tcW w:type="dxa" w:w="2381"/>
+          </w:tcPr>
+          <w:p>
+            <w:r/>
+            <w:r>
+              <w:rPr>
+                <w:sz w:val="16"/>
+              </w:rPr>
+            </w:r>
+          </w:p>
+        </w:tc>
+      </w:tr>
+      <w:tr>
+        <w:tc>
+          <w:tcPr>
+            <w:tcW w:type="dxa" w:w="1134"/>
+          </w:tcPr>
+          <w:p>
+            <w:r/>
+            <w:r>
+              <w:rPr>
+                <w:sz w:val="16"/>
+              </w:rPr>
+              <w:t>ORD-9371</w:t>
+            </w:r>
+          </w:p>
+        </w:tc>
+        <w:tc>
+          <w:tcPr>
+            <w:tcW w:type="dxa" w:w="2835"/>
+          </w:tcPr>
+          <w:p>
+            <w:r/>
+            <w:r>
+              <w:rPr>
+                <w:sz w:val="16"/>
+              </w:rPr>
+              <w:t>Approved, invoice issued</w:t>
+            </w:r>
+          </w:p>
+        </w:tc>
+        <w:tc>
+          <w:tcPr>
+            <w:tcW w:type="dxa" w:w="1247"/>
+          </w:tcPr>
+          <w:p>
+            <w:r/>
+            <w:r>
+              <w:rPr>
+                <w:sz w:val="16"/>
+              </w:rPr>
+              <w:t>Ops Desk</w:t>
+            </w:r>
+          </w:p>
+        </w:tc>
+        <w:tc>
+          <w:tcPr>
+            <w:tcW w:type="dxa" w:w="1474"/>
+          </w:tcPr>
+          <w:p>
+            <w:r/>
+            <w:r>
+              <w:rPr>
+                <w:sz w:val="16"/>
+              </w:rPr>
+              <w:t>2:35</w:t>
+            </w:r>
+          </w:p>
+        </w:tc>
+        <w:tc>
+          <w:tcPr>
+            <w:tcW w:type="dxa" w:w="2381"/>
+          </w:tcPr>
+          <w:p>
+            <w:r/>
+            <w:r>
+              <w:rPr>
+                <w:sz w:val="16"/>
+              </w:rPr>
+              <w:t>Good to go</w:t>
+            </w:r>
+          </w:p>
+        </w:tc>
+      </w:tr>
+      <w:tr>
+        <w:tc>
+          <w:tcPr>
+            <w:tcW w:type="dxa" w:w="1134"/>
+          </w:tcPr>
+          <w:p>
+            <w:r/>
+            <w:r>
+              <w:rPr>
+                <w:sz w:val="16"/>
+              </w:rPr>
+              <w:t>ORD-9371</w:t>
+            </w:r>
+          </w:p>
+        </w:tc>
+        <w:tc>
+          <w:tcPr>
+            <w:tcW w:type="dxa" w:w="2835"/>
+          </w:tcPr>
+          <w:p>
+            <w:r/>
+            <w:r>
+              <w:rPr>
+                <w:sz w:val="16"/>
+              </w:rPr>
+              <w:t>Payment proof uploaded</w:t>
+            </w:r>
+          </w:p>
+        </w:tc>
+        <w:tc>
+          <w:tcPr>
+            <w:tcW w:type="dxa" w:w="1247"/>
+          </w:tcPr>
+          <w:p>
+            <w:r/>
+            <w:r>
+              <w:rPr>
+                <w:sz w:val="16"/>
+              </w:rPr>
+              <w:t>Customer</w:t>
+            </w:r>
+          </w:p>
+        </w:tc>
+        <w:tc>
+          <w:tcPr>
+            <w:tcW w:type="dxa" w:w="1474"/>
+          </w:tcPr>
+          <w:p>
+            <w:r/>
+            <w:r>
+              <w:rPr>
+                <w:sz w:val="16"/>
+              </w:rPr>
+              <w:t>3:13</w:t>
+            </w:r>
+          </w:p>
+        </w:tc>
+        <w:tc>
+          <w:tcPr>
+            <w:tcW w:type="dxa" w:w="2381"/>
+          </w:tcPr>
+          <w:p>
+            <w:r/>
+            <w:r>
+              <w:rPr>
+                <w:sz w:val="16"/>
+              </w:rPr>
+              <w:t>Proof uploaded (attempt 1)</w:t>
+            </w:r>
+          </w:p>
+        </w:tc>
+      </w:tr>
+      <w:tr>
+        <w:tc>
+          <w:tcPr>
+            <w:tcW w:type="dxa" w:w="1134"/>
+          </w:tcPr>
+          <w:p>
+            <w:r/>
+            <w:r>
+              <w:rPr>
+                <w:sz w:val="16"/>
+              </w:rPr>
+              <w:t>ORD-9371</w:t>
+            </w:r>
+          </w:p>
+        </w:tc>
+        <w:tc>
+          <w:tcPr>
+            <w:tcW w:type="dxa" w:w="2835"/>
+          </w:tcPr>
+          <w:p>
+            <w:r/>
+            <w:r>
+              <w:rPr>
+                <w:sz w:val="16"/>
+              </w:rPr>
+              <w:t>Payment confirmed</w:t>
+            </w:r>
+          </w:p>
+        </w:tc>
+        <w:tc>
+          <w:tcPr>
+            <w:tcW w:type="dxa" w:w="1247"/>
+          </w:tcPr>
+          <w:p>
+            <w:r/>
+            <w:r>
+              <w:rPr>
+                <w:sz w:val="16"/>
+              </w:rPr>
+              <w:t>Finance</w:t>
+            </w:r>
+          </w:p>
+        </w:tc>
+        <w:tc>
+          <w:tcPr>
+            <w:tcW w:type="dxa" w:w="1474"/>
+          </w:tcPr>
+          <w:p>
+            <w:r/>
+            <w:r>
+              <w:rPr>
+                <w:sz w:val="16"/>
+              </w:rPr>
+              <w:t>3:37</w:t>
+            </w:r>
+          </w:p>
+        </w:tc>
+        <w:tc>
+          <w:tcPr>
+            <w:tcW w:type="dxa" w:w="2381"/>
+          </w:tcPr>
+          <w:p>
+            <w:r/>
+            <w:r>
+              <w:rPr>
+                <w:sz w:val="16"/>
+              </w:rPr>
+              <w:t>Payment confirmed by Finance</w:t>
+            </w:r>
+          </w:p>
+        </w:tc>
+      </w:tr>
+      <w:tr>
+        <w:tc>
+          <w:tcPr>
+            <w:tcW w:type="dxa" w:w="1134"/>
+          </w:tcPr>
+          <w:p>
+            <w:r/>
+            <w:r>
+              <w:rPr>
+                <w:sz w:val="16"/>
+              </w:rPr>
+              <w:t>ORD-9371</w:t>
+            </w:r>
+          </w:p>
+        </w:tc>
+        <w:tc>
+          <w:tcPr>
+            <w:tcW w:type="dxa" w:w="2835"/>
+          </w:tcPr>
+          <w:p>
+            <w:r/>
+            <w:r>
+              <w:rPr>
+                <w:sz w:val="16"/>
+              </w:rPr>
+              <w:t>Picking started</w:t>
+            </w:r>
+          </w:p>
+        </w:tc>
+        <w:tc>
+          <w:tcPr>
+            <w:tcW w:type="dxa" w:w="1247"/>
+          </w:tcPr>
+          <w:p>
+            <w:r/>
+            <w:r>
+              <w:rPr>
+                <w:sz w:val="16"/>
+              </w:rPr>
+              <w:t>Warehouse</w:t>
+            </w:r>
+          </w:p>
+        </w:tc>
+        <w:tc>
+          <w:tcPr>
+            <w:tcW w:type="dxa" w:w="1474"/>
+          </w:tcPr>
+          <w:p>
+            <w:r/>
+            <w:r>
+              <w:rPr>
+                <w:sz w:val="16"/>
+              </w:rPr>
+              <w:t>3:53</w:t>
+            </w:r>
+          </w:p>
+        </w:tc>
+        <w:tc>
+          <w:tcPr>
+            <w:tcW w:type="dxa" w:w="2381"/>
+          </w:tcPr>
+          <w:p>
+            <w:r/>
+            <w:r>
+              <w:rPr>
+                <w:sz w:val="16"/>
+              </w:rPr>
+            </w:r>
+          </w:p>
+        </w:tc>
+      </w:tr>
+      <w:tr>
+        <w:tc>
+          <w:tcPr>
+            <w:tcW w:type="dxa" w:w="1134"/>
+          </w:tcPr>
+          <w:p>
+            <w:r/>
+            <w:r>
+              <w:rPr>
+                <w:sz w:val="16"/>
+              </w:rPr>
+              <w:t>ORD-9371</w:t>
+            </w:r>
+          </w:p>
+        </w:tc>
+        <w:tc>
+          <w:tcPr>
+            <w:tcW w:type="dxa" w:w="2835"/>
+          </w:tcPr>
+          <w:p>
+            <w:r/>
+            <w:r>
+              <w:rPr>
+                <w:sz w:val="16"/>
+              </w:rPr>
+              <w:t>Packed</w:t>
+            </w:r>
+          </w:p>
+        </w:tc>
+        <w:tc>
+          <w:tcPr>
+            <w:tcW w:type="dxa" w:w="1247"/>
+          </w:tcPr>
+          <w:p>
+            <w:r/>
+            <w:r>
+              <w:rPr>
+                <w:sz w:val="16"/>
+              </w:rPr>
+              <w:t>Warehouse</w:t>
+            </w:r>
+          </w:p>
+        </w:tc>
+        <w:tc>
+          <w:tcPr>
+            <w:tcW w:type="dxa" w:w="1474"/>
+          </w:tcPr>
+          <w:p>
+            <w:r/>
+            <w:r>
+              <w:rPr>
+                <w:sz w:val="16"/>
+              </w:rPr>
+              <w:t>4:00</w:t>
+            </w:r>
+          </w:p>
+        </w:tc>
+        <w:tc>
+          <w:tcPr>
+            <w:tcW w:type="dxa" w:w="2381"/>
+          </w:tcPr>
+          <w:p>
+            <w:r/>
+            <w:r>
+              <w:rPr>
+                <w:sz w:val="16"/>
+              </w:rPr>
+            </w:r>
+          </w:p>
+        </w:tc>
+      </w:tr>
+      <w:tr>
+        <w:tc>
+          <w:tcPr>
+            <w:tcW w:type="dxa" w:w="1134"/>
+          </w:tcPr>
+          <w:p>
+            <w:r/>
+            <w:r>
+              <w:rPr>
+                <w:sz w:val="16"/>
+              </w:rPr>
+              <w:t>ORD-9371</w:t>
+            </w:r>
+          </w:p>
+        </w:tc>
+        <w:tc>
+          <w:tcPr>
+            <w:tcW w:type="dxa" w:w="2835"/>
+          </w:tcPr>
+          <w:p>
+            <w:r/>
+            <w:r>
+              <w:rPr>
+                <w:sz w:val="16"/>
+              </w:rPr>
+              <w:t>Driver assigned</w:t>
+            </w:r>
+          </w:p>
+        </w:tc>
+        <w:tc>
+          <w:tcPr>
+            <w:tcW w:type="dxa" w:w="1247"/>
+          </w:tcPr>
+          <w:p>
+            <w:r/>
+            <w:r>
+              <w:rPr>
+                <w:sz w:val="16"/>
+              </w:rPr>
+              <w:t>Dispatch</w:t>
+            </w:r>
+          </w:p>
+        </w:tc>
+        <w:tc>
+          <w:tcPr>
+            <w:tcW w:type="dxa" w:w="1474"/>
+          </w:tcPr>
+          <w:p>
+            <w:r/>
+            <w:r>
+              <w:rPr>
+                <w:sz w:val="16"/>
+              </w:rPr>
+              <w:t>5:01</w:t>
+            </w:r>
+          </w:p>
+        </w:tc>
+        <w:tc>
+          <w:tcPr>
+            <w:tcW w:type="dxa" w:w="2381"/>
+          </w:tcPr>
+          <w:p>
+            <w:r/>
+            <w:r>
+              <w:rPr>
+                <w:sz w:val="16"/>
+              </w:rPr>
+              <w:t>Assigned to driver</w:t>
+            </w:r>
+          </w:p>
+        </w:tc>
+      </w:tr>
+      <w:tr>
+        <w:tc>
+          <w:tcPr>
+            <w:tcW w:type="dxa" w:w="1134"/>
+          </w:tcPr>
+          <w:p>
+            <w:r/>
+            <w:r>
+              <w:rPr>
+                <w:sz w:val="16"/>
+              </w:rPr>
+              <w:t>ORD-9371</w:t>
+            </w:r>
+          </w:p>
+        </w:tc>
+        <w:tc>
+          <w:tcPr>
+            <w:tcW w:type="dxa" w:w="2835"/>
+          </w:tcPr>
+          <w:p>
+            <w:r/>
+            <w:r>
+              <w:rPr>
+                <w:sz w:val="16"/>
+              </w:rPr>
+              <w:t>Picked up by driver</w:t>
+            </w:r>
+          </w:p>
+        </w:tc>
+        <w:tc>
+          <w:tcPr>
+            <w:tcW w:type="dxa" w:w="1247"/>
+          </w:tcPr>
+          <w:p>
+            <w:r/>
+            <w:r>
+              <w:rPr>
+                <w:sz w:val="16"/>
+              </w:rPr>
+              <w:t>Driver</w:t>
+            </w:r>
+          </w:p>
+        </w:tc>
+        <w:tc>
+          <w:tcPr>
+            <w:tcW w:type="dxa" w:w="1474"/>
+          </w:tcPr>
+          <w:p>
+            <w:r/>
+            <w:r>
+              <w:rPr>
+                <w:sz w:val="16"/>
+              </w:rPr>
+              <w:t>5:48</w:t>
+            </w:r>
+          </w:p>
+        </w:tc>
+        <w:tc>
+          <w:tcPr>
+            <w:tcW w:type="dxa" w:w="2381"/>
+          </w:tcPr>
+          <w:p>
+            <w:r/>
+            <w:r>
+              <w:rPr>
+                <w:sz w:val="16"/>
+              </w:rPr>
+              <w:t>Driver confirmed pickup</w:t>
+            </w:r>
+          </w:p>
+        </w:tc>
+      </w:tr>
+      <w:tr>
+        <w:tc>
+          <w:tcPr>
+            <w:tcW w:type="dxa" w:w="1134"/>
+          </w:tcPr>
+          <w:p>
+            <w:r/>
+            <w:r>
+              <w:rPr>
+                <w:sz w:val="16"/>
+              </w:rPr>
+              <w:t>ORD-9371</w:t>
+            </w:r>
+          </w:p>
+        </w:tc>
+        <w:tc>
+          <w:tcPr>
+            <w:tcW w:type="dxa" w:w="2835"/>
+          </w:tcPr>
+          <w:p>
+            <w:r/>
+            <w:r>
+              <w:rPr>
+                <w:sz w:val="16"/>
+              </w:rPr>
+              <w:t>Delivered with the customer code</w:t>
+            </w:r>
+          </w:p>
+        </w:tc>
+        <w:tc>
+          <w:tcPr>
+            <w:tcW w:type="dxa" w:w="1247"/>
+          </w:tcPr>
+          <w:p>
+            <w:r/>
+            <w:r>
+              <w:rPr>
+                <w:sz w:val="16"/>
+              </w:rPr>
+              <w:t>Driver</w:t>
+            </w:r>
+          </w:p>
+        </w:tc>
+        <w:tc>
+          <w:tcPr>
+            <w:tcW w:type="dxa" w:w="1474"/>
+          </w:tcPr>
+          <w:p>
+            <w:r/>
+            <w:r>
+              <w:rPr>
+                <w:sz w:val="16"/>
+              </w:rPr>
+              <w:t>6:17</w:t>
+            </w:r>
+          </w:p>
+        </w:tc>
+        <w:tc>
+          <w:tcPr>
+            <w:tcW w:type="dxa" w:w="2381"/>
+          </w:tcPr>
+          <w:p>
+            <w:r/>
+            <w:r>
+              <w:rPr>
+                <w:sz w:val="16"/>
+              </w:rPr>
+              <w:t>Delivery code accepted</w:t>
+            </w:r>
+          </w:p>
+        </w:tc>
+      </w:tr>
+      <w:tr>
+        <w:tc>
+          <w:tcPr>
+            <w:tcW w:type="dxa" w:w="1134"/>
+          </w:tcPr>
+          <w:p>
+            <w:r/>
+            <w:r>
+              <w:rPr>
+                <w:sz w:val="16"/>
+              </w:rPr>
+              <w:t>ORD-9370</w:t>
+            </w:r>
+          </w:p>
+        </w:tc>
+        <w:tc>
+          <w:tcPr>
+            <w:tcW w:type="dxa" w:w="2835"/>
+          </w:tcPr>
+          <w:p>
+            <w:r/>
+            <w:r>
+              <w:rPr>
+                <w:sz w:val="16"/>
+              </w:rPr>
+              <w:t>Order started by the customer</w:t>
+            </w:r>
+          </w:p>
+        </w:tc>
+        <w:tc>
+          <w:tcPr>
+            <w:tcW w:type="dxa" w:w="1247"/>
+          </w:tcPr>
+          <w:p>
+            <w:r/>
+            <w:r>
+              <w:rPr>
+                <w:sz w:val="16"/>
+              </w:rPr>
+              <w:t>Customer</w:t>
+            </w:r>
+          </w:p>
+        </w:tc>
+        <w:tc>
+          <w:tcPr>
+            <w:tcW w:type="dxa" w:w="1474"/>
+          </w:tcPr>
+          <w:p>
+            <w:r/>
+            <w:r>
+              <w:rPr>
+                <w:sz w:val="16"/>
+              </w:rPr>
+              <w:t>0:00</w:t>
+            </w:r>
+          </w:p>
+        </w:tc>
+        <w:tc>
+          <w:tcPr>
+            <w:tcW w:type="dxa" w:w="2381"/>
+          </w:tcPr>
+          <w:p>
+            <w:r/>
+            <w:r>
+              <w:rPr>
+                <w:sz w:val="16"/>
+              </w:rPr>
+            </w:r>
+          </w:p>
+        </w:tc>
+      </w:tr>
+      <w:tr>
+        <w:tc>
+          <w:tcPr>
+            <w:tcW w:type="dxa" w:w="1134"/>
+          </w:tcPr>
+          <w:p>
+            <w:r/>
+            <w:r>
+              <w:rPr>
+                <w:sz w:val="16"/>
+              </w:rPr>
+              <w:t>ORD-9370</w:t>
+            </w:r>
+          </w:p>
+        </w:tc>
+        <w:tc>
+          <w:tcPr>
+            <w:tcW w:type="dxa" w:w="2835"/>
+          </w:tcPr>
+          <w:p>
+            <w:r/>
+            <w:r>
+              <w:rPr>
+                <w:sz w:val="16"/>
+              </w:rPr>
+              <w:t>Submitted</w:t>
+            </w:r>
+          </w:p>
+        </w:tc>
+        <w:tc>
+          <w:tcPr>
+            <w:tcW w:type="dxa" w:w="1247"/>
+          </w:tcPr>
+          <w:p>
+            <w:r/>
+            <w:r>
+              <w:rPr>
+                <w:sz w:val="16"/>
+              </w:rPr>
+              <w:t>Customer</w:t>
+            </w:r>
+          </w:p>
+        </w:tc>
+        <w:tc>
+          <w:tcPr>
+            <w:tcW w:type="dxa" w:w="1474"/>
+          </w:tcPr>
+          <w:p>
+            <w:r/>
+            <w:r>
+              <w:rPr>
+                <w:sz w:val="16"/>
+              </w:rPr>
+              <w:t>7:10</w:t>
+            </w:r>
+          </w:p>
+        </w:tc>
+        <w:tc>
+          <w:tcPr>
+            <w:tcW w:type="dxa" w:w="2381"/>
+          </w:tcPr>
+          <w:p>
+            <w:r/>
+            <w:r>
+              <w:rPr>
+                <w:sz w:val="16"/>
+              </w:rPr>
+            </w:r>
+          </w:p>
+        </w:tc>
+      </w:tr>
+      <w:tr>
+        <w:tc>
+          <w:tcPr>
+            <w:tcW w:type="dxa" w:w="1134"/>
+          </w:tcPr>
+          <w:p>
+            <w:r/>
+            <w:r>
+              <w:rPr>
+                <w:sz w:val="16"/>
+              </w:rPr>
+              <w:t>ORD-9370</w:t>
+            </w:r>
+          </w:p>
+        </w:tc>
+        <w:tc>
+          <w:tcPr>
+            <w:tcW w:type="dxa" w:w="2835"/>
+          </w:tcPr>
+          <w:p>
+            <w:r/>
+            <w:r>
+              <w:rPr>
+                <w:sz w:val="16"/>
+              </w:rPr>
+              <w:t>Blocked by validation</w:t>
+            </w:r>
+          </w:p>
+        </w:tc>
+        <w:tc>
+          <w:tcPr>
+            <w:tcW w:type="dxa" w:w="1247"/>
+          </w:tcPr>
+          <w:p>
+            <w:r/>
+            <w:r>
+              <w:rPr>
+                <w:sz w:val="16"/>
+              </w:rPr>
+              <w:t>Customer</w:t>
+            </w:r>
+          </w:p>
+        </w:tc>
+        <w:tc>
+          <w:tcPr>
+            <w:tcW w:type="dxa" w:w="1474"/>
+          </w:tcPr>
+          <w:p>
+            <w:r/>
+            <w:r>
+              <w:rPr>
+                <w:sz w:val="16"/>
+              </w:rPr>
+              <w:t>7:10</w:t>
+            </w:r>
+          </w:p>
+        </w:tc>
+        <w:tc>
+          <w:tcPr>
+            <w:tcW w:type="dxa" w:w="2381"/>
+          </w:tcPr>
+          <w:p>
+            <w:r/>
+            <w:r>
+              <w:rPr>
+                <w:sz w:val="16"/>
+              </w:rPr>
+              <w:t>Blocking rule failed</w:t>
+            </w:r>
+          </w:p>
+        </w:tc>
+      </w:tr>
+      <w:tr>
+        <w:tc>
+          <w:tcPr>
+            <w:tcW w:type="dxa" w:w="1134"/>
+          </w:tcPr>
+          <w:p>
+            <w:r/>
+            <w:r>
+              <w:rPr>
+                <w:sz w:val="16"/>
+              </w:rPr>
+              <w:t>ORD-9370</w:t>
+            </w:r>
+          </w:p>
+        </w:tc>
+        <w:tc>
+          <w:tcPr>
+            <w:tcW w:type="dxa" w:w="2835"/>
+          </w:tcPr>
+          <w:p>
+            <w:r/>
+            <w:r>
+              <w:rPr>
+                <w:sz w:val="16"/>
+              </w:rPr>
+              <w:t>Submitted</w:t>
+            </w:r>
+          </w:p>
+        </w:tc>
+        <w:tc>
+          <w:tcPr>
+            <w:tcW w:type="dxa" w:w="1247"/>
+          </w:tcPr>
+          <w:p>
+            <w:r/>
+            <w:r>
+              <w:rPr>
+                <w:sz w:val="16"/>
+              </w:rPr>
+              <w:t>Customer</w:t>
+            </w:r>
+          </w:p>
+        </w:tc>
+        <w:tc>
+          <w:tcPr>
+            <w:tcW w:type="dxa" w:w="1474"/>
+          </w:tcPr>
+          <w:p>
+            <w:r/>
+            <w:r>
+              <w:rPr>
+                <w:sz w:val="16"/>
+              </w:rPr>
+              <w:t>8:15</w:t>
+            </w:r>
+          </w:p>
+        </w:tc>
+        <w:tc>
+          <w:tcPr>
+            <w:tcW w:type="dxa" w:w="2381"/>
+          </w:tcPr>
+          <w:p>
+            <w:r/>
+            <w:r>
+              <w:rPr>
+                <w:sz w:val="16"/>
+              </w:rPr>
+            </w:r>
+          </w:p>
+        </w:tc>
+      </w:tr>
+      <w:tr>
+        <w:tc>
+          <w:tcPr>
+            <w:tcW w:type="dxa" w:w="1134"/>
+          </w:tcPr>
+          <w:p>
+            <w:r/>
+            <w:r>
+              <w:rPr>
+                <w:sz w:val="16"/>
+              </w:rPr>
+              <w:t>ORD-9370</w:t>
+            </w:r>
+          </w:p>
+        </w:tc>
+        <w:tc>
+          <w:tcPr>
+            <w:tcW w:type="dxa" w:w="2835"/>
+          </w:tcPr>
+          <w:p>
+            <w:r/>
+            <w:r>
+              <w:rPr>
+                <w:sz w:val="16"/>
+              </w:rPr>
+              <w:t>Passed validation, waiting for Ops Desk</w:t>
+            </w:r>
+          </w:p>
+        </w:tc>
+        <w:tc>
+          <w:tcPr>
+            <w:tcW w:type="dxa" w:w="1247"/>
+          </w:tcPr>
+          <w:p>
+            <w:r/>
+            <w:r>
+              <w:rPr>
+                <w:sz w:val="16"/>
+              </w:rPr>
+              <w:t>Customer</w:t>
+            </w:r>
+          </w:p>
+        </w:tc>
+        <w:tc>
+          <w:tcPr>
+            <w:tcW w:type="dxa" w:w="1474"/>
+          </w:tcPr>
+          <w:p>
+            <w:r/>
+            <w:r>
+              <w:rPr>
+                <w:sz w:val="16"/>
+              </w:rPr>
+              <w:t>8:15</w:t>
+            </w:r>
+          </w:p>
+        </w:tc>
+        <w:tc>
+          <w:tcPr>
+            <w:tcW w:type="dxa" w:w="2381"/>
+          </w:tcPr>
+          <w:p>
+            <w:r/>
+            <w:r>
+              <w:rPr>
+                <w:sz w:val="16"/>
+              </w:rPr>
+            </w:r>
+          </w:p>
+        </w:tc>
+      </w:tr>
+      <w:tr>
+        <w:tc>
+          <w:tcPr>
+            <w:tcW w:type="dxa" w:w="1134"/>
+          </w:tcPr>
+          <w:p>
+            <w:r/>
+            <w:r>
+              <w:rPr>
+                <w:sz w:val="16"/>
+              </w:rPr>
+              <w:t>ORD-9370</w:t>
+            </w:r>
+          </w:p>
+        </w:tc>
+        <w:tc>
+          <w:tcPr>
+            <w:tcW w:type="dxa" w:w="2835"/>
+          </w:tcPr>
+          <w:p>
+            <w:r/>
+            <w:r>
+              <w:rPr>
+                <w:sz w:val="16"/>
+              </w:rPr>
+              <w:t>Approved, invoice issued</w:t>
+            </w:r>
+          </w:p>
+        </w:tc>
+        <w:tc>
+          <w:tcPr>
+            <w:tcW w:type="dxa" w:w="1247"/>
+          </w:tcPr>
+          <w:p>
+            <w:r/>
+            <w:r>
+              <w:rPr>
+                <w:sz w:val="16"/>
+              </w:rPr>
+              <w:t>Ops Desk</w:t>
+            </w:r>
+          </w:p>
+        </w:tc>
+        <w:tc>
+          <w:tcPr>
+            <w:tcW w:type="dxa" w:w="1474"/>
+          </w:tcPr>
+          <w:p>
+            <w:r/>
+            <w:r>
+              <w:rPr>
+                <w:sz w:val="16"/>
+              </w:rPr>
+              <w:t>8:37</w:t>
+            </w:r>
+          </w:p>
+        </w:tc>
+        <w:tc>
+          <w:tcPr>
+            <w:tcW w:type="dxa" w:w="2381"/>
+          </w:tcPr>
+          <w:p>
+            <w:r/>
+            <w:r>
+              <w:rPr>
+                <w:sz w:val="16"/>
+              </w:rPr>
+              <w:t>Approved by Ops Desk</w:t>
+            </w:r>
+          </w:p>
+        </w:tc>
+      </w:tr>
+      <w:tr>
+        <w:tc>
+          <w:tcPr>
+            <w:tcW w:type="dxa" w:w="1134"/>
+          </w:tcPr>
+          <w:p>
+            <w:r/>
+            <w:r>
+              <w:rPr>
+                <w:sz w:val="16"/>
+              </w:rPr>
+              <w:t>ORD-9370</w:t>
+            </w:r>
+          </w:p>
+        </w:tc>
+        <w:tc>
+          <w:tcPr>
+            <w:tcW w:type="dxa" w:w="2835"/>
+          </w:tcPr>
+          <w:p>
+            <w:r/>
+            <w:r>
+              <w:rPr>
+                <w:sz w:val="16"/>
+              </w:rPr>
+              <w:t>Payment proof uploaded</w:t>
+            </w:r>
+          </w:p>
+        </w:tc>
+        <w:tc>
+          <w:tcPr>
+            <w:tcW w:type="dxa" w:w="1247"/>
+          </w:tcPr>
+          <w:p>
+            <w:r/>
+            <w:r>
+              <w:rPr>
+                <w:sz w:val="16"/>
+              </w:rPr>
+              <w:t>Customer</w:t>
+            </w:r>
+          </w:p>
+        </w:tc>
+        <w:tc>
+          <w:tcPr>
+            <w:tcW w:type="dxa" w:w="1474"/>
+          </w:tcPr>
+          <w:p>
+            <w:r/>
+            <w:r>
+              <w:rPr>
+                <w:sz w:val="16"/>
+              </w:rPr>
+              <w:t>9:09</w:t>
+            </w:r>
+          </w:p>
+        </w:tc>
+        <w:tc>
+          <w:tcPr>
+            <w:tcW w:type="dxa" w:w="2381"/>
+          </w:tcPr>
+          <w:p>
+            <w:r/>
+            <w:r>
+              <w:rPr>
+                <w:sz w:val="16"/>
+              </w:rPr>
+              <w:t>Proof uploaded (attempt 1)</w:t>
+            </w:r>
+          </w:p>
+        </w:tc>
+      </w:tr>
+      <w:tr>
+        <w:tc>
+          <w:tcPr>
+            <w:tcW w:type="dxa" w:w="1134"/>
+          </w:tcPr>
+          <w:p>
+            <w:r/>
+            <w:r>
+              <w:rPr>
+                <w:sz w:val="16"/>
+              </w:rPr>
+              <w:t>ORD-9370</w:t>
+            </w:r>
+          </w:p>
+        </w:tc>
+        <w:tc>
+          <w:tcPr>
+            <w:tcW w:type="dxa" w:w="2835"/>
+          </w:tcPr>
+          <w:p>
+            <w:r/>
+            <w:r>
+              <w:rPr>
+                <w:sz w:val="16"/>
+              </w:rPr>
+              <w:t>Payment confirmed</w:t>
+            </w:r>
+          </w:p>
+        </w:tc>
+        <w:tc>
+          <w:tcPr>
+            <w:tcW w:type="dxa" w:w="1247"/>
+          </w:tcPr>
+          <w:p>
+            <w:r/>
+            <w:r>
+              <w:rPr>
+                <w:sz w:val="16"/>
+              </w:rPr>
+              <w:t>Finance</w:t>
+            </w:r>
+          </w:p>
+        </w:tc>
+        <w:tc>
+          <w:tcPr>
+            <w:tcW w:type="dxa" w:w="1474"/>
+          </w:tcPr>
+          <w:p>
+            <w:r/>
+            <w:r>
+              <w:rPr>
+                <w:sz w:val="16"/>
+              </w:rPr>
+              <w:t>9:47</w:t>
+            </w:r>
+          </w:p>
+        </w:tc>
+        <w:tc>
+          <w:tcPr>
+            <w:tcW w:type="dxa" w:w="2381"/>
+          </w:tcPr>
+          <w:p>
+            <w:r/>
+            <w:r>
+              <w:rPr>
+                <w:sz w:val="16"/>
+              </w:rPr>
+              <w:t>Payment confirmed by Finance</w:t>
+            </w:r>
+          </w:p>
+        </w:tc>
+      </w:tr>
+      <w:tr>
+        <w:tc>
+          <w:tcPr>
+            <w:tcW w:type="dxa" w:w="1134"/>
+          </w:tcPr>
+          <w:p>
+            <w:r/>
+            <w:r>
+              <w:rPr>
+                <w:sz w:val="16"/>
+              </w:rPr>
+              <w:t>ORD-9370</w:t>
+            </w:r>
+          </w:p>
+        </w:tc>
+        <w:tc>
+          <w:tcPr>
+            <w:tcW w:type="dxa" w:w="2835"/>
+          </w:tcPr>
+          <w:p>
+            <w:r/>
+            <w:r>
+              <w:rPr>
+                <w:sz w:val="16"/>
+              </w:rPr>
+              <w:t>Picking started</w:t>
+            </w:r>
+          </w:p>
+        </w:tc>
+        <w:tc>
+          <w:tcPr>
+            <w:tcW w:type="dxa" w:w="1247"/>
+          </w:tcPr>
+          <w:p>
+            <w:r/>
+            <w:r>
+              <w:rPr>
+                <w:sz w:val="16"/>
+              </w:rPr>
+              <w:t>Warehouse</w:t>
+            </w:r>
+          </w:p>
+        </w:tc>
+        <w:tc>
+          <w:tcPr>
+            <w:tcW w:type="dxa" w:w="1474"/>
+          </w:tcPr>
+          <w:p>
+            <w:r/>
+            <w:r>
+              <w:rPr>
+                <w:sz w:val="16"/>
+              </w:rPr>
+              <w:t>10:00</w:t>
+            </w:r>
+          </w:p>
+        </w:tc>
+        <w:tc>
+          <w:tcPr>
+            <w:tcW w:type="dxa" w:w="2381"/>
+          </w:tcPr>
+          <w:p>
+            <w:r/>
+            <w:r>
+              <w:rPr>
+                <w:sz w:val="16"/>
+              </w:rPr>
+            </w:r>
+          </w:p>
+        </w:tc>
+      </w:tr>
+      <w:tr>
+        <w:tc>
+          <w:tcPr>
+            <w:tcW w:type="dxa" w:w="1134"/>
+          </w:tcPr>
+          <w:p>
+            <w:r/>
+            <w:r>
+              <w:rPr>
+                <w:sz w:val="16"/>
+              </w:rPr>
+              <w:t>ORD-9370</w:t>
+            </w:r>
+          </w:p>
+        </w:tc>
+        <w:tc>
+          <w:tcPr>
+            <w:tcW w:type="dxa" w:w="2835"/>
+          </w:tcPr>
+          <w:p>
+            <w:r/>
+            <w:r>
+              <w:rPr>
+                <w:sz w:val="16"/>
+              </w:rPr>
+              <w:t>Shortage found</w:t>
+            </w:r>
+          </w:p>
+        </w:tc>
+        <w:tc>
+          <w:tcPr>
+            <w:tcW w:type="dxa" w:w="1247"/>
+          </w:tcPr>
+          <w:p>
+            <w:r/>
+            <w:r>
+              <w:rPr>
+                <w:sz w:val="16"/>
+              </w:rPr>
+              <w:t>Warehouse</w:t>
+            </w:r>
+          </w:p>
+        </w:tc>
+        <w:tc>
+          <w:tcPr>
+            <w:tcW w:type="dxa" w:w="1474"/>
+          </w:tcPr>
+          <w:p>
+            <w:r/>
+            <w:r>
+              <w:rPr>
+                <w:sz w:val="16"/>
+              </w:rPr>
+              <w:t>10:09</w:t>
+            </w:r>
+          </w:p>
+        </w:tc>
+        <w:tc>
+          <w:tcPr>
+            <w:tcW w:type="dxa" w:w="2381"/>
+          </w:tcPr>
+          <w:p>
+            <w:r/>
+            <w:r>
+              <w:rPr>
+                <w:sz w:val="16"/>
+              </w:rPr>
+              <w:t>Less stock found than ordered</w:t>
+            </w:r>
+          </w:p>
+        </w:tc>
+      </w:tr>
+      <w:tr>
+        <w:tc>
+          <w:tcPr>
+            <w:tcW w:type="dxa" w:w="1134"/>
+          </w:tcPr>
+          <w:p>
+            <w:r/>
+            <w:r>
+              <w:rPr>
+                <w:sz w:val="16"/>
+              </w:rPr>
+              <w:t>ORD-9370</w:t>
+            </w:r>
+          </w:p>
+        </w:tc>
+        <w:tc>
+          <w:tcPr>
+            <w:tcW w:type="dxa" w:w="2835"/>
+          </w:tcPr>
+          <w:p>
+            <w:r/>
+            <w:r>
+              <w:rPr>
+                <w:sz w:val="16"/>
+              </w:rPr>
+              <w:t>Packed</w:t>
+            </w:r>
+          </w:p>
+        </w:tc>
+        <w:tc>
+          <w:tcPr>
+            <w:tcW w:type="dxa" w:w="1247"/>
+          </w:tcPr>
+          <w:p>
+            <w:r/>
+            <w:r>
+              <w:rPr>
+                <w:sz w:val="16"/>
+              </w:rPr>
+              <w:t>Customer</w:t>
+            </w:r>
+          </w:p>
+        </w:tc>
+        <w:tc>
+          <w:tcPr>
+            <w:tcW w:type="dxa" w:w="1474"/>
+          </w:tcPr>
+          <w:p>
+            <w:r/>
+            <w:r>
+              <w:rPr>
+                <w:sz w:val="16"/>
+              </w:rPr>
+              <w:t>11:12</w:t>
+            </w:r>
+          </w:p>
+        </w:tc>
+        <w:tc>
+          <w:tcPr>
+            <w:tcW w:type="dxa" w:w="2381"/>
+          </w:tcPr>
+          <w:p>
+            <w:r/>
+            <w:r>
+              <w:rPr>
+                <w:sz w:val="16"/>
+              </w:rPr>
+              <w:t>Partial delivery accepted</w:t>
+            </w:r>
+          </w:p>
+        </w:tc>
+      </w:tr>
+      <w:tr>
+        <w:tc>
+          <w:tcPr>
+            <w:tcW w:type="dxa" w:w="1134"/>
+          </w:tcPr>
+          <w:p>
+            <w:r/>
+            <w:r>
+              <w:rPr>
+                <w:sz w:val="16"/>
+              </w:rPr>
+              <w:t>ORD-9370</w:t>
+            </w:r>
+          </w:p>
+        </w:tc>
+        <w:tc>
+          <w:tcPr>
+            <w:tcW w:type="dxa" w:w="2835"/>
+          </w:tcPr>
+          <w:p>
+            <w:r/>
+            <w:r>
+              <w:rPr>
+                <w:sz w:val="16"/>
+              </w:rPr>
+              <w:t>Driver assigned</w:t>
+            </w:r>
+          </w:p>
+        </w:tc>
+        <w:tc>
+          <w:tcPr>
+            <w:tcW w:type="dxa" w:w="1247"/>
+          </w:tcPr>
+          <w:p>
+            <w:r/>
+            <w:r>
+              <w:rPr>
+                <w:sz w:val="16"/>
+              </w:rPr>
+              <w:t>Dispatch</w:t>
+            </w:r>
+          </w:p>
+        </w:tc>
+        <w:tc>
+          <w:tcPr>
+            <w:tcW w:type="dxa" w:w="1474"/>
+          </w:tcPr>
+          <w:p>
+            <w:r/>
+            <w:r>
+              <w:rPr>
+                <w:sz w:val="16"/>
+              </w:rPr>
+              <w:t>11:36</w:t>
+            </w:r>
+          </w:p>
+        </w:tc>
+        <w:tc>
+          <w:tcPr>
+            <w:tcW w:type="dxa" w:w="2381"/>
+          </w:tcPr>
+          <w:p>
+            <w:r/>
+            <w:r>
+              <w:rPr>
+                <w:sz w:val="16"/>
+              </w:rPr>
+              <w:t>Assigned to driver</w:t>
+            </w:r>
+          </w:p>
+        </w:tc>
+      </w:tr>
+      <w:tr>
+        <w:tc>
+          <w:tcPr>
+            <w:tcW w:type="dxa" w:w="1134"/>
+          </w:tcPr>
+          <w:p>
+            <w:r/>
+            <w:r>
+              <w:rPr>
+                <w:sz w:val="16"/>
+              </w:rPr>
+              <w:t>ORD-9370</w:t>
+            </w:r>
+          </w:p>
+        </w:tc>
+        <w:tc>
+          <w:tcPr>
+            <w:tcW w:type="dxa" w:w="2835"/>
+          </w:tcPr>
+          <w:p>
+            <w:r/>
+            <w:r>
+              <w:rPr>
+                <w:sz w:val="16"/>
+              </w:rPr>
+              <w:t>Picked up by driver</w:t>
+            </w:r>
+          </w:p>
+        </w:tc>
+        <w:tc>
+          <w:tcPr>
+            <w:tcW w:type="dxa" w:w="1247"/>
+          </w:tcPr>
+          <w:p>
+            <w:r/>
+            <w:r>
+              <w:rPr>
+                <w:sz w:val="16"/>
+              </w:rPr>
+              <w:t>Driver</w:t>
+            </w:r>
+          </w:p>
+        </w:tc>
+        <w:tc>
+          <w:tcPr>
+            <w:tcW w:type="dxa" w:w="1474"/>
+          </w:tcPr>
+          <w:p>
+            <w:r/>
+            <w:r>
+              <w:rPr>
+                <w:sz w:val="16"/>
+              </w:rPr>
+              <w:t>12:02</w:t>
+            </w:r>
+          </w:p>
+        </w:tc>
+        <w:tc>
+          <w:tcPr>
+            <w:tcW w:type="dxa" w:w="2381"/>
+          </w:tcPr>
+          <w:p>
+            <w:r/>
+            <w:r>
+              <w:rPr>
+                <w:sz w:val="16"/>
+              </w:rPr>
+              <w:t>Driver confirmed pickup</w:t>
+            </w:r>
+          </w:p>
+        </w:tc>
+      </w:tr>
+      <w:tr>
+        <w:tc>
+          <w:tcPr>
+            <w:tcW w:type="dxa" w:w="1134"/>
+          </w:tcPr>
+          <w:p>
+            <w:r/>
+            <w:r>
+              <w:rPr>
+                <w:sz w:val="16"/>
+              </w:rPr>
+              <w:t>ORD-9370</w:t>
+            </w:r>
+          </w:p>
+        </w:tc>
+        <w:tc>
+          <w:tcPr>
+            <w:tcW w:type="dxa" w:w="2835"/>
+          </w:tcPr>
+          <w:p>
+            <w:r/>
+            <w:r>
+              <w:rPr>
+                <w:sz w:val="16"/>
+              </w:rPr>
+              <w:t>Delivery failed</w:t>
+            </w:r>
+          </w:p>
+        </w:tc>
+        <w:tc>
+          <w:tcPr>
+            <w:tcW w:type="dxa" w:w="1247"/>
+          </w:tcPr>
+          <w:p>
+            <w:r/>
+            <w:r>
+              <w:rPr>
+                <w:sz w:val="16"/>
+              </w:rPr>
+              <w:t>Driver</w:t>
+            </w:r>
+          </w:p>
+        </w:tc>
+        <w:tc>
+          <w:tcPr>
+            <w:tcW w:type="dxa" w:w="1474"/>
+          </w:tcPr>
+          <w:p>
+            <w:r/>
+            <w:r>
+              <w:rPr>
+                <w:sz w:val="16"/>
+              </w:rPr>
+              <w:t>12:38</w:t>
+            </w:r>
+          </w:p>
+        </w:tc>
+        <w:tc>
+          <w:tcPr>
+            <w:tcW w:type="dxa" w:w="2381"/>
+          </w:tcPr>
+          <w:p>
+            <w:r/>
+            <w:r>
+              <w:rPr>
+                <w:sz w:val="16"/>
+              </w:rPr>
+              <w:t>Vehicle breakdown</w:t>
+            </w:r>
+          </w:p>
+        </w:tc>
+      </w:tr>
+      <w:tr>
+        <w:tc>
+          <w:tcPr>
+            <w:tcW w:type="dxa" w:w="1134"/>
+          </w:tcPr>
+          <w:p>
+            <w:r/>
+            <w:r>
+              <w:rPr>
+                <w:sz w:val="16"/>
+              </w:rPr>
+              <w:t>ORD-9370</w:t>
+            </w:r>
+          </w:p>
+        </w:tc>
+        <w:tc>
+          <w:tcPr>
+            <w:tcW w:type="dxa" w:w="2835"/>
+          </w:tcPr>
+          <w:p>
+            <w:r/>
+            <w:r>
+              <w:rPr>
+                <w:sz w:val="16"/>
+              </w:rPr>
+              <w:t>Driver assigned</w:t>
+            </w:r>
+          </w:p>
+        </w:tc>
+        <w:tc>
+          <w:tcPr>
+            <w:tcW w:type="dxa" w:w="1247"/>
+          </w:tcPr>
+          <w:p>
+            <w:r/>
+            <w:r>
+              <w:rPr>
+                <w:sz w:val="16"/>
+              </w:rPr>
+              <w:t>Dispatch</w:t>
+            </w:r>
+          </w:p>
+        </w:tc>
+        <w:tc>
+          <w:tcPr>
+            <w:tcW w:type="dxa" w:w="1474"/>
+          </w:tcPr>
+          <w:p>
+            <w:r/>
+            <w:r>
+              <w:rPr>
+                <w:sz w:val="16"/>
+              </w:rPr>
+              <w:t>13:02</w:t>
+            </w:r>
+          </w:p>
+        </w:tc>
+        <w:tc>
+          <w:tcPr>
+            <w:tcW w:type="dxa" w:w="2381"/>
+          </w:tcPr>
+          <w:p>
+            <w:r/>
+            <w:r>
+              <w:rPr>
+                <w:sz w:val="16"/>
+              </w:rPr>
+              <w:t>Assigned to driver</w:t>
+            </w:r>
+          </w:p>
+        </w:tc>
+      </w:tr>
+      <w:tr>
+        <w:tc>
+          <w:tcPr>
+            <w:tcW w:type="dxa" w:w="1134"/>
+          </w:tcPr>
+          <w:p>
+            <w:r/>
+            <w:r>
+              <w:rPr>
+                <w:sz w:val="16"/>
+              </w:rPr>
+              <w:t>ORD-9370</w:t>
+            </w:r>
+          </w:p>
+        </w:tc>
+        <w:tc>
+          <w:tcPr>
+            <w:tcW w:type="dxa" w:w="2835"/>
+          </w:tcPr>
+          <w:p>
+            <w:r/>
+            <w:r>
+              <w:rPr>
+                <w:sz w:val="16"/>
+              </w:rPr>
+              <w:t>Picked up by driver</w:t>
+            </w:r>
+          </w:p>
+        </w:tc>
+        <w:tc>
+          <w:tcPr>
+            <w:tcW w:type="dxa" w:w="1247"/>
+          </w:tcPr>
+          <w:p>
+            <w:r/>
+            <w:r>
+              <w:rPr>
+                <w:sz w:val="16"/>
+              </w:rPr>
+              <w:t>Driver</w:t>
+            </w:r>
+          </w:p>
+        </w:tc>
+        <w:tc>
+          <w:tcPr>
+            <w:tcW w:type="dxa" w:w="1474"/>
+          </w:tcPr>
+          <w:p>
+            <w:r/>
+            <w:r>
+              <w:rPr>
+                <w:sz w:val="16"/>
+              </w:rPr>
+              <w:t>13:23</w:t>
+            </w:r>
+          </w:p>
+        </w:tc>
+        <w:tc>
+          <w:tcPr>
+            <w:tcW w:type="dxa" w:w="2381"/>
+          </w:tcPr>
+          <w:p>
+            <w:r/>
+            <w:r>
+              <w:rPr>
+                <w:sz w:val="16"/>
+              </w:rPr>
+              <w:t>Driver confirmed pickup</w:t>
+            </w:r>
+          </w:p>
+        </w:tc>
+      </w:tr>
+      <w:tr>
+        <w:tc>
+          <w:tcPr>
+            <w:tcW w:type="dxa" w:w="1134"/>
+          </w:tcPr>
+          <w:p>
+            <w:r/>
+            <w:r>
+              <w:rPr>
+                <w:sz w:val="16"/>
+              </w:rPr>
+              <w:t>ORD-9370</w:t>
+            </w:r>
+          </w:p>
+        </w:tc>
+        <w:tc>
+          <w:tcPr>
+            <w:tcW w:type="dxa" w:w="2835"/>
+          </w:tcPr>
+          <w:p>
+            <w:r/>
+            <w:r>
+              <w:rPr>
+                <w:sz w:val="16"/>
+              </w:rPr>
+              <w:t>Delivered with the customer code</w:t>
+            </w:r>
+          </w:p>
+        </w:tc>
+        <w:tc>
+          <w:tcPr>
+            <w:tcW w:type="dxa" w:w="1247"/>
+          </w:tcPr>
+          <w:p>
+            <w:r/>
+            <w:r>
+              <w:rPr>
+                <w:sz w:val="16"/>
+              </w:rPr>
+              <w:t>Driver</w:t>
+            </w:r>
+          </w:p>
+        </w:tc>
+        <w:tc>
+          <w:tcPr>
+            <w:tcW w:type="dxa" w:w="1474"/>
+          </w:tcPr>
+          <w:p>
+            <w:r/>
+            <w:r>
+              <w:rPr>
+                <w:sz w:val="16"/>
+              </w:rPr>
+              <w:t>13:28</w:t>
+            </w:r>
+          </w:p>
+        </w:tc>
+        <w:tc>
+          <w:tcPr>
+            <w:tcW w:type="dxa" w:w="2381"/>
+          </w:tcPr>
+          <w:p>
+            <w:r/>
+            <w:r>
+              <w:rPr>
+                <w:sz w:val="16"/>
+              </w:rPr>
+              <w:t>Delivery code accepted</w:t>
+            </w:r>
+          </w:p>
+        </w:tc>
+      </w:tr>
+    </w:tbl>
+    <w:p>
+      <w:pPr>
+        <w:spacing w:after="240" w:line="360" w:lineRule="auto"/>
+        <w:jc w:val="left"/>
+      </w:pPr>
+      <w:r>
+        <w:rPr>
+          <w:i/>
+          <w:sz w:val="20"/>
+        </w:rPr>
+        <w:t>Source: status history of orders ORD-9371 and ORD-9370 in the live database, 02_functional_tests/manual_walkthrough_2026-10-30.json and manual_walkthrough.sql.</w:t>
+      </w:r>
+    </w:p>
+    <w:p>
+      <w:pPr>
         <w:pStyle w:val="Heading2"/>
       </w:pPr>
       <w:r>
@@ -14663,7 +16838,7 @@
         <w:rPr>
           <w:i w:val="0"/>
         </w:rPr>
-        <w:t>The final simulation used three replicates. Replicate 1 used the random seed 0.42 and is the headline result, while replicates 2 and 3 used the seeds 0.43 and 0.44. The further replicates show how much the measures move when the same design is drawn again. Each replicate contained 500 orders, made up of 200 clean orders and 300 erroneous orders, with 20 orders for each of fifteen planted error types. Twelve of the types are errors that a rule is designed to catch. The remaining three are realistic mistakes that no rule targets, shown at the foot of Table 4.16. Including them means the accuracy figures reflect mistakes the rules were not written for as well as those they were. Automatic approval was switched off so that every order passing validation went to the Ops Desk queue. Table 4.16 describes each planted error type.</w:t>
+        <w:t>The final simulation used three replicates. Replicate 1 used the random seed 0.42 and is the headline result, while replicates 2 and 3 used the seeds 0.43 and 0.44. The further replicates show how much the measures move when the same design is drawn again. Each replicate contained 500 orders, made up of 200 clean orders and 300 erroneous orders, with 20 orders for each of fifteen planted error types. Twelve of the types are errors that a rule is designed to catch. The remaining three are realistic mistakes that no rule targets, shown at the foot of Table 4.17. Including them means the accuracy figures reflect mistakes the rules were not written for as well as those they were. Automatic approval was switched off so that every order passing validation went to the Ops Desk queue. Table 4.17 describes each planted error type.</w:t>
       </w:r>
     </w:p>
     <w:p>
@@ -14677,7 +16852,7 @@
           <w:b/>
           <w:i w:val="0"/>
         </w:rPr>
-        <w:t>Table 4.16: Planted error types and how each was created</w:t>
+        <w:t>Table 4.17: Planted error types and how each was created</w:t>
       </w:r>
     </w:p>
     <w:tbl>
@@ -15434,7 +17609,7 @@
         <w:rPr>
           <w:i w:val="0"/>
         </w:rPr>
-        <w:t>The simulation used twenty customer profiles and the twelve-product catalogue of the first run. As Section 1.5 sets out, the profiles were set up for the test on the pattern of realistic business customers and do not belong to real customers. Each customer had two saved addresses in one of six delivery regions and four earlier orders, which give the unusual-quantity rule a history to compare against. Table 4.17 lists the companies and Table 4.18 describes the replicate 1 dataset. Figure 4.4 shows how the orders were spread across the delivery regions.</w:t>
+        <w:t>The simulation used twenty customer profiles and the twelve-product catalogue of the first run. As Section 1.5 sets out, the profiles were set up for the test on the pattern of realistic business customers and do not belong to real customers. Each customer had two saved addresses in one of six delivery regions and four earlier orders, which give the unusual-quantity rule a history to compare against. Table 4.18 lists the companies and Table 4.19 describes the replicate 1 dataset. Figure 4.4 shows how the orders were spread across the delivery regions.</w:t>
       </w:r>
     </w:p>
     <w:p>
@@ -15448,7 +17623,7 @@
           <w:b/>
           <w:i w:val="0"/>
         </w:rPr>
-        <w:t>Table 4.17: Customer profiles used in the simulation</w:t>
+        <w:t>Table 4.18: Customer profiles used in the simulation</w:t>
       </w:r>
     </w:p>
     <w:tbl>
@@ -16716,7 +18891,7 @@
           <w:b/>
           <w:i w:val="0"/>
         </w:rPr>
-        <w:t>Table 4.18: Description of the replicate 1 dataset</w:t>
+        <w:t>Table 4.19: Description of the replicate 1 dataset</w:t>
       </w:r>
     </w:p>
     <w:tbl>
@@ -17183,7 +19358,7 @@
         <w:rPr>
           <w:i w:val="0"/>
         </w:rPr>
-        <w:t>Table 4.19 shows one order of each kind from replicate 1, with the decision the system took and the first message it showed. Every order of all three replicates is listed in the accompanying workbook, Verity_Simulation_Data_Final.xlsx.</w:t>
+        <w:t>Table 4.20 shows one order of each kind from replicate 1, with the decision the system took and the first message it showed. Every order of all three replicates is listed in the accompanying workbook, Verity_Simulation_Data_Final.xlsx.</w:t>
       </w:r>
     </w:p>
     <w:p>
@@ -17197,7 +19372,7 @@
           <w:b/>
           <w:i w:val="0"/>
         </w:rPr>
-        <w:t>Table 4.19: Sample of simulated orders and the decision taken, replicate 1</w:t>
+        <w:t>Table 4.20: Sample of simulated orders and the decision taken, replicate 1</w:t>
       </w:r>
     </w:p>
     <w:tbl>
@@ -18834,7 +21009,7 @@
         <w:rPr>
           <w:i w:val="0"/>
         </w:rPr>
-        <w:t>Table 4.20 gives the detection rate for each planted error type with a 95 percent Wilson interval, which behaves better than the simple normal interval for small groups and for rates near zero or one (Brown et al., 2001; Wilson, 1927). Every one of the twelve rule-targeted types was flagged in all 20 of its orders, and in each case by the rule designed for it. Figure 4.6 shows the same rates graphically.</w:t>
+        <w:t>Table 4.21 gives the detection rate for each planted error type with a 95 percent Wilson interval, which behaves better than the simple normal interval for small groups and for rates near zero or one (Brown et al., 2001; Wilson, 1927). Every one of the twelve rule-targeted types was flagged in all 20 of its orders, and in each case by the rule designed for it. Figure 4.6 shows the same rates graphically.</w:t>
       </w:r>
     </w:p>
     <w:p>
@@ -18848,7 +21023,7 @@
           <w:b/>
           <w:i w:val="0"/>
         </w:rPr>
-        <w:t>Table 4.20: Detection by planted error type, replicate 1</w:t>
+        <w:t>Table 4.21: Detection by planted error type, replicate 1</w:t>
       </w:r>
     </w:p>
     <w:tbl>
@@ -20447,7 +22622,7 @@
         <w:rPr>
           <w:i w:val="0"/>
         </w:rPr>
-        <w:t>For the binary measures an order counts as flagged when it is warned or blocked and as positive when it carries a planted error. The primary measure uses all 300 erroneous orders against the 200 clean orders, and the secondary measure uses only the 240 rule-targeted orders against the same clean orders. Table 4.21 defines the measures. Table 4.22 gives both confusion matrices for replicate 1 and Table 4.23 gives the measures with their intervals.</w:t>
+        <w:t>For the binary measures an order counts as flagged when it is warned or blocked and as positive when it carries a planted error. The primary measure uses all 300 erroneous orders against the 200 clean orders, and the secondary measure uses only the 240 rule-targeted orders against the same clean orders. Table 4.22 defines the measures. Table 4.23 gives both confusion matrices for replicate 1 and Table 4.24 gives the measures with their intervals.</w:t>
       </w:r>
     </w:p>
     <w:p>
@@ -20461,7 +22636,7 @@
           <w:b/>
           <w:i w:val="0"/>
         </w:rPr>
-        <w:t>Table 4.21: Definitions of the classification measures</w:t>
+        <w:t>Table 4.22: Definitions of the classification measures</w:t>
       </w:r>
     </w:p>
     <w:tbl>
@@ -20816,7 +22991,7 @@
           <w:b/>
           <w:i w:val="0"/>
         </w:rPr>
-        <w:t>Table 4.22: Confusion matrices, replicate 1</w:t>
+        <w:t>Table 4.23: Confusion matrices, replicate 1</w:t>
       </w:r>
     </w:p>
     <w:tbl>
@@ -21129,7 +23304,7 @@
           <w:b/>
           <w:i w:val="0"/>
         </w:rPr>
-        <w:t>Table 4.23: Validation measures with 95 percent Wilson intervals, replicate 1</w:t>
+        <w:t>Table 4.24: Validation measures with 95 percent Wilson intervals, replicate 1</w:t>
       </w:r>
     </w:p>
     <w:tbl>
@@ -21768,7 +23943,7 @@
         <w:rPr>
           <w:i w:val="0"/>
         </w:rPr>
-        <w:t>Table 4.24 shows how often each rule fired. The seven blocking rules fired only on erroneous orders and never on a clean one. The stock rule also fired on the 40 orders whose quantity was above the maximum or whose product was discontinued, because both also exceed the stock on hand. All 28 false alarms on clean orders came from the two warning rules, 27 from the unusual-quantity rule and 1 from the duplicate rule. The unusual-quantity rule fired on 94 orders in all, and on 13.5 percent of clean orders. Figure 4.8 shows the same counts by kind of order.</w:t>
+        <w:t>Table 4.25 shows how often each rule fired. The seven blocking rules fired only on erroneous orders and never on a clean one. The stock rule also fired on the 40 orders whose quantity was above the maximum or whose product was discontinued, because both also exceed the stock on hand. All 28 false alarms on clean orders came from the two warning rules, 27 from the unusual-quantity rule and 1 from the duplicate rule. The unusual-quantity rule fired on 94 orders in all, and on 13.5 percent of clean orders. Figure 4.8 shows the same counts by kind of order.</w:t>
       </w:r>
     </w:p>
     <w:p>
@@ -21782,7 +23957,7 @@
           <w:b/>
           <w:i w:val="0"/>
         </w:rPr>
-        <w:t>Table 4.24: Rule activity and false alarms, replicate 1</w:t>
+        <w:t>Table 4.25: Rule activity and false alarms, replicate 1</w:t>
       </w:r>
     </w:p>
     <w:tbl>
@@ -22911,7 +25086,7 @@
         <w:rPr>
           <w:i w:val="0"/>
         </w:rPr>
-        <w:t>Validation time was measured as the clock time of submit_order inside the database, which validates the order and records the status change. It excludes network time and any time a person spends. Table 4.25 gives the statistics for replicate 1 and Figure 4.9 shows their distribution. The standard deviation is the sample value. The mean was 28.72 ms and the median 22.16 ms, with a 95th percentile of 74.72 ms and a maximum of 124.31 ms. The time measured from the draft event to the last event in the status history gave a mean of 29.78 ms over the 478 orders that had more than one event.</w:t>
+        <w:t>Validation time was measured as the clock time of submit_order inside the database, which validates the order and records the status change. It excludes network time and any time a person spends. Table 4.26 gives the statistics for replicate 1 and Figure 4.9 shows their distribution. The standard deviation is the sample value. The mean was 28.72 ms and the median 22.16 ms, with a 95th percentile of 74.72 ms and a maximum of 124.31 ms. The time measured from the draft event to the last event in the status history gave a mean of 29.78 ms over the 478 orders that had more than one event.</w:t>
       </w:r>
     </w:p>
     <w:p>
@@ -22925,7 +25100,7 @@
           <w:b/>
           <w:i w:val="0"/>
         </w:rPr>
-        <w:t>Table 4.25: Validation time per order in milliseconds, replicate 1</w:t>
+        <w:t>Table 4.26: Validation time per order in milliseconds, replicate 1</w:t>
       </w:r>
     </w:p>
     <w:tbl>
@@ -23701,7 +25876,7 @@
         <w:rPr>
           <w:i w:val="0"/>
         </w:rPr>
-        <w:t>Table 4.26 sets the key measures of the three replicates side by side. No accuracy or detection measure moved by more than 1.7 percentage points between replicates, so the headline figures do not depend on the particular seed. The timing measures moved by an order of magnitude, as described above.</w:t>
+        <w:t>Table 4.27 sets the key measures of the three replicates side by side. No accuracy or detection measure moved by more than 1.7 percentage points between replicates, so the headline figures do not depend on the particular seed. The timing measures moved by an order of magnitude, as described above.</w:t>
       </w:r>
     </w:p>
     <w:p>
@@ -23715,7 +25890,7 @@
           <w:b/>
           <w:i w:val="0"/>
         </w:rPr>
-        <w:t>Table 4.26: Key measures in each replicate</w:t>
+        <w:t>Table 4.27: Key measures in each replicate</w:t>
       </w:r>
     </w:p>
     <w:tbl>
@@ -24926,7 +27101,7 @@
         <w:rPr>
           <w:i w:val="0"/>
         </w:rPr>
-        <w:t>Because the unusual-quantity rule caused nearly all false alarms and also caught the quantity slips, its setting was examined. Replicate 1 was replayed through the live functions with the threshold set from three to five times the customer's average in steps of one, and with four or ten earlier orders per customer. The replay with the live setting reproduced replicate 1 exactly, with no difference in any order, so the six settings in Table 4.27 are compared on identical orders. These runs are for discussion only and the live setting was left at three.</w:t>
+        <w:t>Because the unusual-quantity rule caused nearly all false alarms and also caught the quantity slips, its setting was examined. Replicate 1 was replayed through the live functions with the threshold set from three to five times the customer's average in steps of one, and with four or ten earlier orders per customer. The replay with the live setting reproduced replicate 1 exactly, with no difference in any order, so the six settings in Table 4.28 are compared on identical orders. These runs are for discussion only and the live setting was left at three.</w:t>
       </w:r>
     </w:p>
     <w:p>
@@ -24940,7 +27115,7 @@
           <w:b/>
           <w:i w:val="0"/>
         </w:rPr>
-        <w:t>Table 4.27: Unusual-quantity sensitivity on replicate 1</w:t>
+        <w:t>Table 4.28: Unusual-quantity sensitivity on replicate 1</w:t>
       </w:r>
     </w:p>
     <w:tbl>
@@ -26011,7 +28186,7 @@
         <w:rPr>
           <w:i w:val="0"/>
         </w:rPr>
-        <w:t>Table 4.28 sets each objective of Section 1.3, in its Chapter One wording, against its success criterion and the result of this evaluation.</w:t>
+        <w:t>Table 4.29 sets each objective of Section 1.3, in its Chapter One wording, against its success criterion and the result of this evaluation.</w:t>
       </w:r>
     </w:p>
     <w:p>
@@ -26025,7 +28200,7 @@
           <w:b/>
           <w:i w:val="0"/>
         </w:rPr>
-        <w:t>Table 4.28: Objectives of Section 1.3 and their success criteria</w:t>
+        <w:t>Table 4.29: Objectives of Section 1.3 and their success criteria</w:t>
       </w:r>
     </w:p>
     <w:tbl>
@@ -26829,7 +29004,7 @@
         <w:rPr>
           <w:i w:val="0"/>
         </w:rPr>
-        <w:t>The two parts of the evaluation point in different directions. The simulation shows an engine that stopped every planted error a rule targets, yet only 35.0 percent of respondents agreed that Verity would reduce errors in orders. The respondents judged Verity from a demonstration lasting six to eight minutes, so the gap may reflect what the demonstration showed rather than what the system does. The open answers support this reading. The two features requested most often, a history of changes and approvals and a history of corrections, are already provided by the audit trail and the status history, and the problem named most often concerned mobile access and low data use. The importance ratings of Table 4.5 do not favour any check over the others, so they give no user priority against which the detection rates of Table 4.20 can be read. Section C, which would have shown the error types respondents meet most often, could not be decoded, so the planted error types cannot yet be compared with the errors seen in practice.</w:t>
+        <w:t>The two parts of the evaluation point in different directions. The simulation shows an engine that stopped every planted error a rule targets, yet only 35.0 percent of respondents agreed that Verity would reduce errors in orders. The respondents judged Verity from a demonstration lasting six to eight minutes, so the gap may reflect what the demonstration showed rather than what the system does. The open answers support this reading. The two features requested most often, a history of changes and approvals and a history of corrections, are already provided by the audit trail and the status history, and the problem named most often concerned mobile access and low data use. The importance ratings of Table 4.5 do not favour any check over the others, so they give no user priority against which the detection rates of Table 4.21 can be read. Section C, which would have shown the error types respondents meet most often, could not be decoded, so the planted error types cannot yet be compared with the errors seen in practice.</w:t>
       </w:r>
     </w:p>
     <w:p>

</xml_diff>

<commit_message>
Chapter Four: report error-reduction and speed criteria as Scheduled
Removes the [DATA PENDING] placeholders. Objective 3 is Partly met on the
simulation evidence, and the manual-comparison criteria of Objectives 3 and
4 are Scheduled, with the system's own evidence reported in their place.

Co-Authored-By: Claude Opus 5.5 <noreply@anthropic.com>
Claude-Session: https://claude.ai/code/session_0116ePZsFh2Yr8B4s3JdZBxN
</commit_message>
<xml_diff>
--- a/docs/chapter4_final/08_chapter/Chapter_Four.docx
+++ b/docs/chapter4_final/08_chapter/Chapter_Four.docx
@@ -52,7 +52,7 @@
                 <w:i/>
                 <w:sz w:val="20"/>
               </w:rPr>
-              <w:t>Note for the group. This chapter combines the questionnaire results, supplied by the client team, with the technical evaluation of the system and the simulation. Results that depend on the manual-entry comparison are marked [DATA PENDING]. Delete this note before submission.</w:t>
+              <w:t>Note for the group. This chapter combines the questionnaire results, supplied by the client team, with the technical evaluation of the system and the simulation. The comparison with manual entry is scheduled, and the error-reduction and speed criteria are reported as Scheduled until it is complete. Delete this note before submission.</w:t>
             </w:r>
           </w:p>
         </w:tc>
@@ -88,7 +88,7 @@
         <w:rPr>
           <w:i w:val="0"/>
         </w:rPr>
-        <w:t>At the time of writing the comparison with manual order entry had not been run. Every result that depends on it is therefore marked [DATA PENDING] and every success criterion that rests on it is given the status Pending. All other figures in this chapter come from files and database queries produced during the evaluation, and each is listed with its source in the traceability table that accompanies the chapter.</w:t>
+        <w:t>At the time of writing the comparison with manual order entry was scheduled but not yet complete. The two success criteria that rest on it, the reduction in manual entry errors and the gain in processing speed, are therefore given the status Scheduled, and the evidence the system itself provides on both is reported in their place. All other figures in this chapter come from files and database queries produced during the evaluation, and each is listed with its source in the traceability table that accompanies the chapter.</w:t>
       </w:r>
     </w:p>
     <w:p>
@@ -28483,7 +28483,7 @@
               <w:rPr>
                 <w:sz w:val="17"/>
               </w:rPr>
-              <w:t>[DATA PENDING]</w:t>
+              <w:t>Every rule-targeted error was stopped in all three replicates. 40.0 to 41.7 percent of errors with no rule were flagged. Reduction against manual entry not yet measured</w:t>
             </w:r>
           </w:p>
         </w:tc>
@@ -28497,7 +28497,7 @@
               <w:rPr>
                 <w:sz w:val="17"/>
               </w:rPr>
-              <w:t>[DATA PENDING]</w:t>
+              <w:t>not applicable</w:t>
             </w:r>
           </w:p>
         </w:tc>
@@ -28511,7 +28511,7 @@
               <w:rPr>
                 <w:sz w:val="17"/>
               </w:rPr>
-              <w:t>Pending</w:t>
+              <w:t>Scheduled</w:t>
             </w:r>
           </w:p>
         </w:tc>
@@ -28627,7 +28627,7 @@
               <w:rPr>
                 <w:sz w:val="17"/>
               </w:rPr>
-              <w:t>[DATA PENDING]</w:t>
+              <w:t>Median validation time 2.34 to 22.88 ms per order across the replicates. Gain against manual handling not yet measured</w:t>
             </w:r>
           </w:p>
         </w:tc>
@@ -28641,7 +28641,7 @@
               <w:rPr>
                 <w:sz w:val="17"/>
               </w:rPr>
-              <w:t>[DATA PENDING]</w:t>
+              <w:t>not applicable</w:t>
             </w:r>
           </w:p>
         </w:tc>
@@ -28655,7 +28655,7 @@
               <w:rPr>
                 <w:sz w:val="17"/>
               </w:rPr>
-              <w:t>Pending</w:t>
+              <w:t>Scheduled</w:t>
             </w:r>
           </w:p>
         </w:tc>
@@ -28839,7 +28839,7 @@
         <w:rPr>
           <w:i w:val="0"/>
         </w:rPr>
-        <w:t>The mandatory-fields part of Objective 3 is Met. The error-reduction part of Objective 3 and the speed criterion of Objective 4 remain Pending until the manual baseline is run and scored with analyze_baseline.py, and below about 80 paired orders that comparison of errors will be indicative only. The simulated test run required by Objective 5 is Met, but its usability and acceptance part is Not met. The mean usability score was significantly below the benchmark of 68, and no acceptance item was agreed by a majority of respondents.</w:t>
+        <w:t>Objective 3 is Partly met. Its mandatory-fields criterion is Met, and the simulation shows that the system stops every error a rule is written for before approval. Whether this amounts to 60 percent fewer errors than manual entry depends on the scheduled comparison, so that criterion is given the status Scheduled. The speed criterion of Objective 4 is also Scheduled. The system validates an order in milliseconds, but the criterion concerns end-to-end handling against manual entry, which the same comparison will measure. Below about 80 paired orders its results will be indicative only. The simulated test run required by Objective 5 is Met, but its usability and acceptance part is Not met. The mean usability score was significantly below the benchmark of 68, and no acceptance item was agreed by a majority of respondents.</w:t>
       </w:r>
     </w:p>
     <w:p>
@@ -28934,7 +28934,7 @@
         <w:rPr>
           <w:i w:val="0"/>
         </w:rPr>
-        <w:t>This comparison needs the manual baseline and is [DATA PENDING]. The simulation shows that no order reached approval with a mandatory field missing.</w:t>
+        <w:t>The simulation shows what the system removes. Every error that a rule targets was stopped before approval in all three replicates, and no order reached approval with a mandatory field missing. Errors that lie inside the allowed values, such as a wrong but valid product, were mostly not caught. The size of the reduction against manual entry will be measured in the scheduled comparison.</w:t>
       </w:r>
     </w:p>
     <w:p>
@@ -28959,7 +28959,7 @@
         <w:rPr>
           <w:i w:val="0"/>
         </w:rPr>
-        <w:t>Validation itself takes milliseconds per order, but the question concerns end-to-end processing time against manual handling, and that answer is [DATA PENDING].</w:t>
+        <w:t>Validation itself takes milliseconds per order, but the question concerns end-to-end processing time against manual handling. That gain will be measured in the scheduled comparison with manual entry.</w:t>
       </w:r>
     </w:p>
     <w:p>
@@ -29152,7 +29152,7 @@
         <w:rPr>
           <w:i w:val="0"/>
         </w:rPr>
-        <w:t>The comparison with manual order entry had not been carried out, so the objectives on error reduction and speed could not be assessed.</w:t>
+        <w:t>The comparison with manual order entry had not been completed at the time of writing, so the reduction in errors and the gain in processing speed against manual handling are not yet measured.</w:t>
       </w:r>
     </w:p>
     <w:p>
@@ -29196,7 +29196,7 @@
         <w:rPr>
           <w:i w:val="0"/>
         </w:rPr>
-        <w:t>Verity was built as a working order processing system with a controlled order lifecycle and nine validation rules, protected by role-based access. Of 26 functional tests, 23 passed and the 3 failures were reported. In three replicates of 500 simulated orders the engine flagged every error that a rule targets, and accuracy on that basis was between 93.0 and 93.6 percent. When realistic errors that no rule targets were included, accuracy was between 86.8 and 87.2 percent, below the 90 percent target. Nearly all false alarms came from the unusual-quantity warning, which also caught most quantity slips. Every order that reached approval had its mandatory fields. In the questionnaire, 200 respondents gave Verity a mean usability score of 48.86, significantly below the benchmark of 68, and 38.5 percent said they would use it, so the usability and acceptance part of Objective 5 is Not met. The comparison with manual entry remains to be carried out, and the objectives on error reduction and speed are Pending until it is.</w:t>
+        <w:t>Verity was built as a working order processing system with a controlled order lifecycle and nine validation rules, protected by role-based access. Of 26 functional tests, 23 passed and the 3 failures were reported. In three replicates of 500 simulated orders the engine flagged every error that a rule targets, and accuracy on that basis was between 93.0 and 93.6 percent. When realistic errors that no rule targets were included, accuracy was between 86.8 and 87.2 percent, below the 90 percent target. Nearly all false alarms came from the unusual-quantity warning, which also caught most quantity slips. Every order that reached approval had its mandatory fields. In the questionnaire, 200 respondents gave Verity a mean usability score of 48.86, significantly below the benchmark of 68, and 38.5 percent said they would use it, so the usability and acceptance part of Objective 5 is Not met. The comparison with manual entry is scheduled, and the criteria on error reduction and speed are reported as Scheduled until it is complete.</w:t>
       </w:r>
     </w:p>
     <w:p>

</xml_diff>

<commit_message>
Score the manual-entry comparison and report it in Chapter Four
Two participants handled B-001 to B-040 by hand. score_manual_vs_simulation.py
scores their sheets against the answer key and compares them with Verity's
simulation outcome for the same orders, using the definitions fixed in
analyze_baseline.py. Errors reached the record in 72.5 percent of orders by
hand against 15.0 percent through Verity, a reduction of 79.3 percent.
Chapter Four gains Section 4.5.9 and Table 4.29. Objective 3 becomes Met on
indicative evidence and the speed criterion stays Scheduled, because the time
a person spends entering an order in Verity was not measured.

Co-Authored-By: Claude Opus 5.5 <noreply@anthropic.com>
Claude-Session: https://claude.ai/code/session_0116ePZsFh2Yr8B4s3JdZBxN
</commit_message>
<xml_diff>
--- a/docs/chapter4_final/08_chapter/Chapter_Four.docx
+++ b/docs/chapter4_final/08_chapter/Chapter_Four.docx
@@ -52,7 +52,7 @@
                 <w:i/>
                 <w:sz w:val="20"/>
               </w:rPr>
-              <w:t>Note for the group. This chapter combines the questionnaire results, supplied by the client team, with the technical evaluation of the system and the simulation. The comparison with manual entry is scheduled, and the error-reduction and speed criteria are reported as Scheduled until it is complete. Delete this note before submission.</w:t>
+              <w:t>Note for the group. This chapter combines the questionnaire results, supplied by the client team, with the technical evaluation of the system and the simulation. The comparison with manual entry was run on a small scale and is reported as indicative. The speed criterion is reported as Scheduled. Delete this note before submission.</w:t>
             </w:r>
           </w:p>
         </w:tc>
@@ -88,7 +88,7 @@
         <w:rPr>
           <w:i w:val="0"/>
         </w:rPr>
-        <w:t>At the time of writing the comparison with manual order entry was scheduled but not yet complete. The two success criteria that rest on it, the reduction in manual entry errors and the gain in processing speed, are therefore given the status Scheduled, and the evidence the system itself provides on both is reported in their place. All other figures in this chapter come from files and database queries produced during the evaluation, and each is listed with its source in the traceability table that accompanies the chapter.</w:t>
+        <w:t>The comparison with manual order entry was run on a small scale, with two participants and 40 orders, and its results are reported as indicative. The time a person spends entering an order in Verity was not measured, so the speed criterion is given the status Scheduled. All other figures in this chapter come from files and database queries produced during the evaluation, and each is listed with its source in the traceability table that accompanies the chapter.</w:t>
       </w:r>
     </w:p>
     <w:p>
@@ -28163,6 +28163,676 @@
     </w:p>
     <w:p>
       <w:pPr>
+        <w:pStyle w:val="Heading3"/>
+      </w:pPr>
+      <w:r>
+        <w:t>4.5.9 Comparison with manual entry</w:t>
+      </w:r>
+    </w:p>
+    <w:p>
+      <w:pPr>
+        <w:spacing w:after="160" w:line="360" w:lineRule="auto"/>
+        <w:jc w:val="both"/>
+      </w:pPr>
+      <w:r>
+        <w:rPr>
+          <w:i w:val="0"/>
+        </w:rPr>
+        <w:t>Two participants who had not seen the answer key each handled 20 of the order messages of the comparison pack by hand on 30 October 2026, as orders are handled today. Each checked the message against the reference sheets of the pack and typed the order into an entry sheet without correcting it, noting the time at the start and at the end. The 40 orders were taken from replicate 1 of the simulation, so the outcome of Verity on each of them was already known. In Verity the customer enters the order against the live catalogue and no member of staff retypes it, so an error reaches the record only when the system does not flag it. The comparison used the definitions fixed before any data were collected. By hand an error reached the record when a planted error was not flagged or when any field was typed differently from the message. Table 4.29 gives the results.</w:t>
+      </w:r>
+    </w:p>
+    <w:p>
+      <w:pPr>
+        <w:keepNext/>
+        <w:spacing w:after="80" w:line="360" w:lineRule="auto"/>
+        <w:jc w:val="left"/>
+      </w:pPr>
+      <w:r>
+        <w:rPr>
+          <w:b/>
+          <w:i w:val="0"/>
+        </w:rPr>
+        <w:t>Table 4.29: Manual entry and Verity on the same 40 orders</w:t>
+      </w:r>
+    </w:p>
+    <w:tbl>
+      <w:tblPr>
+        <w:tblStyle w:val="TableGrid"/>
+        <w:tblW w:type="auto" w:w="0"/>
+        <w:jc w:val="center"/>
+        <w:tblLayout w:type="fixed"/>
+        <w:tblLook w:firstColumn="1" w:firstRow="1" w:lastColumn="0" w:lastRow="0" w:noHBand="0" w:noVBand="1" w:val="04A0"/>
+      </w:tblPr>
+      <w:tblGrid>
+        <w:gridCol w:w="2948"/>
+        <w:gridCol w:w="1814"/>
+        <w:gridCol w:w="1360"/>
+        <w:gridCol w:w="1814"/>
+        <w:gridCol w:w="1360"/>
+      </w:tblGrid>
+      <w:tr>
+        <w:tc>
+          <w:tcPr>
+            <w:tcW w:type="dxa" w:w="2948"/>
+            <w:shd w:val="clear" w:color="auto" w:fill="D9E2E1"/>
+          </w:tcPr>
+          <w:p>
+            <w:r/>
+            <w:r>
+              <w:rPr>
+                <w:b/>
+                <w:sz w:val="17"/>
+              </w:rPr>
+              <w:t>Measure</w:t>
+            </w:r>
+          </w:p>
+        </w:tc>
+        <w:tc>
+          <w:tcPr>
+            <w:tcW w:type="dxa" w:w="1814"/>
+            <w:shd w:val="clear" w:color="auto" w:fill="D9E2E1"/>
+          </w:tcPr>
+          <w:p>
+            <w:r/>
+            <w:r>
+              <w:rPr>
+                <w:b/>
+                <w:sz w:val="17"/>
+              </w:rPr>
+              <w:t>Manual entry</w:t>
+            </w:r>
+          </w:p>
+        </w:tc>
+        <w:tc>
+          <w:tcPr>
+            <w:tcW w:type="dxa" w:w="1361"/>
+            <w:shd w:val="clear" w:color="auto" w:fill="D9E2E1"/>
+          </w:tcPr>
+          <w:p>
+            <w:r/>
+            <w:r>
+              <w:rPr>
+                <w:b/>
+                <w:sz w:val="17"/>
+              </w:rPr>
+              <w:t>95% CI</w:t>
+            </w:r>
+          </w:p>
+        </w:tc>
+        <w:tc>
+          <w:tcPr>
+            <w:tcW w:type="dxa" w:w="1814"/>
+            <w:shd w:val="clear" w:color="auto" w:fill="D9E2E1"/>
+          </w:tcPr>
+          <w:p>
+            <w:r/>
+            <w:r>
+              <w:rPr>
+                <w:b/>
+                <w:sz w:val="17"/>
+              </w:rPr>
+              <w:t>Verity</w:t>
+            </w:r>
+          </w:p>
+        </w:tc>
+        <w:tc>
+          <w:tcPr>
+            <w:tcW w:type="dxa" w:w="1361"/>
+            <w:shd w:val="clear" w:color="auto" w:fill="D9E2E1"/>
+          </w:tcPr>
+          <w:p>
+            <w:r/>
+            <w:r>
+              <w:rPr>
+                <w:b/>
+                <w:sz w:val="17"/>
+              </w:rPr>
+              <w:t>95% CI</w:t>
+            </w:r>
+          </w:p>
+        </w:tc>
+      </w:tr>
+      <w:tr>
+        <w:tc>
+          <w:tcPr>
+            <w:tcW w:type="dxa" w:w="2948"/>
+          </w:tcPr>
+          <w:p>
+            <w:r/>
+            <w:r>
+              <w:rPr>
+                <w:sz w:val="17"/>
+              </w:rPr>
+              <w:t>Orders with an error reaching the record</w:t>
+            </w:r>
+          </w:p>
+        </w:tc>
+        <w:tc>
+          <w:tcPr>
+            <w:tcW w:type="dxa" w:w="1814"/>
+          </w:tcPr>
+          <w:p>
+            <w:r/>
+            <w:r>
+              <w:rPr>
+                <w:sz w:val="17"/>
+              </w:rPr>
+              <w:t>29 of 40, 72.5 percent</w:t>
+            </w:r>
+          </w:p>
+        </w:tc>
+        <w:tc>
+          <w:tcPr>
+            <w:tcW w:type="dxa" w:w="1361"/>
+          </w:tcPr>
+          <w:p>
+            <w:r/>
+            <w:r>
+              <w:rPr>
+                <w:sz w:val="17"/>
+              </w:rPr>
+              <w:t>57.2 to 83.9</w:t>
+            </w:r>
+          </w:p>
+        </w:tc>
+        <w:tc>
+          <w:tcPr>
+            <w:tcW w:type="dxa" w:w="1814"/>
+          </w:tcPr>
+          <w:p>
+            <w:r/>
+            <w:r>
+              <w:rPr>
+                <w:sz w:val="17"/>
+              </w:rPr>
+              <w:t>6 of 40, 15.0 percent</w:t>
+            </w:r>
+          </w:p>
+        </w:tc>
+        <w:tc>
+          <w:tcPr>
+            <w:tcW w:type="dxa" w:w="1361"/>
+          </w:tcPr>
+          <w:p>
+            <w:r/>
+            <w:r>
+              <w:rPr>
+                <w:sz w:val="17"/>
+              </w:rPr>
+              <w:t>7.1 to 29.1</w:t>
+            </w:r>
+          </w:p>
+        </w:tc>
+      </w:tr>
+      <w:tr>
+        <w:tc>
+          <w:tcPr>
+            <w:tcW w:type="dxa" w:w="2948"/>
+          </w:tcPr>
+          <w:p>
+            <w:r/>
+            <w:r>
+              <w:rPr>
+                <w:sz w:val="17"/>
+              </w:rPr>
+              <w:t>Planted errors flagged</w:t>
+            </w:r>
+          </w:p>
+        </w:tc>
+        <w:tc>
+          <w:tcPr>
+            <w:tcW w:type="dxa" w:w="1814"/>
+          </w:tcPr>
+          <w:p>
+            <w:r/>
+            <w:r>
+              <w:rPr>
+                <w:sz w:val="17"/>
+              </w:rPr>
+              <w:t>6 of 26</w:t>
+            </w:r>
+          </w:p>
+        </w:tc>
+        <w:tc>
+          <w:tcPr>
+            <w:tcW w:type="dxa" w:w="1361"/>
+          </w:tcPr>
+          <w:p>
+            <w:r/>
+            <w:r>
+              <w:rPr>
+                <w:sz w:val="17"/>
+              </w:rPr>
+              <w:t>11.0 to 42.1</w:t>
+            </w:r>
+          </w:p>
+        </w:tc>
+        <w:tc>
+          <w:tcPr>
+            <w:tcW w:type="dxa" w:w="1814"/>
+          </w:tcPr>
+          <w:p>
+            <w:r/>
+            <w:r>
+              <w:rPr>
+                <w:sz w:val="17"/>
+              </w:rPr>
+              <w:t>20 of 26</w:t>
+            </w:r>
+          </w:p>
+        </w:tc>
+        <w:tc>
+          <w:tcPr>
+            <w:tcW w:type="dxa" w:w="1361"/>
+          </w:tcPr>
+          <w:p>
+            <w:r/>
+            <w:r>
+              <w:rPr>
+                <w:sz w:val="17"/>
+              </w:rPr>
+              <w:t>57.9 to 89.0</w:t>
+            </w:r>
+          </w:p>
+        </w:tc>
+      </w:tr>
+      <w:tr>
+        <w:tc>
+          <w:tcPr>
+            <w:tcW w:type="dxa" w:w="2948"/>
+          </w:tcPr>
+          <w:p>
+            <w:r/>
+            <w:r>
+              <w:rPr>
+                <w:sz w:val="17"/>
+              </w:rPr>
+              <w:t>Rule-targeted errors flagged</w:t>
+            </w:r>
+          </w:p>
+        </w:tc>
+        <w:tc>
+          <w:tcPr>
+            <w:tcW w:type="dxa" w:w="1814"/>
+          </w:tcPr>
+          <w:p>
+            <w:r/>
+            <w:r>
+              <w:rPr>
+                <w:sz w:val="17"/>
+              </w:rPr>
+              <w:t>6 of 19</w:t>
+            </w:r>
+          </w:p>
+        </w:tc>
+        <w:tc>
+          <w:tcPr>
+            <w:tcW w:type="dxa" w:w="1361"/>
+          </w:tcPr>
+          <w:p>
+            <w:r/>
+            <w:r>
+              <w:rPr>
+                <w:sz w:val="17"/>
+              </w:rPr>
+              <w:t>15.4 to 54.0</w:t>
+            </w:r>
+          </w:p>
+        </w:tc>
+        <w:tc>
+          <w:tcPr>
+            <w:tcW w:type="dxa" w:w="1814"/>
+          </w:tcPr>
+          <w:p>
+            <w:r/>
+            <w:r>
+              <w:rPr>
+                <w:sz w:val="17"/>
+              </w:rPr>
+              <w:t>19 of 19</w:t>
+            </w:r>
+          </w:p>
+        </w:tc>
+        <w:tc>
+          <w:tcPr>
+            <w:tcW w:type="dxa" w:w="1361"/>
+          </w:tcPr>
+          <w:p>
+            <w:r/>
+            <w:r>
+              <w:rPr>
+                <w:sz w:val="17"/>
+              </w:rPr>
+              <w:t>83.2 to 100.0</w:t>
+            </w:r>
+          </w:p>
+        </w:tc>
+      </w:tr>
+      <w:tr>
+        <w:tc>
+          <w:tcPr>
+            <w:tcW w:type="dxa" w:w="2948"/>
+          </w:tcPr>
+          <w:p>
+            <w:r/>
+            <w:r>
+              <w:rPr>
+                <w:sz w:val="17"/>
+              </w:rPr>
+              <w:t>Errors with no rule flagged</w:t>
+            </w:r>
+          </w:p>
+        </w:tc>
+        <w:tc>
+          <w:tcPr>
+            <w:tcW w:type="dxa" w:w="1814"/>
+          </w:tcPr>
+          <w:p>
+            <w:r/>
+            <w:r>
+              <w:rPr>
+                <w:sz w:val="17"/>
+              </w:rPr>
+              <w:t>0 of 7</w:t>
+            </w:r>
+          </w:p>
+        </w:tc>
+        <w:tc>
+          <w:tcPr>
+            <w:tcW w:type="dxa" w:w="1361"/>
+          </w:tcPr>
+          <w:p>
+            <w:r/>
+            <w:r>
+              <w:rPr>
+                <w:sz w:val="17"/>
+              </w:rPr>
+              <w:t>0.0 to 35.4</w:t>
+            </w:r>
+          </w:p>
+        </w:tc>
+        <w:tc>
+          <w:tcPr>
+            <w:tcW w:type="dxa" w:w="1814"/>
+          </w:tcPr>
+          <w:p>
+            <w:r/>
+            <w:r>
+              <w:rPr>
+                <w:sz w:val="17"/>
+              </w:rPr>
+              <w:t>1 of 7</w:t>
+            </w:r>
+          </w:p>
+        </w:tc>
+        <w:tc>
+          <w:tcPr>
+            <w:tcW w:type="dxa" w:w="1361"/>
+          </w:tcPr>
+          <w:p>
+            <w:r/>
+            <w:r>
+              <w:rPr>
+                <w:sz w:val="17"/>
+              </w:rPr>
+              <w:t>2.6 to 51.3</w:t>
+            </w:r>
+          </w:p>
+        </w:tc>
+      </w:tr>
+      <w:tr>
+        <w:tc>
+          <w:tcPr>
+            <w:tcW w:type="dxa" w:w="2948"/>
+          </w:tcPr>
+          <w:p>
+            <w:r/>
+            <w:r>
+              <w:rPr>
+                <w:sz w:val="17"/>
+              </w:rPr>
+              <w:t>Orders with a field typed differently from the message</w:t>
+            </w:r>
+          </w:p>
+        </w:tc>
+        <w:tc>
+          <w:tcPr>
+            <w:tcW w:type="dxa" w:w="1814"/>
+          </w:tcPr>
+          <w:p>
+            <w:r/>
+            <w:r>
+              <w:rPr>
+                <w:sz w:val="17"/>
+              </w:rPr>
+              <w:t>19 of 40</w:t>
+            </w:r>
+          </w:p>
+        </w:tc>
+        <w:tc>
+          <w:tcPr>
+            <w:tcW w:type="dxa" w:w="1361"/>
+          </w:tcPr>
+          <w:p>
+            <w:r/>
+            <w:r>
+              <w:rPr>
+                <w:sz w:val="17"/>
+              </w:rPr>
+              <w:t>32.9 to 62.5</w:t>
+            </w:r>
+          </w:p>
+        </w:tc>
+        <w:tc>
+          <w:tcPr>
+            <w:tcW w:type="dxa" w:w="1814"/>
+          </w:tcPr>
+          <w:p>
+            <w:r/>
+            <w:r>
+              <w:rPr>
+                <w:sz w:val="17"/>
+              </w:rPr>
+              <w:t>not applicable</w:t>
+            </w:r>
+          </w:p>
+        </w:tc>
+        <w:tc>
+          <w:tcPr>
+            <w:tcW w:type="dxa" w:w="1361"/>
+          </w:tcPr>
+          <w:p>
+            <w:r/>
+            <w:r>
+              <w:rPr>
+                <w:sz w:val="17"/>
+              </w:rPr>
+            </w:r>
+          </w:p>
+        </w:tc>
+      </w:tr>
+      <w:tr>
+        <w:tc>
+          <w:tcPr>
+            <w:tcW w:type="dxa" w:w="2948"/>
+          </w:tcPr>
+          <w:p>
+            <w:r/>
+            <w:r>
+              <w:rPr>
+                <w:sz w:val="17"/>
+              </w:rPr>
+              <w:t>Clean orders wrongly flagged</w:t>
+            </w:r>
+          </w:p>
+        </w:tc>
+        <w:tc>
+          <w:tcPr>
+            <w:tcW w:type="dxa" w:w="1814"/>
+          </w:tcPr>
+          <w:p>
+            <w:r/>
+            <w:r>
+              <w:rPr>
+                <w:sz w:val="17"/>
+              </w:rPr>
+              <w:t>0 of 14</w:t>
+            </w:r>
+          </w:p>
+        </w:tc>
+        <w:tc>
+          <w:tcPr>
+            <w:tcW w:type="dxa" w:w="1361"/>
+          </w:tcPr>
+          <w:p>
+            <w:r/>
+            <w:r>
+              <w:rPr>
+                <w:sz w:val="17"/>
+              </w:rPr>
+              <w:t>0.0 to 21.5</w:t>
+            </w:r>
+          </w:p>
+        </w:tc>
+        <w:tc>
+          <w:tcPr>
+            <w:tcW w:type="dxa" w:w="1814"/>
+          </w:tcPr>
+          <w:p>
+            <w:r/>
+            <w:r>
+              <w:rPr>
+                <w:sz w:val="17"/>
+              </w:rPr>
+              <w:t>1 of 14</w:t>
+            </w:r>
+          </w:p>
+        </w:tc>
+        <w:tc>
+          <w:tcPr>
+            <w:tcW w:type="dxa" w:w="1361"/>
+          </w:tcPr>
+          <w:p>
+            <w:r/>
+            <w:r>
+              <w:rPr>
+                <w:sz w:val="17"/>
+              </w:rPr>
+              <w:t>1.3 to 31.5</w:t>
+            </w:r>
+          </w:p>
+        </w:tc>
+      </w:tr>
+      <w:tr>
+        <w:tc>
+          <w:tcPr>
+            <w:tcW w:type="dxa" w:w="2948"/>
+          </w:tcPr>
+          <w:p>
+            <w:r/>
+            <w:r>
+              <w:rPr>
+                <w:sz w:val="17"/>
+              </w:rPr>
+              <w:t>Time per order, median and mean</w:t>
+            </w:r>
+          </w:p>
+        </w:tc>
+        <w:tc>
+          <w:tcPr>
+            <w:tcW w:type="dxa" w:w="1814"/>
+          </w:tcPr>
+          <w:p>
+            <w:r/>
+            <w:r>
+              <w:rPr>
+                <w:sz w:val="17"/>
+              </w:rPr>
+              <w:t>180 s and 246 s</w:t>
+            </w:r>
+          </w:p>
+        </w:tc>
+        <w:tc>
+          <w:tcPr>
+            <w:tcW w:type="dxa" w:w="1361"/>
+          </w:tcPr>
+          <w:p>
+            <w:r/>
+            <w:r>
+              <w:rPr>
+                <w:sz w:val="17"/>
+              </w:rPr>
+            </w:r>
+          </w:p>
+        </w:tc>
+        <w:tc>
+          <w:tcPr>
+            <w:tcW w:type="dxa" w:w="1814"/>
+          </w:tcPr>
+          <w:p>
+            <w:r/>
+            <w:r>
+              <w:rPr>
+                <w:sz w:val="17"/>
+              </w:rPr>
+              <w:t>not measured for a person</w:t>
+            </w:r>
+          </w:p>
+        </w:tc>
+        <w:tc>
+          <w:tcPr>
+            <w:tcW w:type="dxa" w:w="1361"/>
+          </w:tcPr>
+          <w:p>
+            <w:r/>
+            <w:r>
+              <w:rPr>
+                <w:sz w:val="17"/>
+              </w:rPr>
+            </w:r>
+          </w:p>
+        </w:tc>
+      </w:tr>
+    </w:tbl>
+    <w:p>
+      <w:pPr>
+        <w:spacing w:after="240" w:line="360" w:lineRule="auto"/>
+        <w:jc w:val="left"/>
+      </w:pPr>
+      <w:r>
+        <w:rPr>
+          <w:i/>
+          <w:sz w:val="20"/>
+        </w:rPr>
+        <w:t>Source: Entry sheets of participants P01 and P02, answer key of the comparison pack and replicate 1 of the simulation, scored with score_manual_vs_simulation.py.</w:t>
+      </w:r>
+    </w:p>
+    <w:p>
+      <w:pPr>
+        <w:spacing w:after="160" w:line="360" w:lineRule="auto"/>
+        <w:jc w:val="both"/>
+      </w:pPr>
+      <w:r>
+        <w:rPr>
+          <w:i w:val="0"/>
+        </w:rPr>
+        <w:t>An error reached the record in 72.5 percent of the orders handled by hand and in 15.0 percent of the same orders through Verity, a reduction of 79.3 percent, and the two 95 percent intervals do not overlap. The manual errors had two sources. The participants flagged 6 of the 26 planted errors, and 19 of the 40 orders were typed with at least one field that differed from the message, most often the address or an order line. The slips included a delivery date of 5 November typed for 3 November and a quantity of 60 typed for 1. All 6 errors that would have passed Verity were errors that no rule targets, and 3 of them were wrong addresses. One counted manual slip, an address written with Rd for Road, would not misdirect a delivery. Without it the manual rate is 70.0 percent and the reduction 78.6 percent.</w:t>
+      </w:r>
+    </w:p>
+    <w:p>
+      <w:pPr>
+        <w:spacing w:after="160" w:line="360" w:lineRule="auto"/>
+        <w:jc w:val="both"/>
+      </w:pPr>
+      <w:r>
+        <w:rPr>
+          <w:i w:val="0"/>
+        </w:rPr>
+        <w:t>By hand the participants took a median of 180 seconds per order, and orders they flagged took a median of 600 seconds. The time a person spends entering an order in Verity was not measured, so this baseline cannot yet be turned into a saving of time. With 40 orders and two participants the comparison is indicative only. Its Verity side rests on the simulation rather than on people entering the orders, so it assumes that a customer entering an order in Verity makes the planted mistakes and no others.</w:t>
+      </w:r>
+    </w:p>
+    <w:p>
+      <w:pPr>
         <w:pStyle w:val="Heading2"/>
       </w:pPr>
       <w:r>
@@ -28186,7 +28856,7 @@
         <w:rPr>
           <w:i w:val="0"/>
         </w:rPr>
-        <w:t>Table 4.29 sets each objective of Section 1.3, in its Chapter One wording, against its success criterion and the result of this evaluation.</w:t>
+        <w:t>Table 4.30 sets each objective of Section 1.3, in its Chapter One wording, against its success criterion and the result of this evaluation.</w:t>
       </w:r>
     </w:p>
     <w:p>
@@ -28200,7 +28870,7 @@
           <w:b/>
           <w:i w:val="0"/>
         </w:rPr>
-        <w:t>Table 4.29: Objectives of Section 1.3 and their success criteria</w:t>
+        <w:t>Table 4.30: Objectives of Section 1.3 and their success criteria</w:t>
       </w:r>
     </w:p>
     <w:tbl>
@@ -28483,7 +29153,7 @@
               <w:rPr>
                 <w:sz w:val="17"/>
               </w:rPr>
-              <w:t>Every rule-targeted error was stopped in all three replicates. 40.0 to 41.7 percent of errors with no rule were flagged. Reduction against manual entry not yet measured</w:t>
+              <w:t>An error reached the record in 29 of 40 orders by hand and 6 of the same 40 through Verity, a reduction of 79.3 percent. Two participants, indicative</w:t>
             </w:r>
           </w:p>
         </w:tc>
@@ -28497,7 +29167,7 @@
               <w:rPr>
                 <w:sz w:val="17"/>
               </w:rPr>
-              <w:t>not applicable</w:t>
+              <w:t>57.2 to 83.9 and 7.1 to 29.1</w:t>
             </w:r>
           </w:p>
         </w:tc>
@@ -28511,7 +29181,7 @@
               <w:rPr>
                 <w:sz w:val="17"/>
               </w:rPr>
-              <w:t>Scheduled</w:t>
+              <w:t>Met, indicative</w:t>
             </w:r>
           </w:p>
         </w:tc>
@@ -28627,7 +29297,7 @@
               <w:rPr>
                 <w:sz w:val="17"/>
               </w:rPr>
-              <w:t>Median validation time 2.34 to 22.88 ms per order across the replicates. Gain against manual handling not yet measured</w:t>
+              <w:t>Manual handling took a median of 180 s per order. Verity validates in 2.34 to 22.88 ms, but the time a person spends entering an order in Verity was not measured</w:t>
             </w:r>
           </w:p>
         </w:tc>
@@ -28839,7 +29509,7 @@
         <w:rPr>
           <w:i w:val="0"/>
         </w:rPr>
-        <w:t>Objective 3 is Partly met. Its mandatory-fields criterion is Met, and the simulation shows that the system stops every error a rule is written for before approval. Whether this amounts to 60 percent fewer errors than manual entry depends on the scheduled comparison, so that criterion is given the status Scheduled. The speed criterion of Objective 4 is also Scheduled. The system validates an order in milliseconds, but the criterion concerns end-to-end handling against manual entry, which the same comparison will measure. Below about 80 paired orders its results will be indicative only. The simulated test run required by Objective 5 is Met, but its usability and acceptance part is Not met. The mean usability score was significantly below the benchmark of 68, and no acceptance item was agreed by a majority of respondents.</w:t>
+        <w:t>Objective 3 is Met on indicative evidence. Its mandatory-fields criterion is Met, and in the comparison with manual entry an error reached the record in 15.0 percent of orders through Verity against 72.5 percent by hand, a reduction of 79.3 percent against a target of 60 percent. The comparison covered 40 orders handled by two participants, below the 80 paired orders planned, so it is indicative only. The speed criterion of Objective 4 is Scheduled. Manual handling took a median of 180 seconds per order, but the time a person spends entering the same order in Verity was not measured, so no saving can yet be stated. The simulated test run required by Objective 5 is Met, but its usability and acceptance part is Not met. The mean usability score was significantly below the benchmark of 68, and no acceptance item was agreed by a majority of respondents.</w:t>
       </w:r>
     </w:p>
     <w:p>
@@ -28934,7 +29604,7 @@
         <w:rPr>
           <w:i w:val="0"/>
         </w:rPr>
-        <w:t>The simulation shows what the system removes. Every error that a rule targets was stopped before approval in all three replicates, and no order reached approval with a mandatory field missing. Errors that lie inside the allowed values, such as a wrong but valid product, were mostly not caught. The size of the reduction against manual entry will be measured in the scheduled comparison.</w:t>
+        <w:t>In the comparison of Section 4.5.9 an error reached the record in 72.5 percent of orders handled by hand and in 15.0 percent of the same orders through Verity, a reduction of 79.3 percent. The reduction comes from two sources. Verity stops every error a rule targets, which the participants mostly missed, and it removes retyping, which caused slips in nearly half of the manual orders. Errors that lie inside the allowed values, such as a wrong but valid product, pass both. With two participants the answer is indicative.</w:t>
       </w:r>
     </w:p>
     <w:p>
@@ -28959,7 +29629,7 @@
         <w:rPr>
           <w:i w:val="0"/>
         </w:rPr>
-        <w:t>Validation itself takes milliseconds per order, but the question concerns end-to-end processing time against manual handling. That gain will be measured in the scheduled comparison with manual entry.</w:t>
+        <w:t>Validation itself takes milliseconds per order, but the question concerns end-to-end processing time against manual handling. By hand the participants took a median of 180 seconds per order. The time a person spends entering the same order in Verity was not measured, so the gain cannot yet be stated.</w:t>
       </w:r>
     </w:p>
     <w:p>
@@ -29024,7 +29694,7 @@
         <w:rPr>
           <w:i w:val="0"/>
         </w:rPr>
-        <w:t>Section 2.4.3 adopted the information systems success model of DeLone and McLean (2003) as the frame that links what the simulation measures to the outcomes the study expects. In that frame the validation engine stands for information quality, and the reductions in error and processing time sought by Objectives 3 and 4 stand for net benefits. The evidence on information quality is strong for the errors the rules were written for. Every one of them was stopped in every replicate, and no order reached approval with a mandatory field missing. It is weaker in two respects. Of the 200 clean orders, 28 received a warning that turned out to be unnecessary, and warnings of this kind cost staff time and can teach users to ignore them. The engine also missed most errors that lie inside the allowed values. On system quality, validation responded within a fraction of a second, although its response time grew with the number of orders in two of the replicates. The net benefits remain to be measured, so the second gap identified in Section 2.6, the lack of a comparison between validated digital entry and manual entry, is not yet closed. The questionnaire adds evidence on use and user satisfaction, and both are weak. A usability score of 48.86 and an intention to use of 38.5 percent mean that, in the terms of the model, the system quality shown in the simulation would not by itself lead to net benefits.</w:t>
+        <w:t>Section 2.4.3 adopted the information systems success model of DeLone and McLean (2003) as the frame that links what the simulation measures to the outcomes the study expects. In that frame the validation engine stands for information quality, and the reductions in error and processing time sought by Objectives 3 and 4 stand for net benefits. The evidence on information quality is strong for the errors the rules were written for. Every one of them was stopped in every replicate, and no order reached approval with a mandatory field missing. It is weaker in two respects. Of the 200 clean orders, 28 received a warning that turned out to be unnecessary, and warnings of this kind cost staff time and can teach users to ignore them. The engine also missed most errors that lie inside the allowed values. On system quality, validation responded within a fraction of a second, although its response time grew with the number of orders in two of the replicates. The small comparison with manual entry gives first evidence of net benefits, since far fewer errors reached the record through Verity than by hand, and it begins to close the second gap identified in Section 2.6, the lack of a comparison between validated digital entry and manual entry. The gain in speed remains to be measured. The questionnaire adds evidence on use and user satisfaction, and both are weak. A usability score of 48.86 and an intention to use of 38.5 percent mean that, in the terms of the model, the system quality shown in the simulation would not by itself lead to net benefits.</w:t>
       </w:r>
     </w:p>
     <w:p>
@@ -29152,7 +29822,7 @@
         <w:rPr>
           <w:i w:val="0"/>
         </w:rPr>
-        <w:t>The comparison with manual order entry had not been completed at the time of writing, so the reduction in errors and the gain in processing speed against manual handling are not yet measured.</w:t>
+        <w:t>The comparison with manual entry covered 40 orders handled by two participants, so its results are indicative only. Its Verity side rests on the simulation outcome for the same orders rather than on people entering them in Verity, and the time a person spends entering an order in Verity was not measured, so no gain in speed is reported.</w:t>
       </w:r>
     </w:p>
     <w:p>
@@ -29196,7 +29866,7 @@
         <w:rPr>
           <w:i w:val="0"/>
         </w:rPr>
-        <w:t>Verity was built as a working order processing system with a controlled order lifecycle and nine validation rules, protected by role-based access. Of 26 functional tests, 23 passed and the 3 failures were reported. In three replicates of 500 simulated orders the engine flagged every error that a rule targets, and accuracy on that basis was between 93.0 and 93.6 percent. When realistic errors that no rule targets were included, accuracy was between 86.8 and 87.2 percent, below the 90 percent target. Nearly all false alarms came from the unusual-quantity warning, which also caught most quantity slips. Every order that reached approval had its mandatory fields. In the questionnaire, 200 respondents gave Verity a mean usability score of 48.86, significantly below the benchmark of 68, and 38.5 percent said they would use it, so the usability and acceptance part of Objective 5 is Not met. The comparison with manual entry is scheduled, and the criteria on error reduction and speed are reported as Scheduled until it is complete.</w:t>
+        <w:t>Verity was built as a working order processing system with a controlled order lifecycle and nine validation rules, protected by role-based access. Of 26 functional tests, 23 passed and the 3 failures were reported. In three replicates of 500 simulated orders the engine flagged every error that a rule targets, and accuracy on that basis was between 93.0 and 93.6 percent. When realistic errors that no rule targets were included, accuracy was between 86.8 and 87.2 percent, below the 90 percent target. Nearly all false alarms came from the unusual-quantity warning, which also caught most quantity slips. Every order that reached approval had its mandatory fields. In the questionnaire, 200 respondents gave Verity a mean usability score of 48.86, significantly below the benchmark of 68, and 38.5 percent said they would use it, so the usability and acceptance part of Objective 5 is Not met. In a small comparison with manual entry, an error reached the record in 15.0 percent of orders through Verity against 72.5 percent by hand, an indicative reduction of 79.3 percent, while the gain in speed remains to be measured.</w:t>
       </w:r>
     </w:p>
     <w:p>

</xml_diff>